<commit_message>
Fix stray markdown fence that broke Results section in Word render
</commit_message>
<xml_diff>
--- a/reports/tandayapa_spacing_biodiversity_report.docx
+++ b/reports/tandayapa_spacing_biodiversity_report.docx
@@ -889,7 +889,7 @@
       </w:r>
     </w:p>
     <w:bookmarkEnd w:id="24"/>
-    <w:bookmarkStart w:id="37" w:name="data-analysis"/>
+    <w:bookmarkStart w:id="25" w:name="data-analysis"/>
     <w:p>
       <w:pPr>
         <w:pStyle w:val="Heading1"/>
@@ -2106,138 +2106,23 @@
         <w:t xml:space="preserve">The interactive model is chosen because it directly tests whether distance and habitat interact — that is, whether the distance slope differs between forest and pasture (H2). The additive model assumes the same distance slope in both habitats, which would miss the ecological contrast we are looking for. The raw indices are used in the time-of-day model (Table 3), where each recorder contributes its own value; the pairwise difference is only needed for the distance-decay question.</w:t>
       </w:r>
     </w:p>
+    <w:bookmarkEnd w:id="25"/>
+    <w:bookmarkStart w:id="42" w:name="results"/>
     <w:p>
       <w:pPr>
-        <w:pStyle w:val="SourceCode"/>
+        <w:pStyle w:val="Heading1"/>
       </w:pPr>
       <w:r>
-        <w:br/>
-      </w:r>
-      <w:r>
-        <w:rPr>
-          <w:rStyle w:val="VerbatimChar"/>
-        </w:rPr>
-        <w:t xml:space="preserve"># Results</w:t>
-      </w:r>
-      <w:r>
-        <w:br/>
-      </w:r>
-      <w:r>
-        <w:br/>
-      </w:r>
-      <w:r>
-        <w:rPr>
-          <w:rStyle w:val="VerbatimChar"/>
-        </w:rPr>
-        <w:t xml:space="preserve">## Acoustic indices and recorder distance</w:t>
-      </w:r>
-      <w:r>
-        <w:br/>
-      </w:r>
-      <w:r>
-        <w:br/>
-      </w:r>
-      <w:r>
-        <w:rPr>
-          <w:rStyle w:val="VerbatimChar"/>
-        </w:rPr>
-        <w:t xml:space="preserve">For every within-habitat recorder pair we took the absolute difference in each index and asked whether</w:t>
-      </w:r>
-      <w:r>
-        <w:br/>
-      </w:r>
-      <w:r>
-        <w:rPr>
-          <w:rStyle w:val="VerbatimChar"/>
-        </w:rPr>
-        <w:t xml:space="preserve">it grows with distance. In **Figure 1** the lines are the mixed-model fits with 95% bands; points are</w:t>
-      </w:r>
-      <w:r>
-        <w:br/>
-      </w:r>
-      <w:r>
-        <w:rPr>
-          <w:rStyle w:val="VerbatimChar"/>
-        </w:rPr>
-        <w:t xml:space="preserve">adjusted for the day random effect, and the symbol marks the first or second replicate day. All three</w:t>
-      </w:r>
-      <w:r>
-        <w:br/>
-      </w:r>
-      <w:r>
-        <w:rPr>
-          <w:rStyle w:val="VerbatimChar"/>
-        </w:rPr>
-        <w:t xml:space="preserve">indices are **flat**: none of the slopes differs from zero (Table 2). The cheap indices do **not**</w:t>
-      </w:r>
-      <w:r>
-        <w:br/>
-      </w:r>
-      <w:r>
-        <w:rPr>
-          <w:rStyle w:val="VerbatimChar"/>
-        </w:rPr>
-        <w:t xml:space="preserve">change with recorder distance over 15–60 m (H1 not supported for the indices).</w:t>
-      </w:r>
-      <w:r>
-        <w:br/>
-      </w:r>
-      <w:r>
-        <w:br/>
-      </w:r>
-      <w:r>
-        <w:br/>
-      </w:r>
-      <w:r>
-        <w:br/>
-      </w:r>
-      <w:r>
-        <w:rPr>
-          <w:rStyle w:val="VerbatimChar"/>
-        </w:rPr>
-        <w:t xml:space="preserve">![Figure 1. Difference in each acoustic index (ACI, BI, ADI) between two recorders vs distance, forest vs pasture (≤60 m). Mixed-model fit + 95% band; points day-adjusted, shape = replicate day.](tandayapa_spacing_biodiversity_report_files/figure-docx/index-fig-1.png)</w:t>
-      </w:r>
-      <w:r>
-        <w:br/>
-      </w:r>
-      <w:r>
-        <w:br/>
-      </w:r>
-      <w:r>
-        <w:br/>
-      </w:r>
-      <w:r>
-        <w:rPr>
-          <w:rStyle w:val="VerbatimChar"/>
-        </w:rPr>
-        <w:t xml:space="preserve">``````{=openxml}</w:t>
-      </w:r>
-      <w:r>
-        <w:br/>
-      </w:r>
-      <w:r>
-        <w:rPr>
-          <w:rStyle w:val="VerbatimChar"/>
-        </w:rPr>
-        <w:t xml:space="preserve">&lt;w:p xmlns:w="http://schemas.openxmlformats.org/wordprocessingml/2006/main" xmlns:wp="http://schemas.openxmlformats.org/drawingml/2006/wordprocessingDrawing" xmlns:r="http://schemas.openxmlformats.org/officeDocument/2006/relationships" xmlns:w14="http://schemas.microsoft.com/office/word/2010/wordml"&gt;&lt;w:pPr&gt;&lt;w:pStyle w:val="TableCaption"/&gt;&lt;w:jc w:val="center"/&gt;&lt;w:keepNext/&gt;&lt;w:pBdr&gt;&lt;w:bottom w:val="none" w:sz="0" w:space="0" w:color="000000"/&gt;&lt;w:top w:val="none" w:sz="0" w:space="0" w:color="000000"/&gt;&lt;w:left w:val="none" w:sz="0" w:space="0" w:color="000000"/&gt;&lt;w:right w:val="none" w:sz="0" w:space="0" w:color="000000"/&gt;&lt;/w:pBdr&gt;&lt;w:spacing w:after="60" w:before="60" w:line="240"/&gt;&lt;w:ind w:left="60" w:right="60" w:firstLine="0" w:firstLineChars="0"/&gt;&lt;/w:pPr&gt;&lt;w:r&gt;&lt;w:t xml:space="preserve"&gt;Table 2. Distance effect on each acoustic-index difference (mixed model, ≤60 m). 'CI excl 0 = yes' would mean the index changes with distance; here every row is 'no'.&lt;/w:t&gt;&lt;/w:r&gt;&lt;/w:p&gt;</w:t>
-      </w:r>
-      <w:r>
-        <w:br/>
-      </w:r>
-      <w:r>
-        <w:rPr>
-          <w:rStyle w:val="VerbatimChar"/>
-        </w:rPr>
-        <w:t xml:space="preserve">&lt;w:tbl xmlns:w="http://schemas.openxmlformats.org/wordprocessingml/2006/main" xmlns:r="http://schemas.openxmlformats.org/officeDocument/2006/relationships" xmlns:w14="http://schemas.microsoft.com/office/word/2010/wordml" xmlns:wp="http://schemas.openxmlformats.org/drawingml/2006/wordprocessingDrawing" xmlns:a="http://schemas.openxmlformats.org/drawingml/2006/main" xmlns:pic="http://schemas.openxmlformats.org/drawingml/2006/picture"&gt;&lt;w:tblPr&gt;&lt;w:tblLayout w:type="autofit"/&gt;&lt;w:jc w:val="center"/&gt;&lt;w:tblW w:type="pct" w:w="5000"/&gt;&lt;w:tblLook w:firstRow="1" w:lastRow="0" w:firstColumn="0" w:lastColumn="0" w:noHBand="0" w:noVBand="1"/&gt;&lt;/w:tblPr&gt;&lt;w:tr&gt;&lt;w:trPr&gt;&lt;w:trHeight w:val="360" w:hRule="auto"/&gt;&lt;w:tblHeader/&gt;&lt;/w:trPr&gt;&lt;w:tc&gt;&lt;w:tcPr&gt;&lt;w:tcBorders&gt;&lt;w:bottom w:val="single" w:sz="8" w:space="0" w:color="000000"/&gt;&lt;w:top w:val="single" w:sz="16" w:space="0" w:color="000000"/&gt;&lt;w:left w:val="none" w:sz="0" w:space="0" w:color="000000"/&gt;&lt;w:right w:val="none" w:sz="0" w:space="0" w:color="000000"/&gt;&lt;/w:tcBorders&gt;&lt;w:shd w:val="clear" w:color="auto" w:fill="FFFFFF"/&gt;&lt;w:tcMar&gt;&lt;w:top w:w="0" w:type="dxa"/&gt;&lt;w:bottom w:w="0" w:type="dxa"/&gt;&lt;w:left w:w="0" w:type="dxa"/&gt;&lt;w:right w:w="0" w:type="dxa"/&gt;&lt;/w:tcMar&gt;&lt;w:vAlign w:val="center"/&gt;&lt;/w:tcPr&gt;&lt;w:p&gt;&lt;w:pPr&gt;&lt;w:jc w:val="left"/&gt;&lt;w:pBdr&gt;&lt;w:bottom w:val="none" w:sz="0" w:space="0" w:color="000000"/&gt;&lt;w:top w:val="none" w:sz="0" w:space="0" w:color="000000"/&gt;&lt;w:left w:val="none" w:sz="0" w:space="0" w:color="000000"/&gt;&lt;w:right w:val="none" w:sz="0" w:space="0" w:color="000000"/&gt;&lt;/w:pBdr&gt;&lt;w:spacing w:after="80" w:before="80" w:line="240"/&gt;&lt;w:ind w:left="80" w:right="80" w:firstLine="0" w:firstLineChars="0"/&gt;&lt;w:rPr&gt;&lt;w:rFonts w:ascii="Arial" w:hAnsi="Arial" w:eastAsia="Arial" w:cs="Arial"/&gt;&lt;w:i w:val="false"/&gt;&lt;w:b w:val="true"/&gt;&lt;w:u w:val="none"/&gt;&lt;w:strike w:val="false"/&gt;&lt;w:sz w:val="18"/&gt;&lt;w:szCs w:val="18"/&gt;&lt;w:color w:val="000000"/&gt;&lt;/w:rPr&gt;&lt;/w:pPr&gt;&lt;w:r xmlns:w="http://schemas.openxmlformats.org/wordprocessingml/2006/main" xmlns:wp="http://schemas.openxmlformats.org/drawingml/2006/wordprocessingDrawing" xmlns:r="http://schemas.openxmlformats.org/officeDocument/2006/relationships" xmlns:w14="http://schemas.microsoft.com/office/word/2010/wordml"&gt;&lt;w:rPr&gt;&lt;w:rFonts w:ascii="Arial" w:hAnsi="Arial" w:eastAsia="Arial" w:cs="Arial"/&gt;&lt;w:i w:val="false"/&gt;&lt;w:b w:val="true"/&gt;&lt;w:u w:val="none"/&gt;&lt;w:strike w:val="false"/&gt;&lt;w:sz w:val="18"/&gt;&lt;w:szCs w:val="18"/&gt;&lt;w:color w:val="000000"/&gt;&lt;/w:rPr&gt;&lt;w:t xml:space="preserve"&gt;index&lt;/w:t&gt;&lt;/w:r&gt;&lt;/w:p&gt;&lt;/w:tc&gt;&lt;w:tc&gt;&lt;w:tcPr&gt;&lt;w:tcBorders&gt;&lt;w:bottom w:val="single" w:sz="8" w:space="0" w:color="000000"/&gt;&lt;w:top w:val="single" w:sz="16" w:space="0" w:color="000000"/&gt;&lt;w:left w:val="none" w:sz="0" w:space="0" w:color="000000"/&gt;&lt;w:right w:val="none" w:sz="0" w:space="0" w:color="000000"/&gt;&lt;/w:tcBorders&gt;&lt;w:shd w:val="clear" w:color="auto" w:fill="FFFFFF"/&gt;&lt;w:tcMar&gt;&lt;w:top w:w="0" w:type="dxa"/&gt;&lt;w:bottom w:w="0" w:type="dxa"/&gt;&lt;w:left w:w="0" w:type="dxa"/&gt;&lt;w:right w:w="0" w:type="dxa"/&gt;&lt;/w:tcMar&gt;&lt;w:vAlign w:val="center"/&gt;&lt;/w:tcPr&gt;&lt;w:p&gt;&lt;w:pPr&gt;&lt;w:jc w:val="center"/&gt;&lt;w:pBdr&gt;&lt;w:bottom w:val="none" w:sz="0" w:space="0" w:color="000000"/&gt;&lt;w:top w:val="none" w:sz="0" w:space="0" w:color="000000"/&gt;&lt;w:left w:val="none" w:sz="0" w:space="0" w:color="000000"/&gt;&lt;w:right w:val="none" w:sz="0" w:space="0" w:color="000000"/&gt;&lt;/w:pBdr&gt;&lt;w:spacing w:after="80" w:before="80" w:line="240"/&gt;&lt;w:ind w:left="80" w:right="80" w:firstLine="0" w:firstLineChars="0"/&gt;&lt;w:rPr&gt;&lt;w:rFonts w:ascii="Arial" w:hAnsi="Arial" w:eastAsia="Arial" w:cs="Arial"/&gt;&lt;w:i w:val="false"/&gt;&lt;w:b w:val="true"/&gt;&lt;w:u w:val="none"/&gt;&lt;w:strike w:val="false"/&gt;&lt;w:sz w:val="18"/&gt;&lt;w:szCs w:val="18"/&gt;&lt;w:color w:val="000000"/&gt;&lt;/w:rPr&gt;&lt;/w:pPr&gt;&lt;w:r xmlns:w="http://schemas.openxmlformats.org/wordprocessingml/2006/main" xmlns:wp="http://schemas.openxmlformats.org/drawingml/2006/wordprocessingDrawing" xmlns:r="http://schemas.openxmlformats.org/officeDocument/2006/relationships" xmlns:w14="http://schemas.microsoft.com/office/word/2010/wordml"&gt;&lt;w:rPr&gt;&lt;w:rFonts w:ascii="Arial" w:hAnsi="Arial" w:eastAsia="Arial" w:cs="Arial"/&gt;&lt;w:i w:val="false"/&gt;&lt;w:b w:val="true"/&gt;&lt;w:u w:val="none"/&gt;&lt;w:strike w:val="false"/&gt;&lt;w:sz w:val="18"/&gt;&lt;w:szCs w:val="18"/&gt;&lt;w:color w:val="000000"/&gt;&lt;/w:rPr&gt;&lt;w:t xml:space="preserve"&gt;habitat&lt;/w:t&gt;&lt;/w:r&gt;&lt;/w:p&gt;&lt;/w:tc&gt;&lt;w:tc&gt;&lt;w:tcPr&gt;&lt;w:tcBorders&gt;&lt;w:bottom w:val="single" w:sz="8" w:space="0" w:color="000000"/&gt;&lt;w:top w:val="single" w:sz="16" w:space="0" w:color="000000"/&gt;&lt;w:left w:val="none" w:sz="0" w:space="0" w:color="000000"/&gt;&lt;w:right w:val="none" w:sz="0" w:space="0" w:color="000000"/&gt;&lt;/w:tcBorders&gt;&lt;w:shd w:val="clear" w:color="auto" w:fill="FFFFFF"/&gt;&lt;w:tcMar&gt;&lt;w:top w:w="0" w:type="dxa"/&gt;&lt;w:bottom w:w="0" w:type="dxa"/&gt;&lt;w:left w:w="0" w:type="dxa"/&gt;&lt;w:right w:w="0" w:type="dxa"/&gt;&lt;/w:tcMar&gt;&lt;w:vAlign w:val="center"/&gt;&lt;/w:tcPr&gt;&lt;w:p&gt;&lt;w:pPr&gt;&lt;w:jc w:val="center"/&gt;&lt;w:pBdr&gt;&lt;w:bottom w:val="none" w:sz="0" w:space="0" w:color="000000"/&gt;&lt;w:top w:val="none" w:sz="0" w:space="0" w:color="000000"/&gt;&lt;w:left w:val="none" w:sz="0" w:space="0" w:color="000000"/&gt;&lt;w:right w:val="none" w:sz="0" w:space="0" w:color="000000"/&gt;&lt;/w:pBdr&gt;&lt;w:spacing w:after="80" w:before="80" w:line="240"/&gt;&lt;w:ind w:left="80" w:right="80" w:firstLine="0" w:firstLineChars="0"/&gt;&lt;w:rPr&gt;&lt;w:rFonts w:ascii="Arial" w:hAnsi="Arial" w:eastAsia="Arial" w:cs="Arial"/&gt;&lt;w:i w:val="false"/&gt;&lt;w:b w:val="true"/&gt;&lt;w:u w:val="none"/&gt;&lt;w:strike w:val="false"/&gt;&lt;w:sz w:val="18"/&gt;&lt;w:szCs w:val="18"/&gt;&lt;w:color w:val="000000"/&gt;&lt;/w:rPr&gt;&lt;/w:pPr&gt;&lt;w:r xmlns:w="http://schemas.openxmlformats.org/wordprocessingml/2006/main" xmlns:wp="http://schemas.openxmlformats.org/drawingml/2006/wordprocessingDrawing" xmlns:r="http://schemas.openxmlformats.org/officeDocument/2006/relationships" xmlns:w14="http://schemas.microsoft.com/office/word/2010/wordml"&gt;&lt;w:rPr&gt;&lt;w:rFonts w:ascii="Arial" w:hAnsi="Arial" w:eastAsia="Arial" w:cs="Arial"/&gt;&lt;w:i w:val="false"/&gt;&lt;w:b w:val="true"/&gt;&lt;w:u w:val="none"/&gt;&lt;w:strike w:val="false"/&gt;&lt;w:sz w:val="18"/&gt;&lt;w:szCs w:val="18"/&gt;&lt;w:color w:val="000000"/&gt;&lt;/w:rPr&gt;&lt;w:t xml:space="preserve"&gt;Δ/+10m&lt;/w:t&gt;&lt;/w:r&gt;&lt;/w:p&gt;&lt;/w:tc&gt;&lt;w:tc&gt;&lt;w:tcPr&gt;&lt;w:tcBorders&gt;&lt;w:bottom w:val="single" w:sz="8" w:space="0" w:color="000000"/&gt;&lt;w:top w:val="single" w:sz="16" w:space="0" w:color="000000"/&gt;&lt;w:left w:val="none" w:sz="0" w:space="0" w:color="000000"/&gt;&lt;w:right w:val="none" w:sz="0" w:space="0" w:color="000000"/&gt;&lt;/w:tcBorders&gt;&lt;w:shd w:val="clear" w:color="auto" w:fill="FFFFFF"/&gt;&lt;w:tcMar&gt;&lt;w:top w:w="0" w:type="dxa"/&gt;&lt;w:bottom w:w="0" w:type="dxa"/&gt;&lt;w:left w:w="0" w:type="dxa"/&gt;&lt;w:right w:w="0" w:type="dxa"/&gt;&lt;/w:tcMar&gt;&lt;w:vAlign w:val="center"/&gt;&lt;/w:tcPr&gt;&lt;w:p&gt;&lt;w:pPr&gt;&lt;w:jc w:val="center"/&gt;&lt;w:pBdr&gt;&lt;w:bottom w:val="none" w:sz="0" w:space="0" w:color="000000"/&gt;&lt;w:top w:val="none" w:sz="0" w:space="0" w:color="000000"/&gt;&lt;w:left w:val="none" w:sz="0" w:space="0" w:color="000000"/&gt;&lt;w:right w:val="none" w:sz="0" w:space="0" w:color="000000"/&gt;&lt;/w:pBdr&gt;&lt;w:spacing w:after="80" w:before="80" w:line="240"/&gt;&lt;w:ind w:left="80" w:right="80" w:firstLine="0" w:firstLineChars="0"/&gt;&lt;w:rPr&gt;&lt;w:rFonts w:ascii="Arial" w:hAnsi="Arial" w:eastAsia="Arial" w:cs="Arial"/&gt;&lt;w:i w:val="false"/&gt;&lt;w:b w:val="true"/&gt;&lt;w:u w:val="none"/&gt;&lt;w:strike w:val="false"/&gt;&lt;w:sz w:val="18"/&gt;&lt;w:szCs w:val="18"/&gt;&lt;w:color w:val="000000"/&gt;&lt;/w:rPr&gt;&lt;/w:pPr&gt;&lt;w:r xmlns:w="http://schemas.openxmlformats.org/wordprocessingml/2006/main" xmlns:wp="http://schemas.openxmlformats.org/drawingml/2006/wordprocessingDrawing" xmlns:r="http://schemas.openxmlformats.org/officeDocument/2006/relationships" xmlns:w14="http://schemas.microsoft.com/office/word/2010/wordml"&gt;&lt;w:rPr&gt;&lt;w:rFonts w:ascii="Arial" w:hAnsi="Arial" w:eastAsia="Arial" w:cs="Arial"/&gt;&lt;w:i w:val="false"/&gt;&lt;w:b w:val="true"/&gt;&lt;w:u w:val="none"/&gt;&lt;w:strike w:val="false"/&gt;&lt;w:sz w:val="18"/&gt;&lt;w:szCs w:val="18"/&gt;&lt;w:color w:val="000000"/&gt;&lt;/w:rPr&gt;&lt;w:t xml:space="preserve"&gt;CI low&lt;/w:t&gt;&lt;/w:r&gt;&lt;/w:p&gt;&lt;/w:tc&gt;&lt;w:tc&gt;&lt;w:tcPr&gt;&lt;w:tcBorders&gt;&lt;w:bottom w:val="single" w:sz="8" w:space="0" w:color="000000"/&gt;&lt;w:top w:val="single" w:sz="16" w:space="0" w:color="000000"/&gt;&lt;w:left w:val="none" w:sz="0" w:space="0" w:color="000000"/&gt;&lt;w:right w:val="none" w:sz="0" w:space="0" w:color="000000"/&gt;&lt;/w:tcBorders&gt;&lt;w:shd w:val="clear" w:color="auto" w:fill="FFFFFF"/&gt;&lt;w:tcMar&gt;&lt;w:top w:w="0" w:type="dxa"/&gt;&lt;w:bottom w:w="0" w:type="dxa"/&gt;&lt;w:left w:w="0" w:type="dxa"/&gt;&lt;w:right w:w="0" w:type="dxa"/&gt;&lt;/w:tcMar&gt;&lt;w:vAlign w:val="center"/&gt;&lt;/w:tcPr&gt;&lt;w:p&gt;&lt;w:pPr&gt;&lt;w:jc w:val="center"/&gt;&lt;w:pBdr&gt;&lt;w:bottom w:val="none" w:sz="0" w:space="0" w:color="000000"/&gt;&lt;w:top w:val="none" w:sz="0" w:space="0" w:color="000000"/&gt;&lt;w:left w:val="none" w:sz="0" w:space="0" w:color="000000"/&gt;&lt;w:right w:val="none" w:sz="0" w:space="0" w:color="000000"/&gt;&lt;/w:pBdr&gt;&lt;w:spacing w:after="80" w:before="80" w:line="240"/&gt;&lt;w:ind w:left="80" w:right="80" w:firstLine="0" w:firstLineChars="0"/&gt;&lt;w:rPr&gt;&lt;w:rFonts w:ascii="Arial" w:hAnsi="Arial" w:eastAsia="Arial" w:cs="Arial"/&gt;&lt;w:i w:val="false"/&gt;&lt;w:b w:val="true"/&gt;&lt;w:u w:val="none"/&gt;&lt;w:strike w:val="false"/&gt;&lt;w:sz w:val="18"/&gt;&lt;w:szCs w:val="18"/&gt;&lt;w:color w:val="000000"/&gt;&lt;/w:rPr&gt;&lt;/w:pPr&gt;&lt;w:r xmlns:w="http://schemas.openxmlformats.org/wordprocessingml/2006/main" xmlns:wp="http://schemas.openxmlformats.org/drawingml/2006/wordprocessingDrawing" xmlns:r="http://schemas.openxmlformats.org/officeDocument/2006/relationships" xmlns:w14="http://schemas.microsoft.com/office/word/2010/wordml"&gt;&lt;w:rPr&gt;&lt;w:rFonts w:ascii="Arial" w:hAnsi="Arial" w:eastAsia="Arial" w:cs="Arial"/&gt;&lt;w:i w:val="false"/&gt;&lt;w:b w:val="true"/&gt;&lt;w:u w:val="none"/&gt;&lt;w:strike w:val="false"/&gt;&lt;w:sz w:val="18"/&gt;&lt;w:szCs w:val="18"/&gt;&lt;w:color w:val="000000"/&gt;&lt;/w:rPr&gt;&lt;w:t xml:space="preserve"&gt;CI high&lt;/w:t&gt;&lt;/w:r&gt;&lt;/w:p&gt;&lt;/w:tc&gt;&lt;w:tc&gt;&lt;w:tcPr&gt;&lt;w:tcBorders&gt;&lt;w:bottom w:val="single" w:sz="8" w:space="0" w:color="000000"/&gt;&lt;w:top w:val="single" w:sz="16" w:space="0" w:color="000000"/&gt;&lt;w:left w:val="none" w:sz="0" w:space="0" w:color="000000"/&gt;&lt;w:right w:val="none" w:sz="0" w:space="0" w:color="000000"/&gt;&lt;/w:tcBorders&gt;&lt;w:shd w:val="clear" w:color="auto" w:fill="FFFFFF"/&gt;&lt;w:tcMar&gt;&lt;w:top w:w="0" w:type="dxa"/&gt;&lt;w:bottom w:w="0" w:type="dxa"/&gt;&lt;w:left w:w="0" w:type="dxa"/&gt;&lt;w:right w:w="0" w:type="dxa"/&gt;&lt;/w:tcMar&gt;&lt;w:vAlign w:val="center"/&gt;&lt;/w:tcPr&gt;&lt;w:p&gt;&lt;w:pPr&gt;&lt;w:jc w:val="center"/&gt;&lt;w:pBdr&gt;&lt;w:bottom w:val="none" w:sz="0" w:space="0" w:color="000000"/&gt;&lt;w:top w:val="none" w:sz="0" w:space="0" w:color="000000"/&gt;&lt;w:left w:val="none" w:sz="0" w:space="0" w:color="000000"/&gt;&lt;w:right w:val="none" w:sz="0" w:space="0" w:color="000000"/&gt;&lt;/w:pBdr&gt;&lt;w:spacing w:after="80" w:before="80" w:line="240"/&gt;&lt;w:ind w:left="80" w:right="80" w:firstLine="0" w:firstLineChars="0"/&gt;&lt;w:rPr&gt;&lt;w:rFonts w:ascii="Arial" w:hAnsi="Arial" w:eastAsia="Arial" w:cs="Arial"/&gt;&lt;w:i w:val="false"/&gt;&lt;w:b w:val="true"/&gt;&lt;w:u w:val="none"/&gt;&lt;w:strike w:val="false"/&gt;&lt;w:sz w:val="18"/&gt;&lt;w:szCs w:val="18"/&gt;&lt;w:color w:val="000000"/&gt;&lt;/w:rPr&gt;&lt;/w:pPr&gt;&lt;w:r xmlns:w="http://schemas.openxmlformats.org/wordprocessingml/2006/main" xmlns:wp="http://schemas.openxmlformats.org/drawingml/2006/wordprocessingDrawing" xmlns:r="http://schemas.openxmlformats.org/officeDocument/2006/relationships" xmlns:w14="http://schemas.microsoft.com/office/word/2010/wordml"&gt;&lt;w:rPr&gt;&lt;w:rFonts w:ascii="Arial" w:hAnsi="Arial" w:eastAsia="Arial" w:cs="Arial"/&gt;&lt;w:i w:val="false"/&gt;&lt;w:b w:val="true"/&gt;&lt;w:u w:val="none"/&gt;&lt;w:strike w:val="false"/&gt;&lt;w:sz w:val="18"/&gt;&lt;w:szCs w:val="18"/&gt;&lt;w:color w:val="000000"/&gt;&lt;/w:rPr&gt;&lt;w:t xml:space="preserve"&gt;R2&lt;/w:t&gt;&lt;/w:r&gt;&lt;/w:p&gt;&lt;/w:tc&gt;&lt;w:tc&gt;&lt;w:tcPr&gt;&lt;w:tcBorders&gt;&lt;w:bottom w:val="single" w:sz="8" w:space="0" w:color="000000"/&gt;&lt;w:top w:val="single" w:sz="16" w:space="0" w:color="000000"/&gt;&lt;w:left w:val="none" w:sz="0" w:space="0" w:color="000000"/&gt;&lt;w:right w:val="none" w:sz="0" w:space="0" w:color="000000"/&gt;&lt;/w:tcBorders&gt;&lt;w:shd w:val="clear" w:color="auto" w:fill="FFFFFF"/&gt;&lt;w:tcMar&gt;&lt;w:top w:w="0" w:type="dxa"/&gt;&lt;w:bottom w:w="0" w:type="dxa"/&gt;&lt;w:left w:w="0" w:type="dxa"/&gt;&lt;w:right w:w="0" w:type="dxa"/&gt;&lt;/w:tcMar&gt;&lt;w:vAlign w:val="center"/&gt;&lt;/w:tcPr&gt;&lt;w:p&gt;&lt;w:pPr&gt;&lt;w:jc w:val="center"/&gt;&lt;w:pBdr&gt;&lt;w:bottom w:val="none" w:sz="0" w:space="0" w:color="000000"/&gt;&lt;w:top w:val="none" w:sz="0" w:space="0" w:color="000000"/&gt;&lt;w:left w:val="none" w:sz="0" w:space="0" w:color="000000"/&gt;&lt;w:right w:val="none" w:sz="0" w:space="0" w:color="000000"/&gt;&lt;/w:pBdr&gt;&lt;w:spacing w:after="80" w:before="80" w:line="240"/&gt;&lt;w:ind w:left="80" w:right="80" w:firstLine="0" w:firstLineChars="0"/&gt;&lt;w:rPr&gt;&lt;w:rFonts w:ascii="Arial" w:hAnsi="Arial" w:eastAsia="Arial" w:cs="Arial"/&gt;&lt;w:i w:val="false"/&gt;&lt;w:b w:val="true"/&gt;&lt;w:u w:val="none"/&gt;&lt;w:strike w:val="false"/&gt;&lt;w:sz w:val="18"/&gt;&lt;w:szCs w:val="18"/&gt;&lt;w:color w:val="000000"/&gt;&lt;/w:rPr&gt;&lt;/w:pPr&gt;&lt;w:r xmlns:w="http://schemas.openxmlformats.org/wordprocessingml/2006/main" xmlns:wp="http://schemas.openxmlformats.org/drawingml/2006/wordprocessingDrawing" xmlns:r="http://schemas.openxmlformats.org/officeDocument/2006/relationships" xmlns:w14="http://schemas.microsoft.com/office/word/2010/wordml"&gt;&lt;w:rPr&gt;&lt;w:rFonts w:ascii="Arial" w:hAnsi="Arial" w:eastAsia="Arial" w:cs="Arial"/&gt;&lt;w:i w:val="false"/&gt;&lt;w:b w:val="true"/&gt;&lt;w:u w:val="none"/&gt;&lt;w:strike w:val="false"/&gt;&lt;w:sz w:val="18"/&gt;&lt;w:szCs w:val="18"/&gt;&lt;w:color w:val="000000"/&gt;&lt;/w:rPr&gt;&lt;w:t xml:space="preserve"&gt;CI excl 0&lt;/w:t&gt;&lt;/w:r&gt;&lt;/w:p&gt;&lt;/w:tc&gt;&lt;w:tc&gt;&lt;w:tcPr&gt;&lt;w:tcBorders&gt;&lt;w:bottom w:val="single" w:sz="8" w:space="0" w:color="000000"/&gt;&lt;w:top w:val="single" w:sz="16" w:space="0" w:color="000000"/&gt;&lt;w:left w:val="none" w:sz="0" w:space="0" w:color="000000"/&gt;&lt;w:right w:val="none" w:sz="0" w:space="0" w:color="000000"/&gt;&lt;/w:tcBorders&gt;&lt;w:shd w:val="clear" w:color="auto" w:fill="FFFFFF"/&gt;&lt;w:tcMar&gt;&lt;w:top w:w="0" w:type="dxa"/&gt;&lt;w:bottom w:w="0" w:type="dxa"/&gt;&lt;w:left w:w="0" w:type="dxa"/&gt;&lt;w:right w:w="0" w:type="dxa"/&gt;&lt;/w:tcMar&gt;&lt;w:vAlign w:val="center"/&gt;&lt;/w:tcPr&gt;&lt;w:p&gt;&lt;w:pPr&gt;&lt;w:jc w:val="center"/&gt;&lt;w:pBdr&gt;&lt;w:bottom w:val="none" w:sz="0" w:space="0" w:color="000000"/&gt;&lt;w:top w:val="none" w:sz="0" w:space="0" w:color="000000"/&gt;&lt;w:left w:val="none" w:sz="0" w:space="0" w:color="000000"/&gt;&lt;w:right w:val="none" w:sz="0" w:space="0" w:color="000000"/&gt;&lt;/w:pBdr&gt;&lt;w:spacing w:after="80" w:before="80" w:line="240"/&gt;&lt;w:ind w:left="80" w:right="80" w:firstLine="0" w:firstLineChars="0"/&gt;&lt;w:rPr&gt;&lt;w:rFonts w:ascii="Arial" w:hAnsi="Arial" w:eastAsia="Arial" w:cs="Arial"/&gt;&lt;w:i w:val="false"/&gt;&lt;w:b w:val="true"/&gt;&lt;w:u w:val="none"/&gt;&lt;w:strike w:val="false"/&gt;&lt;w:sz w:val="18"/&gt;&lt;w:szCs w:val="18"/&gt;&lt;w:color w:val="000000"/&gt;&lt;/w:rPr&gt;&lt;/w:pPr&gt;&lt;w:r xmlns:w="http://schemas.openxmlformats.org/wordprocessingml/2006/main" xmlns:wp="http://schemas.openxmlformats.org/drawingml/2006/wordprocessingDrawing" xmlns:r="http://schemas.openxmlformats.org/officeDocument/2006/relationships" xmlns:w14="http://schemas.microsoft.com/office/word/2010/wordml"&gt;&lt;w:rPr&gt;&lt;w:rFonts w:ascii="Arial" w:hAnsi="Arial" w:eastAsia="Arial" w:cs="Arial"/&gt;&lt;w:i w:val="false"/&gt;&lt;w:b w:val="true"/&gt;&lt;w:u w:val="none"/&gt;&lt;w:strike w:val="false"/&gt;&lt;w:sz w:val="18"/&gt;&lt;w:szCs w:val="18"/&gt;&lt;w:color w:val="000000"/&gt;&lt;/w:rPr&gt;&lt;w:t xml:space="preserve"&gt;n&lt;/w:t&gt;&lt;/w:r&gt;&lt;/w:p&gt;&lt;/w:tc&gt;&lt;/w:tr&gt;&lt;w:tr&gt;&lt;w:trPr&gt;&lt;w:trHeight w:val="360" w:hRule="auto"/&gt;&lt;/w:trPr&gt;&lt;w:tc&gt;&lt;w:tcPr&gt;&lt;w:tcBorders&gt;&lt;w:bottom w:val="none" w:sz="0" w:space="0" w:color="000000"/&gt;&lt;w:top w:val="single" w:sz="8" w:space="0" w:color="000000"/&gt;&lt;w:left w:val="none" w:sz="0" w:space="0" w:color="000000"/&gt;&lt;w:right w:val="none" w:sz="0" w:space="0" w:color="000000"/&gt;&lt;/w:tcBorders&gt;&lt;w:shd w:val="clear" w:color="auto" w:fill="FFFFFF"/&gt;&lt;w:tcMar&gt;&lt;w:top w:w="0" w:type="dxa"/&gt;&lt;w:bottom w:w="0" w:type="dxa"/&gt;&lt;w:left w:w="0" w:type="dxa"/&gt;&lt;w:right w:w="0" w:type="dxa"/&gt;&lt;/w:tcMar&gt;&lt;w:vAlign w:val="center"/&gt;&lt;/w:tcPr&gt;&lt;w:p&gt;&lt;w:pPr&gt;&lt;w:jc w:val="left"/&gt;&lt;w:pBdr&gt;&lt;w:bottom w:val="none" w:sz="0" w:space="0" w:color="000000"/&gt;&lt;w:top w:val="none" w:sz="0" w:space="0" w:color="000000"/&gt;&lt;w:left w:val="none" w:sz="0" w:space="0" w:color="000000"/&gt;&lt;w:right w:val="none" w:sz="0" w:space="0" w:color="000000"/&gt;&lt;/w:pBdr&gt;&lt;w:spacing w:after="80" w:before="80" w:line="240"/&gt;&lt;w:ind w:left="80" w:right="80" w:firstLine="0" w:firstLineChars="0"/&gt;&lt;w:rPr&gt;&lt;w:rFonts w:ascii="Arial" w:hAnsi="Arial" w:eastAsia="Arial" w:cs="Arial"/&gt;&lt;w:i w:val="false"/&gt;&lt;w:b w:val="false"/&gt;&lt;w:u w:val="none"/&gt;&lt;w:strike w:val="false"/&gt;&lt;w:sz w:val="18"/&gt;&lt;w:szCs w:val="18"/&gt;&lt;w:color w:val="000000"/&gt;&lt;/w:rPr&gt;&lt;/w:pPr&gt;&lt;w:r xmlns:w="http://schemas.openxmlformats.org/wordprocessingml/2006/main" xmlns:wp="http://schemas.openxmlformats.org/drawingml/2006/wordprocessingDrawing" xmlns:r="http://schemas.openxmlformats.org/officeDocument/2006/relationships" xmlns:w14="http://schemas.microsoft.com/office/word/2010/wordml"&gt;&lt;w:rPr&gt;&lt;w:rFonts w:ascii="Arial" w:hAnsi="Arial" w:eastAsia="Arial" w:cs="Arial"/&gt;&lt;w:i w:val="false"/&gt;&lt;w:b w:val="false"/&gt;&lt;w:u w:val="none"/&gt;&lt;w:strike w:val="false"/&gt;&lt;w:sz w:val="18"/&gt;&lt;w:szCs w:val="18"/&gt;&lt;w:color w:val="000000"/&gt;&lt;/w:rPr&gt;&lt;w:t xml:space="preserve"&gt;dACI&lt;/w:t&gt;&lt;/w:r&gt;&lt;/w:p&gt;&lt;/w:tc&gt;&lt;w:tc&gt;&lt;w:tcPr&gt;&lt;w:tcBorders&gt;&lt;w:bottom w:val="none" w:sz="0" w:space="0" w:color="000000"/&gt;&lt;w:top w:val="single" w:sz="8" w:space="0" w:color="000000"/&gt;&lt;w:left w:val="none" w:sz="0" w:space="0" w:color="000000"/&gt;&lt;w:right w:val="none" w:sz="0" w:space="0" w:color="000000"/&gt;&lt;/w:tcBorders&gt;&lt;w:shd w:val="clear" w:color="auto" w:fill="FFFFFF"/&gt;&lt;w:tcMar&gt;&lt;w:top w:w="0" w:type="dxa"/&gt;&lt;w:bottom w:w="0" w:type="dxa"/&gt;&lt;w:left w:w="0" w:type="dxa"/&gt;&lt;w:right w:w="0" w:type="dxa"/&gt;&lt;/w:tcMar&gt;&lt;w:vAlign w:val="center"/&gt;&lt;/w:tcPr&gt;&lt;w:p&gt;&lt;w:pPr&gt;&lt;w:jc w:val="center"/&gt;&lt;w:pBdr&gt;&lt;w:bottom w:val="none" w:sz="0" w:space="0" w:color="000000"/&gt;&lt;w:top w:val="none" w:sz="0" w:space="0" w:color="000000"/&gt;&lt;w:left w:val="none" w:sz="0" w:space="0" w:color="000000"/&gt;&lt;w:right w:val="none" w:sz="0" w:space="0" w:color="000000"/&gt;&lt;/w:pBdr&gt;&lt;w:spacing w:after="80" w:before="80" w:line="240"/&gt;&lt;w:ind w:left="80" w:right="80" w:firstLine="0" w:firstLineChars="0"/&gt;&lt;w:rPr&gt;&lt;w:rFonts w:ascii="Arial" w:hAnsi="Arial" w:eastAsia="Arial" w:cs="Arial"/&gt;&lt;w:i w:val="false"/&gt;&lt;w:b w:val="false"/&gt;&lt;w:u w:val="none"/&gt;&lt;w:strike w:val="false"/&gt;&lt;w:sz w:val="18"/&gt;&lt;w:szCs w:val="18"/&gt;&lt;w:color w:val="000000"/&gt;&lt;/w:rPr&gt;&lt;/w:pPr&gt;&lt;w:r xmlns:w="http://schemas.openxmlformats.org/wordprocessingml/2006/main" xmlns:wp="http://schemas.openxmlformats.org/drawingml/2006/wordprocessingDrawing" xmlns:r="http://schemas.openxmlformats.org/officeDocument/2006/relationships" xmlns:w14="http://schemas.microsoft.com/office/word/2010/wordml"&gt;&lt;w:rPr&gt;&lt;w:rFonts w:ascii="Arial" w:hAnsi="Arial" w:eastAsia="Arial" w:cs="Arial"/&gt;&lt;w:i w:val="false"/&gt;&lt;w:b w:val="false"/&gt;&lt;w:u w:val="none"/&gt;&lt;w:strike w:val="false"/&gt;&lt;w:sz w:val="18"/&gt;&lt;w:szCs w:val="18"/&gt;&lt;w:color w:val="000000"/&gt;&lt;/w:rPr&gt;&lt;w:t xml:space="preserve"&gt;forest&lt;/w:t&gt;&lt;/w:r&gt;&lt;/w:p&gt;&lt;/w:tc&gt;&lt;w:tc&gt;&lt;w:tcPr&gt;&lt;w:tcBorders&gt;&lt;w:bottom w:val="none" w:sz="0" w:space="0" w:color="000000"/&gt;&lt;w:top w:val="single" w:sz="8" w:space="0" w:color="000000"/&gt;&lt;w:left w:val="none" w:sz="0" w:space="0" w:color="000000"/&gt;&lt;w:right w:val="none" w:sz="0" w:space="0" w:color="000000"/&gt;&lt;/w:tcBorders&gt;&lt;w:shd w:val="clear" w:color="auto" w:fill="FFFFFF"/&gt;&lt;w:tcMar&gt;&lt;w:top w:w="0" w:type="dxa"/&gt;&lt;w:bottom w:w="0" w:type="dxa"/&gt;&lt;w:left w:w="0" w:type="dxa"/&gt;&lt;w:right w:w="0" w:type="dxa"/&gt;&lt;/w:tcMar&gt;&lt;w:vAlign w:val="center"/&gt;&lt;/w:tcPr&gt;&lt;w:p&gt;&lt;w:pPr&gt;&lt;w:jc w:val="center"/&gt;&lt;w:pBdr&gt;&lt;w:bottom w:val="none" w:sz="0" w:space="0" w:color="000000"/&gt;&lt;w:top w:val="none" w:sz="0" w:space="0" w:color="000000"/&gt;&lt;w:left w:val="none" w:sz="0" w:space="0" w:color="000000"/&gt;&lt;w:right w:val="none" w:sz="0" w:space="0" w:color="000000"/&gt;&lt;/w:pBdr&gt;&lt;w:spacing w:after="80" w:before="80" w:line="240"/&gt;&lt;w:ind w:left="80" w:right="80" w:firstLine="0" w:firstLineChars="0"/&gt;&lt;w:rPr&gt;&lt;w:rFonts w:ascii="Arial" w:hAnsi="Arial" w:eastAsia="Arial" w:cs="Arial"/&gt;&lt;w:i w:val="false"/&gt;&lt;w:b w:val="false"/&gt;&lt;w:u w:val="none"/&gt;&lt;w:strike w:val="false"/&gt;&lt;w:sz w:val="18"/&gt;&lt;w:szCs w:val="18"/&gt;&lt;w:color w:val="000000"/&gt;&lt;/w:rPr&gt;&lt;/w:pPr&gt;&lt;w:r xmlns:w="http://schemas.openxmlformats.org/wordprocessingml/2006/main" xmlns:wp="http://schemas.openxmlformats.org/drawingml/2006/wordprocessingDrawing" xmlns:r="http://schemas.openxmlformats.org/officeDocument/2006/relationships" xmlns:w14="http://schemas.microsoft.com/office/word/2010/wordml"&gt;&lt;w:rPr&gt;&lt;w:rFonts w:ascii="Arial" w:hAnsi="Arial" w:eastAsia="Arial" w:cs="Arial"/&gt;&lt;w:i w:val="false"/&gt;&lt;w:b w:val="false"/&gt;&lt;w:u w:val="none"/&gt;&lt;w:strike w:val="false"/&gt;&lt;w:sz w:val="18"/&gt;&lt;w:szCs w:val="18"/&gt;&lt;w:color w:val="000000"/&gt;&lt;/w:rPr&gt;&lt;w:t xml:space="preserve"&gt;0.1263&lt;/w:t&gt;&lt;/w:r&gt;&lt;/w:p&gt;&lt;/w:tc&gt;&lt;w:tc&gt;&lt;w:tcPr&gt;&lt;w:tcBorders&gt;&lt;w:bottom w:val="none" w:sz="0" w:space="0" w:color="000000"/&gt;&lt;w:top w:val="single" w:sz="8" w:space="0" w:color="000000"/&gt;&lt;w:left w:val="none" w:sz="0" w:space="0" w:color="000000"/&gt;&lt;w:right w:val="none" w:sz="0" w:space="0" w:color="000000"/&gt;&lt;/w:tcBorders&gt;&lt;w:shd w:val="clear" w:color="auto" w:fill="FFFFFF"/&gt;&lt;w:tcMar&gt;&lt;w:top w:w="0" w:type="dxa"/&gt;&lt;w:bottom w:w="0" w:type="dxa"/&gt;&lt;w:left w:w="0" w:type="dxa"/&gt;&lt;w:right w:w="0" w:type="dxa"/&gt;&lt;/w:tcMar&gt;&lt;w:vAlign w:val="center"/&gt;&lt;/w:tcPr&gt;&lt;w:p&gt;&lt;w:pPr&gt;&lt;w:jc w:val="center"/&gt;&lt;w:pBdr&gt;&lt;w:bottom w:val="none" w:sz="0" w:space="0" w:color="000000"/&gt;&lt;w:top w:val="none" w:sz="0" w:space="0" w:color="000000"/&gt;&lt;w:left w:val="none" w:sz="0" w:space="0" w:color="000000"/&gt;&lt;w:right w:val="none" w:sz="0" w:space="0" w:color="000000"/&gt;&lt;/w:pBdr&gt;&lt;w:spacing w:after="80" w:before="80" w:line="240"/&gt;&lt;w:ind w:left="80" w:right="80" w:firstLine="0" w:firstLineChars="0"/&gt;&lt;w:rPr&gt;&lt;w:rFonts w:ascii="Arial" w:hAnsi="Arial" w:eastAsia="Arial" w:cs="Arial"/&gt;&lt;w:i w:val="false"/&gt;&lt;w:b w:val="false"/&gt;&lt;w:u w:val="none"/&gt;&lt;w:strike w:val="false"/&gt;&lt;w:sz w:val="18"/&gt;&lt;w:szCs w:val="18"/&gt;&lt;w:color w:val="000000"/&gt;&lt;/w:rPr&gt;&lt;/w:pPr&gt;&lt;w:r xmlns:w="http://schemas.openxmlformats.org/wordprocessingml/2006/main" xmlns:wp="http://schemas.openxmlformats.org/drawingml/2006/wordprocessingDrawing" xmlns:r="http://schemas.openxmlformats.org/officeDocument/2006/relationships" xmlns:w14="http://schemas.microsoft.com/office/word/2010/wordml"&gt;&lt;w:rPr&gt;&lt;w:rFonts w:ascii="Arial" w:hAnsi="Arial" w:eastAsia="Arial" w:cs="Arial"/&gt;&lt;w:i w:val="false"/&gt;&lt;w:b w:val="false"/&gt;&lt;w:u w:val="none"/&gt;&lt;w:strike w:val="false"/&gt;&lt;w:sz w:val="18"/&gt;&lt;w:szCs w:val="18"/&gt;&lt;w:color w:val="000000"/&gt;&lt;/w:rPr&gt;&lt;w:t xml:space="preserve"&gt;-0.8887&lt;/w:t&gt;&lt;/w:r&gt;&lt;/w:p&gt;&lt;/w:tc&gt;&lt;w:tc&gt;&lt;w:tcPr&gt;&lt;w:tcBorders&gt;&lt;w:bottom w:val="none" w:sz="0" w:space="0" w:color="000000"/&gt;&lt;w:top w:val="single" w:sz="8" w:space="0" w:color="000000"/&gt;&lt;w:left w:val="none" w:sz="0" w:space="0" w:color="000000"/&gt;&lt;w:right w:val="none" w:sz="0" w:space="0" w:color="000000"/&gt;&lt;/w:tcBorders&gt;&lt;w:shd w:val="clear" w:color="auto" w:fill="FFFFFF"/&gt;&lt;w:tcMar&gt;&lt;w:top w:w="0" w:type="dxa"/&gt;&lt;w:bottom w:w="0" w:type="dxa"/&gt;&lt;w:left w:w="0" w:type="dxa"/&gt;&lt;w:right w:w="0" w:type="dxa"/&gt;&lt;/w:tcMar&gt;&lt;w:vAlign w:val="center"/&gt;&lt;/w:tcPr&gt;&lt;w:p&gt;&lt;w:pPr&gt;&lt;w:jc w:val="center"/&gt;&lt;w:pBdr&gt;&lt;w:bottom w:val="none" w:sz="0" w:space="0" w:color="000000"/&gt;&lt;w:top w:val="none" w:sz="0" w:space="0" w:color="000000"/&gt;&lt;w:left w:val="none" w:sz="0" w:space="0" w:color="000000"/&gt;&lt;w:right w:val="none" w:sz="0" w:space="0" w:color="000000"/&gt;&lt;/w:pBdr&gt;&lt;w:spacing w:after="80" w:before="80" w:line="240"/&gt;&lt;w:ind w:left="80" w:right="80" w:firstLine="0" w:firstLineChars="0"/&gt;&lt;w:rPr&gt;&lt;w:rFonts w:ascii="Arial" w:hAnsi="Arial" w:eastAsia="Arial" w:cs="Arial"/&gt;&lt;w:i w:val="false"/&gt;&lt;w:b w:val="false"/&gt;&lt;w:u w:val="none"/&gt;&lt;w:strike w:val="false"/&gt;&lt;w:sz w:val="18"/&gt;&lt;w:szCs w:val="18"/&gt;&lt;w:color w:val="000000"/&gt;&lt;/w:rPr&gt;&lt;/w:pPr&gt;&lt;w:r xmlns:w="http://schemas.openxmlformats.org/wordprocessingml/2006/main" xmlns:wp="http://schemas.openxmlformats.org/drawingml/2006/wordprocessingDrawing" xmlns:r="http://schemas.openxmlformats.org/officeDocument/2006/relationships" xmlns:w14="http://schemas.microsoft.com/office/word/2010/wordml"&gt;&lt;w:rPr&gt;&lt;w:rFonts w:ascii="Arial" w:hAnsi="Arial" w:eastAsia="Arial" w:cs="Arial"/&gt;&lt;w:i w:val="false"/&gt;&lt;w:b w:val="false"/&gt;&lt;w:u w:val="none"/&gt;&lt;w:strike w:val="false"/&gt;&lt;w:sz w:val="18"/&gt;&lt;w:szCs w:val="18"/&gt;&lt;w:color w:val="000000"/&gt;&lt;/w:rPr&gt;&lt;w:t xml:space="preserve"&gt;1.1413&lt;/w:t&gt;&lt;/w:r&gt;&lt;/w:p&gt;&lt;/w:tc&gt;&lt;w:tc&gt;&lt;w:tcPr&gt;&lt;w:tcBorders&gt;&lt;w:bottom w:val="none" w:sz="0" w:space="0" w:color="000000"/&gt;&lt;w:top w:val="single" w:sz="8" w:space="0" w:color="000000"/&gt;&lt;w:left w:val="none" w:sz="0" w:space="0" w:color="000000"/&gt;&lt;w:right w:val="none" w:sz="0" w:space="0" w:color="000000"/&gt;&lt;/w:tcBorders&gt;&lt;w:shd w:val="clear" w:color="auto" w:fill="FFFFFF"/&gt;&lt;w:tcMar&gt;&lt;w:top w:w="0" w:type="dxa"/&gt;&lt;w:bottom w:w="0" w:type="dxa"/&gt;&lt;w:left w:w="0" w:type="dxa"/&gt;&lt;w:right w:w="0" w:type="dxa"/&gt;&lt;/w:tcMar&gt;&lt;w:vAlign w:val="center"/&gt;&lt;/w:tcPr&gt;&lt;w:p&gt;&lt;w:pPr&gt;&lt;w:jc w:val="center"/&gt;&lt;w:pBdr&gt;&lt;w:bottom w:val="none" w:sz="0" w:space="0" w:color="000000"/&gt;&lt;w:top w:val="none" w:sz="0" w:space="0" w:color="000000"/&gt;&lt;w:left w:val="none" w:sz="0" w:space="0" w:color="000000"/&gt;&lt;w:right w:val="none" w:sz="0" w:space="0" w:color="000000"/&gt;&lt;/w:pBdr&gt;&lt;w:spacing w:after="80" w:before="80" w:line="240"/&gt;&lt;w:ind w:left="80" w:right="80" w:firstLine="0" w:firstLineChars="0"/&gt;&lt;w:rPr&gt;&lt;w:rFonts w:ascii="Arial" w:hAnsi="Arial" w:eastAsia="Arial" w:cs="Arial"/&gt;&lt;w:i w:val="false"/&gt;&lt;w:b w:val="false"/&gt;&lt;w:u w:val="none"/&gt;&lt;w:strike w:val="false"/&gt;&lt;w:sz w:val="18"/&gt;&lt;w:szCs w:val="18"/&gt;&lt;w:color w:val="000000"/&gt;&lt;/w:rPr&gt;&lt;/w:pPr&gt;&lt;w:r xmlns:w="http://schemas.openxmlformats.org/wordprocessingml/2006/main" xmlns:wp="http://schemas.openxmlformats.org/drawingml/2006/wordprocessingDrawing" xmlns:r="http://schemas.openxmlformats.org/officeDocument/2006/relationships" xmlns:w14="http://schemas.microsoft.com/office/word/2010/wordml"&gt;&lt;w:rPr&gt;&lt;w:rFonts w:ascii="Arial" w:hAnsi="Arial" w:eastAsia="Arial" w:cs="Arial"/&gt;&lt;w:i w:val="false"/&gt;&lt;w:b w:val="false"/&gt;&lt;w:u w:val="none"/&gt;&lt;w:strike w:val="false"/&gt;&lt;w:sz w:val="18"/&gt;&lt;w:szCs w:val="18"/&gt;&lt;w:color w:val="000000"/&gt;&lt;/w:rPr&gt;&lt;w:t xml:space="preserve"&gt;0.005&lt;/w:t&gt;&lt;/w:r&gt;&lt;/w:p&gt;&lt;/w:tc&gt;&lt;w:tc&gt;&lt;w:tcPr&gt;&lt;w:tcBorders&gt;&lt;w:bottom w:val="none" w:sz="0" w:space="0" w:color="000000"/&gt;&lt;w:top w:val="single" w:sz="8" w:space="0" w:color="000000"/&gt;&lt;w:left w:val="none" w:sz="0" w:space="0" w:color="000000"/&gt;&lt;w:right w:val="none" w:sz="0" w:space="0" w:color="000000"/&gt;&lt;/w:tcBorders&gt;&lt;w:shd w:val="clear" w:color="auto" w:fill="FFFFFF"/&gt;&lt;w:tcMar&gt;&lt;w:top w:w="0" w:type="dxa"/&gt;&lt;w:bottom w:w="0" w:type="dxa"/&gt;&lt;w:left w:w="0" w:type="dxa"/&gt;&lt;w:right w:w="0" w:type="dxa"/&gt;&lt;/w:tcMar&gt;&lt;w:vAlign w:val="center"/&gt;&lt;/w:tcPr&gt;&lt;w:p&gt;&lt;w:pPr&gt;&lt;w:jc w:val="center"/&gt;&lt;w:pBdr&gt;&lt;w:bottom w:val="none" w:sz="0" w:space="0" w:color="000000"/&gt;&lt;w:top w:val="none" w:sz="0" w:space="0" w:color="000000"/&gt;&lt;w:left w:val="none" w:sz="0" w:space="0" w:color="000000"/&gt;&lt;w:right w:val="none" w:sz="0" w:space="0" w:color="000000"/&gt;&lt;/w:pBdr&gt;&lt;w:spacing w:after="80" w:before="80" w:line="240"/&gt;&lt;w:ind w:left="80" w:right="80" w:firstLine="0" w:firstLineChars="0"/&gt;&lt;w:rPr&gt;&lt;w:rFonts w:ascii="Arial" w:hAnsi="Arial" w:eastAsia="Arial" w:cs="Arial"/&gt;&lt;w:i w:val="false"/&gt;&lt;w:b w:val="false"/&gt;&lt;w:u w:val="none"/&gt;&lt;w:strike w:val="false"/&gt;&lt;w:sz w:val="18"/&gt;&lt;w:szCs w:val="18"/&gt;&lt;w:color w:val="000000"/&gt;&lt;/w:rPr&gt;&lt;/w:pPr&gt;&lt;w:r xmlns:w="http://schemas.openxmlformats.org/wordprocessingml/2006/main" xmlns:wp="http://schemas.openxmlformats.org/drawingml/2006/wordprocessingDrawing" xmlns:r="http://schemas.openxmlformats.org/officeDocument/2006/relationships" xmlns:w14="http://schemas.microsoft.com/office/word/2010/wordml"&gt;&lt;w:rPr&gt;&lt;w:rFonts w:ascii="Arial" w:hAnsi="Arial" w:eastAsia="Arial" w:cs="Arial"/&gt;&lt;w:i w:val="false"/&gt;&lt;w:b w:val="false"/&gt;&lt;w:u w:val="none"/&gt;&lt;w:strike w:val="false"/&gt;&lt;w:sz w:val="18"/&gt;&lt;w:szCs w:val="18"/&gt;&lt;w:color w:val="000000"/&gt;&lt;/w:rPr&gt;&lt;w:t xml:space="preserve"&gt;no&lt;/w:t&gt;&lt;/w:r&gt;&lt;/w:p&gt;&lt;/w:tc&gt;&lt;w:tc&gt;&lt;w:tcPr&gt;&lt;w:tcBorders&gt;&lt;w:bottom w:val="none" w:sz="0" w:space="0" w:color="000000"/&gt;&lt;w:top w:val="single" w:sz="8" w:space="0" w:color="000000"/&gt;&lt;w:left w:val="none" w:sz="0" w:space="0" w:color="000000"/&gt;&lt;w:right w:val="none" w:sz="0" w:space="0" w:color="000000"/&gt;&lt;/w:tcBorders&gt;&lt;w:shd w:val="clear" w:color="auto" w:fill="FFFFFF"/&gt;&lt;w:tcMar&gt;&lt;w:top w:w="0" w:type="dxa"/&gt;&lt;w:bottom w:w="0" w:type="dxa"/&gt;&lt;w:left w:w="0" w:type="dxa"/&gt;&lt;w:right w:w="0" w:type="dxa"/&gt;&lt;/w:tcMar&gt;&lt;w:vAlign w:val="center"/&gt;&lt;/w:tcPr&gt;&lt;w:p&gt;&lt;w:pPr&gt;&lt;w:jc w:val="center"/&gt;&lt;w:pBdr&gt;&lt;w:bottom w:val="none" w:sz="0" w:space="0" w:color="000000"/&gt;&lt;w:top w:val="none" w:sz="0" w:space="0" w:color="000000"/&gt;&lt;w:left w:val="none" w:sz="0" w:space="0" w:color="000000"/&gt;&lt;w:right w:val="none" w:sz="0" w:space="0" w:color="000000"/&gt;&lt;/w:pBdr&gt;&lt;w:spacing w:after="80" w:before="80" w:line="240"/&gt;&lt;w:ind w:left="80" w:right="80" w:firstLine="0" w:firstLineChars="0"/&gt;&lt;w:rPr&gt;&lt;w:rFonts w:ascii="Arial" w:hAnsi="Arial" w:eastAsia="Arial" w:cs="Arial"/&gt;&lt;w:i w:val="false"/&gt;&lt;w:b w:val="false"/&gt;&lt;w:u w:val="none"/&gt;&lt;w:strike w:val="false"/&gt;&lt;w:sz w:val="18"/&gt;&lt;w:szCs w:val="18"/&gt;&lt;w:color w:val="000000"/&gt;&lt;/w:rPr&gt;&lt;/w:pPr&gt;&lt;w:r xmlns:w="http://schemas.openxmlformats.org/wordprocessingml/2006/main" xmlns:wp="http://schemas.openxmlformats.org/drawingml/2006/wordprocessingDrawing" xmlns:r="http://schemas.openxmlformats.org/officeDocument/2006/relationships" xmlns:w14="http://schemas.microsoft.com/office/word/2010/wordml"&gt;&lt;w:rPr&gt;&lt;w:rFonts w:ascii="Arial" w:hAnsi="Arial" w:eastAsia="Arial" w:cs="Arial"/&gt;&lt;w:i w:val="false"/&gt;&lt;w:b w:val="false"/&gt;&lt;w:u w:val="none"/&gt;&lt;w:strike w:val="false"/&gt;&lt;w:sz w:val="18"/&gt;&lt;w:szCs w:val="18"/&gt;&lt;w:color w:val="000000"/&gt;&lt;/w:rPr&gt;&lt;w:t xml:space="preserve"&gt;12&lt;/w:t&gt;&lt;/w:r&gt;&lt;/w:p&gt;&lt;/w:tc&gt;&lt;/w:tr&gt;&lt;w:tr&gt;&lt;w:trPr&gt;&lt;w:trHeight w:val="360" w:hRule="auto"/&gt;&lt;/w:trPr&gt;&lt;w:tc&gt;&lt;w:tcPr&gt;&lt;w:tcBorders&gt;&lt;w:bottom w:val="none" w:sz="0" w:space="0" w:color="000000"/&gt;&lt;w:top w:val="none" w:sz="0" w:space="0" w:color="000000"/&gt;&lt;w:left w:val="none" w:sz="0" w:space="0" w:color="000000"/&gt;&lt;w:right w:val="none" w:sz="0" w:space="0" w:color="000000"/&gt;&lt;/w:tcBorders&gt;&lt;w:shd w:val="clear" w:color="auto" w:fill="FFFFFF"/&gt;&lt;w:tcMar&gt;&lt;w:top w:w="0" w:type="dxa"/&gt;&lt;w:bottom w:w="0" w:type="dxa"/&gt;&lt;w:left w:w="0" w:type="dxa"/&gt;&lt;w:right w:w="0" w:type="dxa"/&gt;&lt;/w:tcMar&gt;&lt;w:vAlign w:val="center"/&gt;&lt;/w:tcPr&gt;&lt;w:p&gt;&lt;w:pPr&gt;&lt;w:jc w:val="left"/&gt;&lt;w:pBdr&gt;&lt;w:bottom w:val="none" w:sz="0" w:space="0" w:color="000000"/&gt;&lt;w:top w:val="none" w:sz="0" w:space="0" w:color="000000"/&gt;&lt;w:left w:val="none" w:sz="0" w:space="0" w:color="000000"/&gt;&lt;w:right w:val="none" w:sz="0" w:space="0" w:color="000000"/&gt;&lt;/w:pBdr&gt;&lt;w:spacing w:after="80" w:before="80" w:line="240"/&gt;&lt;w:ind w:left="80" w:right="80" w:firstLine="0" w:firstLineChars="0"/&gt;&lt;w:rPr&gt;&lt;w:rFonts w:ascii="Arial" w:hAnsi="Arial" w:eastAsia="Arial" w:cs="Arial"/&gt;&lt;w:i w:val="false"/&gt;&lt;w:b w:val="false"/&gt;&lt;w:u w:val="none"/&gt;&lt;w:strike w:val="false"/&gt;&lt;w:sz w:val="18"/&gt;&lt;w:szCs w:val="18"/&gt;&lt;w:color w:val="000000"/&gt;&lt;/w:rPr&gt;&lt;/w:pPr&gt;&lt;w:r xmlns:w="http://schemas.openxmlformats.org/wordprocessingml/2006/main" xmlns:wp="http://schemas.openxmlformats.org/drawingml/2006/wordprocessingDrawing" xmlns:r="http://schemas.openxmlformats.org/officeDocument/2006/relationships" xmlns:w14="http://schemas.microsoft.com/office/word/2010/wordml"&gt;&lt;w:rPr&gt;&lt;w:rFonts w:ascii="Arial" w:hAnsi="Arial" w:eastAsia="Arial" w:cs="Arial"/&gt;&lt;w:i w:val="false"/&gt;&lt;w:b w:val="false"/&gt;&lt;w:u w:val="none"/&gt;&lt;w:strike w:val="false"/&gt;&lt;w:sz w:val="18"/&gt;&lt;w:szCs w:val="18"/&gt;&lt;w:color w:val="000000"/&gt;&lt;/w:rPr&gt;&lt;w:t xml:space="preserve"&gt;dACI&lt;/w:t&gt;&lt;/w:r&gt;&lt;/w:p&gt;&lt;/w:tc&gt;&lt;w:tc&gt;&lt;w:tcPr&gt;&lt;w:tcBorders&gt;&lt;w:bottom w:val="none" w:sz="0" w:space="0" w:color="000000"/&gt;&lt;w:top w:val="none" w:sz="0" w:space="0" w:color="000000"/&gt;&lt;w:left w:val="none" w:sz="0" w:space="0" w:color="000000"/&gt;&lt;w:right w:val="none" w:sz="0" w:space="0" w:color="000000"/&gt;&lt;/w:tcBorders&gt;&lt;w:shd w:val="clear" w:color="auto" w:fill="FFFFFF"/&gt;&lt;w:tcMar&gt;&lt;w:top w:w="0" w:type="dxa"/&gt;&lt;w:bottom w:w="0" w:type="dxa"/&gt;&lt;w:left w:w="0" w:type="dxa"/&gt;&lt;w:right w:w="0" w:type="dxa"/&gt;&lt;/w:tcMar&gt;&lt;w:vAlign w:val="center"/&gt;&lt;/w:tcPr&gt;&lt;w:p&gt;&lt;w:pPr&gt;&lt;w:jc w:val="center"/&gt;&lt;w:pBdr&gt;&lt;w:bottom w:val="none" w:sz="0" w:space="0" w:color="000000"/&gt;&lt;w:top w:val="none" w:sz="0" w:space="0" w:color="000000"/&gt;&lt;w:left w:val="none" w:sz="0" w:space="0" w:color="000000"/&gt;&lt;w:right w:val="none" w:sz="0" w:space="0" w:color="000000"/&gt;&lt;/w:pBdr&gt;&lt;w:spacing w:after="80" w:before="80" w:line="240"/&gt;&lt;w:ind w:left="80" w:right="80" w:firstLine="0" w:firstLineChars="0"/&gt;&lt;w:rPr&gt;&lt;w:rFonts w:ascii="Arial" w:hAnsi="Arial" w:eastAsia="Arial" w:cs="Arial"/&gt;&lt;w:i w:val="false"/&gt;&lt;w:b w:val="false"/&gt;&lt;w:u w:val="none"/&gt;&lt;w:strike w:val="false"/&gt;&lt;w:sz w:val="18"/&gt;&lt;w:szCs w:val="18"/&gt;&lt;w:color w:val="000000"/&gt;&lt;/w:rPr&gt;&lt;/w:pPr&gt;&lt;w:r xmlns:w="http://schemas.openxmlformats.org/wordprocessingml/2006/main" xmlns:wp="http://schemas.openxmlformats.org/drawingml/2006/wordprocessingDrawing" xmlns:r="http://schemas.openxmlformats.org/officeDocument/2006/relationships" xmlns:w14="http://schemas.microsoft.com/office/word/2010/wordml"&gt;&lt;w:rPr&gt;&lt;w:rFonts w:ascii="Arial" w:hAnsi="Arial" w:eastAsia="Arial" w:cs="Arial"/&gt;&lt;w:i w:val="false"/&gt;&lt;w:b w:val="false"/&gt;&lt;w:u w:val="none"/&gt;&lt;w:strike w:val="false"/&gt;&lt;w:sz w:val="18"/&gt;&lt;w:szCs w:val="18"/&gt;&lt;w:color w:val="000000"/&gt;&lt;/w:rPr&gt;&lt;w:t xml:space="preserve"&gt;pasture&lt;/w:t&gt;&lt;/w:r&gt;&lt;/w:p&gt;&lt;/w:tc&gt;&lt;w:tc&gt;&lt;w:tcPr&gt;&lt;w:tcBorders&gt;&lt;w:bottom w:val="none" w:sz="0" w:space="0" w:color="000000"/&gt;&lt;w:top w:val="none" w:sz="0" w:space="0" w:color="000000"/&gt;&lt;w:left w:val="none" w:sz="0" w:space="0" w:color="000000"/&gt;&lt;w:right w:val="none" w:sz="0" w:space="0" w:color="000000"/&gt;&lt;/w:tcBorders&gt;&lt;w:shd w:val="clear" w:color="auto" w:fill="FFFFFF"/&gt;&lt;w:tcMar&gt;&lt;w:top w:w="0" w:type="dxa"/&gt;&lt;w:bottom w:w="0" w:type="dxa"/&gt;&lt;w:left w:w="0" w:type="dxa"/&gt;&lt;w:right w:w="0" w:type="dxa"/&gt;&lt;/w:tcMar&gt;&lt;w:vAlign w:val="center"/&gt;&lt;/w:tcPr&gt;&lt;w:p&gt;&lt;w:pPr&gt;&lt;w:jc w:val="center"/&gt;&lt;w:pBdr&gt;&lt;w:bottom w:val="none" w:sz="0" w:space="0" w:color="000000"/&gt;&lt;w:top w:val="none" w:sz="0" w:space="0" w:color="000000"/&gt;&lt;w:left w:val="none" w:sz="0" w:space="0" w:color="000000"/&gt;&lt;w:right w:val="none" w:sz="0" w:space="0" w:color="000000"/&gt;&lt;/w:pBdr&gt;&lt;w:spacing w:after="80" w:before="80" w:line="240"/&gt;&lt;w:ind w:left="80" w:right="80" w:firstLine="0" w:firstLineChars="0"/&gt;&lt;w:rPr&gt;&lt;w:rFonts w:ascii="Arial" w:hAnsi="Arial" w:eastAsia="Arial" w:cs="Arial"/&gt;&lt;w:i w:val="false"/&gt;&lt;w:b w:val="false"/&gt;&lt;w:u w:val="none"/&gt;&lt;w:strike w:val="false"/&gt;&lt;w:sz w:val="18"/&gt;&lt;w:szCs w:val="18"/&gt;&lt;w:color w:val="000000"/&gt;&lt;/w:rPr&gt;&lt;/w:pPr&gt;&lt;w:r xmlns:w="http://schemas.openxmlformats.org/wordprocessingml/2006/main" xmlns:wp="http://schemas.openxmlformats.org/drawingml/2006/wordprocessingDrawing" xmlns:r="http://schemas.openxmlformats.org/officeDocument/2006/relationships" xmlns:w14="http://schemas.microsoft.com/office/word/2010/wordml"&gt;&lt;w:rPr&gt;&lt;w:rFonts w:ascii="Arial" w:hAnsi="Arial" w:eastAsia="Arial" w:cs="Arial"/&gt;&lt;w:i w:val="false"/&gt;&lt;w:b w:val="false"/&gt;&lt;w:u w:val="none"/&gt;&lt;w:strike w:val="false"/&gt;&lt;w:sz w:val="18"/&gt;&lt;w:szCs w:val="18"/&gt;&lt;w:color w:val="000000"/&gt;&lt;/w:rPr&gt;&lt;w:t xml:space="preserve"&gt;-0.2991&lt;/w:t&gt;&lt;/w:r&gt;&lt;/w:p&gt;&lt;/w:tc&gt;&lt;w:tc&gt;&lt;w:tcPr&gt;&lt;w:tcBorders&gt;&lt;w:bottom w:val="none" w:sz="0" w:space="0" w:color="000000"/&gt;&lt;w:top w:val="none" w:sz="0" w:space="0" w:color="000000"/&gt;&lt;w:left w:val="none" w:sz="0" w:space="0" w:color="000000"/&gt;&lt;w:right w:val="none" w:sz="0" w:space="0" w:color="000000"/&gt;&lt;/w:tcBorders&gt;&lt;w:shd w:val="clear" w:color="auto" w:fill="FFFFFF"/&gt;&lt;w:tcMar&gt;&lt;w:top w:w="0" w:type="dxa"/&gt;&lt;w:bottom w:w="0" w:type="dxa"/&gt;&lt;w:left w:w="0" w:type="dxa"/&gt;&lt;w:right w:w="0" w:type="dxa"/&gt;&lt;/w:tcMar&gt;&lt;w:vAlign w:val="center"/&gt;&lt;/w:tcPr&gt;&lt;w:p&gt;&lt;w:pPr&gt;&lt;w:jc w:val="center"/&gt;&lt;w:pBdr&gt;&lt;w:bottom w:val="none" w:sz="0" w:space="0" w:color="000000"/&gt;&lt;w:top w:val="none" w:sz="0" w:space="0" w:color="000000"/&gt;&lt;w:left w:val="none" w:sz="0" w:space="0" w:color="000000"/&gt;&lt;w:right w:val="none" w:sz="0" w:space="0" w:color="000000"/&gt;&lt;/w:pBdr&gt;&lt;w:spacing w:after="80" w:before="80" w:line="240"/&gt;&lt;w:ind w:left="80" w:right="80" w:firstLine="0" w:firstLineChars="0"/&gt;&lt;w:rPr&gt;&lt;w:rFonts w:ascii="Arial" w:hAnsi="Arial" w:eastAsia="Arial" w:cs="Arial"/&gt;&lt;w:i w:val="false"/&gt;&lt;w:b w:val="false"/&gt;&lt;w:u w:val="none"/&gt;&lt;w:strike w:val="false"/&gt;&lt;w:sz w:val="18"/&gt;&lt;w:szCs w:val="18"/&gt;&lt;w:color w:val="000000"/&gt;&lt;/w:rPr&gt;&lt;/w:pPr&gt;&lt;w:r xmlns:w="http://schemas.openxmlformats.org/wordprocessingml/2006/main" xmlns:wp="http://schemas.openxmlformats.org/drawingml/2006/wordprocessingDrawing" xmlns:r="http://schemas.openxmlformats.org/officeDocument/2006/relationships" xmlns:w14="http://schemas.microsoft.com/office/word/2010/wordml"&gt;&lt;w:rPr&gt;&lt;w:rFonts w:ascii="Arial" w:hAnsi="Arial" w:eastAsia="Arial" w:cs="Arial"/&gt;&lt;w:i w:val="false"/&gt;&lt;w:b w:val="false"/&gt;&lt;w:u w:val="none"/&gt;&lt;w:strike w:val="false"/&gt;&lt;w:sz w:val="18"/&gt;&lt;w:szCs w:val="18"/&gt;&lt;w:color w:val="000000"/&gt;&lt;/w:rPr&gt;&lt;w:t xml:space="preserve"&gt;-2.4301&lt;/w:t&gt;&lt;/w:r&gt;&lt;/w:p&gt;&lt;/w:tc&gt;&lt;w:tc&gt;&lt;w:tcPr&gt;&lt;w:tcBorders&gt;&lt;w:bottom w:val="none" w:sz="0" w:space="0" w:color="000000"/&gt;&lt;w:top w:val="none" w:sz="0" w:space="0" w:color="000000"/&gt;&lt;w:left w:val="none" w:sz="0" w:space="0" w:color="000000"/&gt;&lt;w:right w:val="none" w:sz="0" w:space="0" w:color="000000"/&gt;&lt;/w:tcBorders&gt;&lt;w:shd w:val="clear" w:color="auto" w:fill="FFFFFF"/&gt;&lt;w:tcMar&gt;&lt;w:top w:w="0" w:type="dxa"/&gt;&lt;w:bottom w:w="0" w:type="dxa"/&gt;&lt;w:left w:w="0" w:type="dxa"/&gt;&lt;w:right w:w="0" w:type="dxa"/&gt;&lt;/w:tcMar&gt;&lt;w:vAlign w:val="center"/&gt;&lt;/w:tcPr&gt;&lt;w:p&gt;&lt;w:pPr&gt;&lt;w:jc w:val="center"/&gt;&lt;w:pBdr&gt;&lt;w:bottom w:val="none" w:sz="0" w:space="0" w:color="000000"/&gt;&lt;w:top w:val="none" w:sz="0" w:space="0" w:color="000000"/&gt;&lt;w:left w:val="none" w:sz="0" w:space="0" w:color="000000"/&gt;&lt;w:right w:val="none" w:sz="0" w:space="0" w:color="000000"/&gt;&lt;/w:pBdr&gt;&lt;w:spacing w:after="80" w:before="80" w:line="240"/&gt;&lt;w:ind w:left="80" w:right="80" w:firstLine="0" w:firstLineChars="0"/&gt;&lt;w:rPr&gt;&lt;w:rFonts w:ascii="Arial" w:hAnsi="Arial" w:eastAsia="Arial" w:cs="Arial"/&gt;&lt;w:i w:val="false"/&gt;&lt;w:b w:val="false"/&gt;&lt;w:u w:val="none"/&gt;&lt;w:strike w:val="false"/&gt;&lt;w:sz w:val="18"/&gt;&lt;w:szCs w:val="18"/&gt;&lt;w:color w:val="000000"/&gt;&lt;/w:rPr&gt;&lt;/w:pPr&gt;&lt;w:r xmlns:w="http://schemas.openxmlformats.org/wordprocessingml/2006/main" xmlns:wp="http://schemas.openxmlformats.org/drawingml/2006/wordprocessingDrawing" xmlns:r="http://schemas.openxmlformats.org/officeDocument/2006/relationships" xmlns:w14="http://schemas.microsoft.com/office/word/2010/wordml"&gt;&lt;w:rPr&gt;&lt;w:rFonts w:ascii="Arial" w:hAnsi="Arial" w:eastAsia="Arial" w:cs="Arial"/&gt;&lt;w:i w:val="false"/&gt;&lt;w:b w:val="false"/&gt;&lt;w:u w:val="none"/&gt;&lt;w:strike w:val="false"/&gt;&lt;w:sz w:val="18"/&gt;&lt;w:szCs w:val="18"/&gt;&lt;w:color w:val="000000"/&gt;&lt;/w:rPr&gt;&lt;w:t xml:space="preserve"&gt;1.8318&lt;/w:t&gt;&lt;/w:r&gt;&lt;/w:p&gt;&lt;/w:tc&gt;&lt;w:tc&gt;&lt;w:tcPr&gt;&lt;w:tcBorders&gt;&lt;w:bottom w:val="none" w:sz="0" w:space="0" w:color="000000"/&gt;&lt;w:top w:val="none" w:sz="0" w:space="0" w:color="000000"/&gt;&lt;w:left w:val="none" w:sz="0" w:space="0" w:color="000000"/&gt;&lt;w:right w:val="none" w:sz="0" w:space="0" w:color="000000"/&gt;&lt;/w:tcBorders&gt;&lt;w:shd w:val="clear" w:color="auto" w:fill="FFFFFF"/&gt;&lt;w:tcMar&gt;&lt;w:top w:w="0" w:type="dxa"/&gt;&lt;w:bottom w:w="0" w:type="dxa"/&gt;&lt;w:left w:w="0" w:type="dxa"/&gt;&lt;w:right w:w="0" w:type="dxa"/&gt;&lt;/w:tcMar&gt;&lt;w:vAlign w:val="center"/&gt;&lt;/w:tcPr&gt;&lt;w:p&gt;&lt;w:pPr&gt;&lt;w:jc w:val="center"/&gt;&lt;w:pBdr&gt;&lt;w:bottom w:val="none" w:sz="0" w:space="0" w:color="000000"/&gt;&lt;w:top w:val="none" w:sz="0" w:space="0" w:color="000000"/&gt;&lt;w:left w:val="none" w:sz="0" w:space="0" w:color="000000"/&gt;&lt;w:right w:val="none" w:sz="0" w:space="0" w:color="000000"/&gt;&lt;/w:pBdr&gt;&lt;w:spacing w:after="80" w:before="80" w:line="240"/&gt;&lt;w:ind w:left="80" w:right="80" w:firstLine="0" w:firstLineChars="0"/&gt;&lt;w:rPr&gt;&lt;w:rFonts w:ascii="Arial" w:hAnsi="Arial" w:eastAsia="Arial" w:cs="Arial"/&gt;&lt;w:i w:val="false"/&gt;&lt;w:b w:val="false"/&gt;&lt;w:u w:val="none"/&gt;&lt;w:strike w:val="false"/&gt;&lt;w:sz w:val="18"/&gt;&lt;w:szCs w:val="18"/&gt;&lt;w:color w:val="000000"/&gt;&lt;/w:rPr&gt;&lt;/w:pPr&gt;&lt;w:r xmlns:w="http://schemas.openxmlformats.org/wordprocessingml/2006/main" xmlns:wp="http://schemas.openxmlformats.org/drawingml/2006/wordprocessingDrawing" xmlns:r="http://schemas.openxmlformats.org/officeDocument/2006/relationships" xmlns:w14="http://schemas.microsoft.com/office/word/2010/wordml"&gt;&lt;w:rPr&gt;&lt;w:rFonts w:ascii="Arial" w:hAnsi="Arial" w:eastAsia="Arial" w:cs="Arial"/&gt;&lt;w:i w:val="false"/&gt;&lt;w:b w:val="false"/&gt;&lt;w:u w:val="none"/&gt;&lt;w:strike w:val="false"/&gt;&lt;w:sz w:val="18"/&gt;&lt;w:szCs w:val="18"/&gt;&lt;w:color w:val="000000"/&gt;&lt;/w:rPr&gt;&lt;w:t xml:space="preserve"&gt;0.008&lt;/w:t&gt;&lt;/w:r&gt;&lt;/w:p&gt;&lt;/w:tc&gt;&lt;w:tc&gt;&lt;w:tcPr&gt;&lt;w:tcBorders&gt;&lt;w:bottom w:val="none" w:sz="0" w:space="0" w:color="000000"/&gt;&lt;w:top w:val="none" w:sz="0" w:space="0" w:color="000000"/&gt;&lt;w:left w:val="none" w:sz="0" w:space="0" w:color="000000"/&gt;&lt;w:right w:val="none" w:sz="0" w:space="0" w:color="000000"/&gt;&lt;/w:tcBorders&gt;&lt;w:shd w:val="clear" w:color="auto" w:fill="FFFFFF"/&gt;&lt;w:tcMar&gt;&lt;w:top w:w="0" w:type="dxa"/&gt;&lt;w:bottom w:w="0" w:type="dxa"/&gt;&lt;w:left w:w="0" w:type="dxa"/&gt;&lt;w:right w:w="0" w:type="dxa"/&gt;&lt;/w:tcMar&gt;&lt;w:vAlign w:val="center"/&gt;&lt;/w:tcPr&gt;&lt;w:p&gt;&lt;w:pPr&gt;&lt;w:jc w:val="center"/&gt;&lt;w:pBdr&gt;&lt;w:bottom w:val="none" w:sz="0" w:space="0" w:color="000000"/&gt;&lt;w:top w:val="none" w:sz="0" w:space="0" w:color="000000"/&gt;&lt;w:left w:val="none" w:sz="0" w:space="0" w:color="000000"/&gt;&lt;w:right w:val="none" w:sz="0" w:space="0" w:color="000000"/&gt;&lt;/w:pBdr&gt;&lt;w:spacing w:after="80" w:before="80" w:line="240"/&gt;&lt;w:ind w:left="80" w:right="80" w:firstLine="0" w:firstLineChars="0"/&gt;&lt;w:rPr&gt;&lt;w:rFonts w:ascii="Arial" w:hAnsi="Arial" w:eastAsia="Arial" w:cs="Arial"/&gt;&lt;w:i w:val="false"/&gt;&lt;w:b w:val="false"/&gt;&lt;w:u w:val="none"/&gt;&lt;w:strike w:val="false"/&gt;&lt;w:sz w:val="18"/&gt;&lt;w:szCs w:val="18"/&gt;&lt;w:color w:val="000000"/&gt;&lt;/w:rPr&gt;&lt;/w:pPr&gt;&lt;w:r xmlns:w="http://schemas.openxmlformats.org/wordprocessingml/2006/main" xmlns:wp="http://schemas.openxmlformats.org/drawingml/2006/wordprocessingDrawing" xmlns:r="http://schemas.openxmlformats.org/officeDocument/2006/relationships" xmlns:w14="http://schemas.microsoft.com/office/word/2010/wordml"&gt;&lt;w:rPr&gt;&lt;w:rFonts w:ascii="Arial" w:hAnsi="Arial" w:eastAsia="Arial" w:cs="Arial"/&gt;&lt;w:i w:val="false"/&gt;&lt;w:b w:val="false"/&gt;&lt;w:u w:val="none"/&gt;&lt;w:strike w:val="false"/&gt;&lt;w:sz w:val="18"/&gt;&lt;w:szCs w:val="18"/&gt;&lt;w:color w:val="000000"/&gt;&lt;/w:rPr&gt;&lt;w:t xml:space="preserve"&gt;no&lt;/w:t&gt;&lt;/w:r&gt;&lt;/w:p&gt;&lt;/w:tc&gt;&lt;w:tc&gt;&lt;w:tcPr&gt;&lt;w:tcBorders&gt;&lt;w:bottom w:val="none" w:sz="0" w:space="0" w:color="000000"/&gt;&lt;w:top w:val="none" w:sz="0" w:space="0" w:color="000000"/&gt;&lt;w:left w:val="none" w:sz="0" w:space="0" w:color="000000"/&gt;&lt;w:right w:val="none" w:sz="0" w:space="0" w:color="000000"/&gt;&lt;/w:tcBorders&gt;&lt;w:shd w:val="clear" w:color="auto" w:fill="FFFFFF"/&gt;&lt;w:tcMar&gt;&lt;w:top w:w="0" w:type="dxa"/&gt;&lt;w:bottom w:w="0" w:type="dxa"/&gt;&lt;w:left w:w="0" w:type="dxa"/&gt;&lt;w:right w:w="0" w:type="dxa"/&gt;&lt;/w:tcMar&gt;&lt;w:vAlign w:val="center"/&gt;&lt;/w:tcPr&gt;&lt;w:p&gt;&lt;w:pPr&gt;&lt;w:jc w:val="center"/&gt;&lt;w:pBdr&gt;&lt;w:bottom w:val="none" w:sz="0" w:space="0" w:color="000000"/&gt;&lt;w:top w:val="none" w:sz="0" w:space="0" w:color="000000"/&gt;&lt;w:left w:val="none" w:sz="0" w:space="0" w:color="000000"/&gt;&lt;w:right w:val="none" w:sz="0" w:space="0" w:color="000000"/&gt;&lt;/w:pBdr&gt;&lt;w:spacing w:after="80" w:before="80" w:line="240"/&gt;&lt;w:ind w:left="80" w:right="80" w:firstLine="0" w:firstLineChars="0"/&gt;&lt;w:rPr&gt;&lt;w:rFonts w:ascii="Arial" w:hAnsi="Arial" w:eastAsia="Arial" w:cs="Arial"/&gt;&lt;w:i w:val="false"/&gt;&lt;w:b w:val="false"/&gt;&lt;w:u w:val="none"/&gt;&lt;w:strike w:val="false"/&gt;&lt;w:sz w:val="18"/&gt;&lt;w:szCs w:val="18"/&gt;&lt;w:color w:val="000000"/&gt;&lt;/w:rPr&gt;&lt;/w:pPr&gt;&lt;w:r xmlns:w="http://schemas.openxmlformats.org/wordprocessingml/2006/main" xmlns:wp="http://schemas.openxmlformats.org/drawingml/2006/wordprocessingDrawing" xmlns:r="http://schemas.openxmlformats.org/officeDocument/2006/relationships" xmlns:w14="http://schemas.microsoft.com/office/word/2010/wordml"&gt;&lt;w:rPr&gt;&lt;w:rFonts w:ascii="Arial" w:hAnsi="Arial" w:eastAsia="Arial" w:cs="Arial"/&gt;&lt;w:i w:val="false"/&gt;&lt;w:b w:val="false"/&gt;&lt;w:u w:val="none"/&gt;&lt;w:strike w:val="false"/&gt;&lt;w:sz w:val="18"/&gt;&lt;w:szCs w:val="18"/&gt;&lt;w:color w:val="000000"/&gt;&lt;/w:rPr&gt;&lt;w:t xml:space="preserve"&gt;10&lt;/w:t&gt;&lt;/w:r&gt;&lt;/w:p&gt;&lt;/w:tc&gt;&lt;/w:tr&gt;&lt;w:tr&gt;&lt;w:trPr&gt;&lt;w:trHeight w:val="360" w:hRule="auto"/&gt;&lt;/w:trPr&gt;&lt;w:tc&gt;&lt;w:tcPr&gt;&lt;w:tcBorders&gt;&lt;w:bottom w:val="none" w:sz="0" w:space="0" w:color="000000"/&gt;&lt;w:top w:val="none" w:sz="0" w:space="0" w:color="000000"/&gt;&lt;w:left w:val="none" w:sz="0" w:space="0" w:color="000000"/&gt;&lt;w:right w:val="none" w:sz="0" w:space="0" w:color="000000"/&gt;&lt;/w:tcBorders&gt;&lt;w:shd w:val="clear" w:color="auto" w:fill="FFFFFF"/&gt;&lt;w:tcMar&gt;&lt;w:top w:w="0" w:type="dxa"/&gt;&lt;w:bottom w:w="0" w:type="dxa"/&gt;&lt;w:left w:w="0" w:type="dxa"/&gt;&lt;w:right w:w="0" w:type="dxa"/&gt;&lt;/w:tcMar&gt;&lt;w:vAlign w:val="center"/&gt;&lt;/w:tcPr&gt;&lt;w:p&gt;&lt;w:pPr&gt;&lt;w:jc w:val="left"/&gt;&lt;w:pBdr&gt;&lt;w:bottom w:val="none" w:sz="0" w:space="0" w:color="000000"/&gt;&lt;w:top w:val="none" w:sz="0" w:space="0" w:color="000000"/&gt;&lt;w:left w:val="none" w:sz="0" w:space="0" w:color="000000"/&gt;&lt;w:right w:val="none" w:sz="0" w:space="0" w:color="000000"/&gt;&lt;/w:pBdr&gt;&lt;w:spacing w:after="80" w:before="80" w:line="240"/&gt;&lt;w:ind w:left="80" w:right="80" w:firstLine="0" w:firstLineChars="0"/&gt;&lt;w:rPr&gt;&lt;w:rFonts w:ascii="Arial" w:hAnsi="Arial" w:eastAsia="Arial" w:cs="Arial"/&gt;&lt;w:i w:val="false"/&gt;&lt;w:b w:val="false"/&gt;&lt;w:u w:val="none"/&gt;&lt;w:strike w:val="false"/&gt;&lt;w:sz w:val="18"/&gt;&lt;w:szCs w:val="18"/&gt;&lt;w:color w:val="000000"/&gt;&lt;/w:rPr&gt;&lt;/w:pPr&gt;&lt;w:r xmlns:w="http://schemas.openxmlformats.org/wordprocessingml/2006/main" xmlns:wp="http://schemas.openxmlformats.org/drawingml/2006/wordprocessingDrawing" xmlns:r="http://schemas.openxmlformats.org/officeDocument/2006/relationships" xmlns:w14="http://schemas.microsoft.com/office/word/2010/wordml"&gt;&lt;w:rPr&gt;&lt;w:rFonts w:ascii="Arial" w:hAnsi="Arial" w:eastAsia="Arial" w:cs="Arial"/&gt;&lt;w:i w:val="false"/&gt;&lt;w:b w:val="false"/&gt;&lt;w:u w:val="none"/&gt;&lt;w:strike w:val="false"/&gt;&lt;w:sz w:val="18"/&gt;&lt;w:szCs w:val="18"/&gt;&lt;w:color w:val="000000"/&gt;&lt;/w:rPr&gt;&lt;w:t xml:space="preserve"&gt;dBI&lt;/w:t&gt;&lt;/w:r&gt;&lt;/w:p&gt;&lt;/w:tc&gt;&lt;w:tc&gt;&lt;w:tcPr&gt;&lt;w:tcBorders&gt;&lt;w:bottom w:val="none" w:sz="0" w:space="0" w:color="000000"/&gt;&lt;w:top w:val="none" w:sz="0" w:space="0" w:color="000000"/&gt;&lt;w:left w:val="none" w:sz="0" w:space="0" w:color="000000"/&gt;&lt;w:right w:val="none" w:sz="0" w:space="0" w:color="000000"/&gt;&lt;/w:tcBorders&gt;&lt;w:shd w:val="clear" w:color="auto" w:fill="FFFFFF"/&gt;&lt;w:tcMar&gt;&lt;w:top w:w="0" w:type="dxa"/&gt;&lt;w:bottom w:w="0" w:type="dxa"/&gt;&lt;w:left w:w="0" w:type="dxa"/&gt;&lt;w:right w:w="0" w:type="dxa"/&gt;&lt;/w:tcMar&gt;&lt;w:vAlign w:val="center"/&gt;&lt;/w:tcPr&gt;&lt;w:p&gt;&lt;w:pPr&gt;&lt;w:jc w:val="center"/&gt;&lt;w:pBdr&gt;&lt;w:bottom w:val="none" w:sz="0" w:space="0" w:color="000000"/&gt;&lt;w:top w:val="none" w:sz="0" w:space="0" w:color="000000"/&gt;&lt;w:left w:val="none" w:sz="0" w:space="0" w:color="000000"/&gt;&lt;w:right w:val="none" w:sz="0" w:space="0" w:color="000000"/&gt;&lt;/w:pBdr&gt;&lt;w:spacing w:after="80" w:before="80" w:line="240"/&gt;&lt;w:ind w:left="80" w:right="80" w:firstLine="0" w:firstLineChars="0"/&gt;&lt;w:rPr&gt;&lt;w:rFonts w:ascii="Arial" w:hAnsi="Arial" w:eastAsia="Arial" w:cs="Arial"/&gt;&lt;w:i w:val="false"/&gt;&lt;w:b w:val="false"/&gt;&lt;w:u w:val="none"/&gt;&lt;w:strike w:val="false"/&gt;&lt;w:sz w:val="18"/&gt;&lt;w:szCs w:val="18"/&gt;&lt;w:color w:val="000000"/&gt;&lt;/w:rPr&gt;&lt;/w:pPr&gt;&lt;w:r xmlns:w="http://schemas.openxmlformats.org/wordprocessingml/2006/main" xmlns:wp="http://schemas.openxmlformats.org/drawingml/2006/wordprocessingDrawing" xmlns:r="http://schemas.openxmlformats.org/officeDocument/2006/relationships" xmlns:w14="http://schemas.microsoft.com/office/word/2010/wordml"&gt;&lt;w:rPr&gt;&lt;w:rFonts w:ascii="Arial" w:hAnsi="Arial" w:eastAsia="Arial" w:cs="Arial"/&gt;&lt;w:i w:val="false"/&gt;&lt;w:b w:val="false"/&gt;&lt;w:u w:val="none"/&gt;&lt;w:strike w:val="false"/&gt;&lt;w:sz w:val="18"/&gt;&lt;w:szCs w:val="18"/&gt;&lt;w:color w:val="000000"/&gt;&lt;/w:rPr&gt;&lt;w:t xml:space="preserve"&gt;forest&lt;/w:t&gt;&lt;/w:r&gt;&lt;/w:p&gt;&lt;/w:tc&gt;&lt;w:tc&gt;&lt;w:tcPr&gt;&lt;w:tcBorders&gt;&lt;w:bottom w:val="none" w:sz="0" w:space="0" w:color="000000"/&gt;&lt;w:top w:val="none" w:sz="0" w:space="0" w:color="000000"/&gt;&lt;w:left w:val="none" w:sz="0" w:space="0" w:color="000000"/&gt;&lt;w:right w:val="none" w:sz="0" w:space="0" w:color="000000"/&gt;&lt;/w:tcBorders&gt;&lt;w:shd w:val="clear" w:color="auto" w:fill="FFFFFF"/&gt;&lt;w:tcMar&gt;&lt;w:top w:w="0" w:type="dxa"/&gt;&lt;w:bottom w:w="0" w:type="dxa"/&gt;&lt;w:left w:w="0" w:type="dxa"/&gt;&lt;w:right w:w="0" w:type="dxa"/&gt;&lt;/w:tcMar&gt;&lt;w:vAlign w:val="center"/&gt;&lt;/w:tcPr&gt;&lt;w:p&gt;&lt;w:pPr&gt;&lt;w:jc w:val="center"/&gt;&lt;w:pBdr&gt;&lt;w:bottom w:val="none" w:sz="0" w:space="0" w:color="000000"/&gt;&lt;w:top w:val="none" w:sz="0" w:space="0" w:color="000000"/&gt;&lt;w:left w:val="none" w:sz="0" w:space="0" w:color="000000"/&gt;&lt;w:right w:val="none" w:sz="0" w:space="0" w:color="000000"/&gt;&lt;/w:pBdr&gt;&lt;w:spacing w:after="80" w:before="80" w:line="240"/&gt;&lt;w:ind w:left="80" w:right="80" w:firstLine="0" w:firstLineChars="0"/&gt;&lt;w:rPr&gt;&lt;w:rFonts w:ascii="Arial" w:hAnsi="Arial" w:eastAsia="Arial" w:cs="Arial"/&gt;&lt;w:i w:val="false"/&gt;&lt;w:b w:val="false"/&gt;&lt;w:u w:val="none"/&gt;&lt;w:strike w:val="false"/&gt;&lt;w:sz w:val="18"/&gt;&lt;w:szCs w:val="18"/&gt;&lt;w:color w:val="000000"/&gt;&lt;/w:rPr&gt;&lt;/w:pPr&gt;&lt;w:r xmlns:w="http://schemas.openxmlformats.org/wordprocessingml/2006/main" xmlns:wp="http://schemas.openxmlformats.org/drawingml/2006/wordprocessingDrawing" xmlns:r="http://schemas.openxmlformats.org/officeDocument/2006/relationships" xmlns:w14="http://schemas.microsoft.com/office/word/2010/wordml"&gt;&lt;w:rPr&gt;&lt;w:rFonts w:ascii="Arial" w:hAnsi="Arial" w:eastAsia="Arial" w:cs="Arial"/&gt;&lt;w:i w:val="false"/&gt;&lt;w:b w:val="false"/&gt;&lt;w:u w:val="none"/&gt;&lt;w:strike w:val="false"/&gt;&lt;w:sz w:val="18"/&gt;&lt;w:szCs w:val="18"/&gt;&lt;w:color w:val="000000"/&gt;&lt;/w:rPr&gt;&lt;w:t xml:space="preserve"&gt;-0.2331&lt;/w:t&gt;&lt;/w:r&gt;&lt;/w:p&gt;&lt;/w:tc&gt;&lt;w:tc&gt;&lt;w:tcPr&gt;&lt;w:tcBorders&gt;&lt;w:bottom w:val="none" w:sz="0" w:space="0" w:color="000000"/&gt;&lt;w:top w:val="none" w:sz="0" w:space="0" w:color="000000"/&gt;&lt;w:left w:val="none" w:sz="0" w:space="0" w:color="000000"/&gt;&lt;w:right w:val="none" w:sz="0" w:space="0" w:color="000000"/&gt;&lt;/w:tcBorders&gt;&lt;w:shd w:val="clear" w:color="auto" w:fill="FFFFFF"/&gt;&lt;w:tcMar&gt;&lt;w:top w:w="0" w:type="dxa"/&gt;&lt;w:bottom w:w="0" w:type="dxa"/&gt;&lt;w:left w:w="0" w:type="dxa"/&gt;&lt;w:right w:w="0" w:type="dxa"/&gt;&lt;/w:tcMar&gt;&lt;w:vAlign w:val="center"/&gt;&lt;/w:tcPr&gt;&lt;w:p&gt;&lt;w:pPr&gt;&lt;w:jc w:val="center"/&gt;&lt;w:pBdr&gt;&lt;w:bottom w:val="none" w:sz="0" w:space="0" w:color="000000"/&gt;&lt;w:top w:val="none" w:sz="0" w:space="0" w:color="000000"/&gt;&lt;w:left w:val="none" w:sz="0" w:space="0" w:color="000000"/&gt;&lt;w:right w:val="none" w:sz="0" w:space="0" w:color="000000"/&gt;&lt;/w:pBdr&gt;&lt;w:spacing w:after="80" w:before="80" w:line="240"/&gt;&lt;w:ind w:left="80" w:right="80" w:firstLine="0" w:firstLineChars="0"/&gt;&lt;w:rPr&gt;&lt;w:rFonts w:ascii="Arial" w:hAnsi="Arial" w:eastAsia="Arial" w:cs="Arial"/&gt;&lt;w:i w:val="false"/&gt;&lt;w:b w:val="false"/&gt;&lt;w:u w:val="none"/&gt;&lt;w:strike w:val="false"/&gt;&lt;w:sz w:val="18"/&gt;&lt;w:szCs w:val="18"/&gt;&lt;w:color w:val="000000"/&gt;&lt;/w:rPr&gt;&lt;/w:pPr&gt;&lt;w:r xmlns:w="http://schemas.openxmlformats.org/wordprocessingml/2006/main" xmlns:wp="http://schemas.openxmlformats.org/drawingml/2006/wordprocessingDrawing" xmlns:r="http://schemas.openxmlformats.org/officeDocument/2006/relationships" xmlns:w14="http://schemas.microsoft.com/office/word/2010/wordml"&gt;&lt;w:rPr&gt;&lt;w:rFonts w:ascii="Arial" w:hAnsi="Arial" w:eastAsia="Arial" w:cs="Arial"/&gt;&lt;w:i w:val="false"/&gt;&lt;w:b w:val="false"/&gt;&lt;w:u w:val="none"/&gt;&lt;w:strike w:val="false"/&gt;&lt;w:sz w:val="18"/&gt;&lt;w:szCs w:val="18"/&gt;&lt;w:color w:val="000000"/&gt;&lt;/w:rPr&gt;&lt;w:t xml:space="preserve"&gt;-0.5722&lt;/w:t&gt;&lt;/w:r&gt;&lt;/w:p&gt;&lt;/w:tc&gt;&lt;w:tc&gt;&lt;w:tcPr&gt;&lt;w:tcBorders&gt;&lt;w:bottom w:val="none" w:sz="0" w:space="0" w:color="000000"/&gt;&lt;w:top w:val="none" w:sz="0" w:space="0" w:color="000000"/&gt;&lt;w:left w:val="none" w:sz="0" w:space="0" w:color="000000"/&gt;&lt;w:right w:val="none" w:sz="0" w:space="0" w:color="000000"/&gt;&lt;/w:tcBorders&gt;&lt;w:shd w:val="clear" w:color="auto" w:fill="FFFFFF"/&gt;&lt;w:tcMar&gt;&lt;w:top w:w="0" w:type="dxa"/&gt;&lt;w:bottom w:w="0" w:type="dxa"/&gt;&lt;w:left w:w="0" w:type="dxa"/&gt;&lt;w:right w:w="0" w:type="dxa"/&gt;&lt;/w:tcMar&gt;&lt;w:vAlign w:val="center"/&gt;&lt;/w:tcPr&gt;&lt;w:p&gt;&lt;w:pPr&gt;&lt;w:jc w:val="center"/&gt;&lt;w:pBdr&gt;&lt;w:bottom w:val="none" w:sz="0" w:space="0" w:color="000000"/&gt;&lt;w:top w:val="none" w:sz="0" w:space="0" w:color="000000"/&gt;&lt;w:left w:val="none" w:sz="0" w:space="0" w:color="000000"/&gt;&lt;w:right w:val="none" w:sz="0" w:space="0" w:color="000000"/&gt;&lt;/w:pBdr&gt;&lt;w:spacing w:after="80" w:before="80" w:line="240"/&gt;&lt;w:ind w:left="80" w:right="80" w:firstLine="0" w:firstLineChars="0"/&gt;&lt;w:rPr&gt;&lt;w:rFonts w:ascii="Arial" w:hAnsi="Arial" w:eastAsia="Arial" w:cs="Arial"/&gt;&lt;w:i w:val="false"/&gt;&lt;w:b w:val="false"/&gt;&lt;w:u w:val="none"/&gt;&lt;w:strike w:val="false"/&gt;&lt;w:sz w:val="18"/&gt;&lt;w:szCs w:val="18"/&gt;&lt;w:color w:val="000000"/&gt;&lt;/w:rPr&gt;&lt;/w:pPr&gt;&lt;w:r xmlns:w="http://schemas.openxmlformats.org/wordprocessingml/2006/main" xmlns:wp="http://schemas.openxmlformats.org/drawingml/2006/wordprocessingDrawing" xmlns:r="http://schemas.openxmlformats.org/officeDocument/2006/relationships" xmlns:w14="http://schemas.microsoft.com/office/word/2010/wordml"&gt;&lt;w:rPr&gt;&lt;w:rFonts w:ascii="Arial" w:hAnsi="Arial" w:eastAsia="Arial" w:cs="Arial"/&gt;&lt;w:i w:val="false"/&gt;&lt;w:b w:val="false"/&gt;&lt;w:u w:val="none"/&gt;&lt;w:strike w:val="false"/&gt;&lt;w:sz w:val="18"/&gt;&lt;w:szCs w:val="18"/&gt;&lt;w:color w:val="000000"/&gt;&lt;/w:rPr&gt;&lt;w:t xml:space="preserve"&gt;0.1060&lt;/w:t&gt;&lt;/w:r&gt;&lt;/w:p&gt;&lt;/w:tc&gt;&lt;w:tc&gt;&lt;w:tcPr&gt;&lt;w:tcBorders&gt;&lt;w:bottom w:val="none" w:sz="0" w:space="0" w:color="000000"/&gt;&lt;w:top w:val="none" w:sz="0" w:space="0" w:color="000000"/&gt;&lt;w:left w:val="none" w:sz="0" w:space="0" w:color="000000"/&gt;&lt;w:right w:val="none" w:sz="0" w:space="0" w:color="000000"/&gt;&lt;/w:tcBorders&gt;&lt;w:shd w:val="clear" w:color="auto" w:fill="FFFFFF"/&gt;&lt;w:tcMar&gt;&lt;w:top w:w="0" w:type="dxa"/&gt;&lt;w:bottom w:w="0" w:type="dxa"/&gt;&lt;w:left w:w="0" w:type="dxa"/&gt;&lt;w:right w:w="0" w:type="dxa"/&gt;&lt;/w:tcMar&gt;&lt;w:vAlign w:val="center"/&gt;&lt;/w:tcPr&gt;&lt;w:p&gt;&lt;w:pPr&gt;&lt;w:jc w:val="center"/&gt;&lt;w:pBdr&gt;&lt;w:bottom w:val="none" w:sz="0" w:space="0" w:color="000000"/&gt;&lt;w:top w:val="none" w:sz="0" w:space="0" w:color="000000"/&gt;&lt;w:left w:val="none" w:sz="0" w:space="0" w:color="000000"/&gt;&lt;w:right w:val="none" w:sz="0" w:space="0" w:color="000000"/&gt;&lt;/w:pBdr&gt;&lt;w:spacing w:after="80" w:before="80" w:line="240"/&gt;&lt;w:ind w:left="80" w:right="80" w:firstLine="0" w:firstLineChars="0"/&gt;&lt;w:rPr&gt;&lt;w:rFonts w:ascii="Arial" w:hAnsi="Arial" w:eastAsia="Arial" w:cs="Arial"/&gt;&lt;w:i w:val="false"/&gt;&lt;w:b w:val="false"/&gt;&lt;w:u w:val="none"/&gt;&lt;w:strike w:val="false"/&gt;&lt;w:sz w:val="18"/&gt;&lt;w:szCs w:val="18"/&gt;&lt;w:color w:val="000000"/&gt;&lt;/w:rPr&gt;&lt;/w:pPr&gt;&lt;w:r xmlns:w="http://schemas.openxmlformats.org/wordprocessingml/2006/main" xmlns:wp="http://schemas.openxmlformats.org/drawingml/2006/wordprocessingDrawing" xmlns:r="http://schemas.openxmlformats.org/officeDocument/2006/relationships" xmlns:w14="http://schemas.microsoft.com/office/word/2010/wordml"&gt;&lt;w:rPr&gt;&lt;w:rFonts w:ascii="Arial" w:hAnsi="Arial" w:eastAsia="Arial" w:cs="Arial"/&gt;&lt;w:i w:val="false"/&gt;&lt;w:b w:val="false"/&gt;&lt;w:u w:val="none"/&gt;&lt;w:strike w:val="false"/&gt;&lt;w:sz w:val="18"/&gt;&lt;w:szCs w:val="18"/&gt;&lt;w:color w:val="000000"/&gt;&lt;/w:rPr&gt;&lt;w:t xml:space="preserve"&gt;0.142&lt;/w:t&gt;&lt;/w:r&gt;&lt;/w:p&gt;&lt;/w:tc&gt;&lt;w:tc&gt;&lt;w:tcPr&gt;&lt;w:tcBorders&gt;&lt;w:bottom w:val="none" w:sz="0" w:space="0" w:color="000000"/&gt;&lt;w:top w:val="none" w:sz="0" w:space="0" w:color="000000"/&gt;&lt;w:left w:val="none" w:sz="0" w:space="0" w:color="000000"/&gt;&lt;w:right w:val="none" w:sz="0" w:space="0" w:color="000000"/&gt;&lt;/w:tcBorders&gt;&lt;w:shd w:val="clear" w:color="auto" w:fill="FFFFFF"/&gt;&lt;w:tcMar&gt;&lt;w:top w:w="0" w:type="dxa"/&gt;&lt;w:bottom w:w="0" w:type="dxa"/&gt;&lt;w:left w:w="0" w:type="dxa"/&gt;&lt;w:right w:w="0" w:type="dxa"/&gt;&lt;/w:tcMar&gt;&lt;w:vAlign w:val="center"/&gt;&lt;/w:tcPr&gt;&lt;w:p&gt;&lt;w:pPr&gt;&lt;w:jc w:val="center"/&gt;&lt;w:pBdr&gt;&lt;w:bottom w:val="none" w:sz="0" w:space="0" w:color="000000"/&gt;&lt;w:top w:val="none" w:sz="0" w:space="0" w:color="000000"/&gt;&lt;w:left w:val="none" w:sz="0" w:space="0" w:color="000000"/&gt;&lt;w:right w:val="none" w:sz="0" w:space="0" w:color="000000"/&gt;&lt;/w:pBdr&gt;&lt;w:spacing w:after="80" w:before="80" w:line="240"/&gt;&lt;w:ind w:left="80" w:right="80" w:firstLine="0" w:firstLineChars="0"/&gt;&lt;w:rPr&gt;&lt;w:rFonts w:ascii="Arial" w:hAnsi="Arial" w:eastAsia="Arial" w:cs="Arial"/&gt;&lt;w:i w:val="false"/&gt;&lt;w:b w:val="false"/&gt;&lt;w:u w:val="none"/&gt;&lt;w:strike w:val="false"/&gt;&lt;w:sz w:val="18"/&gt;&lt;w:szCs w:val="18"/&gt;&lt;w:color w:val="000000"/&gt;&lt;/w:rPr&gt;&lt;/w:pPr&gt;&lt;w:r xmlns:w="http://schemas.openxmlformats.org/wordprocessingml/2006/main" xmlns:wp="http://schemas.openxmlformats.org/drawingml/2006/wordprocessingDrawing" xmlns:r="http://schemas.openxmlformats.org/officeDocument/2006/relationships" xmlns:w14="http://schemas.microsoft.com/office/word/2010/wordml"&gt;&lt;w:rPr&gt;&lt;w:rFonts w:ascii="Arial" w:hAnsi="Arial" w:eastAsia="Arial" w:cs="Arial"/&gt;&lt;w:i w:val="false"/&gt;&lt;w:b w:val="false"/&gt;&lt;w:u w:val="none"/&gt;&lt;w:strike w:val="false"/&gt;&lt;w:sz w:val="18"/&gt;&lt;w:szCs w:val="18"/&gt;&lt;w:color w:val="000000"/&gt;&lt;/w:rPr&gt;&lt;w:t xml:space="preserve"&gt;no&lt;/w:t&gt;&lt;/w:r&gt;&lt;/w:p&gt;&lt;/w:tc&gt;&lt;w:tc&gt;&lt;w:tcPr&gt;&lt;w:tcBorders&gt;&lt;w:bottom w:val="none" w:sz="0" w:space="0" w:color="000000"/&gt;&lt;w:top w:val="none" w:sz="0" w:space="0" w:color="000000"/&gt;&lt;w:left w:val="none" w:sz="0" w:space="0" w:color="000000"/&gt;&lt;w:right w:val="none" w:sz="0" w:space="0" w:color="000000"/&gt;&lt;/w:tcBorders&gt;&lt;w:shd w:val="clear" w:color="auto" w:fill="FFFFFF"/&gt;&lt;w:tcMar&gt;&lt;w:top w:w="0" w:type="dxa"/&gt;&lt;w:bottom w:w="0" w:type="dxa"/&gt;&lt;w:left w:w="0" w:type="dxa"/&gt;&lt;w:right w:w="0" w:type="dxa"/&gt;&lt;/w:tcMar&gt;&lt;w:vAlign w:val="center"/&gt;&lt;/w:tcPr&gt;&lt;w:p&gt;&lt;w:pPr&gt;&lt;w:jc w:val="center"/&gt;&lt;w:pBdr&gt;&lt;w:bottom w:val="none" w:sz="0" w:space="0" w:color="000000"/&gt;&lt;w:top w:val="none" w:sz="0" w:space="0" w:color="000000"/&gt;&lt;w:left w:val="none" w:sz="0" w:space="0" w:color="000000"/&gt;&lt;w:right w:val="none" w:sz="0" w:space="0" w:color="000000"/&gt;&lt;/w:pBdr&gt;&lt;w:spacing w:after="80" w:before="80" w:line="240"/&gt;&lt;w:ind w:left="80" w:right="80" w:firstLine="0" w:firstLineChars="0"/&gt;&lt;w:rPr&gt;&lt;w:rFonts w:ascii="Arial" w:hAnsi="Arial" w:eastAsia="Arial" w:cs="Arial"/&gt;&lt;w:i w:val="false"/&gt;&lt;w:b w:val="false"/&gt;&lt;w:u w:val="none"/&gt;&lt;w:strike w:val="false"/&gt;&lt;w:sz w:val="18"/&gt;&lt;w:szCs w:val="18"/&gt;&lt;w:color w:val="000000"/&gt;&lt;/w:rPr&gt;&lt;/w:pPr&gt;&lt;w:r xmlns:w="http://schemas.openxmlformats.org/wordprocessingml/2006/main" xmlns:wp="http://schemas.openxmlformats.org/drawingml/2006/wordprocessingDrawing" xmlns:r="http://schemas.openxmlformats.org/officeDocument/2006/relationships" xmlns:w14="http://schemas.microsoft.com/office/word/2010/wordml"&gt;&lt;w:rPr&gt;&lt;w:rFonts w:ascii="Arial" w:hAnsi="Arial" w:eastAsia="Arial" w:cs="Arial"/&gt;&lt;w:i w:val="false"/&gt;&lt;w:b w:val="false"/&gt;&lt;w:u w:val="none"/&gt;&lt;w:strike w:val="false"/&gt;&lt;w:sz w:val="18"/&gt;&lt;w:szCs w:val="18"/&gt;&lt;w:color w:val="000000"/&gt;&lt;/w:rPr&gt;&lt;w:t xml:space="preserve"&gt;12&lt;/w:t&gt;&lt;/w:r&gt;&lt;/w:p&gt;&lt;/w:tc&gt;&lt;/w:tr&gt;&lt;w:tr&gt;&lt;w:trPr&gt;&lt;w:trHeight w:val="360" w:hRule="auto"/&gt;&lt;/w:trPr&gt;&lt;w:tc&gt;&lt;w:tcPr&gt;&lt;w:tcBorders&gt;&lt;w:bottom w:val="none" w:sz="0" w:space="0" w:color="000000"/&gt;&lt;w:top w:val="none" w:sz="0" w:space="0" w:color="000000"/&gt;&lt;w:left w:val="none" w:sz="0" w:space="0" w:color="000000"/&gt;&lt;w:right w:val="none" w:sz="0" w:space="0" w:color="000000"/&gt;&lt;/w:tcBorders&gt;&lt;w:shd w:val="clear" w:color="auto" w:fill="FFFFFF"/&gt;&lt;w:tcMar&gt;&lt;w:top w:w="0" w:type="dxa"/&gt;&lt;w:bottom w:w="0" w:type="dxa"/&gt;&lt;w:left w:w="0" w:type="dxa"/&gt;&lt;w:right w:w="0" w:type="dxa"/&gt;&lt;/w:tcMar&gt;&lt;w:vAlign w:val="center"/&gt;&lt;/w:tcPr&gt;&lt;w:p&gt;&lt;w:pPr&gt;&lt;w:jc w:val="left"/&gt;&lt;w:pBdr&gt;&lt;w:bottom w:val="none" w:sz="0" w:space="0" w:color="000000"/&gt;&lt;w:top w:val="none" w:sz="0" w:space="0" w:color="000000"/&gt;&lt;w:left w:val="none" w:sz="0" w:space="0" w:color="000000"/&gt;&lt;w:right w:val="none" w:sz="0" w:space="0" w:color="000000"/&gt;&lt;/w:pBdr&gt;&lt;w:spacing w:after="80" w:before="80" w:line="240"/&gt;&lt;w:ind w:left="80" w:right="80" w:firstLine="0" w:firstLineChars="0"/&gt;&lt;w:rPr&gt;&lt;w:rFonts w:ascii="Arial" w:hAnsi="Arial" w:eastAsia="Arial" w:cs="Arial"/&gt;&lt;w:i w:val="false"/&gt;&lt;w:b w:val="false"/&gt;&lt;w:u w:val="none"/&gt;&lt;w:strike w:val="false"/&gt;&lt;w:sz w:val="18"/&gt;&lt;w:szCs w:val="18"/&gt;&lt;w:color w:val="000000"/&gt;&lt;/w:rPr&gt;&lt;/w:pPr&gt;&lt;w:r xmlns:w="http://schemas.openxmlformats.org/wordprocessingml/2006/main" xmlns:wp="http://schemas.openxmlformats.org/drawingml/2006/wordprocessingDrawing" xmlns:r="http://schemas.openxmlformats.org/officeDocument/2006/relationships" xmlns:w14="http://schemas.microsoft.com/office/word/2010/wordml"&gt;&lt;w:rPr&gt;&lt;w:rFonts w:ascii="Arial" w:hAnsi="Arial" w:eastAsia="Arial" w:cs="Arial"/&gt;&lt;w:i w:val="false"/&gt;&lt;w:b w:val="false"/&gt;&lt;w:u w:val="none"/&gt;&lt;w:strike w:val="false"/&gt;&lt;w:sz w:val="18"/&gt;&lt;w:szCs w:val="18"/&gt;&lt;w:color w:val="000000"/&gt;&lt;/w:rPr&gt;&lt;w:t xml:space="preserve"&gt;dBI&lt;/w:t&gt;&lt;/w:r&gt;&lt;/w:p&gt;&lt;/w:tc&gt;&lt;w:tc&gt;&lt;w:tcPr&gt;&lt;w:tcBorders&gt;&lt;w:bottom w:val="none" w:sz="0" w:space="0" w:color="000000"/&gt;&lt;w:top w:val="none" w:sz="0" w:space="0" w:color="000000"/&gt;&lt;w:left w:val="none" w:sz="0" w:space="0" w:color="000000"/&gt;&lt;w:right w:val="none" w:sz="0" w:space="0" w:color="000000"/&gt;&lt;/w:tcBorders&gt;&lt;w:shd w:val="clear" w:color="auto" w:fill="FFFFFF"/&gt;&lt;w:tcMar&gt;&lt;w:top w:w="0" w:type="dxa"/&gt;&lt;w:bottom w:w="0" w:type="dxa"/&gt;&lt;w:left w:w="0" w:type="dxa"/&gt;&lt;w:right w:w="0" w:type="dxa"/&gt;&lt;/w:tcMar&gt;&lt;w:vAlign w:val="center"/&gt;&lt;/w:tcPr&gt;&lt;w:p&gt;&lt;w:pPr&gt;&lt;w:jc w:val="center"/&gt;&lt;w:pBdr&gt;&lt;w:bottom w:val="none" w:sz="0" w:space="0" w:color="000000"/&gt;&lt;w:top w:val="none" w:sz="0" w:space="0" w:color="000000"/&gt;&lt;w:left w:val="none" w:sz="0" w:space="0" w:color="000000"/&gt;&lt;w:right w:val="none" w:sz="0" w:space="0" w:color="000000"/&gt;&lt;/w:pBdr&gt;&lt;w:spacing w:after="80" w:before="80" w:line="240"/&gt;&lt;w:ind w:left="80" w:right="80" w:firstLine="0" w:firstLineChars="0"/&gt;&lt;w:rPr&gt;&lt;w:rFonts w:ascii="Arial" w:hAnsi="Arial" w:eastAsia="Arial" w:cs="Arial"/&gt;&lt;w:i w:val="false"/&gt;&lt;w:b w:val="false"/&gt;&lt;w:u w:val="none"/&gt;&lt;w:strike w:val="false"/&gt;&lt;w:sz w:val="18"/&gt;&lt;w:szCs w:val="18"/&gt;&lt;w:color w:val="000000"/&gt;&lt;/w:rPr&gt;&lt;/w:pPr&gt;&lt;w:r xmlns:w="http://schemas.openxmlformats.org/wordprocessingml/2006/main" xmlns:wp="http://schemas.openxmlformats.org/drawingml/2006/wordprocessingDrawing" xmlns:r="http://schemas.openxmlformats.org/officeDocument/2006/relationships" xmlns:w14="http://schemas.microsoft.com/office/word/2010/wordml"&gt;&lt;w:rPr&gt;&lt;w:rFonts w:ascii="Arial" w:hAnsi="Arial" w:eastAsia="Arial" w:cs="Arial"/&gt;&lt;w:i w:val="false"/&gt;&lt;w:b w:val="false"/&gt;&lt;w:u w:val="none"/&gt;&lt;w:strike w:val="false"/&gt;&lt;w:sz w:val="18"/&gt;&lt;w:szCs w:val="18"/&gt;&lt;w:color w:val="000000"/&gt;&lt;/w:rPr&gt;&lt;w:t xml:space="preserve"&gt;pasture&lt;/w:t&gt;&lt;/w:r&gt;&lt;/w:p&gt;&lt;/w:tc&gt;&lt;w:tc&gt;&lt;w:tcPr&gt;&lt;w:tcBorders&gt;&lt;w:bottom w:val="none" w:sz="0" w:space="0" w:color="000000"/&gt;&lt;w:top w:val="none" w:sz="0" w:space="0" w:color="000000"/&gt;&lt;w:left w:val="none" w:sz="0" w:space="0" w:color="000000"/&gt;&lt;w:right w:val="none" w:sz="0" w:space="0" w:color="000000"/&gt;&lt;/w:tcBorders&gt;&lt;w:shd w:val="clear" w:color="auto" w:fill="FFFFFF"/&gt;&lt;w:tcMar&gt;&lt;w:top w:w="0" w:type="dxa"/&gt;&lt;w:bottom w:w="0" w:type="dxa"/&gt;&lt;w:left w:w="0" w:type="dxa"/&gt;&lt;w:right w:w="0" w:type="dxa"/&gt;&lt;/w:tcMar&gt;&lt;w:vAlign w:val="center"/&gt;&lt;/w:tcPr&gt;&lt;w:p&gt;&lt;w:pPr&gt;&lt;w:jc w:val="center"/&gt;&lt;w:pBdr&gt;&lt;w:bottom w:val="none" w:sz="0" w:space="0" w:color="000000"/&gt;&lt;w:top w:val="none" w:sz="0" w:space="0" w:color="000000"/&gt;&lt;w:left w:val="none" w:sz="0" w:space="0" w:color="000000"/&gt;&lt;w:right w:val="none" w:sz="0" w:space="0" w:color="000000"/&gt;&lt;/w:pBdr&gt;&lt;w:spacing w:after="80" w:before="80" w:line="240"/&gt;&lt;w:ind w:left="80" w:right="80" w:firstLine="0" w:firstLineChars="0"/&gt;&lt;w:rPr&gt;&lt;w:rFonts w:ascii="Arial" w:hAnsi="Arial" w:eastAsia="Arial" w:cs="Arial"/&gt;&lt;w:i w:val="false"/&gt;&lt;w:b w:val="false"/&gt;&lt;w:u w:val="none"/&gt;&lt;w:strike w:val="false"/&gt;&lt;w:sz w:val="18"/&gt;&lt;w:szCs w:val="18"/&gt;&lt;w:color w:val="000000"/&gt;&lt;/w:rPr&gt;&lt;/w:pPr&gt;&lt;w:r xmlns:w="http://schemas.openxmlformats.org/wordprocessingml/2006/main" xmlns:wp="http://schemas.openxmlformats.org/drawingml/2006/wordprocessingDrawing" xmlns:r="http://schemas.openxmlformats.org/officeDocument/2006/relationships" xmlns:w14="http://schemas.microsoft.com/office/word/2010/wordml"&gt;&lt;w:rPr&gt;&lt;w:rFonts w:ascii="Arial" w:hAnsi="Arial" w:eastAsia="Arial" w:cs="Arial"/&gt;&lt;w:i w:val="false"/&gt;&lt;w:b w:val="false"/&gt;&lt;w:u w:val="none"/&gt;&lt;w:strike w:val="false"/&gt;&lt;w:sz w:val="18"/&gt;&lt;w:szCs w:val="18"/&gt;&lt;w:color w:val="000000"/&gt;&lt;/w:rPr&gt;&lt;w:t xml:space="preserve"&gt;0.0536&lt;/w:t&gt;&lt;/w:r&gt;&lt;/w:p&gt;&lt;/w:tc&gt;&lt;w:tc&gt;&lt;w:tcPr&gt;&lt;w:tcBorders&gt;&lt;w:bottom w:val="none" w:sz="0" w:space="0" w:color="000000"/&gt;&lt;w:top w:val="none" w:sz="0" w:space="0" w:color="000000"/&gt;&lt;w:left w:val="none" w:sz="0" w:space="0" w:color="000000"/&gt;&lt;w:right w:val="none" w:sz="0" w:space="0" w:color="000000"/&gt;&lt;/w:tcBorders&gt;&lt;w:shd w:val="clear" w:color="auto" w:fill="FFFFFF"/&gt;&lt;w:tcMar&gt;&lt;w:top w:w="0" w:type="dxa"/&gt;&lt;w:bottom w:w="0" w:type="dxa"/&gt;&lt;w:left w:w="0" w:type="dxa"/&gt;&lt;w:right w:w="0" w:type="dxa"/&gt;&lt;/w:tcMar&gt;&lt;w:vAlign w:val="center"/&gt;&lt;/w:tcPr&gt;&lt;w:p&gt;&lt;w:pPr&gt;&lt;w:jc w:val="center"/&gt;&lt;w:pBdr&gt;&lt;w:bottom w:val="none" w:sz="0" w:space="0" w:color="000000"/&gt;&lt;w:top w:val="none" w:sz="0" w:space="0" w:color="000000"/&gt;&lt;w:left w:val="none" w:sz="0" w:space="0" w:color="000000"/&gt;&lt;w:right w:val="none" w:sz="0" w:space="0" w:color="000000"/&gt;&lt;/w:pBdr&gt;&lt;w:spacing w:after="80" w:before="80" w:line="240"/&gt;&lt;w:ind w:left="80" w:right="80" w:firstLine="0" w:firstLineChars="0"/&gt;&lt;w:rPr&gt;&lt;w:rFonts w:ascii="Arial" w:hAnsi="Arial" w:eastAsia="Arial" w:cs="Arial"/&gt;&lt;w:i w:val="false"/&gt;&lt;w:b w:val="false"/&gt;&lt;w:u w:val="none"/&gt;&lt;w:strike w:val="false"/&gt;&lt;w:sz w:val="18"/&gt;&lt;w:szCs w:val="18"/&gt;&lt;w:color w:val="000000"/&gt;&lt;/w:rPr&gt;&lt;/w:pPr&gt;&lt;w:r xmlns:w="http://schemas.openxmlformats.org/wordprocessingml/2006/main" xmlns:wp="http://schemas.openxmlformats.org/drawingml/2006/wordprocessingDrawing" xmlns:r="http://schemas.openxmlformats.org/officeDocument/2006/relationships" xmlns:w14="http://schemas.microsoft.com/office/word/2010/wordml"&gt;&lt;w:rPr&gt;&lt;w:rFonts w:ascii="Arial" w:hAnsi="Arial" w:eastAsia="Arial" w:cs="Arial"/&gt;&lt;w:i w:val="false"/&gt;&lt;w:b w:val="false"/&gt;&lt;w:u w:val="none"/&gt;&lt;w:strike w:val="false"/&gt;&lt;w:sz w:val="18"/&gt;&lt;w:szCs w:val="18"/&gt;&lt;w:color w:val="000000"/&gt;&lt;/w:rPr&gt;&lt;w:t xml:space="preserve"&gt;-0.3373&lt;/w:t&gt;&lt;/w:r&gt;&lt;/w:p&gt;&lt;/w:tc&gt;&lt;w:tc&gt;&lt;w:tcPr&gt;&lt;w:tcBorders&gt;&lt;w:bottom w:val="none" w:sz="0" w:space="0" w:color="000000"/&gt;&lt;w:top w:val="none" w:sz="0" w:space="0" w:color="000000"/&gt;&lt;w:left w:val="none" w:sz="0" w:space="0" w:color="000000"/&gt;&lt;w:right w:val="none" w:sz="0" w:space="0" w:color="000000"/&gt;&lt;/w:tcBorders&gt;&lt;w:shd w:val="clear" w:color="auto" w:fill="FFFFFF"/&gt;&lt;w:tcMar&gt;&lt;w:top w:w="0" w:type="dxa"/&gt;&lt;w:bottom w:w="0" w:type="dxa"/&gt;&lt;w:left w:w="0" w:type="dxa"/&gt;&lt;w:right w:w="0" w:type="dxa"/&gt;&lt;/w:tcMar&gt;&lt;w:vAlign w:val="center"/&gt;&lt;/w:tcPr&gt;&lt;w:p&gt;&lt;w:pPr&gt;&lt;w:jc w:val="center"/&gt;&lt;w:pBdr&gt;&lt;w:bottom w:val="none" w:sz="0" w:space="0" w:color="000000"/&gt;&lt;w:top w:val="none" w:sz="0" w:space="0" w:color="000000"/&gt;&lt;w:left w:val="none" w:sz="0" w:space="0" w:color="000000"/&gt;&lt;w:right w:val="none" w:sz="0" w:space="0" w:color="000000"/&gt;&lt;/w:pBdr&gt;&lt;w:spacing w:after="80" w:before="80" w:line="240"/&gt;&lt;w:ind w:left="80" w:right="80" w:firstLine="0" w:firstLineChars="0"/&gt;&lt;w:rPr&gt;&lt;w:rFonts w:ascii="Arial" w:hAnsi="Arial" w:eastAsia="Arial" w:cs="Arial"/&gt;&lt;w:i w:val="false"/&gt;&lt;w:b w:val="false"/&gt;&lt;w:u w:val="none"/&gt;&lt;w:strike w:val="false"/&gt;&lt;w:sz w:val="18"/&gt;&lt;w:szCs w:val="18"/&gt;&lt;w:color w:val="000000"/&gt;&lt;/w:rPr&gt;&lt;/w:pPr&gt;&lt;w:r xmlns:w="http://schemas.openxmlformats.org/wordprocessingml/2006/main" xmlns:wp="http://schemas.openxmlformats.org/drawingml/2006/wordprocessingDrawing" xmlns:r="http://schemas.openxmlformats.org/officeDocument/2006/relationships" xmlns:w14="http://schemas.microsoft.com/office/word/2010/wordml"&gt;&lt;w:rPr&gt;&lt;w:rFonts w:ascii="Arial" w:hAnsi="Arial" w:eastAsia="Arial" w:cs="Arial"/&gt;&lt;w:i w:val="false"/&gt;&lt;w:b w:val="false"/&gt;&lt;w:u w:val="none"/&gt;&lt;w:strike w:val="false"/&gt;&lt;w:sz w:val="18"/&gt;&lt;w:szCs w:val="18"/&gt;&lt;w:color w:val="000000"/&gt;&lt;/w:rPr&gt;&lt;w:t xml:space="preserve"&gt;0.4446&lt;/w:t&gt;&lt;/w:r&gt;&lt;/w:p&gt;&lt;/w:tc&gt;&lt;w:tc&gt;&lt;w:tcPr&gt;&lt;w:tcBorders&gt;&lt;w:bottom w:val="none" w:sz="0" w:space="0" w:color="000000"/&gt;&lt;w:top w:val="none" w:sz="0" w:space="0" w:color="000000"/&gt;&lt;w:left w:val="none" w:sz="0" w:space="0" w:color="000000"/&gt;&lt;w:right w:val="none" w:sz="0" w:space="0" w:color="000000"/&gt;&lt;/w:tcBorders&gt;&lt;w:shd w:val="clear" w:color="auto" w:fill="FFFFFF"/&gt;&lt;w:tcMar&gt;&lt;w:top w:w="0" w:type="dxa"/&gt;&lt;w:bottom w:w="0" w:type="dxa"/&gt;&lt;w:left w:w="0" w:type="dxa"/&gt;&lt;w:right w:w="0" w:type="dxa"/&gt;&lt;/w:tcMar&gt;&lt;w:vAlign w:val="center"/&gt;&lt;/w:tcPr&gt;&lt;w:p&gt;&lt;w:pPr&gt;&lt;w:jc w:val="center"/&gt;&lt;w:pBdr&gt;&lt;w:bottom w:val="none" w:sz="0" w:space="0" w:color="000000"/&gt;&lt;w:top w:val="none" w:sz="0" w:space="0" w:color="000000"/&gt;&lt;w:left w:val="none" w:sz="0" w:space="0" w:color="000000"/&gt;&lt;w:right w:val="none" w:sz="0" w:space="0" w:color="000000"/&gt;&lt;/w:pBdr&gt;&lt;w:spacing w:after="80" w:before="80" w:line="240"/&gt;&lt;w:ind w:left="80" w:right="80" w:firstLine="0" w:firstLineChars="0"/&gt;&lt;w:rPr&gt;&lt;w:rFonts w:ascii="Arial" w:hAnsi="Arial" w:eastAsia="Arial" w:cs="Arial"/&gt;&lt;w:i w:val="false"/&gt;&lt;w:b w:val="false"/&gt;&lt;w:u w:val="none"/&gt;&lt;w:strike w:val="false"/&gt;&lt;w:sz w:val="18"/&gt;&lt;w:szCs w:val="18"/&gt;&lt;w:color w:val="000000"/&gt;&lt;/w:rPr&gt;&lt;/w:pPr&gt;&lt;w:r xmlns:w="http://schemas.openxmlformats.org/wordprocessingml/2006/main" xmlns:wp="http://schemas.openxmlformats.org/drawingml/2006/wordprocessingDrawing" xmlns:r="http://schemas.openxmlformats.org/officeDocument/2006/relationships" xmlns:w14="http://schemas.microsoft.com/office/word/2010/wordml"&gt;&lt;w:rPr&gt;&lt;w:rFonts w:ascii="Arial" w:hAnsi="Arial" w:eastAsia="Arial" w:cs="Arial"/&gt;&lt;w:i w:val="false"/&gt;&lt;w:b w:val="false"/&gt;&lt;w:u w:val="none"/&gt;&lt;w:strike w:val="false"/&gt;&lt;w:sz w:val="18"/&gt;&lt;w:szCs w:val="18"/&gt;&lt;w:color w:val="000000"/&gt;&lt;/w:rPr&gt;&lt;w:t xml:space="preserve"&gt;0.008&lt;/w:t&gt;&lt;/w:r&gt;&lt;/w:p&gt;&lt;/w:tc&gt;&lt;w:tc&gt;&lt;w:tcPr&gt;&lt;w:tcBorders&gt;&lt;w:bottom w:val="none" w:sz="0" w:space="0" w:color="000000"/&gt;&lt;w:top w:val="none" w:sz="0" w:space="0" w:color="000000"/&gt;&lt;w:left w:val="none" w:sz="0" w:space="0" w:color="000000"/&gt;&lt;w:right w:val="none" w:sz="0" w:space="0" w:color="000000"/&gt;&lt;/w:tcBorders&gt;&lt;w:shd w:val="clear" w:color="auto" w:fill="FFFFFF"/&gt;&lt;w:tcMar&gt;&lt;w:top w:w="0" w:type="dxa"/&gt;&lt;w:bottom w:w="0" w:type="dxa"/&gt;&lt;w:left w:w="0" w:type="dxa"/&gt;&lt;w:right w:w="0" w:type="dxa"/&gt;&lt;/w:tcMar&gt;&lt;w:vAlign w:val="center"/&gt;&lt;/w:tcPr&gt;&lt;w:p&gt;&lt;w:pPr&gt;&lt;w:jc w:val="center"/&gt;&lt;w:pBdr&gt;&lt;w:bottom w:val="none" w:sz="0" w:space="0" w:color="000000"/&gt;&lt;w:top w:val="none" w:sz="0" w:space="0" w:color="000000"/&gt;&lt;w:left w:val="none" w:sz="0" w:space="0" w:color="000000"/&gt;&lt;w:right w:val="none" w:sz="0" w:space="0" w:color="000000"/&gt;&lt;/w:pBdr&gt;&lt;w:spacing w:after="80" w:before="80" w:line="240"/&gt;&lt;w:ind w:left="80" w:right="80" w:firstLine="0" w:firstLineChars="0"/&gt;&lt;w:rPr&gt;&lt;w:rFonts w:ascii="Arial" w:hAnsi="Arial" w:eastAsia="Arial" w:cs="Arial"/&gt;&lt;w:i w:val="false"/&gt;&lt;w:b w:val="false"/&gt;&lt;w:u w:val="none"/&gt;&lt;w:strike w:val="false"/&gt;&lt;w:sz w:val="18"/&gt;&lt;w:szCs w:val="18"/&gt;&lt;w:color w:val="000000"/&gt;&lt;/w:rPr&gt;&lt;/w:pPr&gt;&lt;w:r xmlns:w="http://schemas.openxmlformats.org/wordprocessingml/2006/main" xmlns:wp="http://schemas.openxmlformats.org/drawingml/2006/wordprocessingDrawing" xmlns:r="http://schemas.openxmlformats.org/officeDocument/2006/relationships" xmlns:w14="http://schemas.microsoft.com/office/word/2010/wordml"&gt;&lt;w:rPr&gt;&lt;w:rFonts w:ascii="Arial" w:hAnsi="Arial" w:eastAsia="Arial" w:cs="Arial"/&gt;&lt;w:i w:val="false"/&gt;&lt;w:b w:val="false"/&gt;&lt;w:u w:val="none"/&gt;&lt;w:strike w:val="false"/&gt;&lt;w:sz w:val="18"/&gt;&lt;w:szCs w:val="18"/&gt;&lt;w:color w:val="000000"/&gt;&lt;/w:rPr&gt;&lt;w:t xml:space="preserve"&gt;no&lt;/w:t&gt;&lt;/w:r&gt;&lt;/w:p&gt;&lt;/w:tc&gt;&lt;w:tc&gt;&lt;w:tcPr&gt;&lt;w:tcBorders&gt;&lt;w:bottom w:val="none" w:sz="0" w:space="0" w:color="000000"/&gt;&lt;w:top w:val="none" w:sz="0" w:space="0" w:color="000000"/&gt;&lt;w:left w:val="none" w:sz="0" w:space="0" w:color="000000"/&gt;&lt;w:right w:val="none" w:sz="0" w:space="0" w:color="000000"/&gt;&lt;/w:tcBorders&gt;&lt;w:shd w:val="clear" w:color="auto" w:fill="FFFFFF"/&gt;&lt;w:tcMar&gt;&lt;w:top w:w="0" w:type="dxa"/&gt;&lt;w:bottom w:w="0" w:type="dxa"/&gt;&lt;w:left w:w="0" w:type="dxa"/&gt;&lt;w:right w:w="0" w:type="dxa"/&gt;&lt;/w:tcMar&gt;&lt;w:vAlign w:val="center"/&gt;&lt;/w:tcPr&gt;&lt;w:p&gt;&lt;w:pPr&gt;&lt;w:jc w:val="center"/&gt;&lt;w:pBdr&gt;&lt;w:bottom w:val="none" w:sz="0" w:space="0" w:color="000000"/&gt;&lt;w:top w:val="none" w:sz="0" w:space="0" w:color="000000"/&gt;&lt;w:left w:val="none" w:sz="0" w:space="0" w:color="000000"/&gt;&lt;w:right w:val="none" w:sz="0" w:space="0" w:color="000000"/&gt;&lt;/w:pBdr&gt;&lt;w:spacing w:after="80" w:before="80" w:line="240"/&gt;&lt;w:ind w:left="80" w:right="80" w:firstLine="0" w:firstLineChars="0"/&gt;&lt;w:rPr&gt;&lt;w:rFonts w:ascii="Arial" w:hAnsi="Arial" w:eastAsia="Arial" w:cs="Arial"/&gt;&lt;w:i w:val="false"/&gt;&lt;w:b w:val="false"/&gt;&lt;w:u w:val="none"/&gt;&lt;w:strike w:val="false"/&gt;&lt;w:sz w:val="18"/&gt;&lt;w:szCs w:val="18"/&gt;&lt;w:color w:val="000000"/&gt;&lt;/w:rPr&gt;&lt;/w:pPr&gt;&lt;w:r xmlns:w="http://schemas.openxmlformats.org/wordprocessingml/2006/main" xmlns:wp="http://schemas.openxmlformats.org/drawingml/2006/wordprocessingDrawing" xmlns:r="http://schemas.openxmlformats.org/officeDocument/2006/relationships" xmlns:w14="http://schemas.microsoft.com/office/word/2010/wordml"&gt;&lt;w:rPr&gt;&lt;w:rFonts w:ascii="Arial" w:hAnsi="Arial" w:eastAsia="Arial" w:cs="Arial"/&gt;&lt;w:i w:val="false"/&gt;&lt;w:b w:val="false"/&gt;&lt;w:u w:val="none"/&gt;&lt;w:strike w:val="false"/&gt;&lt;w:sz w:val="18"/&gt;&lt;w:szCs w:val="18"/&gt;&lt;w:color w:val="000000"/&gt;&lt;/w:rPr&gt;&lt;w:t xml:space="preserve"&gt;10&lt;/w:t&gt;&lt;/w:r&gt;&lt;/w:p&gt;&lt;/w:tc&gt;&lt;/w:tr&gt;&lt;w:tr&gt;&lt;w:trPr&gt;&lt;w:trHeight w:val="360" w:hRule="auto"/&gt;&lt;/w:trPr&gt;&lt;w:tc&gt;&lt;w:tcPr&gt;&lt;w:tcBorders&gt;&lt;w:bottom w:val="none" w:sz="0" w:space="0" w:color="000000"/&gt;&lt;w:top w:val="none" w:sz="0" w:space="0" w:color="000000"/&gt;&lt;w:left w:val="none" w:sz="0" w:space="0" w:color="000000"/&gt;&lt;w:right w:val="none" w:sz="0" w:space="0" w:color="000000"/&gt;&lt;/w:tcBorders&gt;&lt;w:shd w:val="clear" w:color="auto" w:fill="FFFFFF"/&gt;&lt;w:tcMar&gt;&lt;w:top w:w="0" w:type="dxa"/&gt;&lt;w:bottom w:w="0" w:type="dxa"/&gt;&lt;w:left w:w="0" w:type="dxa"/&gt;&lt;w:right w:w="0" w:type="dxa"/&gt;&lt;/w:tcMar&gt;&lt;w:vAlign w:val="center"/&gt;&lt;/w:tcPr&gt;&lt;w:p&gt;&lt;w:pPr&gt;&lt;w:jc w:val="left"/&gt;&lt;w:pBdr&gt;&lt;w:bottom w:val="none" w:sz="0" w:space="0" w:color="000000"/&gt;&lt;w:top w:val="none" w:sz="0" w:space="0" w:color="000000"/&gt;&lt;w:left w:val="none" w:sz="0" w:space="0" w:color="000000"/&gt;&lt;w:right w:val="none" w:sz="0" w:space="0" w:color="000000"/&gt;&lt;/w:pBdr&gt;&lt;w:spacing w:after="80" w:before="80" w:line="240"/&gt;&lt;w:ind w:left="80" w:right="80" w:firstLine="0" w:firstLineChars="0"/&gt;&lt;w:rPr&gt;&lt;w:rFonts w:ascii="Arial" w:hAnsi="Arial" w:eastAsia="Arial" w:cs="Arial"/&gt;&lt;w:i w:val="false"/&gt;&lt;w:b w:val="false"/&gt;&lt;w:u w:val="none"/&gt;&lt;w:strike w:val="false"/&gt;&lt;w:sz w:val="18"/&gt;&lt;w:szCs w:val="18"/&gt;&lt;w:color w:val="000000"/&gt;&lt;/w:rPr&gt;&lt;/w:pPr&gt;&lt;w:r xmlns:w="http://schemas.openxmlformats.org/wordprocessingml/2006/main" xmlns:wp="http://schemas.openxmlformats.org/drawingml/2006/wordprocessingDrawing" xmlns:r="http://schemas.openxmlformats.org/officeDocument/2006/relationships" xmlns:w14="http://schemas.microsoft.com/office/word/2010/wordml"&gt;&lt;w:rPr&gt;&lt;w:rFonts w:ascii="Arial" w:hAnsi="Arial" w:eastAsia="Arial" w:cs="Arial"/&gt;&lt;w:i w:val="false"/&gt;&lt;w:b w:val="false"/&gt;&lt;w:u w:val="none"/&gt;&lt;w:strike w:val="false"/&gt;&lt;w:sz w:val="18"/&gt;&lt;w:szCs w:val="18"/&gt;&lt;w:color w:val="000000"/&gt;&lt;/w:rPr&gt;&lt;w:t xml:space="preserve"&gt;dADI&lt;/w:t&gt;&lt;/w:r&gt;&lt;/w:p&gt;&lt;/w:tc&gt;&lt;w:tc&gt;&lt;w:tcPr&gt;&lt;w:tcBorders&gt;&lt;w:bottom w:val="none" w:sz="0" w:space="0" w:color="000000"/&gt;&lt;w:top w:val="none" w:sz="0" w:space="0" w:color="000000"/&gt;&lt;w:left w:val="none" w:sz="0" w:space="0" w:color="000000"/&gt;&lt;w:right w:val="none" w:sz="0" w:space="0" w:color="000000"/&gt;&lt;/w:tcBorders&gt;&lt;w:shd w:val="clear" w:color="auto" w:fill="FFFFFF"/&gt;&lt;w:tcMar&gt;&lt;w:top w:w="0" w:type="dxa"/&gt;&lt;w:bottom w:w="0" w:type="dxa"/&gt;&lt;w:left w:w="0" w:type="dxa"/&gt;&lt;w:right w:w="0" w:type="dxa"/&gt;&lt;/w:tcMar&gt;&lt;w:vAlign w:val="center"/&gt;&lt;/w:tcPr&gt;&lt;w:p&gt;&lt;w:pPr&gt;&lt;w:jc w:val="center"/&gt;&lt;w:pBdr&gt;&lt;w:bottom w:val="none" w:sz="0" w:space="0" w:color="000000"/&gt;&lt;w:top w:val="none" w:sz="0" w:space="0" w:color="000000"/&gt;&lt;w:left w:val="none" w:sz="0" w:space="0" w:color="000000"/&gt;&lt;w:right w:val="none" w:sz="0" w:space="0" w:color="000000"/&gt;&lt;/w:pBdr&gt;&lt;w:spacing w:after="80" w:before="80" w:line="240"/&gt;&lt;w:ind w:left="80" w:right="80" w:firstLine="0" w:firstLineChars="0"/&gt;&lt;w:rPr&gt;&lt;w:rFonts w:ascii="Arial" w:hAnsi="Arial" w:eastAsia="Arial" w:cs="Arial"/&gt;&lt;w:i w:val="false"/&gt;&lt;w:b w:val="false"/&gt;&lt;w:u w:val="none"/&gt;&lt;w:strike w:val="false"/&gt;&lt;w:sz w:val="18"/&gt;&lt;w:szCs w:val="18"/&gt;&lt;w:color w:val="000000"/&gt;&lt;/w:rPr&gt;&lt;/w:pPr&gt;&lt;w:r xmlns:w="http://schemas.openxmlformats.org/wordprocessingml/2006/main" xmlns:wp="http://schemas.openxmlformats.org/drawingml/2006/wordprocessingDrawing" xmlns:r="http://schemas.openxmlformats.org/officeDocument/2006/relationships" xmlns:w14="http://schemas.microsoft.com/office/word/2010/wordml"&gt;&lt;w:rPr&gt;&lt;w:rFonts w:ascii="Arial" w:hAnsi="Arial" w:eastAsia="Arial" w:cs="Arial"/&gt;&lt;w:i w:val="false"/&gt;&lt;w:b w:val="false"/&gt;&lt;w:u w:val="none"/&gt;&lt;w:strike w:val="false"/&gt;&lt;w:sz w:val="18"/&gt;&lt;w:szCs w:val="18"/&gt;&lt;w:color w:val="000000"/&gt;&lt;/w:rPr&gt;&lt;w:t xml:space="preserve"&gt;forest&lt;/w:t&gt;&lt;/w:r&gt;&lt;/w:p&gt;&lt;/w:tc&gt;&lt;w:tc&gt;&lt;w:tcPr&gt;&lt;w:tcBorders&gt;&lt;w:bottom w:val="none" w:sz="0" w:space="0" w:color="000000"/&gt;&lt;w:top w:val="none" w:sz="0" w:space="0" w:color="000000"/&gt;&lt;w:left w:val="none" w:sz="0" w:space="0" w:color="000000"/&gt;&lt;w:right w:val="none" w:sz="0" w:space="0" w:color="000000"/&gt;&lt;/w:tcBorders&gt;&lt;w:shd w:val="clear" w:color="auto" w:fill="FFFFFF"/&gt;&lt;w:tcMar&gt;&lt;w:top w:w="0" w:type="dxa"/&gt;&lt;w:bottom w:w="0" w:type="dxa"/&gt;&lt;w:left w:w="0" w:type="dxa"/&gt;&lt;w:right w:w="0" w:type="dxa"/&gt;&lt;/w:tcMar&gt;&lt;w:vAlign w:val="center"/&gt;&lt;/w:tcPr&gt;&lt;w:p&gt;&lt;w:pPr&gt;&lt;w:jc w:val="center"/&gt;&lt;w:pBdr&gt;&lt;w:bottom w:val="none" w:sz="0" w:space="0" w:color="000000"/&gt;&lt;w:top w:val="none" w:sz="0" w:space="0" w:color="000000"/&gt;&lt;w:left w:val="none" w:sz="0" w:space="0" w:color="000000"/&gt;&lt;w:right w:val="none" w:sz="0" w:space="0" w:color="000000"/&gt;&lt;/w:pBdr&gt;&lt;w:spacing w:after="80" w:before="80" w:line="240"/&gt;&lt;w:ind w:left="80" w:right="80" w:firstLine="0" w:firstLineChars="0"/&gt;&lt;w:rPr&gt;&lt;w:rFonts w:ascii="Arial" w:hAnsi="Arial" w:eastAsia="Arial" w:cs="Arial"/&gt;&lt;w:i w:val="false"/&gt;&lt;w:b w:val="false"/&gt;&lt;w:u w:val="none"/&gt;&lt;w:strike w:val="false"/&gt;&lt;w:sz w:val="18"/&gt;&lt;w:szCs w:val="18"/&gt;&lt;w:color w:val="000000"/&gt;&lt;/w:rPr&gt;&lt;/w:pPr&gt;&lt;w:r xmlns:w="http://schemas.openxmlformats.org/wordprocessingml/2006/main" xmlns:wp="http://schemas.openxmlformats.org/drawingml/2006/wordprocessingDrawing" xmlns:r="http://schemas.openxmlformats.org/officeDocument/2006/relationships" xmlns:w14="http://schemas.microsoft.com/office/word/2010/wordml"&gt;&lt;w:rPr&gt;&lt;w:rFonts w:ascii="Arial" w:hAnsi="Arial" w:eastAsia="Arial" w:cs="Arial"/&gt;&lt;w:i w:val="false"/&gt;&lt;w:b w:val="false"/&gt;&lt;w:u w:val="none"/&gt;&lt;w:strike w:val="false"/&gt;&lt;w:sz w:val="18"/&gt;&lt;w:szCs w:val="18"/&gt;&lt;w:color w:val="000000"/&gt;&lt;/w:rPr&gt;&lt;w:t xml:space="preserve"&gt;-0.0074&lt;/w:t&gt;&lt;/w:r&gt;&lt;/w:p&gt;&lt;/w:tc&gt;&lt;w:tc&gt;&lt;w:tcPr&gt;&lt;w:tcBorders&gt;&lt;w:bottom w:val="none" w:sz="0" w:space="0" w:color="000000"/&gt;&lt;w:top w:val="none" w:sz="0" w:space="0" w:color="000000"/&gt;&lt;w:left w:val="none" w:sz="0" w:space="0" w:color="000000"/&gt;&lt;w:right w:val="none" w:sz="0" w:space="0" w:color="000000"/&gt;&lt;/w:tcBorders&gt;&lt;w:shd w:val="clear" w:color="auto" w:fill="FFFFFF"/&gt;&lt;w:tcMar&gt;&lt;w:top w:w="0" w:type="dxa"/&gt;&lt;w:bottom w:w="0" w:type="dxa"/&gt;&lt;w:left w:w="0" w:type="dxa"/&gt;&lt;w:right w:w="0" w:type="dxa"/&gt;&lt;/w:tcMar&gt;&lt;w:vAlign w:val="center"/&gt;&lt;/w:tcPr&gt;&lt;w:p&gt;&lt;w:pPr&gt;&lt;w:jc w:val="center"/&gt;&lt;w:pBdr&gt;&lt;w:bottom w:val="none" w:sz="0" w:space="0" w:color="000000"/&gt;&lt;w:top w:val="none" w:sz="0" w:space="0" w:color="000000"/&gt;&lt;w:left w:val="none" w:sz="0" w:space="0" w:color="000000"/&gt;&lt;w:right w:val="none" w:sz="0" w:space="0" w:color="000000"/&gt;&lt;/w:pBdr&gt;&lt;w:spacing w:after="80" w:before="80" w:line="240"/&gt;&lt;w:ind w:left="80" w:right="80" w:firstLine="0" w:firstLineChars="0"/&gt;&lt;w:rPr&gt;&lt;w:rFonts w:ascii="Arial" w:hAnsi="Arial" w:eastAsia="Arial" w:cs="Arial"/&gt;&lt;w:i w:val="false"/&gt;&lt;w:b w:val="false"/&gt;&lt;w:u w:val="none"/&gt;&lt;w:strike w:val="false"/&gt;&lt;w:sz w:val="18"/&gt;&lt;w:szCs w:val="18"/&gt;&lt;w:color w:val="000000"/&gt;&lt;/w:rPr&gt;&lt;/w:pPr&gt;&lt;w:r xmlns:w="http://schemas.openxmlformats.org/wordprocessingml/2006/main" xmlns:wp="http://schemas.openxmlformats.org/drawingml/2006/wordprocessingDrawing" xmlns:r="http://schemas.openxmlformats.org/officeDocument/2006/relationships" xmlns:w14="http://schemas.microsoft.com/office/word/2010/wordml"&gt;&lt;w:rPr&gt;&lt;w:rFonts w:ascii="Arial" w:hAnsi="Arial" w:eastAsia="Arial" w:cs="Arial"/&gt;&lt;w:i w:val="false"/&gt;&lt;w:b w:val="false"/&gt;&lt;w:u w:val="none"/&gt;&lt;w:strike w:val="false"/&gt;&lt;w:sz w:val="18"/&gt;&lt;w:szCs w:val="18"/&gt;&lt;w:color w:val="000000"/&gt;&lt;/w:rPr&gt;&lt;w:t xml:space="preserve"&gt;-0.0254&lt;/w:t&gt;&lt;/w:r&gt;&lt;/w:p&gt;&lt;/w:tc&gt;&lt;w:tc&gt;&lt;w:tcPr&gt;&lt;w:tcBorders&gt;&lt;w:bottom w:val="none" w:sz="0" w:space="0" w:color="000000"/&gt;&lt;w:top w:val="none" w:sz="0" w:space="0" w:color="000000"/&gt;&lt;w:left w:val="none" w:sz="0" w:space="0" w:color="000000"/&gt;&lt;w:right w:val="none" w:sz="0" w:space="0" w:color="000000"/&gt;&lt;/w:tcBorders&gt;&lt;w:shd w:val="clear" w:color="auto" w:fill="FFFFFF"/&gt;&lt;w:tcMar&gt;&lt;w:top w:w="0" w:type="dxa"/&gt;&lt;w:bottom w:w="0" w:type="dxa"/&gt;&lt;w:left w:w="0" w:type="dxa"/&gt;&lt;w:right w:w="0" w:type="dxa"/&gt;&lt;/w:tcMar&gt;&lt;w:vAlign w:val="center"/&gt;&lt;/w:tcPr&gt;&lt;w:p&gt;&lt;w:pPr&gt;&lt;w:jc w:val="center"/&gt;&lt;w:pBdr&gt;&lt;w:bottom w:val="none" w:sz="0" w:space="0" w:color="000000"/&gt;&lt;w:top w:val="none" w:sz="0" w:space="0" w:color="000000"/&gt;&lt;w:left w:val="none" w:sz="0" w:space="0" w:color="000000"/&gt;&lt;w:right w:val="none" w:sz="0" w:space="0" w:color="000000"/&gt;&lt;/w:pBdr&gt;&lt;w:spacing w:after="80" w:before="80" w:line="240"/&gt;&lt;w:ind w:left="80" w:right="80" w:firstLine="0" w:firstLineChars="0"/&gt;&lt;w:rPr&gt;&lt;w:rFonts w:ascii="Arial" w:hAnsi="Arial" w:eastAsia="Arial" w:cs="Arial"/&gt;&lt;w:i w:val="false"/&gt;&lt;w:b w:val="false"/&gt;&lt;w:u w:val="none"/&gt;&lt;w:strike w:val="false"/&gt;&lt;w:sz w:val="18"/&gt;&lt;w:szCs w:val="18"/&gt;&lt;w:color w:val="000000"/&gt;&lt;/w:rPr&gt;&lt;/w:pPr&gt;&lt;w:r xmlns:w="http://schemas.openxmlformats.org/wordprocessingml/2006/main" xmlns:wp="http://schemas.openxmlformats.org/drawingml/2006/wordprocessingDrawing" xmlns:r="http://schemas.openxmlformats.org/officeDocument/2006/relationships" xmlns:w14="http://schemas.microsoft.com/office/word/2010/wordml"&gt;&lt;w:rPr&gt;&lt;w:rFonts w:ascii="Arial" w:hAnsi="Arial" w:eastAsia="Arial" w:cs="Arial"/&gt;&lt;w:i w:val="false"/&gt;&lt;w:b w:val="false"/&gt;&lt;w:u w:val="none"/&gt;&lt;w:strike w:val="false"/&gt;&lt;w:sz w:val="18"/&gt;&lt;w:szCs w:val="18"/&gt;&lt;w:color w:val="000000"/&gt;&lt;/w:rPr&gt;&lt;w:t xml:space="preserve"&gt;0.0106&lt;/w:t&gt;&lt;/w:r&gt;&lt;/w:p&gt;&lt;/w:tc&gt;&lt;w:tc&gt;&lt;w:tcPr&gt;&lt;w:tcBorders&gt;&lt;w:bottom w:val="none" w:sz="0" w:space="0" w:color="000000"/&gt;&lt;w:top w:val="none" w:sz="0" w:space="0" w:color="000000"/&gt;&lt;w:left w:val="none" w:sz="0" w:space="0" w:color="000000"/&gt;&lt;w:right w:val="none" w:sz="0" w:space="0" w:color="000000"/&gt;&lt;/w:tcBorders&gt;&lt;w:shd w:val="clear" w:color="auto" w:fill="FFFFFF"/&gt;&lt;w:tcMar&gt;&lt;w:top w:w="0" w:type="dxa"/&gt;&lt;w:bottom w:w="0" w:type="dxa"/&gt;&lt;w:left w:w="0" w:type="dxa"/&gt;&lt;w:right w:w="0" w:type="dxa"/&gt;&lt;/w:tcMar&gt;&lt;w:vAlign w:val="center"/&gt;&lt;/w:tcPr&gt;&lt;w:p&gt;&lt;w:pPr&gt;&lt;w:jc w:val="center"/&gt;&lt;w:pBdr&gt;&lt;w:bottom w:val="none" w:sz="0" w:space="0" w:color="000000"/&gt;&lt;w:top w:val="none" w:sz="0" w:space="0" w:color="000000"/&gt;&lt;w:left w:val="none" w:sz="0" w:space="0" w:color="000000"/&gt;&lt;w:right w:val="none" w:sz="0" w:space="0" w:color="000000"/&gt;&lt;/w:pBdr&gt;&lt;w:spacing w:after="80" w:before="80" w:line="240"/&gt;&lt;w:ind w:left="80" w:right="80" w:firstLine="0" w:firstLineChars="0"/&gt;&lt;w:rPr&gt;&lt;w:rFonts w:ascii="Arial" w:hAnsi="Arial" w:eastAsia="Arial" w:cs="Arial"/&gt;&lt;w:i w:val="false"/&gt;&lt;w:b w:val="false"/&gt;&lt;w:u w:val="none"/&gt;&lt;w:strike w:val="false"/&gt;&lt;w:sz w:val="18"/&gt;&lt;w:szCs w:val="18"/&gt;&lt;w:color w:val="000000"/&gt;&lt;/w:rPr&gt;&lt;/w:pPr&gt;&lt;w:r xmlns:w="http://schemas.openxmlformats.org/wordprocessingml/2006/main" xmlns:wp="http://schemas.openxmlformats.org/drawingml/2006/wordprocessingDrawing" xmlns:r="http://schemas.openxmlformats.org/officeDocument/2006/relationships" xmlns:w14="http://schemas.microsoft.com/office/word/2010/wordml"&gt;&lt;w:rPr&gt;&lt;w:rFonts w:ascii="Arial" w:hAnsi="Arial" w:eastAsia="Arial" w:cs="Arial"/&gt;&lt;w:i w:val="false"/&gt;&lt;w:b w:val="false"/&gt;&lt;w:u w:val="none"/&gt;&lt;w:strike w:val="false"/&gt;&lt;w:sz w:val="18"/&gt;&lt;w:szCs w:val="18"/&gt;&lt;w:color w:val="000000"/&gt;&lt;/w:rPr&gt;&lt;w:t xml:space="preserve"&gt;0.055&lt;/w:t&gt;&lt;/w:r&gt;&lt;/w:p&gt;&lt;/w:tc&gt;&lt;w:tc&gt;&lt;w:tcPr&gt;&lt;w:tcBorders&gt;&lt;w:bottom w:val="none" w:sz="0" w:space="0" w:color="000000"/&gt;&lt;w:top w:val="none" w:sz="0" w:space="0" w:color="000000"/&gt;&lt;w:left w:val="none" w:sz="0" w:space="0" w:color="000000"/&gt;&lt;w:right w:val="none" w:sz="0" w:space="0" w:color="000000"/&gt;&lt;/w:tcBorders&gt;&lt;w:shd w:val="clear" w:color="auto" w:fill="FFFFFF"/&gt;&lt;w:tcMar&gt;&lt;w:top w:w="0" w:type="dxa"/&gt;&lt;w:bottom w:w="0" w:type="dxa"/&gt;&lt;w:left w:w="0" w:type="dxa"/&gt;&lt;w:right w:w="0" w:type="dxa"/&gt;&lt;/w:tcMar&gt;&lt;w:vAlign w:val="center"/&gt;&lt;/w:tcPr&gt;&lt;w:p&gt;&lt;w:pPr&gt;&lt;w:jc w:val="center"/&gt;&lt;w:pBdr&gt;&lt;w:bottom w:val="none" w:sz="0" w:space="0" w:color="000000"/&gt;&lt;w:top w:val="none" w:sz="0" w:space="0" w:color="000000"/&gt;&lt;w:left w:val="none" w:sz="0" w:space="0" w:color="000000"/&gt;&lt;w:right w:val="none" w:sz="0" w:space="0" w:color="000000"/&gt;&lt;/w:pBdr&gt;&lt;w:spacing w:after="80" w:before="80" w:line="240"/&gt;&lt;w:ind w:left="80" w:right="80" w:firstLine="0" w:firstLineChars="0"/&gt;&lt;w:rPr&gt;&lt;w:rFonts w:ascii="Arial" w:hAnsi="Arial" w:eastAsia="Arial" w:cs="Arial"/&gt;&lt;w:i w:val="false"/&gt;&lt;w:b w:val="false"/&gt;&lt;w:u w:val="none"/&gt;&lt;w:strike w:val="false"/&gt;&lt;w:sz w:val="18"/&gt;&lt;w:szCs w:val="18"/&gt;&lt;w:color w:val="000000"/&gt;&lt;/w:rPr&gt;&lt;/w:pPr&gt;&lt;w:r xmlns:w="http://schemas.openxmlformats.org/wordprocessingml/2006/main" xmlns:wp="http://schemas.openxmlformats.org/drawingml/2006/wordprocessingDrawing" xmlns:r="http://schemas.openxmlformats.org/officeDocument/2006/relationships" xmlns:w14="http://schemas.microsoft.com/office/word/2010/wordml"&gt;&lt;w:rPr&gt;&lt;w:rFonts w:ascii="Arial" w:hAnsi="Arial" w:eastAsia="Arial" w:cs="Arial"/&gt;&lt;w:i w:val="false"/&gt;&lt;w:b w:val="false"/&gt;&lt;w:u w:val="none"/&gt;&lt;w:strike w:val="false"/&gt;&lt;w:sz w:val="18"/&gt;&lt;w:szCs w:val="18"/&gt;&lt;w:color w:val="000000"/&gt;&lt;/w:rPr&gt;&lt;w:t xml:space="preserve"&gt;no&lt;/w:t&gt;&lt;/w:r&gt;&lt;/w:p&gt;&lt;/w:tc&gt;&lt;w:tc&gt;&lt;w:tcPr&gt;&lt;w:tcBorders&gt;&lt;w:bottom w:val="none" w:sz="0" w:space="0" w:color="000000"/&gt;&lt;w:top w:val="none" w:sz="0" w:space="0" w:color="000000"/&gt;&lt;w:left w:val="none" w:sz="0" w:space="0" w:color="000000"/&gt;&lt;w:right w:val="none" w:sz="0" w:space="0" w:color="000000"/&gt;&lt;/w:tcBorders&gt;&lt;w:shd w:val="clear" w:color="auto" w:fill="FFFFFF"/&gt;&lt;w:tcMar&gt;&lt;w:top w:w="0" w:type="dxa"/&gt;&lt;w:bottom w:w="0" w:type="dxa"/&gt;&lt;w:left w:w="0" w:type="dxa"/&gt;&lt;w:right w:w="0" w:type="dxa"/&gt;&lt;/w:tcMar&gt;&lt;w:vAlign w:val="center"/&gt;&lt;/w:tcPr&gt;&lt;w:p&gt;&lt;w:pPr&gt;&lt;w:jc w:val="center"/&gt;&lt;w:pBdr&gt;&lt;w:bottom w:val="none" w:sz="0" w:space="0" w:color="000000"/&gt;&lt;w:top w:val="none" w:sz="0" w:space="0" w:color="000000"/&gt;&lt;w:left w:val="none" w:sz="0" w:space="0" w:color="000000"/&gt;&lt;w:right w:val="none" w:sz="0" w:space="0" w:color="000000"/&gt;&lt;/w:pBdr&gt;&lt;w:spacing w:after="80" w:before="80" w:line="240"/&gt;&lt;w:ind w:left="80" w:right="80" w:firstLine="0" w:firstLineChars="0"/&gt;&lt;w:rPr&gt;&lt;w:rFonts w:ascii="Arial" w:hAnsi="Arial" w:eastAsia="Arial" w:cs="Arial"/&gt;&lt;w:i w:val="false"/&gt;&lt;w:b w:val="false"/&gt;&lt;w:u w:val="none"/&gt;&lt;w:strike w:val="false"/&gt;&lt;w:sz w:val="18"/&gt;&lt;w:szCs w:val="18"/&gt;&lt;w:color w:val="000000"/&gt;&lt;/w:rPr&gt;&lt;/w:pPr&gt;&lt;w:r xmlns:w="http://schemas.openxmlformats.org/wordprocessingml/2006/main" xmlns:wp="http://schemas.openxmlformats.org/drawingml/2006/wordprocessingDrawing" xmlns:r="http://schemas.openxmlformats.org/officeDocument/2006/relationships" xmlns:w14="http://schemas.microsoft.com/office/word/2010/wordml"&gt;&lt;w:rPr&gt;&lt;w:rFonts w:ascii="Arial" w:hAnsi="Arial" w:eastAsia="Arial" w:cs="Arial"/&gt;&lt;w:i w:val="false"/&gt;&lt;w:b w:val="false"/&gt;&lt;w:u w:val="none"/&gt;&lt;w:strike w:val="false"/&gt;&lt;w:sz w:val="18"/&gt;&lt;w:szCs w:val="18"/&gt;&lt;w:color w:val="000000"/&gt;&lt;/w:rPr&gt;&lt;w:t xml:space="preserve"&gt;12&lt;/w:t&gt;&lt;/w:r&gt;&lt;/w:p&gt;&lt;/w:tc&gt;&lt;/w:tr&gt;&lt;w:tr&gt;&lt;w:trPr&gt;&lt;w:trHeight w:val="360" w:hRule="auto"/&gt;&lt;/w:trPr&gt;&lt;w:tc&gt;&lt;w:tcPr&gt;&lt;w:tcBorders&gt;&lt;w:bottom w:val="single" w:sz="16" w:space="0" w:color="000000"/&gt;&lt;w:top w:val="none" w:sz="0" w:space="0" w:color="000000"/&gt;&lt;w:left w:val="none" w:sz="0" w:space="0" w:color="000000"/&gt;&lt;w:right w:val="none" w:sz="0" w:space="0" w:color="000000"/&gt;&lt;/w:tcBorders&gt;&lt;w:shd w:val="clear" w:color="auto" w:fill="FFFFFF"/&gt;&lt;w:tcMar&gt;&lt;w:top w:w="0" w:type="dxa"/&gt;&lt;w:bottom w:w="0" w:type="dxa"/&gt;&lt;w:left w:w="0" w:type="dxa"/&gt;&lt;w:right w:w="0" w:type="dxa"/&gt;&lt;/w:tcMar&gt;&lt;w:vAlign w:val="center"/&gt;&lt;/w:tcPr&gt;&lt;w:p&gt;&lt;w:pPr&gt;&lt;w:jc w:val="left"/&gt;&lt;w:pBdr&gt;&lt;w:bottom w:val="none" w:sz="0" w:space="0" w:color="000000"/&gt;&lt;w:top w:val="none" w:sz="0" w:space="0" w:color="000000"/&gt;&lt;w:left w:val="none" w:sz="0" w:space="0" w:color="000000"/&gt;&lt;w:right w:val="none" w:sz="0" w:space="0" w:color="000000"/&gt;&lt;/w:pBdr&gt;&lt;w:spacing w:after="80" w:before="80" w:line="240"/&gt;&lt;w:ind w:left="80" w:right="80" w:firstLine="0" w:firstLineChars="0"/&gt;&lt;w:rPr&gt;&lt;w:rFonts w:ascii="Arial" w:hAnsi="Arial" w:eastAsia="Arial" w:cs="Arial"/&gt;&lt;w:i w:val="false"/&gt;&lt;w:b w:val="false"/&gt;&lt;w:u w:val="none"/&gt;&lt;w:strike w:val="false"/&gt;&lt;w:sz w:val="18"/&gt;&lt;w:szCs w:val="18"/&gt;&lt;w:color w:val="000000"/&gt;&lt;/w:rPr&gt;&lt;/w:pPr&gt;&lt;w:r xmlns:w="http://schemas.openxmlformats.org/wordprocessingml/2006/main" xmlns:wp="http://schemas.openxmlformats.org/drawingml/2006/wordprocessingDrawing" xmlns:r="http://schemas.openxmlformats.org/officeDocument/2006/relationships" xmlns:w14="http://schemas.microsoft.com/office/word/2010/wordml"&gt;&lt;w:rPr&gt;&lt;w:rFonts w:ascii="Arial" w:hAnsi="Arial" w:eastAsia="Arial" w:cs="Arial"/&gt;&lt;w:i w:val="false"/&gt;&lt;w:b w:val="false"/&gt;&lt;w:u w:val="none"/&gt;&lt;w:strike w:val="false"/&gt;&lt;w:sz w:val="18"/&gt;&lt;w:szCs w:val="18"/&gt;&lt;w:color w:val="000000"/&gt;&lt;/w:rPr&gt;&lt;w:t xml:space="preserve"&gt;dADI&lt;/w:t&gt;&lt;/w:r&gt;&lt;/w:p&gt;&lt;/w:tc&gt;&lt;w:tc&gt;&lt;w:tcPr&gt;&lt;w:tcBorders&gt;&lt;w:bottom w:val="single" w:sz="16" w:space="0" w:color="000000"/&gt;&lt;w:top w:val="none" w:sz="0" w:space="0" w:color="000000"/&gt;&lt;w:left w:val="none" w:sz="0" w:space="0" w:color="000000"/&gt;&lt;w:right w:val="none" w:sz="0" w:space="0" w:color="000000"/&gt;&lt;/w:tcBorders&gt;&lt;w:shd w:val="clear" w:color="auto" w:fill="FFFFFF"/&gt;&lt;w:tcMar&gt;&lt;w:top w:w="0" w:type="dxa"/&gt;&lt;w:bottom w:w="0" w:type="dxa"/&gt;&lt;w:left w:w="0" w:type="dxa"/&gt;&lt;w:right w:w="0" w:type="dxa"/&gt;&lt;/w:tcMar&gt;&lt;w:vAlign w:val="center"/&gt;&lt;/w:tcPr&gt;&lt;w:p&gt;&lt;w:pPr&gt;&lt;w:jc w:val="center"/&gt;&lt;w:pBdr&gt;&lt;w:bottom w:val="none" w:sz="0" w:space="0" w:color="000000"/&gt;&lt;w:top w:val="none" w:sz="0" w:space="0" w:color="000000"/&gt;&lt;w:left w:val="none" w:sz="0" w:space="0" w:color="000000"/&gt;&lt;w:right w:val="none" w:sz="0" w:space="0" w:color="000000"/&gt;&lt;/w:pBdr&gt;&lt;w:spacing w:after="80" w:before="80" w:line="240"/&gt;&lt;w:ind w:left="80" w:right="80" w:firstLine="0" w:firstLineChars="0"/&gt;&lt;w:rPr&gt;&lt;w:rFonts w:ascii="Arial" w:hAnsi="Arial" w:eastAsia="Arial" w:cs="Arial"/&gt;&lt;w:i w:val="false"/&gt;&lt;w:b w:val="false"/&gt;&lt;w:u w:val="none"/&gt;&lt;w:strike w:val="false"/&gt;&lt;w:sz w:val="18"/&gt;&lt;w:szCs w:val="18"/&gt;&lt;w:color w:val="000000"/&gt;&lt;/w:rPr&gt;&lt;/w:pPr&gt;&lt;w:r xmlns:w="http://schemas.openxmlformats.org/wordprocessingml/2006/main" xmlns:wp="http://schemas.openxmlformats.org/drawingml/2006/wordprocessingDrawing" xmlns:r="http://schemas.openxmlformats.org/officeDocument/2006/relationships" xmlns:w14="http://schemas.microsoft.com/office/word/2010/wordml"&gt;&lt;w:rPr&gt;&lt;w:rFonts w:ascii="Arial" w:hAnsi="Arial" w:eastAsia="Arial" w:cs="Arial"/&gt;&lt;w:i w:val="false"/&gt;&lt;w:b w:val="false"/&gt;&lt;w:u w:val="none"/&gt;&lt;w:strike w:val="false"/&gt;&lt;w:sz w:val="18"/&gt;&lt;w:szCs w:val="18"/&gt;&lt;w:color w:val="000000"/&gt;&lt;/w:rPr&gt;&lt;w:t xml:space="preserve"&gt;pasture&lt;/w:t&gt;&lt;/w:r&gt;&lt;/w:p&gt;&lt;/w:tc&gt;&lt;w:tc&gt;&lt;w:tcPr&gt;&lt;w:tcBorders&gt;&lt;w:bottom w:val="single" w:sz="16" w:space="0" w:color="000000"/&gt;&lt;w:top w:val="none" w:sz="0" w:space="0" w:color="000000"/&gt;&lt;w:left w:val="none" w:sz="0" w:space="0" w:color="000000"/&gt;&lt;w:right w:val="none" w:sz="0" w:space="0" w:color="000000"/&gt;&lt;/w:tcBorders&gt;&lt;w:shd w:val="clear" w:color="auto" w:fill="FFFFFF"/&gt;&lt;w:tcMar&gt;&lt;w:top w:w="0" w:type="dxa"/&gt;&lt;w:bottom w:w="0" w:type="dxa"/&gt;&lt;w:left w:w="0" w:type="dxa"/&gt;&lt;w:right w:w="0" w:type="dxa"/&gt;&lt;/w:tcMar&gt;&lt;w:vAlign w:val="center"/&gt;&lt;/w:tcPr&gt;&lt;w:p&gt;&lt;w:pPr&gt;&lt;w:jc w:val="center"/&gt;&lt;w:pBdr&gt;&lt;w:bottom w:val="none" w:sz="0" w:space="0" w:color="000000"/&gt;&lt;w:top w:val="none" w:sz="0" w:space="0" w:color="000000"/&gt;&lt;w:left w:val="none" w:sz="0" w:space="0" w:color="000000"/&gt;&lt;w:right w:val="none" w:sz="0" w:space="0" w:color="000000"/&gt;&lt;/w:pBdr&gt;&lt;w:spacing w:after="80" w:before="80" w:line="240"/&gt;&lt;w:ind w:left="80" w:right="80" w:firstLine="0" w:firstLineChars="0"/&gt;&lt;w:rPr&gt;&lt;w:rFonts w:ascii="Arial" w:hAnsi="Arial" w:eastAsia="Arial" w:cs="Arial"/&gt;&lt;w:i w:val="false"/&gt;&lt;w:b w:val="false"/&gt;&lt;w:u w:val="none"/&gt;&lt;w:strike w:val="false"/&gt;&lt;w:sz w:val="18"/&gt;&lt;w:szCs w:val="18"/&gt;&lt;w:color w:val="000000"/&gt;&lt;/w:rPr&gt;&lt;/w:pPr&gt;&lt;w:r xmlns:w="http://schemas.openxmlformats.org/wordprocessingml/2006/main" xmlns:wp="http://schemas.openxmlformats.org/drawingml/2006/wordprocessingDrawing" xmlns:r="http://schemas.openxmlformats.org/officeDocument/2006/relationships" xmlns:w14="http://schemas.microsoft.com/office/word/2010/wordml"&gt;&lt;w:rPr&gt;&lt;w:rFonts w:ascii="Arial" w:hAnsi="Arial" w:eastAsia="Arial" w:cs="Arial"/&gt;&lt;w:i w:val="false"/&gt;&lt;w:b w:val="false"/&gt;&lt;w:u w:val="none"/&gt;&lt;w:strike w:val="false"/&gt;&lt;w:sz w:val="18"/&gt;&lt;w:szCs w:val="18"/&gt;&lt;w:color w:val="000000"/&gt;&lt;/w:rPr&gt;&lt;w:t xml:space="preserve"&gt;-0.0048&lt;/w:t&gt;&lt;/w:r&gt;&lt;/w:p&gt;&lt;/w:tc&gt;&lt;w:tc&gt;&lt;w:tcPr&gt;&lt;w:tcBorders&gt;&lt;w:bottom w:val="single" w:sz="16" w:space="0" w:color="000000"/&gt;&lt;w:top w:val="none" w:sz="0" w:space="0" w:color="000000"/&gt;&lt;w:left w:val="none" w:sz="0" w:space="0" w:color="000000"/&gt;&lt;w:right w:val="none" w:sz="0" w:space="0" w:color="000000"/&gt;&lt;/w:tcBorders&gt;&lt;w:shd w:val="clear" w:color="auto" w:fill="FFFFFF"/&gt;&lt;w:tcMar&gt;&lt;w:top w:w="0" w:type="dxa"/&gt;&lt;w:bottom w:w="0" w:type="dxa"/&gt;&lt;w:left w:w="0" w:type="dxa"/&gt;&lt;w:right w:w="0" w:type="dxa"/&gt;&lt;/w:tcMar&gt;&lt;w:vAlign w:val="center"/&gt;&lt;/w:tcPr&gt;&lt;w:p&gt;&lt;w:pPr&gt;&lt;w:jc w:val="center"/&gt;&lt;w:pBdr&gt;&lt;w:bottom w:val="none" w:sz="0" w:space="0" w:color="000000"/&gt;&lt;w:top w:val="none" w:sz="0" w:space="0" w:color="000000"/&gt;&lt;w:left w:val="none" w:sz="0" w:space="0" w:color="000000"/&gt;&lt;w:right w:val="none" w:sz="0" w:space="0" w:color="000000"/&gt;&lt;/w:pBdr&gt;&lt;w:spacing w:after="80" w:before="80" w:line="240"/&gt;&lt;w:ind w:left="80" w:right="80" w:firstLine="0" w:firstLineChars="0"/&gt;&lt;w:rPr&gt;&lt;w:rFonts w:ascii="Arial" w:hAnsi="Arial" w:eastAsia="Arial" w:cs="Arial"/&gt;&lt;w:i w:val="false"/&gt;&lt;w:b w:val="false"/&gt;&lt;w:u w:val="none"/&gt;&lt;w:strike w:val="false"/&gt;&lt;w:sz w:val="18"/&gt;&lt;w:szCs w:val="18"/&gt;&lt;w:color w:val="000000"/&gt;&lt;/w:rPr&gt;&lt;/w:pPr&gt;&lt;w:r xmlns:w="http://schemas.openxmlformats.org/wordprocessingml/2006/main" xmlns:wp="http://schemas.openxmlformats.org/drawingml/2006/wordprocessingDrawing" xmlns:r="http://schemas.openxmlformats.org/officeDocument/2006/relationships" xmlns:w14="http://schemas.microsoft.com/office/word/2010/wordml"&gt;&lt;w:rPr&gt;&lt;w:rFonts w:ascii="Arial" w:hAnsi="Arial" w:eastAsia="Arial" w:cs="Arial"/&gt;&lt;w:i w:val="false"/&gt;&lt;w:b w:val="false"/&gt;&lt;w:u w:val="none"/&gt;&lt;w:strike w:val="false"/&gt;&lt;w:sz w:val="18"/&gt;&lt;w:szCs w:val="18"/&gt;&lt;w:color w:val="000000"/&gt;&lt;/w:rPr&gt;&lt;w:t xml:space="preserve"&gt;-0.0187&lt;/w:t&gt;&lt;/w:r&gt;&lt;/w:p&gt;&lt;/w:tc&gt;&lt;w:tc&gt;&lt;w:tcPr&gt;&lt;w:tcBorders&gt;&lt;w:bottom w:val="single" w:sz="16" w:space="0" w:color="000000"/&gt;&lt;w:top w:val="none" w:sz="0" w:space="0" w:color="000000"/&gt;&lt;w:left w:val="none" w:sz="0" w:space="0" w:color="000000"/&gt;&lt;w:right w:val="none" w:sz="0" w:space="0" w:color="000000"/&gt;&lt;/w:tcBorders&gt;&lt;w:shd w:val="clear" w:color="auto" w:fill="FFFFFF"/&gt;&lt;w:tcMar&gt;&lt;w:top w:w="0" w:type="dxa"/&gt;&lt;w:bottom w:w="0" w:type="dxa"/&gt;&lt;w:left w:w="0" w:type="dxa"/&gt;&lt;w:right w:w="0" w:type="dxa"/&gt;&lt;/w:tcMar&gt;&lt;w:vAlign w:val="center"/&gt;&lt;/w:tcPr&gt;&lt;w:p&gt;&lt;w:pPr&gt;&lt;w:jc w:val="center"/&gt;&lt;w:pBdr&gt;&lt;w:bottom w:val="none" w:sz="0" w:space="0" w:color="000000"/&gt;&lt;w:top w:val="none" w:sz="0" w:space="0" w:color="000000"/&gt;&lt;w:left w:val="none" w:sz="0" w:space="0" w:color="000000"/&gt;&lt;w:right w:val="none" w:sz="0" w:space="0" w:color="000000"/&gt;&lt;/w:pBdr&gt;&lt;w:spacing w:after="80" w:before="80" w:line="240"/&gt;&lt;w:ind w:left="80" w:right="80" w:firstLine="0" w:firstLineChars="0"/&gt;&lt;w:rPr&gt;&lt;w:rFonts w:ascii="Arial" w:hAnsi="Arial" w:eastAsia="Arial" w:cs="Arial"/&gt;&lt;w:i w:val="false"/&gt;&lt;w:b w:val="false"/&gt;&lt;w:u w:val="none"/&gt;&lt;w:strike w:val="false"/&gt;&lt;w:sz w:val="18"/&gt;&lt;w:szCs w:val="18"/&gt;&lt;w:color w:val="000000"/&gt;&lt;/w:rPr&gt;&lt;/w:pPr&gt;&lt;w:r xmlns:w="http://schemas.openxmlformats.org/wordprocessingml/2006/main" xmlns:wp="http://schemas.openxmlformats.org/drawingml/2006/wordprocessingDrawing" xmlns:r="http://schemas.openxmlformats.org/officeDocument/2006/relationships" xmlns:w14="http://schemas.microsoft.com/office/word/2010/wordml"&gt;&lt;w:rPr&gt;&lt;w:rFonts w:ascii="Arial" w:hAnsi="Arial" w:eastAsia="Arial" w:cs="Arial"/&gt;&lt;w:i w:val="false"/&gt;&lt;w:b w:val="false"/&gt;&lt;w:u w:val="none"/&gt;&lt;w:strike w:val="false"/&gt;&lt;w:sz w:val="18"/&gt;&lt;w:szCs w:val="18"/&gt;&lt;w:color w:val="000000"/&gt;&lt;/w:rPr&gt;&lt;w:t xml:space="preserve"&gt;0.0092&lt;/w:t&gt;&lt;/w:r&gt;&lt;/w:p&gt;&lt;/w:tc&gt;&lt;w:tc&gt;&lt;w:tcPr&gt;&lt;w:tcBorders&gt;&lt;w:bottom w:val="single" w:sz="16" w:space="0" w:color="000000"/&gt;&lt;w:top w:val="none" w:sz="0" w:space="0" w:color="000000"/&gt;&lt;w:left w:val="none" w:sz="0" w:space="0" w:color="000000"/&gt;&lt;w:right w:val="none" w:sz="0" w:space="0" w:color="000000"/&gt;&lt;/w:tcBorders&gt;&lt;w:shd w:val="clear" w:color="auto" w:fill="FFFFFF"/&gt;&lt;w:tcMar&gt;&lt;w:top w:w="0" w:type="dxa"/&gt;&lt;w:bottom w:w="0" w:type="dxa"/&gt;&lt;w:left w:w="0" w:type="dxa"/&gt;&lt;w:right w:w="0" w:type="dxa"/&gt;&lt;/w:tcMar&gt;&lt;w:vAlign w:val="center"/&gt;&lt;/w:tcPr&gt;&lt;w:p&gt;&lt;w:pPr&gt;&lt;w:jc w:val="center"/&gt;&lt;w:pBdr&gt;&lt;w:bottom w:val="none" w:sz="0" w:space="0" w:color="000000"/&gt;&lt;w:top w:val="none" w:sz="0" w:space="0" w:color="000000"/&gt;&lt;w:left w:val="none" w:sz="0" w:space="0" w:color="000000"/&gt;&lt;w:right w:val="none" w:sz="0" w:space="0" w:color="000000"/&gt;&lt;/w:pBdr&gt;&lt;w:spacing w:after="80" w:before="80" w:line="240"/&gt;&lt;w:ind w:left="80" w:right="80" w:firstLine="0" w:firstLineChars="0"/&gt;&lt;w:rPr&gt;&lt;w:rFonts w:ascii="Arial" w:hAnsi="Arial" w:eastAsia="Arial" w:cs="Arial"/&gt;&lt;w:i w:val="false"/&gt;&lt;w:b w:val="false"/&gt;&lt;w:u w:val="none"/&gt;&lt;w:strike w:val="false"/&gt;&lt;w:sz w:val="18"/&gt;&lt;w:szCs w:val="18"/&gt;&lt;w:color w:val="000000"/&gt;&lt;/w:rPr&gt;&lt;/w:pPr&gt;&lt;w:r xmlns:w="http://schemas.openxmlformats.org/wordprocessingml/2006/main" xmlns:wp="http://schemas.openxmlformats.org/drawingml/2006/wordprocessingDrawing" xmlns:r="http://schemas.openxmlformats.org/officeDocument/2006/relationships" xmlns:w14="http://schemas.microsoft.com/office/word/2010/wordml"&gt;&lt;w:rPr&gt;&lt;w:rFonts w:ascii="Arial" w:hAnsi="Arial" w:eastAsia="Arial" w:cs="Arial"/&gt;&lt;w:i w:val="false"/&gt;&lt;w:b w:val="false"/&gt;&lt;w:u w:val="none"/&gt;&lt;w:strike w:val="false"/&gt;&lt;w:sz w:val="18"/&gt;&lt;w:szCs w:val="18"/&gt;&lt;w:color w:val="000000"/&gt;&lt;/w:rPr&gt;&lt;w:t xml:space="preserve"&gt;0.048&lt;/w:t&gt;&lt;/w:r&gt;&lt;/w:p&gt;&lt;/w:tc&gt;&lt;w:tc&gt;&lt;w:tcPr&gt;&lt;w:tcBorders&gt;&lt;w:bottom w:val="single" w:sz="16" w:space="0" w:color="000000"/&gt;&lt;w:top w:val="none" w:sz="0" w:space="0" w:color="000000"/&gt;&lt;w:left w:val="none" w:sz="0" w:space="0" w:color="000000"/&gt;&lt;w:right w:val="none" w:sz="0" w:space="0" w:color="000000"/&gt;&lt;/w:tcBorders&gt;&lt;w:shd w:val="clear" w:color="auto" w:fill="FFFFFF"/&gt;&lt;w:tcMar&gt;&lt;w:top w:w="0" w:type="dxa"/&gt;&lt;w:bottom w:w="0" w:type="dxa"/&gt;&lt;w:left w:w="0" w:type="dxa"/&gt;&lt;w:right w:w="0" w:type="dxa"/&gt;&lt;/w:tcMar&gt;&lt;w:vAlign w:val="center"/&gt;&lt;/w:tcPr&gt;&lt;w:p&gt;&lt;w:pPr&gt;&lt;w:jc w:val="center"/&gt;&lt;w:pBdr&gt;&lt;w:bottom w:val="none" w:sz="0" w:space="0" w:color="000000"/&gt;&lt;w:top w:val="none" w:sz="0" w:space="0" w:color="000000"/&gt;&lt;w:left w:val="none" w:sz="0" w:space="0" w:color="000000"/&gt;&lt;w:right w:val="none" w:sz="0" w:space="0" w:color="000000"/&gt;&lt;/w:pBdr&gt;&lt;w:spacing w:after="80" w:before="80" w:line="240"/&gt;&lt;w:ind w:left="80" w:right="80" w:firstLine="0" w:firstLineChars="0"/&gt;&lt;w:rPr&gt;&lt;w:rFonts w:ascii="Arial" w:hAnsi="Arial" w:eastAsia="Arial" w:cs="Arial"/&gt;&lt;w:i w:val="false"/&gt;&lt;w:b w:val="false"/&gt;&lt;w:u w:val="none"/&gt;&lt;w:strike w:val="false"/&gt;&lt;w:sz w:val="18"/&gt;&lt;w:szCs w:val="18"/&gt;&lt;w:color w:val="000000"/&gt;&lt;/w:rPr&gt;&lt;/w:pPr&gt;&lt;w:r xmlns:w="http://schemas.openxmlformats.org/wordprocessingml/2006/main" xmlns:wp="http://schemas.openxmlformats.org/drawingml/2006/wordprocessingDrawing" xmlns:r="http://schemas.openxmlformats.org/officeDocument/2006/relationships" xmlns:w14="http://schemas.microsoft.com/office/word/2010/wordml"&gt;&lt;w:rPr&gt;&lt;w:rFonts w:ascii="Arial" w:hAnsi="Arial" w:eastAsia="Arial" w:cs="Arial"/&gt;&lt;w:i w:val="false"/&gt;&lt;w:b w:val="false"/&gt;&lt;w:u w:val="none"/&gt;&lt;w:strike w:val="false"/&gt;&lt;w:sz w:val="18"/&gt;&lt;w:szCs w:val="18"/&gt;&lt;w:color w:val="000000"/&gt;&lt;/w:rPr&gt;&lt;w:t xml:space="preserve"&gt;no&lt;/w:t&gt;&lt;/w:r&gt;&lt;/w:p&gt;&lt;/w:tc&gt;&lt;w:tc&gt;&lt;w:tcPr&gt;&lt;w:tcBorders&gt;&lt;w:bottom w:val="single" w:sz="16" w:space="0" w:color="000000"/&gt;&lt;w:top w:val="none" w:sz="0" w:space="0" w:color="000000"/&gt;&lt;w:left w:val="none" w:sz="0" w:space="0" w:color="000000"/&gt;&lt;w:right w:val="none" w:sz="0" w:space="0" w:color="000000"/&gt;&lt;/w:tcBorders&gt;&lt;w:shd w:val="clear" w:color="auto" w:fill="FFFFFF"/&gt;&lt;w:tcMar&gt;&lt;w:top w:w="0" w:type="dxa"/&gt;&lt;w:bottom w:w="0" w:type="dxa"/&gt;&lt;w:left w:w="0" w:type="dxa"/&gt;&lt;w:right w:w="0" w:type="dxa"/&gt;&lt;/w:tcMar&gt;&lt;w:vAlign w:val="center"/&gt;&lt;/w:tcPr&gt;&lt;w:p&gt;&lt;w:pPr&gt;&lt;w:jc w:val="center"/&gt;&lt;w:pBdr&gt;&lt;w:bottom w:val="none" w:sz="0" w:space="0" w:color="000000"/&gt;&lt;w:top w:val="none" w:sz="0" w:space="0" w:color="000000"/&gt;&lt;w:left w:val="none" w:sz="0" w:space="0" w:color="000000"/&gt;&lt;w:right w:val="none" w:sz="0" w:space="0" w:color="000000"/&gt;&lt;/w:pBdr&gt;&lt;w:spacing w:after="80" w:before="80" w:line="240"/&gt;&lt;w:ind w:left="80" w:right="80" w:firstLine="0" w:firstLineChars="0"/&gt;&lt;w:rPr&gt;&lt;w:rFonts w:ascii="Arial" w:hAnsi="Arial" w:eastAsia="Arial" w:cs="Arial"/&gt;&lt;w:i w:val="false"/&gt;&lt;w:b w:val="false"/&gt;&lt;w:u w:val="none"/&gt;&lt;w:strike w:val="false"/&gt;&lt;w:sz w:val="18"/&gt;&lt;w:szCs w:val="18"/&gt;&lt;w:color w:val="000000"/&gt;&lt;/w:rPr&gt;&lt;/w:pPr&gt;&lt;w:r xmlns:w="http://schemas.openxmlformats.org/wordprocessingml/2006/main" xmlns:wp="http://schemas.openxmlformats.org/drawingml/2006/wordprocessingDrawing" xmlns:r="http://schemas.openxmlformats.org/officeDocument/2006/relationships" xmlns:w14="http://schemas.microsoft.com/office/word/2010/wordml"&gt;&lt;w:rPr&gt;&lt;w:rFonts w:ascii="Arial" w:hAnsi="Arial" w:eastAsia="Arial" w:cs="Arial"/&gt;&lt;w:i w:val="false"/&gt;&lt;w:b w:val="false"/&gt;&lt;w:u w:val="none"/&gt;&lt;w:strike w:val="false"/&gt;&lt;w:sz w:val="18"/&gt;&lt;w:szCs w:val="18"/&gt;&lt;w:color w:val="000000"/&gt;&lt;/w:rPr&gt;&lt;w:t xml:space="preserve"&gt;10&lt;/w:t&gt;&lt;/w:r&gt;&lt;/w:p&gt;&lt;/w:tc&gt;&lt;/w:tr&gt;&lt;/w:tbl&gt;</w:t>
+        <w:t xml:space="preserve">Results</w:t>
       </w:r>
     </w:p>
-    <w:bookmarkStart w:id="28" w:name="acoustic-indices-and-time-of-day"/>
+    <w:bookmarkStart w:id="29" w:name="acoustic-indices-and-recorder-distance"/>
     <w:p>
       <w:pPr>
         <w:pStyle w:val="Heading2"/>
       </w:pPr>
       <w:r>
-        <w:t xml:space="preserve">Acoustic indices and time of day</w:t>
+        <w:t xml:space="preserve">Acoustic indices and recorder distance</w:t>
       </w:r>
     </w:p>
     <w:p>
@@ -2245,6 +2130,3228 @@
         <w:pStyle w:val="FirstParagraph"/>
       </w:pPr>
       <w:r>
+        <w:t xml:space="preserve">For every within-habitat recorder pair we took the absolute difference in each index and asked whether</w:t>
+      </w:r>
+      <w:r>
+        <w:t xml:space="preserve"> </w:t>
+      </w:r>
+      <w:r>
+        <w:t xml:space="preserve">it grows with distance. In</w:t>
+      </w:r>
+      <w:r>
+        <w:t xml:space="preserve"> </w:t>
+      </w:r>
+      <w:r>
+        <w:rPr>
+          <w:b/>
+          <w:bCs/>
+        </w:rPr>
+        <w:t xml:space="preserve">Figure 1</w:t>
+      </w:r>
+      <w:r>
+        <w:t xml:space="preserve"> </w:t>
+      </w:r>
+      <w:r>
+        <w:t xml:space="preserve">the lines are the mixed-model fits with 95% bands; points are</w:t>
+      </w:r>
+      <w:r>
+        <w:t xml:space="preserve"> </w:t>
+      </w:r>
+      <w:r>
+        <w:t xml:space="preserve">adjusted for the day random effect, and the symbol marks the first or second replicate day. All three</w:t>
+      </w:r>
+      <w:r>
+        <w:t xml:space="preserve"> </w:t>
+      </w:r>
+      <w:r>
+        <w:t xml:space="preserve">indices are</w:t>
+      </w:r>
+      <w:r>
+        <w:t xml:space="preserve"> </w:t>
+      </w:r>
+      <w:r>
+        <w:rPr>
+          <w:b/>
+          <w:bCs/>
+        </w:rPr>
+        <w:t xml:space="preserve">flat</w:t>
+      </w:r>
+      <w:r>
+        <w:t xml:space="preserve">: none of the slopes differs from zero (Table 2). The cheap indices do</w:t>
+      </w:r>
+      <w:r>
+        <w:t xml:space="preserve"> </w:t>
+      </w:r>
+      <w:r>
+        <w:rPr>
+          <w:b/>
+          <w:bCs/>
+        </w:rPr>
+        <w:t xml:space="preserve">not</w:t>
+      </w:r>
+      <w:r>
+        <w:t xml:space="preserve"> </w:t>
+      </w:r>
+      <w:r>
+        <w:t xml:space="preserve">change with recorder distance over 15–60 m (H1 not supported for the indices).</w:t>
+      </w:r>
+    </w:p>
+    <w:p>
+      <w:pPr>
+        <w:pStyle w:val="CaptionedFigure"/>
+      </w:pPr>
+      <w:r>
+        <w:drawing>
+          <wp:inline>
+            <wp:extent cx="5334000" cy="2129895"/>
+            <wp:effectExtent b="0" l="0" r="0" t="0"/>
+            <wp:docPr descr="Figure 1. Difference in each acoustic index (ACI, BI, ADI) between two recorders vs distance, forest vs pasture (≤60 m). Mixed-model fit + 95% band; points day-adjusted, shape = replicate day." title="" id="27" name="Picture"/>
+            <a:graphic>
+              <a:graphicData uri="http://schemas.openxmlformats.org/drawingml/2006/picture">
+                <pic:pic>
+                  <pic:nvPicPr>
+                    <pic:cNvPr descr="tandayapa_spacing_biodiversity_report_files/tandayapa_spacing_biodiversity_report_files/figure-docx/index-fig-1.png" id="28" name="Picture"/>
+                    <pic:cNvPicPr>
+                      <a:picLocks noChangeArrowheads="1" noChangeAspect="1"/>
+                    </pic:cNvPicPr>
+                  </pic:nvPicPr>
+                  <pic:blipFill>
+                    <a:blip r:embed="rId26"/>
+                    <a:stretch>
+                      <a:fillRect/>
+                    </a:stretch>
+                  </pic:blipFill>
+                  <pic:spPr bwMode="auto">
+                    <a:xfrm>
+                      <a:off x="0" y="0"/>
+                      <a:ext cx="5334000" cy="2129895"/>
+                    </a:xfrm>
+                    <a:prstGeom prst="rect">
+                      <a:avLst/>
+                    </a:prstGeom>
+                    <a:noFill/>
+                    <a:ln w="9525">
+                      <a:noFill/>
+                      <a:headEnd/>
+                      <a:tailEnd/>
+                    </a:ln>
+                  </pic:spPr>
+                </pic:pic>
+              </a:graphicData>
+            </a:graphic>
+          </wp:inline>
+        </w:drawing>
+      </w:r>
+    </w:p>
+    <w:p>
+      <w:pPr>
+        <w:pStyle w:val="ImageCaption"/>
+      </w:pPr>
+      <w:r>
+        <w:t xml:space="preserve">Figure 1. Difference in each acoustic index (ACI, BI, ADI) between two recorders vs distance, forest vs pasture (≤60 m). Mixed-model fit + 95% band; points day-adjusted, shape = replicate day.</w:t>
+      </w:r>
+    </w:p>
+    <w:p xmlns:w="http://schemas.openxmlformats.org/wordprocessingml/2006/main" xmlns:wp="http://schemas.openxmlformats.org/drawingml/2006/wordprocessingDrawing" xmlns:r="http://schemas.openxmlformats.org/officeDocument/2006/relationships" xmlns:w14="http://schemas.microsoft.com/office/word/2010/wordml">
+      <w:pPr>
+        <w:pStyle w:val="TableCaption"/>
+        <w:jc w:val="center"/>
+        <w:keepNext/>
+        <w:pBdr>
+          <w:bottom w:val="none" w:sz="0" w:space="0" w:color="000000"/>
+          <w:top w:val="none" w:sz="0" w:space="0" w:color="000000"/>
+          <w:left w:val="none" w:sz="0" w:space="0" w:color="000000"/>
+          <w:right w:val="none" w:sz="0" w:space="0" w:color="000000"/>
+        </w:pBdr>
+        <w:spacing w:after="60" w:before="60" w:line="240"/>
+        <w:ind w:left="60" w:right="60" w:firstLine="0" w:firstLineChars="0"/>
+      </w:pPr>
+      <w:r>
+        <w:t xml:space="preserve">Table 2. Distance effect on each acoustic-index difference (mixed model, ≤60 m). 'CI excl 0 = yes' would mean the index changes with distance; here every row is 'no'.</w:t>
+      </w:r>
+    </w:p>
+    <w:tbl xmlns:w="http://schemas.openxmlformats.org/wordprocessingml/2006/main" xmlns:r="http://schemas.openxmlformats.org/officeDocument/2006/relationships" xmlns:w14="http://schemas.microsoft.com/office/word/2010/wordml" xmlns:wp="http://schemas.openxmlformats.org/drawingml/2006/wordprocessingDrawing" xmlns:a="http://schemas.openxmlformats.org/drawingml/2006/main" xmlns:pic="http://schemas.openxmlformats.org/drawingml/2006/picture">
+      <w:tblPr>
+        <w:tblLayout w:type="autofit"/>
+        <w:jc w:val="center"/>
+        <w:tblW w:type="pct" w:w="5000"/>
+        <w:tblLook w:firstRow="1" w:lastRow="0" w:firstColumn="0" w:lastColumn="0" w:noHBand="0" w:noVBand="1"/>
+      </w:tblPr>
+      <w:tr>
+        <w:trPr>
+          <w:trHeight w:val="360" w:hRule="auto"/>
+          <w:tblHeader/>
+        </w:trPr>
+        <w:tc>
+          <w:tcPr>
+            <w:tcBorders>
+              <w:bottom w:val="single" w:sz="8" w:space="0" w:color="000000"/>
+              <w:top w:val="single" w:sz="16" w:space="0" w:color="000000"/>
+              <w:left w:val="none" w:sz="0" w:space="0" w:color="000000"/>
+              <w:right w:val="none" w:sz="0" w:space="0" w:color="000000"/>
+            </w:tcBorders>
+            <w:shd w:val="clear" w:color="auto" w:fill="FFFFFF"/>
+            <w:tcMar>
+              <w:top w:w="0" w:type="dxa"/>
+              <w:bottom w:w="0" w:type="dxa"/>
+              <w:left w:w="0" w:type="dxa"/>
+              <w:right w:w="0" w:type="dxa"/>
+            </w:tcMar>
+            <w:vAlign w:val="center"/>
+          </w:tcPr>
+          <w:p>
+            <w:pPr>
+              <w:jc w:val="left"/>
+              <w:pBdr>
+                <w:bottom w:val="none" w:sz="0" w:space="0" w:color="000000"/>
+                <w:top w:val="none" w:sz="0" w:space="0" w:color="000000"/>
+                <w:left w:val="none" w:sz="0" w:space="0" w:color="000000"/>
+                <w:right w:val="none" w:sz="0" w:space="0" w:color="000000"/>
+              </w:pBdr>
+              <w:spacing w:after="80" w:before="80" w:line="240"/>
+              <w:ind w:left="80" w:right="80" w:firstLine="0" w:firstLineChars="0"/>
+              <w:rPr>
+                <w:rFonts w:ascii="Arial" w:hAnsi="Arial" w:eastAsia="Arial" w:cs="Arial"/>
+                <w:i w:val="false"/>
+                <w:b w:val="true"/>
+                <w:u w:val="none"/>
+                <w:strike w:val="false"/>
+                <w:sz w:val="18"/>
+                <w:szCs w:val="18"/>
+                <w:color w:val="000000"/>
+              </w:rPr>
+            </w:pPr>
+            <w:r xmlns:w="http://schemas.openxmlformats.org/wordprocessingml/2006/main" xmlns:wp="http://schemas.openxmlformats.org/drawingml/2006/wordprocessingDrawing" xmlns:r="http://schemas.openxmlformats.org/officeDocument/2006/relationships" xmlns:w14="http://schemas.microsoft.com/office/word/2010/wordml">
+              <w:rPr>
+                <w:rFonts w:ascii="Arial" w:hAnsi="Arial" w:eastAsia="Arial" w:cs="Arial"/>
+                <w:i w:val="false"/>
+                <w:b w:val="true"/>
+                <w:u w:val="none"/>
+                <w:strike w:val="false"/>
+                <w:sz w:val="18"/>
+                <w:szCs w:val="18"/>
+                <w:color w:val="000000"/>
+              </w:rPr>
+              <w:t xml:space="preserve">index</w:t>
+            </w:r>
+          </w:p>
+        </w:tc>
+        <w:tc>
+          <w:tcPr>
+            <w:tcBorders>
+              <w:bottom w:val="single" w:sz="8" w:space="0" w:color="000000"/>
+              <w:top w:val="single" w:sz="16" w:space="0" w:color="000000"/>
+              <w:left w:val="none" w:sz="0" w:space="0" w:color="000000"/>
+              <w:right w:val="none" w:sz="0" w:space="0" w:color="000000"/>
+            </w:tcBorders>
+            <w:shd w:val="clear" w:color="auto" w:fill="FFFFFF"/>
+            <w:tcMar>
+              <w:top w:w="0" w:type="dxa"/>
+              <w:bottom w:w="0" w:type="dxa"/>
+              <w:left w:w="0" w:type="dxa"/>
+              <w:right w:w="0" w:type="dxa"/>
+            </w:tcMar>
+            <w:vAlign w:val="center"/>
+          </w:tcPr>
+          <w:p>
+            <w:pPr>
+              <w:jc w:val="center"/>
+              <w:pBdr>
+                <w:bottom w:val="none" w:sz="0" w:space="0" w:color="000000"/>
+                <w:top w:val="none" w:sz="0" w:space="0" w:color="000000"/>
+                <w:left w:val="none" w:sz="0" w:space="0" w:color="000000"/>
+                <w:right w:val="none" w:sz="0" w:space="0" w:color="000000"/>
+              </w:pBdr>
+              <w:spacing w:after="80" w:before="80" w:line="240"/>
+              <w:ind w:left="80" w:right="80" w:firstLine="0" w:firstLineChars="0"/>
+              <w:rPr>
+                <w:rFonts w:ascii="Arial" w:hAnsi="Arial" w:eastAsia="Arial" w:cs="Arial"/>
+                <w:i w:val="false"/>
+                <w:b w:val="true"/>
+                <w:u w:val="none"/>
+                <w:strike w:val="false"/>
+                <w:sz w:val="18"/>
+                <w:szCs w:val="18"/>
+                <w:color w:val="000000"/>
+              </w:rPr>
+            </w:pPr>
+            <w:r xmlns:w="http://schemas.openxmlformats.org/wordprocessingml/2006/main" xmlns:wp="http://schemas.openxmlformats.org/drawingml/2006/wordprocessingDrawing" xmlns:r="http://schemas.openxmlformats.org/officeDocument/2006/relationships" xmlns:w14="http://schemas.microsoft.com/office/word/2010/wordml">
+              <w:rPr>
+                <w:rFonts w:ascii="Arial" w:hAnsi="Arial" w:eastAsia="Arial" w:cs="Arial"/>
+                <w:i w:val="false"/>
+                <w:b w:val="true"/>
+                <w:u w:val="none"/>
+                <w:strike w:val="false"/>
+                <w:sz w:val="18"/>
+                <w:szCs w:val="18"/>
+                <w:color w:val="000000"/>
+              </w:rPr>
+              <w:t xml:space="preserve">habitat</w:t>
+            </w:r>
+          </w:p>
+        </w:tc>
+        <w:tc>
+          <w:tcPr>
+            <w:tcBorders>
+              <w:bottom w:val="single" w:sz="8" w:space="0" w:color="000000"/>
+              <w:top w:val="single" w:sz="16" w:space="0" w:color="000000"/>
+              <w:left w:val="none" w:sz="0" w:space="0" w:color="000000"/>
+              <w:right w:val="none" w:sz="0" w:space="0" w:color="000000"/>
+            </w:tcBorders>
+            <w:shd w:val="clear" w:color="auto" w:fill="FFFFFF"/>
+            <w:tcMar>
+              <w:top w:w="0" w:type="dxa"/>
+              <w:bottom w:w="0" w:type="dxa"/>
+              <w:left w:w="0" w:type="dxa"/>
+              <w:right w:w="0" w:type="dxa"/>
+            </w:tcMar>
+            <w:vAlign w:val="center"/>
+          </w:tcPr>
+          <w:p>
+            <w:pPr>
+              <w:jc w:val="center"/>
+              <w:pBdr>
+                <w:bottom w:val="none" w:sz="0" w:space="0" w:color="000000"/>
+                <w:top w:val="none" w:sz="0" w:space="0" w:color="000000"/>
+                <w:left w:val="none" w:sz="0" w:space="0" w:color="000000"/>
+                <w:right w:val="none" w:sz="0" w:space="0" w:color="000000"/>
+              </w:pBdr>
+              <w:spacing w:after="80" w:before="80" w:line="240"/>
+              <w:ind w:left="80" w:right="80" w:firstLine="0" w:firstLineChars="0"/>
+              <w:rPr>
+                <w:rFonts w:ascii="Arial" w:hAnsi="Arial" w:eastAsia="Arial" w:cs="Arial"/>
+                <w:i w:val="false"/>
+                <w:b w:val="true"/>
+                <w:u w:val="none"/>
+                <w:strike w:val="false"/>
+                <w:sz w:val="18"/>
+                <w:szCs w:val="18"/>
+                <w:color w:val="000000"/>
+              </w:rPr>
+            </w:pPr>
+            <w:r xmlns:w="http://schemas.openxmlformats.org/wordprocessingml/2006/main" xmlns:wp="http://schemas.openxmlformats.org/drawingml/2006/wordprocessingDrawing" xmlns:r="http://schemas.openxmlformats.org/officeDocument/2006/relationships" xmlns:w14="http://schemas.microsoft.com/office/word/2010/wordml">
+              <w:rPr>
+                <w:rFonts w:ascii="Arial" w:hAnsi="Arial" w:eastAsia="Arial" w:cs="Arial"/>
+                <w:i w:val="false"/>
+                <w:b w:val="true"/>
+                <w:u w:val="none"/>
+                <w:strike w:val="false"/>
+                <w:sz w:val="18"/>
+                <w:szCs w:val="18"/>
+                <w:color w:val="000000"/>
+              </w:rPr>
+              <w:t xml:space="preserve">Δ/+10m</w:t>
+            </w:r>
+          </w:p>
+        </w:tc>
+        <w:tc>
+          <w:tcPr>
+            <w:tcBorders>
+              <w:bottom w:val="single" w:sz="8" w:space="0" w:color="000000"/>
+              <w:top w:val="single" w:sz="16" w:space="0" w:color="000000"/>
+              <w:left w:val="none" w:sz="0" w:space="0" w:color="000000"/>
+              <w:right w:val="none" w:sz="0" w:space="0" w:color="000000"/>
+            </w:tcBorders>
+            <w:shd w:val="clear" w:color="auto" w:fill="FFFFFF"/>
+            <w:tcMar>
+              <w:top w:w="0" w:type="dxa"/>
+              <w:bottom w:w="0" w:type="dxa"/>
+              <w:left w:w="0" w:type="dxa"/>
+              <w:right w:w="0" w:type="dxa"/>
+            </w:tcMar>
+            <w:vAlign w:val="center"/>
+          </w:tcPr>
+          <w:p>
+            <w:pPr>
+              <w:jc w:val="center"/>
+              <w:pBdr>
+                <w:bottom w:val="none" w:sz="0" w:space="0" w:color="000000"/>
+                <w:top w:val="none" w:sz="0" w:space="0" w:color="000000"/>
+                <w:left w:val="none" w:sz="0" w:space="0" w:color="000000"/>
+                <w:right w:val="none" w:sz="0" w:space="0" w:color="000000"/>
+              </w:pBdr>
+              <w:spacing w:after="80" w:before="80" w:line="240"/>
+              <w:ind w:left="80" w:right="80" w:firstLine="0" w:firstLineChars="0"/>
+              <w:rPr>
+                <w:rFonts w:ascii="Arial" w:hAnsi="Arial" w:eastAsia="Arial" w:cs="Arial"/>
+                <w:i w:val="false"/>
+                <w:b w:val="true"/>
+                <w:u w:val="none"/>
+                <w:strike w:val="false"/>
+                <w:sz w:val="18"/>
+                <w:szCs w:val="18"/>
+                <w:color w:val="000000"/>
+              </w:rPr>
+            </w:pPr>
+            <w:r xmlns:w="http://schemas.openxmlformats.org/wordprocessingml/2006/main" xmlns:wp="http://schemas.openxmlformats.org/drawingml/2006/wordprocessingDrawing" xmlns:r="http://schemas.openxmlformats.org/officeDocument/2006/relationships" xmlns:w14="http://schemas.microsoft.com/office/word/2010/wordml">
+              <w:rPr>
+                <w:rFonts w:ascii="Arial" w:hAnsi="Arial" w:eastAsia="Arial" w:cs="Arial"/>
+                <w:i w:val="false"/>
+                <w:b w:val="true"/>
+                <w:u w:val="none"/>
+                <w:strike w:val="false"/>
+                <w:sz w:val="18"/>
+                <w:szCs w:val="18"/>
+                <w:color w:val="000000"/>
+              </w:rPr>
+              <w:t xml:space="preserve">CI low</w:t>
+            </w:r>
+          </w:p>
+        </w:tc>
+        <w:tc>
+          <w:tcPr>
+            <w:tcBorders>
+              <w:bottom w:val="single" w:sz="8" w:space="0" w:color="000000"/>
+              <w:top w:val="single" w:sz="16" w:space="0" w:color="000000"/>
+              <w:left w:val="none" w:sz="0" w:space="0" w:color="000000"/>
+              <w:right w:val="none" w:sz="0" w:space="0" w:color="000000"/>
+            </w:tcBorders>
+            <w:shd w:val="clear" w:color="auto" w:fill="FFFFFF"/>
+            <w:tcMar>
+              <w:top w:w="0" w:type="dxa"/>
+              <w:bottom w:w="0" w:type="dxa"/>
+              <w:left w:w="0" w:type="dxa"/>
+              <w:right w:w="0" w:type="dxa"/>
+            </w:tcMar>
+            <w:vAlign w:val="center"/>
+          </w:tcPr>
+          <w:p>
+            <w:pPr>
+              <w:jc w:val="center"/>
+              <w:pBdr>
+                <w:bottom w:val="none" w:sz="0" w:space="0" w:color="000000"/>
+                <w:top w:val="none" w:sz="0" w:space="0" w:color="000000"/>
+                <w:left w:val="none" w:sz="0" w:space="0" w:color="000000"/>
+                <w:right w:val="none" w:sz="0" w:space="0" w:color="000000"/>
+              </w:pBdr>
+              <w:spacing w:after="80" w:before="80" w:line="240"/>
+              <w:ind w:left="80" w:right="80" w:firstLine="0" w:firstLineChars="0"/>
+              <w:rPr>
+                <w:rFonts w:ascii="Arial" w:hAnsi="Arial" w:eastAsia="Arial" w:cs="Arial"/>
+                <w:i w:val="false"/>
+                <w:b w:val="true"/>
+                <w:u w:val="none"/>
+                <w:strike w:val="false"/>
+                <w:sz w:val="18"/>
+                <w:szCs w:val="18"/>
+                <w:color w:val="000000"/>
+              </w:rPr>
+            </w:pPr>
+            <w:r xmlns:w="http://schemas.openxmlformats.org/wordprocessingml/2006/main" xmlns:wp="http://schemas.openxmlformats.org/drawingml/2006/wordprocessingDrawing" xmlns:r="http://schemas.openxmlformats.org/officeDocument/2006/relationships" xmlns:w14="http://schemas.microsoft.com/office/word/2010/wordml">
+              <w:rPr>
+                <w:rFonts w:ascii="Arial" w:hAnsi="Arial" w:eastAsia="Arial" w:cs="Arial"/>
+                <w:i w:val="false"/>
+                <w:b w:val="true"/>
+                <w:u w:val="none"/>
+                <w:strike w:val="false"/>
+                <w:sz w:val="18"/>
+                <w:szCs w:val="18"/>
+                <w:color w:val="000000"/>
+              </w:rPr>
+              <w:t xml:space="preserve">CI high</w:t>
+            </w:r>
+          </w:p>
+        </w:tc>
+        <w:tc>
+          <w:tcPr>
+            <w:tcBorders>
+              <w:bottom w:val="single" w:sz="8" w:space="0" w:color="000000"/>
+              <w:top w:val="single" w:sz="16" w:space="0" w:color="000000"/>
+              <w:left w:val="none" w:sz="0" w:space="0" w:color="000000"/>
+              <w:right w:val="none" w:sz="0" w:space="0" w:color="000000"/>
+            </w:tcBorders>
+            <w:shd w:val="clear" w:color="auto" w:fill="FFFFFF"/>
+            <w:tcMar>
+              <w:top w:w="0" w:type="dxa"/>
+              <w:bottom w:w="0" w:type="dxa"/>
+              <w:left w:w="0" w:type="dxa"/>
+              <w:right w:w="0" w:type="dxa"/>
+            </w:tcMar>
+            <w:vAlign w:val="center"/>
+          </w:tcPr>
+          <w:p>
+            <w:pPr>
+              <w:jc w:val="center"/>
+              <w:pBdr>
+                <w:bottom w:val="none" w:sz="0" w:space="0" w:color="000000"/>
+                <w:top w:val="none" w:sz="0" w:space="0" w:color="000000"/>
+                <w:left w:val="none" w:sz="0" w:space="0" w:color="000000"/>
+                <w:right w:val="none" w:sz="0" w:space="0" w:color="000000"/>
+              </w:pBdr>
+              <w:spacing w:after="80" w:before="80" w:line="240"/>
+              <w:ind w:left="80" w:right="80" w:firstLine="0" w:firstLineChars="0"/>
+              <w:rPr>
+                <w:rFonts w:ascii="Arial" w:hAnsi="Arial" w:eastAsia="Arial" w:cs="Arial"/>
+                <w:i w:val="false"/>
+                <w:b w:val="true"/>
+                <w:u w:val="none"/>
+                <w:strike w:val="false"/>
+                <w:sz w:val="18"/>
+                <w:szCs w:val="18"/>
+                <w:color w:val="000000"/>
+              </w:rPr>
+            </w:pPr>
+            <w:r xmlns:w="http://schemas.openxmlformats.org/wordprocessingml/2006/main" xmlns:wp="http://schemas.openxmlformats.org/drawingml/2006/wordprocessingDrawing" xmlns:r="http://schemas.openxmlformats.org/officeDocument/2006/relationships" xmlns:w14="http://schemas.microsoft.com/office/word/2010/wordml">
+              <w:rPr>
+                <w:rFonts w:ascii="Arial" w:hAnsi="Arial" w:eastAsia="Arial" w:cs="Arial"/>
+                <w:i w:val="false"/>
+                <w:b w:val="true"/>
+                <w:u w:val="none"/>
+                <w:strike w:val="false"/>
+                <w:sz w:val="18"/>
+                <w:szCs w:val="18"/>
+                <w:color w:val="000000"/>
+              </w:rPr>
+              <w:t xml:space="preserve">R2</w:t>
+            </w:r>
+          </w:p>
+        </w:tc>
+        <w:tc>
+          <w:tcPr>
+            <w:tcBorders>
+              <w:bottom w:val="single" w:sz="8" w:space="0" w:color="000000"/>
+              <w:top w:val="single" w:sz="16" w:space="0" w:color="000000"/>
+              <w:left w:val="none" w:sz="0" w:space="0" w:color="000000"/>
+              <w:right w:val="none" w:sz="0" w:space="0" w:color="000000"/>
+            </w:tcBorders>
+            <w:shd w:val="clear" w:color="auto" w:fill="FFFFFF"/>
+            <w:tcMar>
+              <w:top w:w="0" w:type="dxa"/>
+              <w:bottom w:w="0" w:type="dxa"/>
+              <w:left w:w="0" w:type="dxa"/>
+              <w:right w:w="0" w:type="dxa"/>
+            </w:tcMar>
+            <w:vAlign w:val="center"/>
+          </w:tcPr>
+          <w:p>
+            <w:pPr>
+              <w:jc w:val="center"/>
+              <w:pBdr>
+                <w:bottom w:val="none" w:sz="0" w:space="0" w:color="000000"/>
+                <w:top w:val="none" w:sz="0" w:space="0" w:color="000000"/>
+                <w:left w:val="none" w:sz="0" w:space="0" w:color="000000"/>
+                <w:right w:val="none" w:sz="0" w:space="0" w:color="000000"/>
+              </w:pBdr>
+              <w:spacing w:after="80" w:before="80" w:line="240"/>
+              <w:ind w:left="80" w:right="80" w:firstLine="0" w:firstLineChars="0"/>
+              <w:rPr>
+                <w:rFonts w:ascii="Arial" w:hAnsi="Arial" w:eastAsia="Arial" w:cs="Arial"/>
+                <w:i w:val="false"/>
+                <w:b w:val="true"/>
+                <w:u w:val="none"/>
+                <w:strike w:val="false"/>
+                <w:sz w:val="18"/>
+                <w:szCs w:val="18"/>
+                <w:color w:val="000000"/>
+              </w:rPr>
+            </w:pPr>
+            <w:r xmlns:w="http://schemas.openxmlformats.org/wordprocessingml/2006/main" xmlns:wp="http://schemas.openxmlformats.org/drawingml/2006/wordprocessingDrawing" xmlns:r="http://schemas.openxmlformats.org/officeDocument/2006/relationships" xmlns:w14="http://schemas.microsoft.com/office/word/2010/wordml">
+              <w:rPr>
+                <w:rFonts w:ascii="Arial" w:hAnsi="Arial" w:eastAsia="Arial" w:cs="Arial"/>
+                <w:i w:val="false"/>
+                <w:b w:val="true"/>
+                <w:u w:val="none"/>
+                <w:strike w:val="false"/>
+                <w:sz w:val="18"/>
+                <w:szCs w:val="18"/>
+                <w:color w:val="000000"/>
+              </w:rPr>
+              <w:t xml:space="preserve">CI excl 0</w:t>
+            </w:r>
+          </w:p>
+        </w:tc>
+        <w:tc>
+          <w:tcPr>
+            <w:tcBorders>
+              <w:bottom w:val="single" w:sz="8" w:space="0" w:color="000000"/>
+              <w:top w:val="single" w:sz="16" w:space="0" w:color="000000"/>
+              <w:left w:val="none" w:sz="0" w:space="0" w:color="000000"/>
+              <w:right w:val="none" w:sz="0" w:space="0" w:color="000000"/>
+            </w:tcBorders>
+            <w:shd w:val="clear" w:color="auto" w:fill="FFFFFF"/>
+            <w:tcMar>
+              <w:top w:w="0" w:type="dxa"/>
+              <w:bottom w:w="0" w:type="dxa"/>
+              <w:left w:w="0" w:type="dxa"/>
+              <w:right w:w="0" w:type="dxa"/>
+            </w:tcMar>
+            <w:vAlign w:val="center"/>
+          </w:tcPr>
+          <w:p>
+            <w:pPr>
+              <w:jc w:val="center"/>
+              <w:pBdr>
+                <w:bottom w:val="none" w:sz="0" w:space="0" w:color="000000"/>
+                <w:top w:val="none" w:sz="0" w:space="0" w:color="000000"/>
+                <w:left w:val="none" w:sz="0" w:space="0" w:color="000000"/>
+                <w:right w:val="none" w:sz="0" w:space="0" w:color="000000"/>
+              </w:pBdr>
+              <w:spacing w:after="80" w:before="80" w:line="240"/>
+              <w:ind w:left="80" w:right="80" w:firstLine="0" w:firstLineChars="0"/>
+              <w:rPr>
+                <w:rFonts w:ascii="Arial" w:hAnsi="Arial" w:eastAsia="Arial" w:cs="Arial"/>
+                <w:i w:val="false"/>
+                <w:b w:val="true"/>
+                <w:u w:val="none"/>
+                <w:strike w:val="false"/>
+                <w:sz w:val="18"/>
+                <w:szCs w:val="18"/>
+                <w:color w:val="000000"/>
+              </w:rPr>
+            </w:pPr>
+            <w:r xmlns:w="http://schemas.openxmlformats.org/wordprocessingml/2006/main" xmlns:wp="http://schemas.openxmlformats.org/drawingml/2006/wordprocessingDrawing" xmlns:r="http://schemas.openxmlformats.org/officeDocument/2006/relationships" xmlns:w14="http://schemas.microsoft.com/office/word/2010/wordml">
+              <w:rPr>
+                <w:rFonts w:ascii="Arial" w:hAnsi="Arial" w:eastAsia="Arial" w:cs="Arial"/>
+                <w:i w:val="false"/>
+                <w:b w:val="true"/>
+                <w:u w:val="none"/>
+                <w:strike w:val="false"/>
+                <w:sz w:val="18"/>
+                <w:szCs w:val="18"/>
+                <w:color w:val="000000"/>
+              </w:rPr>
+              <w:t xml:space="preserve">n</w:t>
+            </w:r>
+          </w:p>
+        </w:tc>
+      </w:tr>
+      <w:tr>
+        <w:trPr>
+          <w:trHeight w:val="360" w:hRule="auto"/>
+        </w:trPr>
+        <w:tc>
+          <w:tcPr>
+            <w:tcBorders>
+              <w:bottom w:val="none" w:sz="0" w:space="0" w:color="000000"/>
+              <w:top w:val="single" w:sz="8" w:space="0" w:color="000000"/>
+              <w:left w:val="none" w:sz="0" w:space="0" w:color="000000"/>
+              <w:right w:val="none" w:sz="0" w:space="0" w:color="000000"/>
+            </w:tcBorders>
+            <w:shd w:val="clear" w:color="auto" w:fill="FFFFFF"/>
+            <w:tcMar>
+              <w:top w:w="0" w:type="dxa"/>
+              <w:bottom w:w="0" w:type="dxa"/>
+              <w:left w:w="0" w:type="dxa"/>
+              <w:right w:w="0" w:type="dxa"/>
+            </w:tcMar>
+            <w:vAlign w:val="center"/>
+          </w:tcPr>
+          <w:p>
+            <w:pPr>
+              <w:jc w:val="left"/>
+              <w:pBdr>
+                <w:bottom w:val="none" w:sz="0" w:space="0" w:color="000000"/>
+                <w:top w:val="none" w:sz="0" w:space="0" w:color="000000"/>
+                <w:left w:val="none" w:sz="0" w:space="0" w:color="000000"/>
+                <w:right w:val="none" w:sz="0" w:space="0" w:color="000000"/>
+              </w:pBdr>
+              <w:spacing w:after="80" w:before="80" w:line="240"/>
+              <w:ind w:left="80" w:right="80" w:firstLine="0" w:firstLineChars="0"/>
+              <w:rPr>
+                <w:rFonts w:ascii="Arial" w:hAnsi="Arial" w:eastAsia="Arial" w:cs="Arial"/>
+                <w:i w:val="false"/>
+                <w:b w:val="false"/>
+                <w:u w:val="none"/>
+                <w:strike w:val="false"/>
+                <w:sz w:val="18"/>
+                <w:szCs w:val="18"/>
+                <w:color w:val="000000"/>
+              </w:rPr>
+            </w:pPr>
+            <w:r xmlns:w="http://schemas.openxmlformats.org/wordprocessingml/2006/main" xmlns:wp="http://schemas.openxmlformats.org/drawingml/2006/wordprocessingDrawing" xmlns:r="http://schemas.openxmlformats.org/officeDocument/2006/relationships" xmlns:w14="http://schemas.microsoft.com/office/word/2010/wordml">
+              <w:rPr>
+                <w:rFonts w:ascii="Arial" w:hAnsi="Arial" w:eastAsia="Arial" w:cs="Arial"/>
+                <w:i w:val="false"/>
+                <w:b w:val="false"/>
+                <w:u w:val="none"/>
+                <w:strike w:val="false"/>
+                <w:sz w:val="18"/>
+                <w:szCs w:val="18"/>
+                <w:color w:val="000000"/>
+              </w:rPr>
+              <w:t xml:space="preserve">dACI</w:t>
+            </w:r>
+          </w:p>
+        </w:tc>
+        <w:tc>
+          <w:tcPr>
+            <w:tcBorders>
+              <w:bottom w:val="none" w:sz="0" w:space="0" w:color="000000"/>
+              <w:top w:val="single" w:sz="8" w:space="0" w:color="000000"/>
+              <w:left w:val="none" w:sz="0" w:space="0" w:color="000000"/>
+              <w:right w:val="none" w:sz="0" w:space="0" w:color="000000"/>
+            </w:tcBorders>
+            <w:shd w:val="clear" w:color="auto" w:fill="FFFFFF"/>
+            <w:tcMar>
+              <w:top w:w="0" w:type="dxa"/>
+              <w:bottom w:w="0" w:type="dxa"/>
+              <w:left w:w="0" w:type="dxa"/>
+              <w:right w:w="0" w:type="dxa"/>
+            </w:tcMar>
+            <w:vAlign w:val="center"/>
+          </w:tcPr>
+          <w:p>
+            <w:pPr>
+              <w:jc w:val="center"/>
+              <w:pBdr>
+                <w:bottom w:val="none" w:sz="0" w:space="0" w:color="000000"/>
+                <w:top w:val="none" w:sz="0" w:space="0" w:color="000000"/>
+                <w:left w:val="none" w:sz="0" w:space="0" w:color="000000"/>
+                <w:right w:val="none" w:sz="0" w:space="0" w:color="000000"/>
+              </w:pBdr>
+              <w:spacing w:after="80" w:before="80" w:line="240"/>
+              <w:ind w:left="80" w:right="80" w:firstLine="0" w:firstLineChars="0"/>
+              <w:rPr>
+                <w:rFonts w:ascii="Arial" w:hAnsi="Arial" w:eastAsia="Arial" w:cs="Arial"/>
+                <w:i w:val="false"/>
+                <w:b w:val="false"/>
+                <w:u w:val="none"/>
+                <w:strike w:val="false"/>
+                <w:sz w:val="18"/>
+                <w:szCs w:val="18"/>
+                <w:color w:val="000000"/>
+              </w:rPr>
+            </w:pPr>
+            <w:r xmlns:w="http://schemas.openxmlformats.org/wordprocessingml/2006/main" xmlns:wp="http://schemas.openxmlformats.org/drawingml/2006/wordprocessingDrawing" xmlns:r="http://schemas.openxmlformats.org/officeDocument/2006/relationships" xmlns:w14="http://schemas.microsoft.com/office/word/2010/wordml">
+              <w:rPr>
+                <w:rFonts w:ascii="Arial" w:hAnsi="Arial" w:eastAsia="Arial" w:cs="Arial"/>
+                <w:i w:val="false"/>
+                <w:b w:val="false"/>
+                <w:u w:val="none"/>
+                <w:strike w:val="false"/>
+                <w:sz w:val="18"/>
+                <w:szCs w:val="18"/>
+                <w:color w:val="000000"/>
+              </w:rPr>
+              <w:t xml:space="preserve">forest</w:t>
+            </w:r>
+          </w:p>
+        </w:tc>
+        <w:tc>
+          <w:tcPr>
+            <w:tcBorders>
+              <w:bottom w:val="none" w:sz="0" w:space="0" w:color="000000"/>
+              <w:top w:val="single" w:sz="8" w:space="0" w:color="000000"/>
+              <w:left w:val="none" w:sz="0" w:space="0" w:color="000000"/>
+              <w:right w:val="none" w:sz="0" w:space="0" w:color="000000"/>
+            </w:tcBorders>
+            <w:shd w:val="clear" w:color="auto" w:fill="FFFFFF"/>
+            <w:tcMar>
+              <w:top w:w="0" w:type="dxa"/>
+              <w:bottom w:w="0" w:type="dxa"/>
+              <w:left w:w="0" w:type="dxa"/>
+              <w:right w:w="0" w:type="dxa"/>
+            </w:tcMar>
+            <w:vAlign w:val="center"/>
+          </w:tcPr>
+          <w:p>
+            <w:pPr>
+              <w:jc w:val="center"/>
+              <w:pBdr>
+                <w:bottom w:val="none" w:sz="0" w:space="0" w:color="000000"/>
+                <w:top w:val="none" w:sz="0" w:space="0" w:color="000000"/>
+                <w:left w:val="none" w:sz="0" w:space="0" w:color="000000"/>
+                <w:right w:val="none" w:sz="0" w:space="0" w:color="000000"/>
+              </w:pBdr>
+              <w:spacing w:after="80" w:before="80" w:line="240"/>
+              <w:ind w:left="80" w:right="80" w:firstLine="0" w:firstLineChars="0"/>
+              <w:rPr>
+                <w:rFonts w:ascii="Arial" w:hAnsi="Arial" w:eastAsia="Arial" w:cs="Arial"/>
+                <w:i w:val="false"/>
+                <w:b w:val="false"/>
+                <w:u w:val="none"/>
+                <w:strike w:val="false"/>
+                <w:sz w:val="18"/>
+                <w:szCs w:val="18"/>
+                <w:color w:val="000000"/>
+              </w:rPr>
+            </w:pPr>
+            <w:r xmlns:w="http://schemas.openxmlformats.org/wordprocessingml/2006/main" xmlns:wp="http://schemas.openxmlformats.org/drawingml/2006/wordprocessingDrawing" xmlns:r="http://schemas.openxmlformats.org/officeDocument/2006/relationships" xmlns:w14="http://schemas.microsoft.com/office/word/2010/wordml">
+              <w:rPr>
+                <w:rFonts w:ascii="Arial" w:hAnsi="Arial" w:eastAsia="Arial" w:cs="Arial"/>
+                <w:i w:val="false"/>
+                <w:b w:val="false"/>
+                <w:u w:val="none"/>
+                <w:strike w:val="false"/>
+                <w:sz w:val="18"/>
+                <w:szCs w:val="18"/>
+                <w:color w:val="000000"/>
+              </w:rPr>
+              <w:t xml:space="preserve">0.1263</w:t>
+            </w:r>
+          </w:p>
+        </w:tc>
+        <w:tc>
+          <w:tcPr>
+            <w:tcBorders>
+              <w:bottom w:val="none" w:sz="0" w:space="0" w:color="000000"/>
+              <w:top w:val="single" w:sz="8" w:space="0" w:color="000000"/>
+              <w:left w:val="none" w:sz="0" w:space="0" w:color="000000"/>
+              <w:right w:val="none" w:sz="0" w:space="0" w:color="000000"/>
+            </w:tcBorders>
+            <w:shd w:val="clear" w:color="auto" w:fill="FFFFFF"/>
+            <w:tcMar>
+              <w:top w:w="0" w:type="dxa"/>
+              <w:bottom w:w="0" w:type="dxa"/>
+              <w:left w:w="0" w:type="dxa"/>
+              <w:right w:w="0" w:type="dxa"/>
+            </w:tcMar>
+            <w:vAlign w:val="center"/>
+          </w:tcPr>
+          <w:p>
+            <w:pPr>
+              <w:jc w:val="center"/>
+              <w:pBdr>
+                <w:bottom w:val="none" w:sz="0" w:space="0" w:color="000000"/>
+                <w:top w:val="none" w:sz="0" w:space="0" w:color="000000"/>
+                <w:left w:val="none" w:sz="0" w:space="0" w:color="000000"/>
+                <w:right w:val="none" w:sz="0" w:space="0" w:color="000000"/>
+              </w:pBdr>
+              <w:spacing w:after="80" w:before="80" w:line="240"/>
+              <w:ind w:left="80" w:right="80" w:firstLine="0" w:firstLineChars="0"/>
+              <w:rPr>
+                <w:rFonts w:ascii="Arial" w:hAnsi="Arial" w:eastAsia="Arial" w:cs="Arial"/>
+                <w:i w:val="false"/>
+                <w:b w:val="false"/>
+                <w:u w:val="none"/>
+                <w:strike w:val="false"/>
+                <w:sz w:val="18"/>
+                <w:szCs w:val="18"/>
+                <w:color w:val="000000"/>
+              </w:rPr>
+            </w:pPr>
+            <w:r xmlns:w="http://schemas.openxmlformats.org/wordprocessingml/2006/main" xmlns:wp="http://schemas.openxmlformats.org/drawingml/2006/wordprocessingDrawing" xmlns:r="http://schemas.openxmlformats.org/officeDocument/2006/relationships" xmlns:w14="http://schemas.microsoft.com/office/word/2010/wordml">
+              <w:rPr>
+                <w:rFonts w:ascii="Arial" w:hAnsi="Arial" w:eastAsia="Arial" w:cs="Arial"/>
+                <w:i w:val="false"/>
+                <w:b w:val="false"/>
+                <w:u w:val="none"/>
+                <w:strike w:val="false"/>
+                <w:sz w:val="18"/>
+                <w:szCs w:val="18"/>
+                <w:color w:val="000000"/>
+              </w:rPr>
+              <w:t xml:space="preserve">-0.8887</w:t>
+            </w:r>
+          </w:p>
+        </w:tc>
+        <w:tc>
+          <w:tcPr>
+            <w:tcBorders>
+              <w:bottom w:val="none" w:sz="0" w:space="0" w:color="000000"/>
+              <w:top w:val="single" w:sz="8" w:space="0" w:color="000000"/>
+              <w:left w:val="none" w:sz="0" w:space="0" w:color="000000"/>
+              <w:right w:val="none" w:sz="0" w:space="0" w:color="000000"/>
+            </w:tcBorders>
+            <w:shd w:val="clear" w:color="auto" w:fill="FFFFFF"/>
+            <w:tcMar>
+              <w:top w:w="0" w:type="dxa"/>
+              <w:bottom w:w="0" w:type="dxa"/>
+              <w:left w:w="0" w:type="dxa"/>
+              <w:right w:w="0" w:type="dxa"/>
+            </w:tcMar>
+            <w:vAlign w:val="center"/>
+          </w:tcPr>
+          <w:p>
+            <w:pPr>
+              <w:jc w:val="center"/>
+              <w:pBdr>
+                <w:bottom w:val="none" w:sz="0" w:space="0" w:color="000000"/>
+                <w:top w:val="none" w:sz="0" w:space="0" w:color="000000"/>
+                <w:left w:val="none" w:sz="0" w:space="0" w:color="000000"/>
+                <w:right w:val="none" w:sz="0" w:space="0" w:color="000000"/>
+              </w:pBdr>
+              <w:spacing w:after="80" w:before="80" w:line="240"/>
+              <w:ind w:left="80" w:right="80" w:firstLine="0" w:firstLineChars="0"/>
+              <w:rPr>
+                <w:rFonts w:ascii="Arial" w:hAnsi="Arial" w:eastAsia="Arial" w:cs="Arial"/>
+                <w:i w:val="false"/>
+                <w:b w:val="false"/>
+                <w:u w:val="none"/>
+                <w:strike w:val="false"/>
+                <w:sz w:val="18"/>
+                <w:szCs w:val="18"/>
+                <w:color w:val="000000"/>
+              </w:rPr>
+            </w:pPr>
+            <w:r xmlns:w="http://schemas.openxmlformats.org/wordprocessingml/2006/main" xmlns:wp="http://schemas.openxmlformats.org/drawingml/2006/wordprocessingDrawing" xmlns:r="http://schemas.openxmlformats.org/officeDocument/2006/relationships" xmlns:w14="http://schemas.microsoft.com/office/word/2010/wordml">
+              <w:rPr>
+                <w:rFonts w:ascii="Arial" w:hAnsi="Arial" w:eastAsia="Arial" w:cs="Arial"/>
+                <w:i w:val="false"/>
+                <w:b w:val="false"/>
+                <w:u w:val="none"/>
+                <w:strike w:val="false"/>
+                <w:sz w:val="18"/>
+                <w:szCs w:val="18"/>
+                <w:color w:val="000000"/>
+              </w:rPr>
+              <w:t xml:space="preserve">1.1413</w:t>
+            </w:r>
+          </w:p>
+        </w:tc>
+        <w:tc>
+          <w:tcPr>
+            <w:tcBorders>
+              <w:bottom w:val="none" w:sz="0" w:space="0" w:color="000000"/>
+              <w:top w:val="single" w:sz="8" w:space="0" w:color="000000"/>
+              <w:left w:val="none" w:sz="0" w:space="0" w:color="000000"/>
+              <w:right w:val="none" w:sz="0" w:space="0" w:color="000000"/>
+            </w:tcBorders>
+            <w:shd w:val="clear" w:color="auto" w:fill="FFFFFF"/>
+            <w:tcMar>
+              <w:top w:w="0" w:type="dxa"/>
+              <w:bottom w:w="0" w:type="dxa"/>
+              <w:left w:w="0" w:type="dxa"/>
+              <w:right w:w="0" w:type="dxa"/>
+            </w:tcMar>
+            <w:vAlign w:val="center"/>
+          </w:tcPr>
+          <w:p>
+            <w:pPr>
+              <w:jc w:val="center"/>
+              <w:pBdr>
+                <w:bottom w:val="none" w:sz="0" w:space="0" w:color="000000"/>
+                <w:top w:val="none" w:sz="0" w:space="0" w:color="000000"/>
+                <w:left w:val="none" w:sz="0" w:space="0" w:color="000000"/>
+                <w:right w:val="none" w:sz="0" w:space="0" w:color="000000"/>
+              </w:pBdr>
+              <w:spacing w:after="80" w:before="80" w:line="240"/>
+              <w:ind w:left="80" w:right="80" w:firstLine="0" w:firstLineChars="0"/>
+              <w:rPr>
+                <w:rFonts w:ascii="Arial" w:hAnsi="Arial" w:eastAsia="Arial" w:cs="Arial"/>
+                <w:i w:val="false"/>
+                <w:b w:val="false"/>
+                <w:u w:val="none"/>
+                <w:strike w:val="false"/>
+                <w:sz w:val="18"/>
+                <w:szCs w:val="18"/>
+                <w:color w:val="000000"/>
+              </w:rPr>
+            </w:pPr>
+            <w:r xmlns:w="http://schemas.openxmlformats.org/wordprocessingml/2006/main" xmlns:wp="http://schemas.openxmlformats.org/drawingml/2006/wordprocessingDrawing" xmlns:r="http://schemas.openxmlformats.org/officeDocument/2006/relationships" xmlns:w14="http://schemas.microsoft.com/office/word/2010/wordml">
+              <w:rPr>
+                <w:rFonts w:ascii="Arial" w:hAnsi="Arial" w:eastAsia="Arial" w:cs="Arial"/>
+                <w:i w:val="false"/>
+                <w:b w:val="false"/>
+                <w:u w:val="none"/>
+                <w:strike w:val="false"/>
+                <w:sz w:val="18"/>
+                <w:szCs w:val="18"/>
+                <w:color w:val="000000"/>
+              </w:rPr>
+              <w:t xml:space="preserve">0.005</w:t>
+            </w:r>
+          </w:p>
+        </w:tc>
+        <w:tc>
+          <w:tcPr>
+            <w:tcBorders>
+              <w:bottom w:val="none" w:sz="0" w:space="0" w:color="000000"/>
+              <w:top w:val="single" w:sz="8" w:space="0" w:color="000000"/>
+              <w:left w:val="none" w:sz="0" w:space="0" w:color="000000"/>
+              <w:right w:val="none" w:sz="0" w:space="0" w:color="000000"/>
+            </w:tcBorders>
+            <w:shd w:val="clear" w:color="auto" w:fill="FFFFFF"/>
+            <w:tcMar>
+              <w:top w:w="0" w:type="dxa"/>
+              <w:bottom w:w="0" w:type="dxa"/>
+              <w:left w:w="0" w:type="dxa"/>
+              <w:right w:w="0" w:type="dxa"/>
+            </w:tcMar>
+            <w:vAlign w:val="center"/>
+          </w:tcPr>
+          <w:p>
+            <w:pPr>
+              <w:jc w:val="center"/>
+              <w:pBdr>
+                <w:bottom w:val="none" w:sz="0" w:space="0" w:color="000000"/>
+                <w:top w:val="none" w:sz="0" w:space="0" w:color="000000"/>
+                <w:left w:val="none" w:sz="0" w:space="0" w:color="000000"/>
+                <w:right w:val="none" w:sz="0" w:space="0" w:color="000000"/>
+              </w:pBdr>
+              <w:spacing w:after="80" w:before="80" w:line="240"/>
+              <w:ind w:left="80" w:right="80" w:firstLine="0" w:firstLineChars="0"/>
+              <w:rPr>
+                <w:rFonts w:ascii="Arial" w:hAnsi="Arial" w:eastAsia="Arial" w:cs="Arial"/>
+                <w:i w:val="false"/>
+                <w:b w:val="false"/>
+                <w:u w:val="none"/>
+                <w:strike w:val="false"/>
+                <w:sz w:val="18"/>
+                <w:szCs w:val="18"/>
+                <w:color w:val="000000"/>
+              </w:rPr>
+            </w:pPr>
+            <w:r xmlns:w="http://schemas.openxmlformats.org/wordprocessingml/2006/main" xmlns:wp="http://schemas.openxmlformats.org/drawingml/2006/wordprocessingDrawing" xmlns:r="http://schemas.openxmlformats.org/officeDocument/2006/relationships" xmlns:w14="http://schemas.microsoft.com/office/word/2010/wordml">
+              <w:rPr>
+                <w:rFonts w:ascii="Arial" w:hAnsi="Arial" w:eastAsia="Arial" w:cs="Arial"/>
+                <w:i w:val="false"/>
+                <w:b w:val="false"/>
+                <w:u w:val="none"/>
+                <w:strike w:val="false"/>
+                <w:sz w:val="18"/>
+                <w:szCs w:val="18"/>
+                <w:color w:val="000000"/>
+              </w:rPr>
+              <w:t xml:space="preserve">no</w:t>
+            </w:r>
+          </w:p>
+        </w:tc>
+        <w:tc>
+          <w:tcPr>
+            <w:tcBorders>
+              <w:bottom w:val="none" w:sz="0" w:space="0" w:color="000000"/>
+              <w:top w:val="single" w:sz="8" w:space="0" w:color="000000"/>
+              <w:left w:val="none" w:sz="0" w:space="0" w:color="000000"/>
+              <w:right w:val="none" w:sz="0" w:space="0" w:color="000000"/>
+            </w:tcBorders>
+            <w:shd w:val="clear" w:color="auto" w:fill="FFFFFF"/>
+            <w:tcMar>
+              <w:top w:w="0" w:type="dxa"/>
+              <w:bottom w:w="0" w:type="dxa"/>
+              <w:left w:w="0" w:type="dxa"/>
+              <w:right w:w="0" w:type="dxa"/>
+            </w:tcMar>
+            <w:vAlign w:val="center"/>
+          </w:tcPr>
+          <w:p>
+            <w:pPr>
+              <w:jc w:val="center"/>
+              <w:pBdr>
+                <w:bottom w:val="none" w:sz="0" w:space="0" w:color="000000"/>
+                <w:top w:val="none" w:sz="0" w:space="0" w:color="000000"/>
+                <w:left w:val="none" w:sz="0" w:space="0" w:color="000000"/>
+                <w:right w:val="none" w:sz="0" w:space="0" w:color="000000"/>
+              </w:pBdr>
+              <w:spacing w:after="80" w:before="80" w:line="240"/>
+              <w:ind w:left="80" w:right="80" w:firstLine="0" w:firstLineChars="0"/>
+              <w:rPr>
+                <w:rFonts w:ascii="Arial" w:hAnsi="Arial" w:eastAsia="Arial" w:cs="Arial"/>
+                <w:i w:val="false"/>
+                <w:b w:val="false"/>
+                <w:u w:val="none"/>
+                <w:strike w:val="false"/>
+                <w:sz w:val="18"/>
+                <w:szCs w:val="18"/>
+                <w:color w:val="000000"/>
+              </w:rPr>
+            </w:pPr>
+            <w:r xmlns:w="http://schemas.openxmlformats.org/wordprocessingml/2006/main" xmlns:wp="http://schemas.openxmlformats.org/drawingml/2006/wordprocessingDrawing" xmlns:r="http://schemas.openxmlformats.org/officeDocument/2006/relationships" xmlns:w14="http://schemas.microsoft.com/office/word/2010/wordml">
+              <w:rPr>
+                <w:rFonts w:ascii="Arial" w:hAnsi="Arial" w:eastAsia="Arial" w:cs="Arial"/>
+                <w:i w:val="false"/>
+                <w:b w:val="false"/>
+                <w:u w:val="none"/>
+                <w:strike w:val="false"/>
+                <w:sz w:val="18"/>
+                <w:szCs w:val="18"/>
+                <w:color w:val="000000"/>
+              </w:rPr>
+              <w:t xml:space="preserve">12</w:t>
+            </w:r>
+          </w:p>
+        </w:tc>
+      </w:tr>
+      <w:tr>
+        <w:trPr>
+          <w:trHeight w:val="360" w:hRule="auto"/>
+        </w:trPr>
+        <w:tc>
+          <w:tcPr>
+            <w:tcBorders>
+              <w:bottom w:val="none" w:sz="0" w:space="0" w:color="000000"/>
+              <w:top w:val="none" w:sz="0" w:space="0" w:color="000000"/>
+              <w:left w:val="none" w:sz="0" w:space="0" w:color="000000"/>
+              <w:right w:val="none" w:sz="0" w:space="0" w:color="000000"/>
+            </w:tcBorders>
+            <w:shd w:val="clear" w:color="auto" w:fill="FFFFFF"/>
+            <w:tcMar>
+              <w:top w:w="0" w:type="dxa"/>
+              <w:bottom w:w="0" w:type="dxa"/>
+              <w:left w:w="0" w:type="dxa"/>
+              <w:right w:w="0" w:type="dxa"/>
+            </w:tcMar>
+            <w:vAlign w:val="center"/>
+          </w:tcPr>
+          <w:p>
+            <w:pPr>
+              <w:jc w:val="left"/>
+              <w:pBdr>
+                <w:bottom w:val="none" w:sz="0" w:space="0" w:color="000000"/>
+                <w:top w:val="none" w:sz="0" w:space="0" w:color="000000"/>
+                <w:left w:val="none" w:sz="0" w:space="0" w:color="000000"/>
+                <w:right w:val="none" w:sz="0" w:space="0" w:color="000000"/>
+              </w:pBdr>
+              <w:spacing w:after="80" w:before="80" w:line="240"/>
+              <w:ind w:left="80" w:right="80" w:firstLine="0" w:firstLineChars="0"/>
+              <w:rPr>
+                <w:rFonts w:ascii="Arial" w:hAnsi="Arial" w:eastAsia="Arial" w:cs="Arial"/>
+                <w:i w:val="false"/>
+                <w:b w:val="false"/>
+                <w:u w:val="none"/>
+                <w:strike w:val="false"/>
+                <w:sz w:val="18"/>
+                <w:szCs w:val="18"/>
+                <w:color w:val="000000"/>
+              </w:rPr>
+            </w:pPr>
+            <w:r xmlns:w="http://schemas.openxmlformats.org/wordprocessingml/2006/main" xmlns:wp="http://schemas.openxmlformats.org/drawingml/2006/wordprocessingDrawing" xmlns:r="http://schemas.openxmlformats.org/officeDocument/2006/relationships" xmlns:w14="http://schemas.microsoft.com/office/word/2010/wordml">
+              <w:rPr>
+                <w:rFonts w:ascii="Arial" w:hAnsi="Arial" w:eastAsia="Arial" w:cs="Arial"/>
+                <w:i w:val="false"/>
+                <w:b w:val="false"/>
+                <w:u w:val="none"/>
+                <w:strike w:val="false"/>
+                <w:sz w:val="18"/>
+                <w:szCs w:val="18"/>
+                <w:color w:val="000000"/>
+              </w:rPr>
+              <w:t xml:space="preserve">dACI</w:t>
+            </w:r>
+          </w:p>
+        </w:tc>
+        <w:tc>
+          <w:tcPr>
+            <w:tcBorders>
+              <w:bottom w:val="none" w:sz="0" w:space="0" w:color="000000"/>
+              <w:top w:val="none" w:sz="0" w:space="0" w:color="000000"/>
+              <w:left w:val="none" w:sz="0" w:space="0" w:color="000000"/>
+              <w:right w:val="none" w:sz="0" w:space="0" w:color="000000"/>
+            </w:tcBorders>
+            <w:shd w:val="clear" w:color="auto" w:fill="FFFFFF"/>
+            <w:tcMar>
+              <w:top w:w="0" w:type="dxa"/>
+              <w:bottom w:w="0" w:type="dxa"/>
+              <w:left w:w="0" w:type="dxa"/>
+              <w:right w:w="0" w:type="dxa"/>
+            </w:tcMar>
+            <w:vAlign w:val="center"/>
+          </w:tcPr>
+          <w:p>
+            <w:pPr>
+              <w:jc w:val="center"/>
+              <w:pBdr>
+                <w:bottom w:val="none" w:sz="0" w:space="0" w:color="000000"/>
+                <w:top w:val="none" w:sz="0" w:space="0" w:color="000000"/>
+                <w:left w:val="none" w:sz="0" w:space="0" w:color="000000"/>
+                <w:right w:val="none" w:sz="0" w:space="0" w:color="000000"/>
+              </w:pBdr>
+              <w:spacing w:after="80" w:before="80" w:line="240"/>
+              <w:ind w:left="80" w:right="80" w:firstLine="0" w:firstLineChars="0"/>
+              <w:rPr>
+                <w:rFonts w:ascii="Arial" w:hAnsi="Arial" w:eastAsia="Arial" w:cs="Arial"/>
+                <w:i w:val="false"/>
+                <w:b w:val="false"/>
+                <w:u w:val="none"/>
+                <w:strike w:val="false"/>
+                <w:sz w:val="18"/>
+                <w:szCs w:val="18"/>
+                <w:color w:val="000000"/>
+              </w:rPr>
+            </w:pPr>
+            <w:r xmlns:w="http://schemas.openxmlformats.org/wordprocessingml/2006/main" xmlns:wp="http://schemas.openxmlformats.org/drawingml/2006/wordprocessingDrawing" xmlns:r="http://schemas.openxmlformats.org/officeDocument/2006/relationships" xmlns:w14="http://schemas.microsoft.com/office/word/2010/wordml">
+              <w:rPr>
+                <w:rFonts w:ascii="Arial" w:hAnsi="Arial" w:eastAsia="Arial" w:cs="Arial"/>
+                <w:i w:val="false"/>
+                <w:b w:val="false"/>
+                <w:u w:val="none"/>
+                <w:strike w:val="false"/>
+                <w:sz w:val="18"/>
+                <w:szCs w:val="18"/>
+                <w:color w:val="000000"/>
+              </w:rPr>
+              <w:t xml:space="preserve">pasture</w:t>
+            </w:r>
+          </w:p>
+        </w:tc>
+        <w:tc>
+          <w:tcPr>
+            <w:tcBorders>
+              <w:bottom w:val="none" w:sz="0" w:space="0" w:color="000000"/>
+              <w:top w:val="none" w:sz="0" w:space="0" w:color="000000"/>
+              <w:left w:val="none" w:sz="0" w:space="0" w:color="000000"/>
+              <w:right w:val="none" w:sz="0" w:space="0" w:color="000000"/>
+            </w:tcBorders>
+            <w:shd w:val="clear" w:color="auto" w:fill="FFFFFF"/>
+            <w:tcMar>
+              <w:top w:w="0" w:type="dxa"/>
+              <w:bottom w:w="0" w:type="dxa"/>
+              <w:left w:w="0" w:type="dxa"/>
+              <w:right w:w="0" w:type="dxa"/>
+            </w:tcMar>
+            <w:vAlign w:val="center"/>
+          </w:tcPr>
+          <w:p>
+            <w:pPr>
+              <w:jc w:val="center"/>
+              <w:pBdr>
+                <w:bottom w:val="none" w:sz="0" w:space="0" w:color="000000"/>
+                <w:top w:val="none" w:sz="0" w:space="0" w:color="000000"/>
+                <w:left w:val="none" w:sz="0" w:space="0" w:color="000000"/>
+                <w:right w:val="none" w:sz="0" w:space="0" w:color="000000"/>
+              </w:pBdr>
+              <w:spacing w:after="80" w:before="80" w:line="240"/>
+              <w:ind w:left="80" w:right="80" w:firstLine="0" w:firstLineChars="0"/>
+              <w:rPr>
+                <w:rFonts w:ascii="Arial" w:hAnsi="Arial" w:eastAsia="Arial" w:cs="Arial"/>
+                <w:i w:val="false"/>
+                <w:b w:val="false"/>
+                <w:u w:val="none"/>
+                <w:strike w:val="false"/>
+                <w:sz w:val="18"/>
+                <w:szCs w:val="18"/>
+                <w:color w:val="000000"/>
+              </w:rPr>
+            </w:pPr>
+            <w:r xmlns:w="http://schemas.openxmlformats.org/wordprocessingml/2006/main" xmlns:wp="http://schemas.openxmlformats.org/drawingml/2006/wordprocessingDrawing" xmlns:r="http://schemas.openxmlformats.org/officeDocument/2006/relationships" xmlns:w14="http://schemas.microsoft.com/office/word/2010/wordml">
+              <w:rPr>
+                <w:rFonts w:ascii="Arial" w:hAnsi="Arial" w:eastAsia="Arial" w:cs="Arial"/>
+                <w:i w:val="false"/>
+                <w:b w:val="false"/>
+                <w:u w:val="none"/>
+                <w:strike w:val="false"/>
+                <w:sz w:val="18"/>
+                <w:szCs w:val="18"/>
+                <w:color w:val="000000"/>
+              </w:rPr>
+              <w:t xml:space="preserve">-0.2991</w:t>
+            </w:r>
+          </w:p>
+        </w:tc>
+        <w:tc>
+          <w:tcPr>
+            <w:tcBorders>
+              <w:bottom w:val="none" w:sz="0" w:space="0" w:color="000000"/>
+              <w:top w:val="none" w:sz="0" w:space="0" w:color="000000"/>
+              <w:left w:val="none" w:sz="0" w:space="0" w:color="000000"/>
+              <w:right w:val="none" w:sz="0" w:space="0" w:color="000000"/>
+            </w:tcBorders>
+            <w:shd w:val="clear" w:color="auto" w:fill="FFFFFF"/>
+            <w:tcMar>
+              <w:top w:w="0" w:type="dxa"/>
+              <w:bottom w:w="0" w:type="dxa"/>
+              <w:left w:w="0" w:type="dxa"/>
+              <w:right w:w="0" w:type="dxa"/>
+            </w:tcMar>
+            <w:vAlign w:val="center"/>
+          </w:tcPr>
+          <w:p>
+            <w:pPr>
+              <w:jc w:val="center"/>
+              <w:pBdr>
+                <w:bottom w:val="none" w:sz="0" w:space="0" w:color="000000"/>
+                <w:top w:val="none" w:sz="0" w:space="0" w:color="000000"/>
+                <w:left w:val="none" w:sz="0" w:space="0" w:color="000000"/>
+                <w:right w:val="none" w:sz="0" w:space="0" w:color="000000"/>
+              </w:pBdr>
+              <w:spacing w:after="80" w:before="80" w:line="240"/>
+              <w:ind w:left="80" w:right="80" w:firstLine="0" w:firstLineChars="0"/>
+              <w:rPr>
+                <w:rFonts w:ascii="Arial" w:hAnsi="Arial" w:eastAsia="Arial" w:cs="Arial"/>
+                <w:i w:val="false"/>
+                <w:b w:val="false"/>
+                <w:u w:val="none"/>
+                <w:strike w:val="false"/>
+                <w:sz w:val="18"/>
+                <w:szCs w:val="18"/>
+                <w:color w:val="000000"/>
+              </w:rPr>
+            </w:pPr>
+            <w:r xmlns:w="http://schemas.openxmlformats.org/wordprocessingml/2006/main" xmlns:wp="http://schemas.openxmlformats.org/drawingml/2006/wordprocessingDrawing" xmlns:r="http://schemas.openxmlformats.org/officeDocument/2006/relationships" xmlns:w14="http://schemas.microsoft.com/office/word/2010/wordml">
+              <w:rPr>
+                <w:rFonts w:ascii="Arial" w:hAnsi="Arial" w:eastAsia="Arial" w:cs="Arial"/>
+                <w:i w:val="false"/>
+                <w:b w:val="false"/>
+                <w:u w:val="none"/>
+                <w:strike w:val="false"/>
+                <w:sz w:val="18"/>
+                <w:szCs w:val="18"/>
+                <w:color w:val="000000"/>
+              </w:rPr>
+              <w:t xml:space="preserve">-2.4301</w:t>
+            </w:r>
+          </w:p>
+        </w:tc>
+        <w:tc>
+          <w:tcPr>
+            <w:tcBorders>
+              <w:bottom w:val="none" w:sz="0" w:space="0" w:color="000000"/>
+              <w:top w:val="none" w:sz="0" w:space="0" w:color="000000"/>
+              <w:left w:val="none" w:sz="0" w:space="0" w:color="000000"/>
+              <w:right w:val="none" w:sz="0" w:space="0" w:color="000000"/>
+            </w:tcBorders>
+            <w:shd w:val="clear" w:color="auto" w:fill="FFFFFF"/>
+            <w:tcMar>
+              <w:top w:w="0" w:type="dxa"/>
+              <w:bottom w:w="0" w:type="dxa"/>
+              <w:left w:w="0" w:type="dxa"/>
+              <w:right w:w="0" w:type="dxa"/>
+            </w:tcMar>
+            <w:vAlign w:val="center"/>
+          </w:tcPr>
+          <w:p>
+            <w:pPr>
+              <w:jc w:val="center"/>
+              <w:pBdr>
+                <w:bottom w:val="none" w:sz="0" w:space="0" w:color="000000"/>
+                <w:top w:val="none" w:sz="0" w:space="0" w:color="000000"/>
+                <w:left w:val="none" w:sz="0" w:space="0" w:color="000000"/>
+                <w:right w:val="none" w:sz="0" w:space="0" w:color="000000"/>
+              </w:pBdr>
+              <w:spacing w:after="80" w:before="80" w:line="240"/>
+              <w:ind w:left="80" w:right="80" w:firstLine="0" w:firstLineChars="0"/>
+              <w:rPr>
+                <w:rFonts w:ascii="Arial" w:hAnsi="Arial" w:eastAsia="Arial" w:cs="Arial"/>
+                <w:i w:val="false"/>
+                <w:b w:val="false"/>
+                <w:u w:val="none"/>
+                <w:strike w:val="false"/>
+                <w:sz w:val="18"/>
+                <w:szCs w:val="18"/>
+                <w:color w:val="000000"/>
+              </w:rPr>
+            </w:pPr>
+            <w:r xmlns:w="http://schemas.openxmlformats.org/wordprocessingml/2006/main" xmlns:wp="http://schemas.openxmlformats.org/drawingml/2006/wordprocessingDrawing" xmlns:r="http://schemas.openxmlformats.org/officeDocument/2006/relationships" xmlns:w14="http://schemas.microsoft.com/office/word/2010/wordml">
+              <w:rPr>
+                <w:rFonts w:ascii="Arial" w:hAnsi="Arial" w:eastAsia="Arial" w:cs="Arial"/>
+                <w:i w:val="false"/>
+                <w:b w:val="false"/>
+                <w:u w:val="none"/>
+                <w:strike w:val="false"/>
+                <w:sz w:val="18"/>
+                <w:szCs w:val="18"/>
+                <w:color w:val="000000"/>
+              </w:rPr>
+              <w:t xml:space="preserve">1.8318</w:t>
+            </w:r>
+          </w:p>
+        </w:tc>
+        <w:tc>
+          <w:tcPr>
+            <w:tcBorders>
+              <w:bottom w:val="none" w:sz="0" w:space="0" w:color="000000"/>
+              <w:top w:val="none" w:sz="0" w:space="0" w:color="000000"/>
+              <w:left w:val="none" w:sz="0" w:space="0" w:color="000000"/>
+              <w:right w:val="none" w:sz="0" w:space="0" w:color="000000"/>
+            </w:tcBorders>
+            <w:shd w:val="clear" w:color="auto" w:fill="FFFFFF"/>
+            <w:tcMar>
+              <w:top w:w="0" w:type="dxa"/>
+              <w:bottom w:w="0" w:type="dxa"/>
+              <w:left w:w="0" w:type="dxa"/>
+              <w:right w:w="0" w:type="dxa"/>
+            </w:tcMar>
+            <w:vAlign w:val="center"/>
+          </w:tcPr>
+          <w:p>
+            <w:pPr>
+              <w:jc w:val="center"/>
+              <w:pBdr>
+                <w:bottom w:val="none" w:sz="0" w:space="0" w:color="000000"/>
+                <w:top w:val="none" w:sz="0" w:space="0" w:color="000000"/>
+                <w:left w:val="none" w:sz="0" w:space="0" w:color="000000"/>
+                <w:right w:val="none" w:sz="0" w:space="0" w:color="000000"/>
+              </w:pBdr>
+              <w:spacing w:after="80" w:before="80" w:line="240"/>
+              <w:ind w:left="80" w:right="80" w:firstLine="0" w:firstLineChars="0"/>
+              <w:rPr>
+                <w:rFonts w:ascii="Arial" w:hAnsi="Arial" w:eastAsia="Arial" w:cs="Arial"/>
+                <w:i w:val="false"/>
+                <w:b w:val="false"/>
+                <w:u w:val="none"/>
+                <w:strike w:val="false"/>
+                <w:sz w:val="18"/>
+                <w:szCs w:val="18"/>
+                <w:color w:val="000000"/>
+              </w:rPr>
+            </w:pPr>
+            <w:r xmlns:w="http://schemas.openxmlformats.org/wordprocessingml/2006/main" xmlns:wp="http://schemas.openxmlformats.org/drawingml/2006/wordprocessingDrawing" xmlns:r="http://schemas.openxmlformats.org/officeDocument/2006/relationships" xmlns:w14="http://schemas.microsoft.com/office/word/2010/wordml">
+              <w:rPr>
+                <w:rFonts w:ascii="Arial" w:hAnsi="Arial" w:eastAsia="Arial" w:cs="Arial"/>
+                <w:i w:val="false"/>
+                <w:b w:val="false"/>
+                <w:u w:val="none"/>
+                <w:strike w:val="false"/>
+                <w:sz w:val="18"/>
+                <w:szCs w:val="18"/>
+                <w:color w:val="000000"/>
+              </w:rPr>
+              <w:t xml:space="preserve">0.008</w:t>
+            </w:r>
+          </w:p>
+        </w:tc>
+        <w:tc>
+          <w:tcPr>
+            <w:tcBorders>
+              <w:bottom w:val="none" w:sz="0" w:space="0" w:color="000000"/>
+              <w:top w:val="none" w:sz="0" w:space="0" w:color="000000"/>
+              <w:left w:val="none" w:sz="0" w:space="0" w:color="000000"/>
+              <w:right w:val="none" w:sz="0" w:space="0" w:color="000000"/>
+            </w:tcBorders>
+            <w:shd w:val="clear" w:color="auto" w:fill="FFFFFF"/>
+            <w:tcMar>
+              <w:top w:w="0" w:type="dxa"/>
+              <w:bottom w:w="0" w:type="dxa"/>
+              <w:left w:w="0" w:type="dxa"/>
+              <w:right w:w="0" w:type="dxa"/>
+            </w:tcMar>
+            <w:vAlign w:val="center"/>
+          </w:tcPr>
+          <w:p>
+            <w:pPr>
+              <w:jc w:val="center"/>
+              <w:pBdr>
+                <w:bottom w:val="none" w:sz="0" w:space="0" w:color="000000"/>
+                <w:top w:val="none" w:sz="0" w:space="0" w:color="000000"/>
+                <w:left w:val="none" w:sz="0" w:space="0" w:color="000000"/>
+                <w:right w:val="none" w:sz="0" w:space="0" w:color="000000"/>
+              </w:pBdr>
+              <w:spacing w:after="80" w:before="80" w:line="240"/>
+              <w:ind w:left="80" w:right="80" w:firstLine="0" w:firstLineChars="0"/>
+              <w:rPr>
+                <w:rFonts w:ascii="Arial" w:hAnsi="Arial" w:eastAsia="Arial" w:cs="Arial"/>
+                <w:i w:val="false"/>
+                <w:b w:val="false"/>
+                <w:u w:val="none"/>
+                <w:strike w:val="false"/>
+                <w:sz w:val="18"/>
+                <w:szCs w:val="18"/>
+                <w:color w:val="000000"/>
+              </w:rPr>
+            </w:pPr>
+            <w:r xmlns:w="http://schemas.openxmlformats.org/wordprocessingml/2006/main" xmlns:wp="http://schemas.openxmlformats.org/drawingml/2006/wordprocessingDrawing" xmlns:r="http://schemas.openxmlformats.org/officeDocument/2006/relationships" xmlns:w14="http://schemas.microsoft.com/office/word/2010/wordml">
+              <w:rPr>
+                <w:rFonts w:ascii="Arial" w:hAnsi="Arial" w:eastAsia="Arial" w:cs="Arial"/>
+                <w:i w:val="false"/>
+                <w:b w:val="false"/>
+                <w:u w:val="none"/>
+                <w:strike w:val="false"/>
+                <w:sz w:val="18"/>
+                <w:szCs w:val="18"/>
+                <w:color w:val="000000"/>
+              </w:rPr>
+              <w:t xml:space="preserve">no</w:t>
+            </w:r>
+          </w:p>
+        </w:tc>
+        <w:tc>
+          <w:tcPr>
+            <w:tcBorders>
+              <w:bottom w:val="none" w:sz="0" w:space="0" w:color="000000"/>
+              <w:top w:val="none" w:sz="0" w:space="0" w:color="000000"/>
+              <w:left w:val="none" w:sz="0" w:space="0" w:color="000000"/>
+              <w:right w:val="none" w:sz="0" w:space="0" w:color="000000"/>
+            </w:tcBorders>
+            <w:shd w:val="clear" w:color="auto" w:fill="FFFFFF"/>
+            <w:tcMar>
+              <w:top w:w="0" w:type="dxa"/>
+              <w:bottom w:w="0" w:type="dxa"/>
+              <w:left w:w="0" w:type="dxa"/>
+              <w:right w:w="0" w:type="dxa"/>
+            </w:tcMar>
+            <w:vAlign w:val="center"/>
+          </w:tcPr>
+          <w:p>
+            <w:pPr>
+              <w:jc w:val="center"/>
+              <w:pBdr>
+                <w:bottom w:val="none" w:sz="0" w:space="0" w:color="000000"/>
+                <w:top w:val="none" w:sz="0" w:space="0" w:color="000000"/>
+                <w:left w:val="none" w:sz="0" w:space="0" w:color="000000"/>
+                <w:right w:val="none" w:sz="0" w:space="0" w:color="000000"/>
+              </w:pBdr>
+              <w:spacing w:after="80" w:before="80" w:line="240"/>
+              <w:ind w:left="80" w:right="80" w:firstLine="0" w:firstLineChars="0"/>
+              <w:rPr>
+                <w:rFonts w:ascii="Arial" w:hAnsi="Arial" w:eastAsia="Arial" w:cs="Arial"/>
+                <w:i w:val="false"/>
+                <w:b w:val="false"/>
+                <w:u w:val="none"/>
+                <w:strike w:val="false"/>
+                <w:sz w:val="18"/>
+                <w:szCs w:val="18"/>
+                <w:color w:val="000000"/>
+              </w:rPr>
+            </w:pPr>
+            <w:r xmlns:w="http://schemas.openxmlformats.org/wordprocessingml/2006/main" xmlns:wp="http://schemas.openxmlformats.org/drawingml/2006/wordprocessingDrawing" xmlns:r="http://schemas.openxmlformats.org/officeDocument/2006/relationships" xmlns:w14="http://schemas.microsoft.com/office/word/2010/wordml">
+              <w:rPr>
+                <w:rFonts w:ascii="Arial" w:hAnsi="Arial" w:eastAsia="Arial" w:cs="Arial"/>
+                <w:i w:val="false"/>
+                <w:b w:val="false"/>
+                <w:u w:val="none"/>
+                <w:strike w:val="false"/>
+                <w:sz w:val="18"/>
+                <w:szCs w:val="18"/>
+                <w:color w:val="000000"/>
+              </w:rPr>
+              <w:t xml:space="preserve">10</w:t>
+            </w:r>
+          </w:p>
+        </w:tc>
+      </w:tr>
+      <w:tr>
+        <w:trPr>
+          <w:trHeight w:val="360" w:hRule="auto"/>
+        </w:trPr>
+        <w:tc>
+          <w:tcPr>
+            <w:tcBorders>
+              <w:bottom w:val="none" w:sz="0" w:space="0" w:color="000000"/>
+              <w:top w:val="none" w:sz="0" w:space="0" w:color="000000"/>
+              <w:left w:val="none" w:sz="0" w:space="0" w:color="000000"/>
+              <w:right w:val="none" w:sz="0" w:space="0" w:color="000000"/>
+            </w:tcBorders>
+            <w:shd w:val="clear" w:color="auto" w:fill="FFFFFF"/>
+            <w:tcMar>
+              <w:top w:w="0" w:type="dxa"/>
+              <w:bottom w:w="0" w:type="dxa"/>
+              <w:left w:w="0" w:type="dxa"/>
+              <w:right w:w="0" w:type="dxa"/>
+            </w:tcMar>
+            <w:vAlign w:val="center"/>
+          </w:tcPr>
+          <w:p>
+            <w:pPr>
+              <w:jc w:val="left"/>
+              <w:pBdr>
+                <w:bottom w:val="none" w:sz="0" w:space="0" w:color="000000"/>
+                <w:top w:val="none" w:sz="0" w:space="0" w:color="000000"/>
+                <w:left w:val="none" w:sz="0" w:space="0" w:color="000000"/>
+                <w:right w:val="none" w:sz="0" w:space="0" w:color="000000"/>
+              </w:pBdr>
+              <w:spacing w:after="80" w:before="80" w:line="240"/>
+              <w:ind w:left="80" w:right="80" w:firstLine="0" w:firstLineChars="0"/>
+              <w:rPr>
+                <w:rFonts w:ascii="Arial" w:hAnsi="Arial" w:eastAsia="Arial" w:cs="Arial"/>
+                <w:i w:val="false"/>
+                <w:b w:val="false"/>
+                <w:u w:val="none"/>
+                <w:strike w:val="false"/>
+                <w:sz w:val="18"/>
+                <w:szCs w:val="18"/>
+                <w:color w:val="000000"/>
+              </w:rPr>
+            </w:pPr>
+            <w:r xmlns:w="http://schemas.openxmlformats.org/wordprocessingml/2006/main" xmlns:wp="http://schemas.openxmlformats.org/drawingml/2006/wordprocessingDrawing" xmlns:r="http://schemas.openxmlformats.org/officeDocument/2006/relationships" xmlns:w14="http://schemas.microsoft.com/office/word/2010/wordml">
+              <w:rPr>
+                <w:rFonts w:ascii="Arial" w:hAnsi="Arial" w:eastAsia="Arial" w:cs="Arial"/>
+                <w:i w:val="false"/>
+                <w:b w:val="false"/>
+                <w:u w:val="none"/>
+                <w:strike w:val="false"/>
+                <w:sz w:val="18"/>
+                <w:szCs w:val="18"/>
+                <w:color w:val="000000"/>
+              </w:rPr>
+              <w:t xml:space="preserve">dBI</w:t>
+            </w:r>
+          </w:p>
+        </w:tc>
+        <w:tc>
+          <w:tcPr>
+            <w:tcBorders>
+              <w:bottom w:val="none" w:sz="0" w:space="0" w:color="000000"/>
+              <w:top w:val="none" w:sz="0" w:space="0" w:color="000000"/>
+              <w:left w:val="none" w:sz="0" w:space="0" w:color="000000"/>
+              <w:right w:val="none" w:sz="0" w:space="0" w:color="000000"/>
+            </w:tcBorders>
+            <w:shd w:val="clear" w:color="auto" w:fill="FFFFFF"/>
+            <w:tcMar>
+              <w:top w:w="0" w:type="dxa"/>
+              <w:bottom w:w="0" w:type="dxa"/>
+              <w:left w:w="0" w:type="dxa"/>
+              <w:right w:w="0" w:type="dxa"/>
+            </w:tcMar>
+            <w:vAlign w:val="center"/>
+          </w:tcPr>
+          <w:p>
+            <w:pPr>
+              <w:jc w:val="center"/>
+              <w:pBdr>
+                <w:bottom w:val="none" w:sz="0" w:space="0" w:color="000000"/>
+                <w:top w:val="none" w:sz="0" w:space="0" w:color="000000"/>
+                <w:left w:val="none" w:sz="0" w:space="0" w:color="000000"/>
+                <w:right w:val="none" w:sz="0" w:space="0" w:color="000000"/>
+              </w:pBdr>
+              <w:spacing w:after="80" w:before="80" w:line="240"/>
+              <w:ind w:left="80" w:right="80" w:firstLine="0" w:firstLineChars="0"/>
+              <w:rPr>
+                <w:rFonts w:ascii="Arial" w:hAnsi="Arial" w:eastAsia="Arial" w:cs="Arial"/>
+                <w:i w:val="false"/>
+                <w:b w:val="false"/>
+                <w:u w:val="none"/>
+                <w:strike w:val="false"/>
+                <w:sz w:val="18"/>
+                <w:szCs w:val="18"/>
+                <w:color w:val="000000"/>
+              </w:rPr>
+            </w:pPr>
+            <w:r xmlns:w="http://schemas.openxmlformats.org/wordprocessingml/2006/main" xmlns:wp="http://schemas.openxmlformats.org/drawingml/2006/wordprocessingDrawing" xmlns:r="http://schemas.openxmlformats.org/officeDocument/2006/relationships" xmlns:w14="http://schemas.microsoft.com/office/word/2010/wordml">
+              <w:rPr>
+                <w:rFonts w:ascii="Arial" w:hAnsi="Arial" w:eastAsia="Arial" w:cs="Arial"/>
+                <w:i w:val="false"/>
+                <w:b w:val="false"/>
+                <w:u w:val="none"/>
+                <w:strike w:val="false"/>
+                <w:sz w:val="18"/>
+                <w:szCs w:val="18"/>
+                <w:color w:val="000000"/>
+              </w:rPr>
+              <w:t xml:space="preserve">forest</w:t>
+            </w:r>
+          </w:p>
+        </w:tc>
+        <w:tc>
+          <w:tcPr>
+            <w:tcBorders>
+              <w:bottom w:val="none" w:sz="0" w:space="0" w:color="000000"/>
+              <w:top w:val="none" w:sz="0" w:space="0" w:color="000000"/>
+              <w:left w:val="none" w:sz="0" w:space="0" w:color="000000"/>
+              <w:right w:val="none" w:sz="0" w:space="0" w:color="000000"/>
+            </w:tcBorders>
+            <w:shd w:val="clear" w:color="auto" w:fill="FFFFFF"/>
+            <w:tcMar>
+              <w:top w:w="0" w:type="dxa"/>
+              <w:bottom w:w="0" w:type="dxa"/>
+              <w:left w:w="0" w:type="dxa"/>
+              <w:right w:w="0" w:type="dxa"/>
+            </w:tcMar>
+            <w:vAlign w:val="center"/>
+          </w:tcPr>
+          <w:p>
+            <w:pPr>
+              <w:jc w:val="center"/>
+              <w:pBdr>
+                <w:bottom w:val="none" w:sz="0" w:space="0" w:color="000000"/>
+                <w:top w:val="none" w:sz="0" w:space="0" w:color="000000"/>
+                <w:left w:val="none" w:sz="0" w:space="0" w:color="000000"/>
+                <w:right w:val="none" w:sz="0" w:space="0" w:color="000000"/>
+              </w:pBdr>
+              <w:spacing w:after="80" w:before="80" w:line="240"/>
+              <w:ind w:left="80" w:right="80" w:firstLine="0" w:firstLineChars="0"/>
+              <w:rPr>
+                <w:rFonts w:ascii="Arial" w:hAnsi="Arial" w:eastAsia="Arial" w:cs="Arial"/>
+                <w:i w:val="false"/>
+                <w:b w:val="false"/>
+                <w:u w:val="none"/>
+                <w:strike w:val="false"/>
+                <w:sz w:val="18"/>
+                <w:szCs w:val="18"/>
+                <w:color w:val="000000"/>
+              </w:rPr>
+            </w:pPr>
+            <w:r xmlns:w="http://schemas.openxmlformats.org/wordprocessingml/2006/main" xmlns:wp="http://schemas.openxmlformats.org/drawingml/2006/wordprocessingDrawing" xmlns:r="http://schemas.openxmlformats.org/officeDocument/2006/relationships" xmlns:w14="http://schemas.microsoft.com/office/word/2010/wordml">
+              <w:rPr>
+                <w:rFonts w:ascii="Arial" w:hAnsi="Arial" w:eastAsia="Arial" w:cs="Arial"/>
+                <w:i w:val="false"/>
+                <w:b w:val="false"/>
+                <w:u w:val="none"/>
+                <w:strike w:val="false"/>
+                <w:sz w:val="18"/>
+                <w:szCs w:val="18"/>
+                <w:color w:val="000000"/>
+              </w:rPr>
+              <w:t xml:space="preserve">-0.2331</w:t>
+            </w:r>
+          </w:p>
+        </w:tc>
+        <w:tc>
+          <w:tcPr>
+            <w:tcBorders>
+              <w:bottom w:val="none" w:sz="0" w:space="0" w:color="000000"/>
+              <w:top w:val="none" w:sz="0" w:space="0" w:color="000000"/>
+              <w:left w:val="none" w:sz="0" w:space="0" w:color="000000"/>
+              <w:right w:val="none" w:sz="0" w:space="0" w:color="000000"/>
+            </w:tcBorders>
+            <w:shd w:val="clear" w:color="auto" w:fill="FFFFFF"/>
+            <w:tcMar>
+              <w:top w:w="0" w:type="dxa"/>
+              <w:bottom w:w="0" w:type="dxa"/>
+              <w:left w:w="0" w:type="dxa"/>
+              <w:right w:w="0" w:type="dxa"/>
+            </w:tcMar>
+            <w:vAlign w:val="center"/>
+          </w:tcPr>
+          <w:p>
+            <w:pPr>
+              <w:jc w:val="center"/>
+              <w:pBdr>
+                <w:bottom w:val="none" w:sz="0" w:space="0" w:color="000000"/>
+                <w:top w:val="none" w:sz="0" w:space="0" w:color="000000"/>
+                <w:left w:val="none" w:sz="0" w:space="0" w:color="000000"/>
+                <w:right w:val="none" w:sz="0" w:space="0" w:color="000000"/>
+              </w:pBdr>
+              <w:spacing w:after="80" w:before="80" w:line="240"/>
+              <w:ind w:left="80" w:right="80" w:firstLine="0" w:firstLineChars="0"/>
+              <w:rPr>
+                <w:rFonts w:ascii="Arial" w:hAnsi="Arial" w:eastAsia="Arial" w:cs="Arial"/>
+                <w:i w:val="false"/>
+                <w:b w:val="false"/>
+                <w:u w:val="none"/>
+                <w:strike w:val="false"/>
+                <w:sz w:val="18"/>
+                <w:szCs w:val="18"/>
+                <w:color w:val="000000"/>
+              </w:rPr>
+            </w:pPr>
+            <w:r xmlns:w="http://schemas.openxmlformats.org/wordprocessingml/2006/main" xmlns:wp="http://schemas.openxmlformats.org/drawingml/2006/wordprocessingDrawing" xmlns:r="http://schemas.openxmlformats.org/officeDocument/2006/relationships" xmlns:w14="http://schemas.microsoft.com/office/word/2010/wordml">
+              <w:rPr>
+                <w:rFonts w:ascii="Arial" w:hAnsi="Arial" w:eastAsia="Arial" w:cs="Arial"/>
+                <w:i w:val="false"/>
+                <w:b w:val="false"/>
+                <w:u w:val="none"/>
+                <w:strike w:val="false"/>
+                <w:sz w:val="18"/>
+                <w:szCs w:val="18"/>
+                <w:color w:val="000000"/>
+              </w:rPr>
+              <w:t xml:space="preserve">-0.5722</w:t>
+            </w:r>
+          </w:p>
+        </w:tc>
+        <w:tc>
+          <w:tcPr>
+            <w:tcBorders>
+              <w:bottom w:val="none" w:sz="0" w:space="0" w:color="000000"/>
+              <w:top w:val="none" w:sz="0" w:space="0" w:color="000000"/>
+              <w:left w:val="none" w:sz="0" w:space="0" w:color="000000"/>
+              <w:right w:val="none" w:sz="0" w:space="0" w:color="000000"/>
+            </w:tcBorders>
+            <w:shd w:val="clear" w:color="auto" w:fill="FFFFFF"/>
+            <w:tcMar>
+              <w:top w:w="0" w:type="dxa"/>
+              <w:bottom w:w="0" w:type="dxa"/>
+              <w:left w:w="0" w:type="dxa"/>
+              <w:right w:w="0" w:type="dxa"/>
+            </w:tcMar>
+            <w:vAlign w:val="center"/>
+          </w:tcPr>
+          <w:p>
+            <w:pPr>
+              <w:jc w:val="center"/>
+              <w:pBdr>
+                <w:bottom w:val="none" w:sz="0" w:space="0" w:color="000000"/>
+                <w:top w:val="none" w:sz="0" w:space="0" w:color="000000"/>
+                <w:left w:val="none" w:sz="0" w:space="0" w:color="000000"/>
+                <w:right w:val="none" w:sz="0" w:space="0" w:color="000000"/>
+              </w:pBdr>
+              <w:spacing w:after="80" w:before="80" w:line="240"/>
+              <w:ind w:left="80" w:right="80" w:firstLine="0" w:firstLineChars="0"/>
+              <w:rPr>
+                <w:rFonts w:ascii="Arial" w:hAnsi="Arial" w:eastAsia="Arial" w:cs="Arial"/>
+                <w:i w:val="false"/>
+                <w:b w:val="false"/>
+                <w:u w:val="none"/>
+                <w:strike w:val="false"/>
+                <w:sz w:val="18"/>
+                <w:szCs w:val="18"/>
+                <w:color w:val="000000"/>
+              </w:rPr>
+            </w:pPr>
+            <w:r xmlns:w="http://schemas.openxmlformats.org/wordprocessingml/2006/main" xmlns:wp="http://schemas.openxmlformats.org/drawingml/2006/wordprocessingDrawing" xmlns:r="http://schemas.openxmlformats.org/officeDocument/2006/relationships" xmlns:w14="http://schemas.microsoft.com/office/word/2010/wordml">
+              <w:rPr>
+                <w:rFonts w:ascii="Arial" w:hAnsi="Arial" w:eastAsia="Arial" w:cs="Arial"/>
+                <w:i w:val="false"/>
+                <w:b w:val="false"/>
+                <w:u w:val="none"/>
+                <w:strike w:val="false"/>
+                <w:sz w:val="18"/>
+                <w:szCs w:val="18"/>
+                <w:color w:val="000000"/>
+              </w:rPr>
+              <w:t xml:space="preserve">0.1060</w:t>
+            </w:r>
+          </w:p>
+        </w:tc>
+        <w:tc>
+          <w:tcPr>
+            <w:tcBorders>
+              <w:bottom w:val="none" w:sz="0" w:space="0" w:color="000000"/>
+              <w:top w:val="none" w:sz="0" w:space="0" w:color="000000"/>
+              <w:left w:val="none" w:sz="0" w:space="0" w:color="000000"/>
+              <w:right w:val="none" w:sz="0" w:space="0" w:color="000000"/>
+            </w:tcBorders>
+            <w:shd w:val="clear" w:color="auto" w:fill="FFFFFF"/>
+            <w:tcMar>
+              <w:top w:w="0" w:type="dxa"/>
+              <w:bottom w:w="0" w:type="dxa"/>
+              <w:left w:w="0" w:type="dxa"/>
+              <w:right w:w="0" w:type="dxa"/>
+            </w:tcMar>
+            <w:vAlign w:val="center"/>
+          </w:tcPr>
+          <w:p>
+            <w:pPr>
+              <w:jc w:val="center"/>
+              <w:pBdr>
+                <w:bottom w:val="none" w:sz="0" w:space="0" w:color="000000"/>
+                <w:top w:val="none" w:sz="0" w:space="0" w:color="000000"/>
+                <w:left w:val="none" w:sz="0" w:space="0" w:color="000000"/>
+                <w:right w:val="none" w:sz="0" w:space="0" w:color="000000"/>
+              </w:pBdr>
+              <w:spacing w:after="80" w:before="80" w:line="240"/>
+              <w:ind w:left="80" w:right="80" w:firstLine="0" w:firstLineChars="0"/>
+              <w:rPr>
+                <w:rFonts w:ascii="Arial" w:hAnsi="Arial" w:eastAsia="Arial" w:cs="Arial"/>
+                <w:i w:val="false"/>
+                <w:b w:val="false"/>
+                <w:u w:val="none"/>
+                <w:strike w:val="false"/>
+                <w:sz w:val="18"/>
+                <w:szCs w:val="18"/>
+                <w:color w:val="000000"/>
+              </w:rPr>
+            </w:pPr>
+            <w:r xmlns:w="http://schemas.openxmlformats.org/wordprocessingml/2006/main" xmlns:wp="http://schemas.openxmlformats.org/drawingml/2006/wordprocessingDrawing" xmlns:r="http://schemas.openxmlformats.org/officeDocument/2006/relationships" xmlns:w14="http://schemas.microsoft.com/office/word/2010/wordml">
+              <w:rPr>
+                <w:rFonts w:ascii="Arial" w:hAnsi="Arial" w:eastAsia="Arial" w:cs="Arial"/>
+                <w:i w:val="false"/>
+                <w:b w:val="false"/>
+                <w:u w:val="none"/>
+                <w:strike w:val="false"/>
+                <w:sz w:val="18"/>
+                <w:szCs w:val="18"/>
+                <w:color w:val="000000"/>
+              </w:rPr>
+              <w:t xml:space="preserve">0.142</w:t>
+            </w:r>
+          </w:p>
+        </w:tc>
+        <w:tc>
+          <w:tcPr>
+            <w:tcBorders>
+              <w:bottom w:val="none" w:sz="0" w:space="0" w:color="000000"/>
+              <w:top w:val="none" w:sz="0" w:space="0" w:color="000000"/>
+              <w:left w:val="none" w:sz="0" w:space="0" w:color="000000"/>
+              <w:right w:val="none" w:sz="0" w:space="0" w:color="000000"/>
+            </w:tcBorders>
+            <w:shd w:val="clear" w:color="auto" w:fill="FFFFFF"/>
+            <w:tcMar>
+              <w:top w:w="0" w:type="dxa"/>
+              <w:bottom w:w="0" w:type="dxa"/>
+              <w:left w:w="0" w:type="dxa"/>
+              <w:right w:w="0" w:type="dxa"/>
+            </w:tcMar>
+            <w:vAlign w:val="center"/>
+          </w:tcPr>
+          <w:p>
+            <w:pPr>
+              <w:jc w:val="center"/>
+              <w:pBdr>
+                <w:bottom w:val="none" w:sz="0" w:space="0" w:color="000000"/>
+                <w:top w:val="none" w:sz="0" w:space="0" w:color="000000"/>
+                <w:left w:val="none" w:sz="0" w:space="0" w:color="000000"/>
+                <w:right w:val="none" w:sz="0" w:space="0" w:color="000000"/>
+              </w:pBdr>
+              <w:spacing w:after="80" w:before="80" w:line="240"/>
+              <w:ind w:left="80" w:right="80" w:firstLine="0" w:firstLineChars="0"/>
+              <w:rPr>
+                <w:rFonts w:ascii="Arial" w:hAnsi="Arial" w:eastAsia="Arial" w:cs="Arial"/>
+                <w:i w:val="false"/>
+                <w:b w:val="false"/>
+                <w:u w:val="none"/>
+                <w:strike w:val="false"/>
+                <w:sz w:val="18"/>
+                <w:szCs w:val="18"/>
+                <w:color w:val="000000"/>
+              </w:rPr>
+            </w:pPr>
+            <w:r xmlns:w="http://schemas.openxmlformats.org/wordprocessingml/2006/main" xmlns:wp="http://schemas.openxmlformats.org/drawingml/2006/wordprocessingDrawing" xmlns:r="http://schemas.openxmlformats.org/officeDocument/2006/relationships" xmlns:w14="http://schemas.microsoft.com/office/word/2010/wordml">
+              <w:rPr>
+                <w:rFonts w:ascii="Arial" w:hAnsi="Arial" w:eastAsia="Arial" w:cs="Arial"/>
+                <w:i w:val="false"/>
+                <w:b w:val="false"/>
+                <w:u w:val="none"/>
+                <w:strike w:val="false"/>
+                <w:sz w:val="18"/>
+                <w:szCs w:val="18"/>
+                <w:color w:val="000000"/>
+              </w:rPr>
+              <w:t xml:space="preserve">no</w:t>
+            </w:r>
+          </w:p>
+        </w:tc>
+        <w:tc>
+          <w:tcPr>
+            <w:tcBorders>
+              <w:bottom w:val="none" w:sz="0" w:space="0" w:color="000000"/>
+              <w:top w:val="none" w:sz="0" w:space="0" w:color="000000"/>
+              <w:left w:val="none" w:sz="0" w:space="0" w:color="000000"/>
+              <w:right w:val="none" w:sz="0" w:space="0" w:color="000000"/>
+            </w:tcBorders>
+            <w:shd w:val="clear" w:color="auto" w:fill="FFFFFF"/>
+            <w:tcMar>
+              <w:top w:w="0" w:type="dxa"/>
+              <w:bottom w:w="0" w:type="dxa"/>
+              <w:left w:w="0" w:type="dxa"/>
+              <w:right w:w="0" w:type="dxa"/>
+            </w:tcMar>
+            <w:vAlign w:val="center"/>
+          </w:tcPr>
+          <w:p>
+            <w:pPr>
+              <w:jc w:val="center"/>
+              <w:pBdr>
+                <w:bottom w:val="none" w:sz="0" w:space="0" w:color="000000"/>
+                <w:top w:val="none" w:sz="0" w:space="0" w:color="000000"/>
+                <w:left w:val="none" w:sz="0" w:space="0" w:color="000000"/>
+                <w:right w:val="none" w:sz="0" w:space="0" w:color="000000"/>
+              </w:pBdr>
+              <w:spacing w:after="80" w:before="80" w:line="240"/>
+              <w:ind w:left="80" w:right="80" w:firstLine="0" w:firstLineChars="0"/>
+              <w:rPr>
+                <w:rFonts w:ascii="Arial" w:hAnsi="Arial" w:eastAsia="Arial" w:cs="Arial"/>
+                <w:i w:val="false"/>
+                <w:b w:val="false"/>
+                <w:u w:val="none"/>
+                <w:strike w:val="false"/>
+                <w:sz w:val="18"/>
+                <w:szCs w:val="18"/>
+                <w:color w:val="000000"/>
+              </w:rPr>
+            </w:pPr>
+            <w:r xmlns:w="http://schemas.openxmlformats.org/wordprocessingml/2006/main" xmlns:wp="http://schemas.openxmlformats.org/drawingml/2006/wordprocessingDrawing" xmlns:r="http://schemas.openxmlformats.org/officeDocument/2006/relationships" xmlns:w14="http://schemas.microsoft.com/office/word/2010/wordml">
+              <w:rPr>
+                <w:rFonts w:ascii="Arial" w:hAnsi="Arial" w:eastAsia="Arial" w:cs="Arial"/>
+                <w:i w:val="false"/>
+                <w:b w:val="false"/>
+                <w:u w:val="none"/>
+                <w:strike w:val="false"/>
+                <w:sz w:val="18"/>
+                <w:szCs w:val="18"/>
+                <w:color w:val="000000"/>
+              </w:rPr>
+              <w:t xml:space="preserve">12</w:t>
+            </w:r>
+          </w:p>
+        </w:tc>
+      </w:tr>
+      <w:tr>
+        <w:trPr>
+          <w:trHeight w:val="360" w:hRule="auto"/>
+        </w:trPr>
+        <w:tc>
+          <w:tcPr>
+            <w:tcBorders>
+              <w:bottom w:val="none" w:sz="0" w:space="0" w:color="000000"/>
+              <w:top w:val="none" w:sz="0" w:space="0" w:color="000000"/>
+              <w:left w:val="none" w:sz="0" w:space="0" w:color="000000"/>
+              <w:right w:val="none" w:sz="0" w:space="0" w:color="000000"/>
+            </w:tcBorders>
+            <w:shd w:val="clear" w:color="auto" w:fill="FFFFFF"/>
+            <w:tcMar>
+              <w:top w:w="0" w:type="dxa"/>
+              <w:bottom w:w="0" w:type="dxa"/>
+              <w:left w:w="0" w:type="dxa"/>
+              <w:right w:w="0" w:type="dxa"/>
+            </w:tcMar>
+            <w:vAlign w:val="center"/>
+          </w:tcPr>
+          <w:p>
+            <w:pPr>
+              <w:jc w:val="left"/>
+              <w:pBdr>
+                <w:bottom w:val="none" w:sz="0" w:space="0" w:color="000000"/>
+                <w:top w:val="none" w:sz="0" w:space="0" w:color="000000"/>
+                <w:left w:val="none" w:sz="0" w:space="0" w:color="000000"/>
+                <w:right w:val="none" w:sz="0" w:space="0" w:color="000000"/>
+              </w:pBdr>
+              <w:spacing w:after="80" w:before="80" w:line="240"/>
+              <w:ind w:left="80" w:right="80" w:firstLine="0" w:firstLineChars="0"/>
+              <w:rPr>
+                <w:rFonts w:ascii="Arial" w:hAnsi="Arial" w:eastAsia="Arial" w:cs="Arial"/>
+                <w:i w:val="false"/>
+                <w:b w:val="false"/>
+                <w:u w:val="none"/>
+                <w:strike w:val="false"/>
+                <w:sz w:val="18"/>
+                <w:szCs w:val="18"/>
+                <w:color w:val="000000"/>
+              </w:rPr>
+            </w:pPr>
+            <w:r xmlns:w="http://schemas.openxmlformats.org/wordprocessingml/2006/main" xmlns:wp="http://schemas.openxmlformats.org/drawingml/2006/wordprocessingDrawing" xmlns:r="http://schemas.openxmlformats.org/officeDocument/2006/relationships" xmlns:w14="http://schemas.microsoft.com/office/word/2010/wordml">
+              <w:rPr>
+                <w:rFonts w:ascii="Arial" w:hAnsi="Arial" w:eastAsia="Arial" w:cs="Arial"/>
+                <w:i w:val="false"/>
+                <w:b w:val="false"/>
+                <w:u w:val="none"/>
+                <w:strike w:val="false"/>
+                <w:sz w:val="18"/>
+                <w:szCs w:val="18"/>
+                <w:color w:val="000000"/>
+              </w:rPr>
+              <w:t xml:space="preserve">dBI</w:t>
+            </w:r>
+          </w:p>
+        </w:tc>
+        <w:tc>
+          <w:tcPr>
+            <w:tcBorders>
+              <w:bottom w:val="none" w:sz="0" w:space="0" w:color="000000"/>
+              <w:top w:val="none" w:sz="0" w:space="0" w:color="000000"/>
+              <w:left w:val="none" w:sz="0" w:space="0" w:color="000000"/>
+              <w:right w:val="none" w:sz="0" w:space="0" w:color="000000"/>
+            </w:tcBorders>
+            <w:shd w:val="clear" w:color="auto" w:fill="FFFFFF"/>
+            <w:tcMar>
+              <w:top w:w="0" w:type="dxa"/>
+              <w:bottom w:w="0" w:type="dxa"/>
+              <w:left w:w="0" w:type="dxa"/>
+              <w:right w:w="0" w:type="dxa"/>
+            </w:tcMar>
+            <w:vAlign w:val="center"/>
+          </w:tcPr>
+          <w:p>
+            <w:pPr>
+              <w:jc w:val="center"/>
+              <w:pBdr>
+                <w:bottom w:val="none" w:sz="0" w:space="0" w:color="000000"/>
+                <w:top w:val="none" w:sz="0" w:space="0" w:color="000000"/>
+                <w:left w:val="none" w:sz="0" w:space="0" w:color="000000"/>
+                <w:right w:val="none" w:sz="0" w:space="0" w:color="000000"/>
+              </w:pBdr>
+              <w:spacing w:after="80" w:before="80" w:line="240"/>
+              <w:ind w:left="80" w:right="80" w:firstLine="0" w:firstLineChars="0"/>
+              <w:rPr>
+                <w:rFonts w:ascii="Arial" w:hAnsi="Arial" w:eastAsia="Arial" w:cs="Arial"/>
+                <w:i w:val="false"/>
+                <w:b w:val="false"/>
+                <w:u w:val="none"/>
+                <w:strike w:val="false"/>
+                <w:sz w:val="18"/>
+                <w:szCs w:val="18"/>
+                <w:color w:val="000000"/>
+              </w:rPr>
+            </w:pPr>
+            <w:r xmlns:w="http://schemas.openxmlformats.org/wordprocessingml/2006/main" xmlns:wp="http://schemas.openxmlformats.org/drawingml/2006/wordprocessingDrawing" xmlns:r="http://schemas.openxmlformats.org/officeDocument/2006/relationships" xmlns:w14="http://schemas.microsoft.com/office/word/2010/wordml">
+              <w:rPr>
+                <w:rFonts w:ascii="Arial" w:hAnsi="Arial" w:eastAsia="Arial" w:cs="Arial"/>
+                <w:i w:val="false"/>
+                <w:b w:val="false"/>
+                <w:u w:val="none"/>
+                <w:strike w:val="false"/>
+                <w:sz w:val="18"/>
+                <w:szCs w:val="18"/>
+                <w:color w:val="000000"/>
+              </w:rPr>
+              <w:t xml:space="preserve">pasture</w:t>
+            </w:r>
+          </w:p>
+        </w:tc>
+        <w:tc>
+          <w:tcPr>
+            <w:tcBorders>
+              <w:bottom w:val="none" w:sz="0" w:space="0" w:color="000000"/>
+              <w:top w:val="none" w:sz="0" w:space="0" w:color="000000"/>
+              <w:left w:val="none" w:sz="0" w:space="0" w:color="000000"/>
+              <w:right w:val="none" w:sz="0" w:space="0" w:color="000000"/>
+            </w:tcBorders>
+            <w:shd w:val="clear" w:color="auto" w:fill="FFFFFF"/>
+            <w:tcMar>
+              <w:top w:w="0" w:type="dxa"/>
+              <w:bottom w:w="0" w:type="dxa"/>
+              <w:left w:w="0" w:type="dxa"/>
+              <w:right w:w="0" w:type="dxa"/>
+            </w:tcMar>
+            <w:vAlign w:val="center"/>
+          </w:tcPr>
+          <w:p>
+            <w:pPr>
+              <w:jc w:val="center"/>
+              <w:pBdr>
+                <w:bottom w:val="none" w:sz="0" w:space="0" w:color="000000"/>
+                <w:top w:val="none" w:sz="0" w:space="0" w:color="000000"/>
+                <w:left w:val="none" w:sz="0" w:space="0" w:color="000000"/>
+                <w:right w:val="none" w:sz="0" w:space="0" w:color="000000"/>
+              </w:pBdr>
+              <w:spacing w:after="80" w:before="80" w:line="240"/>
+              <w:ind w:left="80" w:right="80" w:firstLine="0" w:firstLineChars="0"/>
+              <w:rPr>
+                <w:rFonts w:ascii="Arial" w:hAnsi="Arial" w:eastAsia="Arial" w:cs="Arial"/>
+                <w:i w:val="false"/>
+                <w:b w:val="false"/>
+                <w:u w:val="none"/>
+                <w:strike w:val="false"/>
+                <w:sz w:val="18"/>
+                <w:szCs w:val="18"/>
+                <w:color w:val="000000"/>
+              </w:rPr>
+            </w:pPr>
+            <w:r xmlns:w="http://schemas.openxmlformats.org/wordprocessingml/2006/main" xmlns:wp="http://schemas.openxmlformats.org/drawingml/2006/wordprocessingDrawing" xmlns:r="http://schemas.openxmlformats.org/officeDocument/2006/relationships" xmlns:w14="http://schemas.microsoft.com/office/word/2010/wordml">
+              <w:rPr>
+                <w:rFonts w:ascii="Arial" w:hAnsi="Arial" w:eastAsia="Arial" w:cs="Arial"/>
+                <w:i w:val="false"/>
+                <w:b w:val="false"/>
+                <w:u w:val="none"/>
+                <w:strike w:val="false"/>
+                <w:sz w:val="18"/>
+                <w:szCs w:val="18"/>
+                <w:color w:val="000000"/>
+              </w:rPr>
+              <w:t xml:space="preserve">0.0536</w:t>
+            </w:r>
+          </w:p>
+        </w:tc>
+        <w:tc>
+          <w:tcPr>
+            <w:tcBorders>
+              <w:bottom w:val="none" w:sz="0" w:space="0" w:color="000000"/>
+              <w:top w:val="none" w:sz="0" w:space="0" w:color="000000"/>
+              <w:left w:val="none" w:sz="0" w:space="0" w:color="000000"/>
+              <w:right w:val="none" w:sz="0" w:space="0" w:color="000000"/>
+            </w:tcBorders>
+            <w:shd w:val="clear" w:color="auto" w:fill="FFFFFF"/>
+            <w:tcMar>
+              <w:top w:w="0" w:type="dxa"/>
+              <w:bottom w:w="0" w:type="dxa"/>
+              <w:left w:w="0" w:type="dxa"/>
+              <w:right w:w="0" w:type="dxa"/>
+            </w:tcMar>
+            <w:vAlign w:val="center"/>
+          </w:tcPr>
+          <w:p>
+            <w:pPr>
+              <w:jc w:val="center"/>
+              <w:pBdr>
+                <w:bottom w:val="none" w:sz="0" w:space="0" w:color="000000"/>
+                <w:top w:val="none" w:sz="0" w:space="0" w:color="000000"/>
+                <w:left w:val="none" w:sz="0" w:space="0" w:color="000000"/>
+                <w:right w:val="none" w:sz="0" w:space="0" w:color="000000"/>
+              </w:pBdr>
+              <w:spacing w:after="80" w:before="80" w:line="240"/>
+              <w:ind w:left="80" w:right="80" w:firstLine="0" w:firstLineChars="0"/>
+              <w:rPr>
+                <w:rFonts w:ascii="Arial" w:hAnsi="Arial" w:eastAsia="Arial" w:cs="Arial"/>
+                <w:i w:val="false"/>
+                <w:b w:val="false"/>
+                <w:u w:val="none"/>
+                <w:strike w:val="false"/>
+                <w:sz w:val="18"/>
+                <w:szCs w:val="18"/>
+                <w:color w:val="000000"/>
+              </w:rPr>
+            </w:pPr>
+            <w:r xmlns:w="http://schemas.openxmlformats.org/wordprocessingml/2006/main" xmlns:wp="http://schemas.openxmlformats.org/drawingml/2006/wordprocessingDrawing" xmlns:r="http://schemas.openxmlformats.org/officeDocument/2006/relationships" xmlns:w14="http://schemas.microsoft.com/office/word/2010/wordml">
+              <w:rPr>
+                <w:rFonts w:ascii="Arial" w:hAnsi="Arial" w:eastAsia="Arial" w:cs="Arial"/>
+                <w:i w:val="false"/>
+                <w:b w:val="false"/>
+                <w:u w:val="none"/>
+                <w:strike w:val="false"/>
+                <w:sz w:val="18"/>
+                <w:szCs w:val="18"/>
+                <w:color w:val="000000"/>
+              </w:rPr>
+              <w:t xml:space="preserve">-0.3373</w:t>
+            </w:r>
+          </w:p>
+        </w:tc>
+        <w:tc>
+          <w:tcPr>
+            <w:tcBorders>
+              <w:bottom w:val="none" w:sz="0" w:space="0" w:color="000000"/>
+              <w:top w:val="none" w:sz="0" w:space="0" w:color="000000"/>
+              <w:left w:val="none" w:sz="0" w:space="0" w:color="000000"/>
+              <w:right w:val="none" w:sz="0" w:space="0" w:color="000000"/>
+            </w:tcBorders>
+            <w:shd w:val="clear" w:color="auto" w:fill="FFFFFF"/>
+            <w:tcMar>
+              <w:top w:w="0" w:type="dxa"/>
+              <w:bottom w:w="0" w:type="dxa"/>
+              <w:left w:w="0" w:type="dxa"/>
+              <w:right w:w="0" w:type="dxa"/>
+            </w:tcMar>
+            <w:vAlign w:val="center"/>
+          </w:tcPr>
+          <w:p>
+            <w:pPr>
+              <w:jc w:val="center"/>
+              <w:pBdr>
+                <w:bottom w:val="none" w:sz="0" w:space="0" w:color="000000"/>
+                <w:top w:val="none" w:sz="0" w:space="0" w:color="000000"/>
+                <w:left w:val="none" w:sz="0" w:space="0" w:color="000000"/>
+                <w:right w:val="none" w:sz="0" w:space="0" w:color="000000"/>
+              </w:pBdr>
+              <w:spacing w:after="80" w:before="80" w:line="240"/>
+              <w:ind w:left="80" w:right="80" w:firstLine="0" w:firstLineChars="0"/>
+              <w:rPr>
+                <w:rFonts w:ascii="Arial" w:hAnsi="Arial" w:eastAsia="Arial" w:cs="Arial"/>
+                <w:i w:val="false"/>
+                <w:b w:val="false"/>
+                <w:u w:val="none"/>
+                <w:strike w:val="false"/>
+                <w:sz w:val="18"/>
+                <w:szCs w:val="18"/>
+                <w:color w:val="000000"/>
+              </w:rPr>
+            </w:pPr>
+            <w:r xmlns:w="http://schemas.openxmlformats.org/wordprocessingml/2006/main" xmlns:wp="http://schemas.openxmlformats.org/drawingml/2006/wordprocessingDrawing" xmlns:r="http://schemas.openxmlformats.org/officeDocument/2006/relationships" xmlns:w14="http://schemas.microsoft.com/office/word/2010/wordml">
+              <w:rPr>
+                <w:rFonts w:ascii="Arial" w:hAnsi="Arial" w:eastAsia="Arial" w:cs="Arial"/>
+                <w:i w:val="false"/>
+                <w:b w:val="false"/>
+                <w:u w:val="none"/>
+                <w:strike w:val="false"/>
+                <w:sz w:val="18"/>
+                <w:szCs w:val="18"/>
+                <w:color w:val="000000"/>
+              </w:rPr>
+              <w:t xml:space="preserve">0.4446</w:t>
+            </w:r>
+          </w:p>
+        </w:tc>
+        <w:tc>
+          <w:tcPr>
+            <w:tcBorders>
+              <w:bottom w:val="none" w:sz="0" w:space="0" w:color="000000"/>
+              <w:top w:val="none" w:sz="0" w:space="0" w:color="000000"/>
+              <w:left w:val="none" w:sz="0" w:space="0" w:color="000000"/>
+              <w:right w:val="none" w:sz="0" w:space="0" w:color="000000"/>
+            </w:tcBorders>
+            <w:shd w:val="clear" w:color="auto" w:fill="FFFFFF"/>
+            <w:tcMar>
+              <w:top w:w="0" w:type="dxa"/>
+              <w:bottom w:w="0" w:type="dxa"/>
+              <w:left w:w="0" w:type="dxa"/>
+              <w:right w:w="0" w:type="dxa"/>
+            </w:tcMar>
+            <w:vAlign w:val="center"/>
+          </w:tcPr>
+          <w:p>
+            <w:pPr>
+              <w:jc w:val="center"/>
+              <w:pBdr>
+                <w:bottom w:val="none" w:sz="0" w:space="0" w:color="000000"/>
+                <w:top w:val="none" w:sz="0" w:space="0" w:color="000000"/>
+                <w:left w:val="none" w:sz="0" w:space="0" w:color="000000"/>
+                <w:right w:val="none" w:sz="0" w:space="0" w:color="000000"/>
+              </w:pBdr>
+              <w:spacing w:after="80" w:before="80" w:line="240"/>
+              <w:ind w:left="80" w:right="80" w:firstLine="0" w:firstLineChars="0"/>
+              <w:rPr>
+                <w:rFonts w:ascii="Arial" w:hAnsi="Arial" w:eastAsia="Arial" w:cs="Arial"/>
+                <w:i w:val="false"/>
+                <w:b w:val="false"/>
+                <w:u w:val="none"/>
+                <w:strike w:val="false"/>
+                <w:sz w:val="18"/>
+                <w:szCs w:val="18"/>
+                <w:color w:val="000000"/>
+              </w:rPr>
+            </w:pPr>
+            <w:r xmlns:w="http://schemas.openxmlformats.org/wordprocessingml/2006/main" xmlns:wp="http://schemas.openxmlformats.org/drawingml/2006/wordprocessingDrawing" xmlns:r="http://schemas.openxmlformats.org/officeDocument/2006/relationships" xmlns:w14="http://schemas.microsoft.com/office/word/2010/wordml">
+              <w:rPr>
+                <w:rFonts w:ascii="Arial" w:hAnsi="Arial" w:eastAsia="Arial" w:cs="Arial"/>
+                <w:i w:val="false"/>
+                <w:b w:val="false"/>
+                <w:u w:val="none"/>
+                <w:strike w:val="false"/>
+                <w:sz w:val="18"/>
+                <w:szCs w:val="18"/>
+                <w:color w:val="000000"/>
+              </w:rPr>
+              <w:t xml:space="preserve">0.008</w:t>
+            </w:r>
+          </w:p>
+        </w:tc>
+        <w:tc>
+          <w:tcPr>
+            <w:tcBorders>
+              <w:bottom w:val="none" w:sz="0" w:space="0" w:color="000000"/>
+              <w:top w:val="none" w:sz="0" w:space="0" w:color="000000"/>
+              <w:left w:val="none" w:sz="0" w:space="0" w:color="000000"/>
+              <w:right w:val="none" w:sz="0" w:space="0" w:color="000000"/>
+            </w:tcBorders>
+            <w:shd w:val="clear" w:color="auto" w:fill="FFFFFF"/>
+            <w:tcMar>
+              <w:top w:w="0" w:type="dxa"/>
+              <w:bottom w:w="0" w:type="dxa"/>
+              <w:left w:w="0" w:type="dxa"/>
+              <w:right w:w="0" w:type="dxa"/>
+            </w:tcMar>
+            <w:vAlign w:val="center"/>
+          </w:tcPr>
+          <w:p>
+            <w:pPr>
+              <w:jc w:val="center"/>
+              <w:pBdr>
+                <w:bottom w:val="none" w:sz="0" w:space="0" w:color="000000"/>
+                <w:top w:val="none" w:sz="0" w:space="0" w:color="000000"/>
+                <w:left w:val="none" w:sz="0" w:space="0" w:color="000000"/>
+                <w:right w:val="none" w:sz="0" w:space="0" w:color="000000"/>
+              </w:pBdr>
+              <w:spacing w:after="80" w:before="80" w:line="240"/>
+              <w:ind w:left="80" w:right="80" w:firstLine="0" w:firstLineChars="0"/>
+              <w:rPr>
+                <w:rFonts w:ascii="Arial" w:hAnsi="Arial" w:eastAsia="Arial" w:cs="Arial"/>
+                <w:i w:val="false"/>
+                <w:b w:val="false"/>
+                <w:u w:val="none"/>
+                <w:strike w:val="false"/>
+                <w:sz w:val="18"/>
+                <w:szCs w:val="18"/>
+                <w:color w:val="000000"/>
+              </w:rPr>
+            </w:pPr>
+            <w:r xmlns:w="http://schemas.openxmlformats.org/wordprocessingml/2006/main" xmlns:wp="http://schemas.openxmlformats.org/drawingml/2006/wordprocessingDrawing" xmlns:r="http://schemas.openxmlformats.org/officeDocument/2006/relationships" xmlns:w14="http://schemas.microsoft.com/office/word/2010/wordml">
+              <w:rPr>
+                <w:rFonts w:ascii="Arial" w:hAnsi="Arial" w:eastAsia="Arial" w:cs="Arial"/>
+                <w:i w:val="false"/>
+                <w:b w:val="false"/>
+                <w:u w:val="none"/>
+                <w:strike w:val="false"/>
+                <w:sz w:val="18"/>
+                <w:szCs w:val="18"/>
+                <w:color w:val="000000"/>
+              </w:rPr>
+              <w:t xml:space="preserve">no</w:t>
+            </w:r>
+          </w:p>
+        </w:tc>
+        <w:tc>
+          <w:tcPr>
+            <w:tcBorders>
+              <w:bottom w:val="none" w:sz="0" w:space="0" w:color="000000"/>
+              <w:top w:val="none" w:sz="0" w:space="0" w:color="000000"/>
+              <w:left w:val="none" w:sz="0" w:space="0" w:color="000000"/>
+              <w:right w:val="none" w:sz="0" w:space="0" w:color="000000"/>
+            </w:tcBorders>
+            <w:shd w:val="clear" w:color="auto" w:fill="FFFFFF"/>
+            <w:tcMar>
+              <w:top w:w="0" w:type="dxa"/>
+              <w:bottom w:w="0" w:type="dxa"/>
+              <w:left w:w="0" w:type="dxa"/>
+              <w:right w:w="0" w:type="dxa"/>
+            </w:tcMar>
+            <w:vAlign w:val="center"/>
+          </w:tcPr>
+          <w:p>
+            <w:pPr>
+              <w:jc w:val="center"/>
+              <w:pBdr>
+                <w:bottom w:val="none" w:sz="0" w:space="0" w:color="000000"/>
+                <w:top w:val="none" w:sz="0" w:space="0" w:color="000000"/>
+                <w:left w:val="none" w:sz="0" w:space="0" w:color="000000"/>
+                <w:right w:val="none" w:sz="0" w:space="0" w:color="000000"/>
+              </w:pBdr>
+              <w:spacing w:after="80" w:before="80" w:line="240"/>
+              <w:ind w:left="80" w:right="80" w:firstLine="0" w:firstLineChars="0"/>
+              <w:rPr>
+                <w:rFonts w:ascii="Arial" w:hAnsi="Arial" w:eastAsia="Arial" w:cs="Arial"/>
+                <w:i w:val="false"/>
+                <w:b w:val="false"/>
+                <w:u w:val="none"/>
+                <w:strike w:val="false"/>
+                <w:sz w:val="18"/>
+                <w:szCs w:val="18"/>
+                <w:color w:val="000000"/>
+              </w:rPr>
+            </w:pPr>
+            <w:r xmlns:w="http://schemas.openxmlformats.org/wordprocessingml/2006/main" xmlns:wp="http://schemas.openxmlformats.org/drawingml/2006/wordprocessingDrawing" xmlns:r="http://schemas.openxmlformats.org/officeDocument/2006/relationships" xmlns:w14="http://schemas.microsoft.com/office/word/2010/wordml">
+              <w:rPr>
+                <w:rFonts w:ascii="Arial" w:hAnsi="Arial" w:eastAsia="Arial" w:cs="Arial"/>
+                <w:i w:val="false"/>
+                <w:b w:val="false"/>
+                <w:u w:val="none"/>
+                <w:strike w:val="false"/>
+                <w:sz w:val="18"/>
+                <w:szCs w:val="18"/>
+                <w:color w:val="000000"/>
+              </w:rPr>
+              <w:t xml:space="preserve">10</w:t>
+            </w:r>
+          </w:p>
+        </w:tc>
+      </w:tr>
+      <w:tr>
+        <w:trPr>
+          <w:trHeight w:val="360" w:hRule="auto"/>
+        </w:trPr>
+        <w:tc>
+          <w:tcPr>
+            <w:tcBorders>
+              <w:bottom w:val="none" w:sz="0" w:space="0" w:color="000000"/>
+              <w:top w:val="none" w:sz="0" w:space="0" w:color="000000"/>
+              <w:left w:val="none" w:sz="0" w:space="0" w:color="000000"/>
+              <w:right w:val="none" w:sz="0" w:space="0" w:color="000000"/>
+            </w:tcBorders>
+            <w:shd w:val="clear" w:color="auto" w:fill="FFFFFF"/>
+            <w:tcMar>
+              <w:top w:w="0" w:type="dxa"/>
+              <w:bottom w:w="0" w:type="dxa"/>
+              <w:left w:w="0" w:type="dxa"/>
+              <w:right w:w="0" w:type="dxa"/>
+            </w:tcMar>
+            <w:vAlign w:val="center"/>
+          </w:tcPr>
+          <w:p>
+            <w:pPr>
+              <w:jc w:val="left"/>
+              <w:pBdr>
+                <w:bottom w:val="none" w:sz="0" w:space="0" w:color="000000"/>
+                <w:top w:val="none" w:sz="0" w:space="0" w:color="000000"/>
+                <w:left w:val="none" w:sz="0" w:space="0" w:color="000000"/>
+                <w:right w:val="none" w:sz="0" w:space="0" w:color="000000"/>
+              </w:pBdr>
+              <w:spacing w:after="80" w:before="80" w:line="240"/>
+              <w:ind w:left="80" w:right="80" w:firstLine="0" w:firstLineChars="0"/>
+              <w:rPr>
+                <w:rFonts w:ascii="Arial" w:hAnsi="Arial" w:eastAsia="Arial" w:cs="Arial"/>
+                <w:i w:val="false"/>
+                <w:b w:val="false"/>
+                <w:u w:val="none"/>
+                <w:strike w:val="false"/>
+                <w:sz w:val="18"/>
+                <w:szCs w:val="18"/>
+                <w:color w:val="000000"/>
+              </w:rPr>
+            </w:pPr>
+            <w:r xmlns:w="http://schemas.openxmlformats.org/wordprocessingml/2006/main" xmlns:wp="http://schemas.openxmlformats.org/drawingml/2006/wordprocessingDrawing" xmlns:r="http://schemas.openxmlformats.org/officeDocument/2006/relationships" xmlns:w14="http://schemas.microsoft.com/office/word/2010/wordml">
+              <w:rPr>
+                <w:rFonts w:ascii="Arial" w:hAnsi="Arial" w:eastAsia="Arial" w:cs="Arial"/>
+                <w:i w:val="false"/>
+                <w:b w:val="false"/>
+                <w:u w:val="none"/>
+                <w:strike w:val="false"/>
+                <w:sz w:val="18"/>
+                <w:szCs w:val="18"/>
+                <w:color w:val="000000"/>
+              </w:rPr>
+              <w:t xml:space="preserve">dADI</w:t>
+            </w:r>
+          </w:p>
+        </w:tc>
+        <w:tc>
+          <w:tcPr>
+            <w:tcBorders>
+              <w:bottom w:val="none" w:sz="0" w:space="0" w:color="000000"/>
+              <w:top w:val="none" w:sz="0" w:space="0" w:color="000000"/>
+              <w:left w:val="none" w:sz="0" w:space="0" w:color="000000"/>
+              <w:right w:val="none" w:sz="0" w:space="0" w:color="000000"/>
+            </w:tcBorders>
+            <w:shd w:val="clear" w:color="auto" w:fill="FFFFFF"/>
+            <w:tcMar>
+              <w:top w:w="0" w:type="dxa"/>
+              <w:bottom w:w="0" w:type="dxa"/>
+              <w:left w:w="0" w:type="dxa"/>
+              <w:right w:w="0" w:type="dxa"/>
+            </w:tcMar>
+            <w:vAlign w:val="center"/>
+          </w:tcPr>
+          <w:p>
+            <w:pPr>
+              <w:jc w:val="center"/>
+              <w:pBdr>
+                <w:bottom w:val="none" w:sz="0" w:space="0" w:color="000000"/>
+                <w:top w:val="none" w:sz="0" w:space="0" w:color="000000"/>
+                <w:left w:val="none" w:sz="0" w:space="0" w:color="000000"/>
+                <w:right w:val="none" w:sz="0" w:space="0" w:color="000000"/>
+              </w:pBdr>
+              <w:spacing w:after="80" w:before="80" w:line="240"/>
+              <w:ind w:left="80" w:right="80" w:firstLine="0" w:firstLineChars="0"/>
+              <w:rPr>
+                <w:rFonts w:ascii="Arial" w:hAnsi="Arial" w:eastAsia="Arial" w:cs="Arial"/>
+                <w:i w:val="false"/>
+                <w:b w:val="false"/>
+                <w:u w:val="none"/>
+                <w:strike w:val="false"/>
+                <w:sz w:val="18"/>
+                <w:szCs w:val="18"/>
+                <w:color w:val="000000"/>
+              </w:rPr>
+            </w:pPr>
+            <w:r xmlns:w="http://schemas.openxmlformats.org/wordprocessingml/2006/main" xmlns:wp="http://schemas.openxmlformats.org/drawingml/2006/wordprocessingDrawing" xmlns:r="http://schemas.openxmlformats.org/officeDocument/2006/relationships" xmlns:w14="http://schemas.microsoft.com/office/word/2010/wordml">
+              <w:rPr>
+                <w:rFonts w:ascii="Arial" w:hAnsi="Arial" w:eastAsia="Arial" w:cs="Arial"/>
+                <w:i w:val="false"/>
+                <w:b w:val="false"/>
+                <w:u w:val="none"/>
+                <w:strike w:val="false"/>
+                <w:sz w:val="18"/>
+                <w:szCs w:val="18"/>
+                <w:color w:val="000000"/>
+              </w:rPr>
+              <w:t xml:space="preserve">forest</w:t>
+            </w:r>
+          </w:p>
+        </w:tc>
+        <w:tc>
+          <w:tcPr>
+            <w:tcBorders>
+              <w:bottom w:val="none" w:sz="0" w:space="0" w:color="000000"/>
+              <w:top w:val="none" w:sz="0" w:space="0" w:color="000000"/>
+              <w:left w:val="none" w:sz="0" w:space="0" w:color="000000"/>
+              <w:right w:val="none" w:sz="0" w:space="0" w:color="000000"/>
+            </w:tcBorders>
+            <w:shd w:val="clear" w:color="auto" w:fill="FFFFFF"/>
+            <w:tcMar>
+              <w:top w:w="0" w:type="dxa"/>
+              <w:bottom w:w="0" w:type="dxa"/>
+              <w:left w:w="0" w:type="dxa"/>
+              <w:right w:w="0" w:type="dxa"/>
+            </w:tcMar>
+            <w:vAlign w:val="center"/>
+          </w:tcPr>
+          <w:p>
+            <w:pPr>
+              <w:jc w:val="center"/>
+              <w:pBdr>
+                <w:bottom w:val="none" w:sz="0" w:space="0" w:color="000000"/>
+                <w:top w:val="none" w:sz="0" w:space="0" w:color="000000"/>
+                <w:left w:val="none" w:sz="0" w:space="0" w:color="000000"/>
+                <w:right w:val="none" w:sz="0" w:space="0" w:color="000000"/>
+              </w:pBdr>
+              <w:spacing w:after="80" w:before="80" w:line="240"/>
+              <w:ind w:left="80" w:right="80" w:firstLine="0" w:firstLineChars="0"/>
+              <w:rPr>
+                <w:rFonts w:ascii="Arial" w:hAnsi="Arial" w:eastAsia="Arial" w:cs="Arial"/>
+                <w:i w:val="false"/>
+                <w:b w:val="false"/>
+                <w:u w:val="none"/>
+                <w:strike w:val="false"/>
+                <w:sz w:val="18"/>
+                <w:szCs w:val="18"/>
+                <w:color w:val="000000"/>
+              </w:rPr>
+            </w:pPr>
+            <w:r xmlns:w="http://schemas.openxmlformats.org/wordprocessingml/2006/main" xmlns:wp="http://schemas.openxmlformats.org/drawingml/2006/wordprocessingDrawing" xmlns:r="http://schemas.openxmlformats.org/officeDocument/2006/relationships" xmlns:w14="http://schemas.microsoft.com/office/word/2010/wordml">
+              <w:rPr>
+                <w:rFonts w:ascii="Arial" w:hAnsi="Arial" w:eastAsia="Arial" w:cs="Arial"/>
+                <w:i w:val="false"/>
+                <w:b w:val="false"/>
+                <w:u w:val="none"/>
+                <w:strike w:val="false"/>
+                <w:sz w:val="18"/>
+                <w:szCs w:val="18"/>
+                <w:color w:val="000000"/>
+              </w:rPr>
+              <w:t xml:space="preserve">-0.0074</w:t>
+            </w:r>
+          </w:p>
+        </w:tc>
+        <w:tc>
+          <w:tcPr>
+            <w:tcBorders>
+              <w:bottom w:val="none" w:sz="0" w:space="0" w:color="000000"/>
+              <w:top w:val="none" w:sz="0" w:space="0" w:color="000000"/>
+              <w:left w:val="none" w:sz="0" w:space="0" w:color="000000"/>
+              <w:right w:val="none" w:sz="0" w:space="0" w:color="000000"/>
+            </w:tcBorders>
+            <w:shd w:val="clear" w:color="auto" w:fill="FFFFFF"/>
+            <w:tcMar>
+              <w:top w:w="0" w:type="dxa"/>
+              <w:bottom w:w="0" w:type="dxa"/>
+              <w:left w:w="0" w:type="dxa"/>
+              <w:right w:w="0" w:type="dxa"/>
+            </w:tcMar>
+            <w:vAlign w:val="center"/>
+          </w:tcPr>
+          <w:p>
+            <w:pPr>
+              <w:jc w:val="center"/>
+              <w:pBdr>
+                <w:bottom w:val="none" w:sz="0" w:space="0" w:color="000000"/>
+                <w:top w:val="none" w:sz="0" w:space="0" w:color="000000"/>
+                <w:left w:val="none" w:sz="0" w:space="0" w:color="000000"/>
+                <w:right w:val="none" w:sz="0" w:space="0" w:color="000000"/>
+              </w:pBdr>
+              <w:spacing w:after="80" w:before="80" w:line="240"/>
+              <w:ind w:left="80" w:right="80" w:firstLine="0" w:firstLineChars="0"/>
+              <w:rPr>
+                <w:rFonts w:ascii="Arial" w:hAnsi="Arial" w:eastAsia="Arial" w:cs="Arial"/>
+                <w:i w:val="false"/>
+                <w:b w:val="false"/>
+                <w:u w:val="none"/>
+                <w:strike w:val="false"/>
+                <w:sz w:val="18"/>
+                <w:szCs w:val="18"/>
+                <w:color w:val="000000"/>
+              </w:rPr>
+            </w:pPr>
+            <w:r xmlns:w="http://schemas.openxmlformats.org/wordprocessingml/2006/main" xmlns:wp="http://schemas.openxmlformats.org/drawingml/2006/wordprocessingDrawing" xmlns:r="http://schemas.openxmlformats.org/officeDocument/2006/relationships" xmlns:w14="http://schemas.microsoft.com/office/word/2010/wordml">
+              <w:rPr>
+                <w:rFonts w:ascii="Arial" w:hAnsi="Arial" w:eastAsia="Arial" w:cs="Arial"/>
+                <w:i w:val="false"/>
+                <w:b w:val="false"/>
+                <w:u w:val="none"/>
+                <w:strike w:val="false"/>
+                <w:sz w:val="18"/>
+                <w:szCs w:val="18"/>
+                <w:color w:val="000000"/>
+              </w:rPr>
+              <w:t xml:space="preserve">-0.0254</w:t>
+            </w:r>
+          </w:p>
+        </w:tc>
+        <w:tc>
+          <w:tcPr>
+            <w:tcBorders>
+              <w:bottom w:val="none" w:sz="0" w:space="0" w:color="000000"/>
+              <w:top w:val="none" w:sz="0" w:space="0" w:color="000000"/>
+              <w:left w:val="none" w:sz="0" w:space="0" w:color="000000"/>
+              <w:right w:val="none" w:sz="0" w:space="0" w:color="000000"/>
+            </w:tcBorders>
+            <w:shd w:val="clear" w:color="auto" w:fill="FFFFFF"/>
+            <w:tcMar>
+              <w:top w:w="0" w:type="dxa"/>
+              <w:bottom w:w="0" w:type="dxa"/>
+              <w:left w:w="0" w:type="dxa"/>
+              <w:right w:w="0" w:type="dxa"/>
+            </w:tcMar>
+            <w:vAlign w:val="center"/>
+          </w:tcPr>
+          <w:p>
+            <w:pPr>
+              <w:jc w:val="center"/>
+              <w:pBdr>
+                <w:bottom w:val="none" w:sz="0" w:space="0" w:color="000000"/>
+                <w:top w:val="none" w:sz="0" w:space="0" w:color="000000"/>
+                <w:left w:val="none" w:sz="0" w:space="0" w:color="000000"/>
+                <w:right w:val="none" w:sz="0" w:space="0" w:color="000000"/>
+              </w:pBdr>
+              <w:spacing w:after="80" w:before="80" w:line="240"/>
+              <w:ind w:left="80" w:right="80" w:firstLine="0" w:firstLineChars="0"/>
+              <w:rPr>
+                <w:rFonts w:ascii="Arial" w:hAnsi="Arial" w:eastAsia="Arial" w:cs="Arial"/>
+                <w:i w:val="false"/>
+                <w:b w:val="false"/>
+                <w:u w:val="none"/>
+                <w:strike w:val="false"/>
+                <w:sz w:val="18"/>
+                <w:szCs w:val="18"/>
+                <w:color w:val="000000"/>
+              </w:rPr>
+            </w:pPr>
+            <w:r xmlns:w="http://schemas.openxmlformats.org/wordprocessingml/2006/main" xmlns:wp="http://schemas.openxmlformats.org/drawingml/2006/wordprocessingDrawing" xmlns:r="http://schemas.openxmlformats.org/officeDocument/2006/relationships" xmlns:w14="http://schemas.microsoft.com/office/word/2010/wordml">
+              <w:rPr>
+                <w:rFonts w:ascii="Arial" w:hAnsi="Arial" w:eastAsia="Arial" w:cs="Arial"/>
+                <w:i w:val="false"/>
+                <w:b w:val="false"/>
+                <w:u w:val="none"/>
+                <w:strike w:val="false"/>
+                <w:sz w:val="18"/>
+                <w:szCs w:val="18"/>
+                <w:color w:val="000000"/>
+              </w:rPr>
+              <w:t xml:space="preserve">0.0106</w:t>
+            </w:r>
+          </w:p>
+        </w:tc>
+        <w:tc>
+          <w:tcPr>
+            <w:tcBorders>
+              <w:bottom w:val="none" w:sz="0" w:space="0" w:color="000000"/>
+              <w:top w:val="none" w:sz="0" w:space="0" w:color="000000"/>
+              <w:left w:val="none" w:sz="0" w:space="0" w:color="000000"/>
+              <w:right w:val="none" w:sz="0" w:space="0" w:color="000000"/>
+            </w:tcBorders>
+            <w:shd w:val="clear" w:color="auto" w:fill="FFFFFF"/>
+            <w:tcMar>
+              <w:top w:w="0" w:type="dxa"/>
+              <w:bottom w:w="0" w:type="dxa"/>
+              <w:left w:w="0" w:type="dxa"/>
+              <w:right w:w="0" w:type="dxa"/>
+            </w:tcMar>
+            <w:vAlign w:val="center"/>
+          </w:tcPr>
+          <w:p>
+            <w:pPr>
+              <w:jc w:val="center"/>
+              <w:pBdr>
+                <w:bottom w:val="none" w:sz="0" w:space="0" w:color="000000"/>
+                <w:top w:val="none" w:sz="0" w:space="0" w:color="000000"/>
+                <w:left w:val="none" w:sz="0" w:space="0" w:color="000000"/>
+                <w:right w:val="none" w:sz="0" w:space="0" w:color="000000"/>
+              </w:pBdr>
+              <w:spacing w:after="80" w:before="80" w:line="240"/>
+              <w:ind w:left="80" w:right="80" w:firstLine="0" w:firstLineChars="0"/>
+              <w:rPr>
+                <w:rFonts w:ascii="Arial" w:hAnsi="Arial" w:eastAsia="Arial" w:cs="Arial"/>
+                <w:i w:val="false"/>
+                <w:b w:val="false"/>
+                <w:u w:val="none"/>
+                <w:strike w:val="false"/>
+                <w:sz w:val="18"/>
+                <w:szCs w:val="18"/>
+                <w:color w:val="000000"/>
+              </w:rPr>
+            </w:pPr>
+            <w:r xmlns:w="http://schemas.openxmlformats.org/wordprocessingml/2006/main" xmlns:wp="http://schemas.openxmlformats.org/drawingml/2006/wordprocessingDrawing" xmlns:r="http://schemas.openxmlformats.org/officeDocument/2006/relationships" xmlns:w14="http://schemas.microsoft.com/office/word/2010/wordml">
+              <w:rPr>
+                <w:rFonts w:ascii="Arial" w:hAnsi="Arial" w:eastAsia="Arial" w:cs="Arial"/>
+                <w:i w:val="false"/>
+                <w:b w:val="false"/>
+                <w:u w:val="none"/>
+                <w:strike w:val="false"/>
+                <w:sz w:val="18"/>
+                <w:szCs w:val="18"/>
+                <w:color w:val="000000"/>
+              </w:rPr>
+              <w:t xml:space="preserve">0.055</w:t>
+            </w:r>
+          </w:p>
+        </w:tc>
+        <w:tc>
+          <w:tcPr>
+            <w:tcBorders>
+              <w:bottom w:val="none" w:sz="0" w:space="0" w:color="000000"/>
+              <w:top w:val="none" w:sz="0" w:space="0" w:color="000000"/>
+              <w:left w:val="none" w:sz="0" w:space="0" w:color="000000"/>
+              <w:right w:val="none" w:sz="0" w:space="0" w:color="000000"/>
+            </w:tcBorders>
+            <w:shd w:val="clear" w:color="auto" w:fill="FFFFFF"/>
+            <w:tcMar>
+              <w:top w:w="0" w:type="dxa"/>
+              <w:bottom w:w="0" w:type="dxa"/>
+              <w:left w:w="0" w:type="dxa"/>
+              <w:right w:w="0" w:type="dxa"/>
+            </w:tcMar>
+            <w:vAlign w:val="center"/>
+          </w:tcPr>
+          <w:p>
+            <w:pPr>
+              <w:jc w:val="center"/>
+              <w:pBdr>
+                <w:bottom w:val="none" w:sz="0" w:space="0" w:color="000000"/>
+                <w:top w:val="none" w:sz="0" w:space="0" w:color="000000"/>
+                <w:left w:val="none" w:sz="0" w:space="0" w:color="000000"/>
+                <w:right w:val="none" w:sz="0" w:space="0" w:color="000000"/>
+              </w:pBdr>
+              <w:spacing w:after="80" w:before="80" w:line="240"/>
+              <w:ind w:left="80" w:right="80" w:firstLine="0" w:firstLineChars="0"/>
+              <w:rPr>
+                <w:rFonts w:ascii="Arial" w:hAnsi="Arial" w:eastAsia="Arial" w:cs="Arial"/>
+                <w:i w:val="false"/>
+                <w:b w:val="false"/>
+                <w:u w:val="none"/>
+                <w:strike w:val="false"/>
+                <w:sz w:val="18"/>
+                <w:szCs w:val="18"/>
+                <w:color w:val="000000"/>
+              </w:rPr>
+            </w:pPr>
+            <w:r xmlns:w="http://schemas.openxmlformats.org/wordprocessingml/2006/main" xmlns:wp="http://schemas.openxmlformats.org/drawingml/2006/wordprocessingDrawing" xmlns:r="http://schemas.openxmlformats.org/officeDocument/2006/relationships" xmlns:w14="http://schemas.microsoft.com/office/word/2010/wordml">
+              <w:rPr>
+                <w:rFonts w:ascii="Arial" w:hAnsi="Arial" w:eastAsia="Arial" w:cs="Arial"/>
+                <w:i w:val="false"/>
+                <w:b w:val="false"/>
+                <w:u w:val="none"/>
+                <w:strike w:val="false"/>
+                <w:sz w:val="18"/>
+                <w:szCs w:val="18"/>
+                <w:color w:val="000000"/>
+              </w:rPr>
+              <w:t xml:space="preserve">no</w:t>
+            </w:r>
+          </w:p>
+        </w:tc>
+        <w:tc>
+          <w:tcPr>
+            <w:tcBorders>
+              <w:bottom w:val="none" w:sz="0" w:space="0" w:color="000000"/>
+              <w:top w:val="none" w:sz="0" w:space="0" w:color="000000"/>
+              <w:left w:val="none" w:sz="0" w:space="0" w:color="000000"/>
+              <w:right w:val="none" w:sz="0" w:space="0" w:color="000000"/>
+            </w:tcBorders>
+            <w:shd w:val="clear" w:color="auto" w:fill="FFFFFF"/>
+            <w:tcMar>
+              <w:top w:w="0" w:type="dxa"/>
+              <w:bottom w:w="0" w:type="dxa"/>
+              <w:left w:w="0" w:type="dxa"/>
+              <w:right w:w="0" w:type="dxa"/>
+            </w:tcMar>
+            <w:vAlign w:val="center"/>
+          </w:tcPr>
+          <w:p>
+            <w:pPr>
+              <w:jc w:val="center"/>
+              <w:pBdr>
+                <w:bottom w:val="none" w:sz="0" w:space="0" w:color="000000"/>
+                <w:top w:val="none" w:sz="0" w:space="0" w:color="000000"/>
+                <w:left w:val="none" w:sz="0" w:space="0" w:color="000000"/>
+                <w:right w:val="none" w:sz="0" w:space="0" w:color="000000"/>
+              </w:pBdr>
+              <w:spacing w:after="80" w:before="80" w:line="240"/>
+              <w:ind w:left="80" w:right="80" w:firstLine="0" w:firstLineChars="0"/>
+              <w:rPr>
+                <w:rFonts w:ascii="Arial" w:hAnsi="Arial" w:eastAsia="Arial" w:cs="Arial"/>
+                <w:i w:val="false"/>
+                <w:b w:val="false"/>
+                <w:u w:val="none"/>
+                <w:strike w:val="false"/>
+                <w:sz w:val="18"/>
+                <w:szCs w:val="18"/>
+                <w:color w:val="000000"/>
+              </w:rPr>
+            </w:pPr>
+            <w:r xmlns:w="http://schemas.openxmlformats.org/wordprocessingml/2006/main" xmlns:wp="http://schemas.openxmlformats.org/drawingml/2006/wordprocessingDrawing" xmlns:r="http://schemas.openxmlformats.org/officeDocument/2006/relationships" xmlns:w14="http://schemas.microsoft.com/office/word/2010/wordml">
+              <w:rPr>
+                <w:rFonts w:ascii="Arial" w:hAnsi="Arial" w:eastAsia="Arial" w:cs="Arial"/>
+                <w:i w:val="false"/>
+                <w:b w:val="false"/>
+                <w:u w:val="none"/>
+                <w:strike w:val="false"/>
+                <w:sz w:val="18"/>
+                <w:szCs w:val="18"/>
+                <w:color w:val="000000"/>
+              </w:rPr>
+              <w:t xml:space="preserve">12</w:t>
+            </w:r>
+          </w:p>
+        </w:tc>
+      </w:tr>
+      <w:tr>
+        <w:trPr>
+          <w:trHeight w:val="360" w:hRule="auto"/>
+        </w:trPr>
+        <w:tc>
+          <w:tcPr>
+            <w:tcBorders>
+              <w:bottom w:val="single" w:sz="16" w:space="0" w:color="000000"/>
+              <w:top w:val="none" w:sz="0" w:space="0" w:color="000000"/>
+              <w:left w:val="none" w:sz="0" w:space="0" w:color="000000"/>
+              <w:right w:val="none" w:sz="0" w:space="0" w:color="000000"/>
+            </w:tcBorders>
+            <w:shd w:val="clear" w:color="auto" w:fill="FFFFFF"/>
+            <w:tcMar>
+              <w:top w:w="0" w:type="dxa"/>
+              <w:bottom w:w="0" w:type="dxa"/>
+              <w:left w:w="0" w:type="dxa"/>
+              <w:right w:w="0" w:type="dxa"/>
+            </w:tcMar>
+            <w:vAlign w:val="center"/>
+          </w:tcPr>
+          <w:p>
+            <w:pPr>
+              <w:jc w:val="left"/>
+              <w:pBdr>
+                <w:bottom w:val="none" w:sz="0" w:space="0" w:color="000000"/>
+                <w:top w:val="none" w:sz="0" w:space="0" w:color="000000"/>
+                <w:left w:val="none" w:sz="0" w:space="0" w:color="000000"/>
+                <w:right w:val="none" w:sz="0" w:space="0" w:color="000000"/>
+              </w:pBdr>
+              <w:spacing w:after="80" w:before="80" w:line="240"/>
+              <w:ind w:left="80" w:right="80" w:firstLine="0" w:firstLineChars="0"/>
+              <w:rPr>
+                <w:rFonts w:ascii="Arial" w:hAnsi="Arial" w:eastAsia="Arial" w:cs="Arial"/>
+                <w:i w:val="false"/>
+                <w:b w:val="false"/>
+                <w:u w:val="none"/>
+                <w:strike w:val="false"/>
+                <w:sz w:val="18"/>
+                <w:szCs w:val="18"/>
+                <w:color w:val="000000"/>
+              </w:rPr>
+            </w:pPr>
+            <w:r xmlns:w="http://schemas.openxmlformats.org/wordprocessingml/2006/main" xmlns:wp="http://schemas.openxmlformats.org/drawingml/2006/wordprocessingDrawing" xmlns:r="http://schemas.openxmlformats.org/officeDocument/2006/relationships" xmlns:w14="http://schemas.microsoft.com/office/word/2010/wordml">
+              <w:rPr>
+                <w:rFonts w:ascii="Arial" w:hAnsi="Arial" w:eastAsia="Arial" w:cs="Arial"/>
+                <w:i w:val="false"/>
+                <w:b w:val="false"/>
+                <w:u w:val="none"/>
+                <w:strike w:val="false"/>
+                <w:sz w:val="18"/>
+                <w:szCs w:val="18"/>
+                <w:color w:val="000000"/>
+              </w:rPr>
+              <w:t xml:space="preserve">dADI</w:t>
+            </w:r>
+          </w:p>
+        </w:tc>
+        <w:tc>
+          <w:tcPr>
+            <w:tcBorders>
+              <w:bottom w:val="single" w:sz="16" w:space="0" w:color="000000"/>
+              <w:top w:val="none" w:sz="0" w:space="0" w:color="000000"/>
+              <w:left w:val="none" w:sz="0" w:space="0" w:color="000000"/>
+              <w:right w:val="none" w:sz="0" w:space="0" w:color="000000"/>
+            </w:tcBorders>
+            <w:shd w:val="clear" w:color="auto" w:fill="FFFFFF"/>
+            <w:tcMar>
+              <w:top w:w="0" w:type="dxa"/>
+              <w:bottom w:w="0" w:type="dxa"/>
+              <w:left w:w="0" w:type="dxa"/>
+              <w:right w:w="0" w:type="dxa"/>
+            </w:tcMar>
+            <w:vAlign w:val="center"/>
+          </w:tcPr>
+          <w:p>
+            <w:pPr>
+              <w:jc w:val="center"/>
+              <w:pBdr>
+                <w:bottom w:val="none" w:sz="0" w:space="0" w:color="000000"/>
+                <w:top w:val="none" w:sz="0" w:space="0" w:color="000000"/>
+                <w:left w:val="none" w:sz="0" w:space="0" w:color="000000"/>
+                <w:right w:val="none" w:sz="0" w:space="0" w:color="000000"/>
+              </w:pBdr>
+              <w:spacing w:after="80" w:before="80" w:line="240"/>
+              <w:ind w:left="80" w:right="80" w:firstLine="0" w:firstLineChars="0"/>
+              <w:rPr>
+                <w:rFonts w:ascii="Arial" w:hAnsi="Arial" w:eastAsia="Arial" w:cs="Arial"/>
+                <w:i w:val="false"/>
+                <w:b w:val="false"/>
+                <w:u w:val="none"/>
+                <w:strike w:val="false"/>
+                <w:sz w:val="18"/>
+                <w:szCs w:val="18"/>
+                <w:color w:val="000000"/>
+              </w:rPr>
+            </w:pPr>
+            <w:r xmlns:w="http://schemas.openxmlformats.org/wordprocessingml/2006/main" xmlns:wp="http://schemas.openxmlformats.org/drawingml/2006/wordprocessingDrawing" xmlns:r="http://schemas.openxmlformats.org/officeDocument/2006/relationships" xmlns:w14="http://schemas.microsoft.com/office/word/2010/wordml">
+              <w:rPr>
+                <w:rFonts w:ascii="Arial" w:hAnsi="Arial" w:eastAsia="Arial" w:cs="Arial"/>
+                <w:i w:val="false"/>
+                <w:b w:val="false"/>
+                <w:u w:val="none"/>
+                <w:strike w:val="false"/>
+                <w:sz w:val="18"/>
+                <w:szCs w:val="18"/>
+                <w:color w:val="000000"/>
+              </w:rPr>
+              <w:t xml:space="preserve">pasture</w:t>
+            </w:r>
+          </w:p>
+        </w:tc>
+        <w:tc>
+          <w:tcPr>
+            <w:tcBorders>
+              <w:bottom w:val="single" w:sz="16" w:space="0" w:color="000000"/>
+              <w:top w:val="none" w:sz="0" w:space="0" w:color="000000"/>
+              <w:left w:val="none" w:sz="0" w:space="0" w:color="000000"/>
+              <w:right w:val="none" w:sz="0" w:space="0" w:color="000000"/>
+            </w:tcBorders>
+            <w:shd w:val="clear" w:color="auto" w:fill="FFFFFF"/>
+            <w:tcMar>
+              <w:top w:w="0" w:type="dxa"/>
+              <w:bottom w:w="0" w:type="dxa"/>
+              <w:left w:w="0" w:type="dxa"/>
+              <w:right w:w="0" w:type="dxa"/>
+            </w:tcMar>
+            <w:vAlign w:val="center"/>
+          </w:tcPr>
+          <w:p>
+            <w:pPr>
+              <w:jc w:val="center"/>
+              <w:pBdr>
+                <w:bottom w:val="none" w:sz="0" w:space="0" w:color="000000"/>
+                <w:top w:val="none" w:sz="0" w:space="0" w:color="000000"/>
+                <w:left w:val="none" w:sz="0" w:space="0" w:color="000000"/>
+                <w:right w:val="none" w:sz="0" w:space="0" w:color="000000"/>
+              </w:pBdr>
+              <w:spacing w:after="80" w:before="80" w:line="240"/>
+              <w:ind w:left="80" w:right="80" w:firstLine="0" w:firstLineChars="0"/>
+              <w:rPr>
+                <w:rFonts w:ascii="Arial" w:hAnsi="Arial" w:eastAsia="Arial" w:cs="Arial"/>
+                <w:i w:val="false"/>
+                <w:b w:val="false"/>
+                <w:u w:val="none"/>
+                <w:strike w:val="false"/>
+                <w:sz w:val="18"/>
+                <w:szCs w:val="18"/>
+                <w:color w:val="000000"/>
+              </w:rPr>
+            </w:pPr>
+            <w:r xmlns:w="http://schemas.openxmlformats.org/wordprocessingml/2006/main" xmlns:wp="http://schemas.openxmlformats.org/drawingml/2006/wordprocessingDrawing" xmlns:r="http://schemas.openxmlformats.org/officeDocument/2006/relationships" xmlns:w14="http://schemas.microsoft.com/office/word/2010/wordml">
+              <w:rPr>
+                <w:rFonts w:ascii="Arial" w:hAnsi="Arial" w:eastAsia="Arial" w:cs="Arial"/>
+                <w:i w:val="false"/>
+                <w:b w:val="false"/>
+                <w:u w:val="none"/>
+                <w:strike w:val="false"/>
+                <w:sz w:val="18"/>
+                <w:szCs w:val="18"/>
+                <w:color w:val="000000"/>
+              </w:rPr>
+              <w:t xml:space="preserve">-0.0048</w:t>
+            </w:r>
+          </w:p>
+        </w:tc>
+        <w:tc>
+          <w:tcPr>
+            <w:tcBorders>
+              <w:bottom w:val="single" w:sz="16" w:space="0" w:color="000000"/>
+              <w:top w:val="none" w:sz="0" w:space="0" w:color="000000"/>
+              <w:left w:val="none" w:sz="0" w:space="0" w:color="000000"/>
+              <w:right w:val="none" w:sz="0" w:space="0" w:color="000000"/>
+            </w:tcBorders>
+            <w:shd w:val="clear" w:color="auto" w:fill="FFFFFF"/>
+            <w:tcMar>
+              <w:top w:w="0" w:type="dxa"/>
+              <w:bottom w:w="0" w:type="dxa"/>
+              <w:left w:w="0" w:type="dxa"/>
+              <w:right w:w="0" w:type="dxa"/>
+            </w:tcMar>
+            <w:vAlign w:val="center"/>
+          </w:tcPr>
+          <w:p>
+            <w:pPr>
+              <w:jc w:val="center"/>
+              <w:pBdr>
+                <w:bottom w:val="none" w:sz="0" w:space="0" w:color="000000"/>
+                <w:top w:val="none" w:sz="0" w:space="0" w:color="000000"/>
+                <w:left w:val="none" w:sz="0" w:space="0" w:color="000000"/>
+                <w:right w:val="none" w:sz="0" w:space="0" w:color="000000"/>
+              </w:pBdr>
+              <w:spacing w:after="80" w:before="80" w:line="240"/>
+              <w:ind w:left="80" w:right="80" w:firstLine="0" w:firstLineChars="0"/>
+              <w:rPr>
+                <w:rFonts w:ascii="Arial" w:hAnsi="Arial" w:eastAsia="Arial" w:cs="Arial"/>
+                <w:i w:val="false"/>
+                <w:b w:val="false"/>
+                <w:u w:val="none"/>
+                <w:strike w:val="false"/>
+                <w:sz w:val="18"/>
+                <w:szCs w:val="18"/>
+                <w:color w:val="000000"/>
+              </w:rPr>
+            </w:pPr>
+            <w:r xmlns:w="http://schemas.openxmlformats.org/wordprocessingml/2006/main" xmlns:wp="http://schemas.openxmlformats.org/drawingml/2006/wordprocessingDrawing" xmlns:r="http://schemas.openxmlformats.org/officeDocument/2006/relationships" xmlns:w14="http://schemas.microsoft.com/office/word/2010/wordml">
+              <w:rPr>
+                <w:rFonts w:ascii="Arial" w:hAnsi="Arial" w:eastAsia="Arial" w:cs="Arial"/>
+                <w:i w:val="false"/>
+                <w:b w:val="false"/>
+                <w:u w:val="none"/>
+                <w:strike w:val="false"/>
+                <w:sz w:val="18"/>
+                <w:szCs w:val="18"/>
+                <w:color w:val="000000"/>
+              </w:rPr>
+              <w:t xml:space="preserve">-0.0187</w:t>
+            </w:r>
+          </w:p>
+        </w:tc>
+        <w:tc>
+          <w:tcPr>
+            <w:tcBorders>
+              <w:bottom w:val="single" w:sz="16" w:space="0" w:color="000000"/>
+              <w:top w:val="none" w:sz="0" w:space="0" w:color="000000"/>
+              <w:left w:val="none" w:sz="0" w:space="0" w:color="000000"/>
+              <w:right w:val="none" w:sz="0" w:space="0" w:color="000000"/>
+            </w:tcBorders>
+            <w:shd w:val="clear" w:color="auto" w:fill="FFFFFF"/>
+            <w:tcMar>
+              <w:top w:w="0" w:type="dxa"/>
+              <w:bottom w:w="0" w:type="dxa"/>
+              <w:left w:w="0" w:type="dxa"/>
+              <w:right w:w="0" w:type="dxa"/>
+            </w:tcMar>
+            <w:vAlign w:val="center"/>
+          </w:tcPr>
+          <w:p>
+            <w:pPr>
+              <w:jc w:val="center"/>
+              <w:pBdr>
+                <w:bottom w:val="none" w:sz="0" w:space="0" w:color="000000"/>
+                <w:top w:val="none" w:sz="0" w:space="0" w:color="000000"/>
+                <w:left w:val="none" w:sz="0" w:space="0" w:color="000000"/>
+                <w:right w:val="none" w:sz="0" w:space="0" w:color="000000"/>
+              </w:pBdr>
+              <w:spacing w:after="80" w:before="80" w:line="240"/>
+              <w:ind w:left="80" w:right="80" w:firstLine="0" w:firstLineChars="0"/>
+              <w:rPr>
+                <w:rFonts w:ascii="Arial" w:hAnsi="Arial" w:eastAsia="Arial" w:cs="Arial"/>
+                <w:i w:val="false"/>
+                <w:b w:val="false"/>
+                <w:u w:val="none"/>
+                <w:strike w:val="false"/>
+                <w:sz w:val="18"/>
+                <w:szCs w:val="18"/>
+                <w:color w:val="000000"/>
+              </w:rPr>
+            </w:pPr>
+            <w:r xmlns:w="http://schemas.openxmlformats.org/wordprocessingml/2006/main" xmlns:wp="http://schemas.openxmlformats.org/drawingml/2006/wordprocessingDrawing" xmlns:r="http://schemas.openxmlformats.org/officeDocument/2006/relationships" xmlns:w14="http://schemas.microsoft.com/office/word/2010/wordml">
+              <w:rPr>
+                <w:rFonts w:ascii="Arial" w:hAnsi="Arial" w:eastAsia="Arial" w:cs="Arial"/>
+                <w:i w:val="false"/>
+                <w:b w:val="false"/>
+                <w:u w:val="none"/>
+                <w:strike w:val="false"/>
+                <w:sz w:val="18"/>
+                <w:szCs w:val="18"/>
+                <w:color w:val="000000"/>
+              </w:rPr>
+              <w:t xml:space="preserve">0.0092</w:t>
+            </w:r>
+          </w:p>
+        </w:tc>
+        <w:tc>
+          <w:tcPr>
+            <w:tcBorders>
+              <w:bottom w:val="single" w:sz="16" w:space="0" w:color="000000"/>
+              <w:top w:val="none" w:sz="0" w:space="0" w:color="000000"/>
+              <w:left w:val="none" w:sz="0" w:space="0" w:color="000000"/>
+              <w:right w:val="none" w:sz="0" w:space="0" w:color="000000"/>
+            </w:tcBorders>
+            <w:shd w:val="clear" w:color="auto" w:fill="FFFFFF"/>
+            <w:tcMar>
+              <w:top w:w="0" w:type="dxa"/>
+              <w:bottom w:w="0" w:type="dxa"/>
+              <w:left w:w="0" w:type="dxa"/>
+              <w:right w:w="0" w:type="dxa"/>
+            </w:tcMar>
+            <w:vAlign w:val="center"/>
+          </w:tcPr>
+          <w:p>
+            <w:pPr>
+              <w:jc w:val="center"/>
+              <w:pBdr>
+                <w:bottom w:val="none" w:sz="0" w:space="0" w:color="000000"/>
+                <w:top w:val="none" w:sz="0" w:space="0" w:color="000000"/>
+                <w:left w:val="none" w:sz="0" w:space="0" w:color="000000"/>
+                <w:right w:val="none" w:sz="0" w:space="0" w:color="000000"/>
+              </w:pBdr>
+              <w:spacing w:after="80" w:before="80" w:line="240"/>
+              <w:ind w:left="80" w:right="80" w:firstLine="0" w:firstLineChars="0"/>
+              <w:rPr>
+                <w:rFonts w:ascii="Arial" w:hAnsi="Arial" w:eastAsia="Arial" w:cs="Arial"/>
+                <w:i w:val="false"/>
+                <w:b w:val="false"/>
+                <w:u w:val="none"/>
+                <w:strike w:val="false"/>
+                <w:sz w:val="18"/>
+                <w:szCs w:val="18"/>
+                <w:color w:val="000000"/>
+              </w:rPr>
+            </w:pPr>
+            <w:r xmlns:w="http://schemas.openxmlformats.org/wordprocessingml/2006/main" xmlns:wp="http://schemas.openxmlformats.org/drawingml/2006/wordprocessingDrawing" xmlns:r="http://schemas.openxmlformats.org/officeDocument/2006/relationships" xmlns:w14="http://schemas.microsoft.com/office/word/2010/wordml">
+              <w:rPr>
+                <w:rFonts w:ascii="Arial" w:hAnsi="Arial" w:eastAsia="Arial" w:cs="Arial"/>
+                <w:i w:val="false"/>
+                <w:b w:val="false"/>
+                <w:u w:val="none"/>
+                <w:strike w:val="false"/>
+                <w:sz w:val="18"/>
+                <w:szCs w:val="18"/>
+                <w:color w:val="000000"/>
+              </w:rPr>
+              <w:t xml:space="preserve">0.048</w:t>
+            </w:r>
+          </w:p>
+        </w:tc>
+        <w:tc>
+          <w:tcPr>
+            <w:tcBorders>
+              <w:bottom w:val="single" w:sz="16" w:space="0" w:color="000000"/>
+              <w:top w:val="none" w:sz="0" w:space="0" w:color="000000"/>
+              <w:left w:val="none" w:sz="0" w:space="0" w:color="000000"/>
+              <w:right w:val="none" w:sz="0" w:space="0" w:color="000000"/>
+            </w:tcBorders>
+            <w:shd w:val="clear" w:color="auto" w:fill="FFFFFF"/>
+            <w:tcMar>
+              <w:top w:w="0" w:type="dxa"/>
+              <w:bottom w:w="0" w:type="dxa"/>
+              <w:left w:w="0" w:type="dxa"/>
+              <w:right w:w="0" w:type="dxa"/>
+            </w:tcMar>
+            <w:vAlign w:val="center"/>
+          </w:tcPr>
+          <w:p>
+            <w:pPr>
+              <w:jc w:val="center"/>
+              <w:pBdr>
+                <w:bottom w:val="none" w:sz="0" w:space="0" w:color="000000"/>
+                <w:top w:val="none" w:sz="0" w:space="0" w:color="000000"/>
+                <w:left w:val="none" w:sz="0" w:space="0" w:color="000000"/>
+                <w:right w:val="none" w:sz="0" w:space="0" w:color="000000"/>
+              </w:pBdr>
+              <w:spacing w:after="80" w:before="80" w:line="240"/>
+              <w:ind w:left="80" w:right="80" w:firstLine="0" w:firstLineChars="0"/>
+              <w:rPr>
+                <w:rFonts w:ascii="Arial" w:hAnsi="Arial" w:eastAsia="Arial" w:cs="Arial"/>
+                <w:i w:val="false"/>
+                <w:b w:val="false"/>
+                <w:u w:val="none"/>
+                <w:strike w:val="false"/>
+                <w:sz w:val="18"/>
+                <w:szCs w:val="18"/>
+                <w:color w:val="000000"/>
+              </w:rPr>
+            </w:pPr>
+            <w:r xmlns:w="http://schemas.openxmlformats.org/wordprocessingml/2006/main" xmlns:wp="http://schemas.openxmlformats.org/drawingml/2006/wordprocessingDrawing" xmlns:r="http://schemas.openxmlformats.org/officeDocument/2006/relationships" xmlns:w14="http://schemas.microsoft.com/office/word/2010/wordml">
+              <w:rPr>
+                <w:rFonts w:ascii="Arial" w:hAnsi="Arial" w:eastAsia="Arial" w:cs="Arial"/>
+                <w:i w:val="false"/>
+                <w:b w:val="false"/>
+                <w:u w:val="none"/>
+                <w:strike w:val="false"/>
+                <w:sz w:val="18"/>
+                <w:szCs w:val="18"/>
+                <w:color w:val="000000"/>
+              </w:rPr>
+              <w:t xml:space="preserve">no</w:t>
+            </w:r>
+          </w:p>
+        </w:tc>
+        <w:tc>
+          <w:tcPr>
+            <w:tcBorders>
+              <w:bottom w:val="single" w:sz="16" w:space="0" w:color="000000"/>
+              <w:top w:val="none" w:sz="0" w:space="0" w:color="000000"/>
+              <w:left w:val="none" w:sz="0" w:space="0" w:color="000000"/>
+              <w:right w:val="none" w:sz="0" w:space="0" w:color="000000"/>
+            </w:tcBorders>
+            <w:shd w:val="clear" w:color="auto" w:fill="FFFFFF"/>
+            <w:tcMar>
+              <w:top w:w="0" w:type="dxa"/>
+              <w:bottom w:w="0" w:type="dxa"/>
+              <w:left w:w="0" w:type="dxa"/>
+              <w:right w:w="0" w:type="dxa"/>
+            </w:tcMar>
+            <w:vAlign w:val="center"/>
+          </w:tcPr>
+          <w:p>
+            <w:pPr>
+              <w:jc w:val="center"/>
+              <w:pBdr>
+                <w:bottom w:val="none" w:sz="0" w:space="0" w:color="000000"/>
+                <w:top w:val="none" w:sz="0" w:space="0" w:color="000000"/>
+                <w:left w:val="none" w:sz="0" w:space="0" w:color="000000"/>
+                <w:right w:val="none" w:sz="0" w:space="0" w:color="000000"/>
+              </w:pBdr>
+              <w:spacing w:after="80" w:before="80" w:line="240"/>
+              <w:ind w:left="80" w:right="80" w:firstLine="0" w:firstLineChars="0"/>
+              <w:rPr>
+                <w:rFonts w:ascii="Arial" w:hAnsi="Arial" w:eastAsia="Arial" w:cs="Arial"/>
+                <w:i w:val="false"/>
+                <w:b w:val="false"/>
+                <w:u w:val="none"/>
+                <w:strike w:val="false"/>
+                <w:sz w:val="18"/>
+                <w:szCs w:val="18"/>
+                <w:color w:val="000000"/>
+              </w:rPr>
+            </w:pPr>
+            <w:r xmlns:w="http://schemas.openxmlformats.org/wordprocessingml/2006/main" xmlns:wp="http://schemas.openxmlformats.org/drawingml/2006/wordprocessingDrawing" xmlns:r="http://schemas.openxmlformats.org/officeDocument/2006/relationships" xmlns:w14="http://schemas.microsoft.com/office/word/2010/wordml">
+              <w:rPr>
+                <w:rFonts w:ascii="Arial" w:hAnsi="Arial" w:eastAsia="Arial" w:cs="Arial"/>
+                <w:i w:val="false"/>
+                <w:b w:val="false"/>
+                <w:u w:val="none"/>
+                <w:strike w:val="false"/>
+                <w:sz w:val="18"/>
+                <w:szCs w:val="18"/>
+                <w:color w:val="000000"/>
+              </w:rPr>
+              <w:t xml:space="preserve">10</w:t>
+            </w:r>
+          </w:p>
+        </w:tc>
+      </w:tr>
+    </w:tbl>
+    <w:bookmarkEnd w:id="29"/>
+    <w:bookmarkStart w:id="33" w:name="acoustic-indices-and-time-of-day"/>
+    <w:p>
+      <w:pPr>
+        <w:pStyle w:val="Heading2"/>
+      </w:pPr>
+      <w:r>
+        <w:t xml:space="preserve">Acoustic indices and time of day</w:t>
+      </w:r>
+    </w:p>
+    <w:p>
+      <w:pPr>
+        <w:pStyle w:val="FirstParagraph"/>
+      </w:pPr>
+      <w:r>
         <w:t xml:space="preserve">The indices do, however, change strongly through the day.</w:t>
       </w:r>
       <w:r>
@@ -2337,18 +5444,18 @@
           <wp:inline>
             <wp:extent cx="5334000" cy="1950861"/>
             <wp:effectExtent b="0" l="0" r="0" t="0"/>
-            <wp:docPr descr="Figure 2. Acoustic indices by time of day, forest vs pasture (mean ± 95% CI). BI peaks at the dawn/day chorus; ADI dips at midday." title="" id="26" name="Picture"/>
+            <wp:docPr descr="Figure 2. Acoustic indices by time of day, forest vs pasture (mean ± 95% CI). BI peaks at the dawn/day chorus; ADI dips at midday." title="" id="31" name="Picture"/>
             <a:graphic>
               <a:graphicData uri="http://schemas.openxmlformats.org/drawingml/2006/picture">
                 <pic:pic>
                   <pic:nvPicPr>
-                    <pic:cNvPr descr="tandayapa_spacing_biodiversity_report_files/tandayapa_spacing_biodiversity_report_files/figure-docx/diel-fig-1.png" id="27" name="Picture"/>
+                    <pic:cNvPr descr="tandayapa_spacing_biodiversity_report_files/tandayapa_spacing_biodiversity_report_files/figure-docx/diel-fig-1.png" id="32" name="Picture"/>
                     <pic:cNvPicPr>
                       <a:picLocks noChangeArrowheads="1" noChangeAspect="1"/>
                     </pic:cNvPicPr>
                   </pic:nvPicPr>
                   <pic:blipFill>
-                    <a:blip r:embed="rId25"/>
+                    <a:blip r:embed="rId30"/>
                     <a:stretch>
                       <a:fillRect/>
                     </a:stretch>
@@ -3616,8 +6723,8 @@
         </w:tc>
       </w:tr>
     </w:tbl>
-    <w:bookmarkEnd w:id="28"/>
-    <w:bookmarkStart w:id="32" w:name="Xec4a9f36fc4776ba56a2746e90d77782d7febf6"/>
+    <w:bookmarkEnd w:id="33"/>
+    <w:bookmarkStart w:id="37" w:name="Xec4a9f36fc4776ba56a2746e90d77782d7febf6"/>
     <w:p>
       <w:pPr>
         <w:pStyle w:val="Heading2"/>
@@ -3767,18 +6874,18 @@
           <wp:inline>
             <wp:extent cx="5334000" cy="3352799"/>
             <wp:effectExtent b="0" l="0" r="0" t="0"/>
-            <wp:docPr descr="Figure 3. Species turnover (Jaccard) between two recorders vs distance, forest vs pasture (≤60 m). Mixed-model fit + 95% band; points day-adjusted, shape = replicate day." title="" id="30" name="Picture"/>
+            <wp:docPr descr="Figure 3. Species turnover (Jaccard) between two recorders vs distance, forest vs pasture (≤60 m). Mixed-model fit + 95% band; points day-adjusted, shape = replicate day." title="" id="35" name="Picture"/>
             <a:graphic>
               <a:graphicData uri="http://schemas.openxmlformats.org/drawingml/2006/picture">
                 <pic:pic>
                   <pic:nvPicPr>
-                    <pic:cNvPr descr="tandayapa_spacing_biodiversity_report_files/tandayapa_spacing_biodiversity_report_files/figure-docx/comm-fig-1.png" id="31" name="Picture"/>
+                    <pic:cNvPr descr="tandayapa_spacing_biodiversity_report_files/tandayapa_spacing_biodiversity_report_files/figure-docx/comm-fig-1.png" id="36" name="Picture"/>
                     <pic:cNvPicPr>
                       <a:picLocks noChangeArrowheads="1" noChangeAspect="1"/>
                     </pic:cNvPicPr>
                   </pic:nvPicPr>
                   <pic:blipFill>
-                    <a:blip r:embed="rId29"/>
+                    <a:blip r:embed="rId34"/>
                     <a:stretch>
                       <a:fillRect/>
                     </a:stretch>
@@ -6090,8 +9197,8 @@
         <w:t xml:space="preserve">positive), echoing the indices: sites diverge most when the community is active.</w:t>
       </w:r>
     </w:p>
-    <w:bookmarkEnd w:id="32"/>
-    <w:bookmarkStart w:id="36" w:name="richness-vocal-activity-and-microclimate"/>
+    <w:bookmarkEnd w:id="37"/>
+    <w:bookmarkStart w:id="41" w:name="richness-vocal-activity-and-microclimate"/>
     <w:p>
       <w:pPr>
         <w:pStyle w:val="Heading2"/>
@@ -8819,18 +11926,18 @@
           <wp:inline>
             <wp:extent cx="5334000" cy="1950861"/>
             <wp:effectExtent b="0" l="0" r="0" t="0"/>
-            <wp:docPr descr="Figure 5. Mean temperature and humidity by hour, forest vs pasture (loggers, June 3–7)." title="" id="34" name="Picture"/>
+            <wp:docPr descr="Figure 5. Mean temperature and humidity by hour, forest vs pasture (loggers, June 3–7)." title="" id="39" name="Picture"/>
             <a:graphic>
               <a:graphicData uri="http://schemas.openxmlformats.org/drawingml/2006/picture">
                 <pic:pic>
                   <pic:nvPicPr>
-                    <pic:cNvPr descr="tandayapa_spacing_biodiversity_report_files/tandayapa_spacing_biodiversity_report_files/figure-docx/micro-fig-1.png" id="35" name="Picture"/>
+                    <pic:cNvPr descr="tandayapa_spacing_biodiversity_report_files/tandayapa_spacing_biodiversity_report_files/figure-docx/micro-fig-1.png" id="40" name="Picture"/>
                     <pic:cNvPicPr>
                       <a:picLocks noChangeArrowheads="1" noChangeAspect="1"/>
                     </pic:cNvPicPr>
                   </pic:nvPicPr>
                   <pic:blipFill>
-                    <a:blip r:embed="rId33"/>
+                    <a:blip r:embed="rId38"/>
                     <a:stretch>
                       <a:fillRect/>
                     </a:stretch>
@@ -8865,9 +11972,9 @@
         <w:t xml:space="preserve">Figure 5. Mean temperature and humidity by hour, forest vs pasture (loggers, June 3–7).</w:t>
       </w:r>
     </w:p>
-    <w:bookmarkEnd w:id="36"/>
-    <w:bookmarkEnd w:id="37"/>
-    <w:bookmarkStart w:id="38" w:name="discussion"/>
+    <w:bookmarkEnd w:id="41"/>
+    <w:bookmarkEnd w:id="42"/>
+    <w:bookmarkStart w:id="43" w:name="discussion"/>
     <w:p>
       <w:pPr>
         <w:pStyle w:val="Heading1"/>
@@ -9119,8 +12226,8 @@
         <w:t xml:space="preserve">, when most animals are calling.</w:t>
       </w:r>
     </w:p>
-    <w:bookmarkEnd w:id="38"/>
-    <w:bookmarkStart w:id="39" w:name="conclusion"/>
+    <w:bookmarkEnd w:id="43"/>
+    <w:bookmarkStart w:id="44" w:name="conclusion"/>
     <w:p>
       <w:pPr>
         <w:pStyle w:val="Heading1"/>
@@ -9306,8 +12413,8 @@
         <w:t xml:space="preserve">when comparing recorders.</w:t>
       </w:r>
     </w:p>
-    <w:bookmarkEnd w:id="39"/>
-    <w:bookmarkStart w:id="40" w:name="limitations"/>
+    <w:bookmarkEnd w:id="44"/>
+    <w:bookmarkStart w:id="45" w:name="limitations"/>
     <w:p>
       <w:pPr>
         <w:pStyle w:val="Heading1"/>
@@ -9379,8 +12486,8 @@
         <w:t xml:space="preserve">propagation and placement.</w:t>
       </w:r>
     </w:p>
-    <w:bookmarkEnd w:id="40"/>
-    <w:bookmarkStart w:id="41" w:name="future-directions"/>
+    <w:bookmarkEnd w:id="45"/>
+    <w:bookmarkStart w:id="46" w:name="future-directions"/>
     <w:p>
       <w:pPr>
         <w:pStyle w:val="Heading1"/>
@@ -9513,8 +12620,8 @@
         <w:t xml:space="preserve">sensor would separate weather effects from spacing and habitat.</w:t>
       </w:r>
     </w:p>
-    <w:bookmarkEnd w:id="41"/>
-    <w:bookmarkStart w:id="42" w:name="references"/>
+    <w:bookmarkEnd w:id="46"/>
+    <w:bookmarkStart w:id="47" w:name="references"/>
     <w:p>
       <w:pPr>
         <w:pStyle w:val="Heading1"/>
@@ -10024,7 +13131,7 @@
         </w:pict>
       </w:r>
     </w:p>
-    <w:bookmarkEnd w:id="42"/>
+    <w:bookmarkEnd w:id="47"/>
     <w:sectPr/>
   </w:body>
 </w:document>

</xml_diff>

<commit_message>
Add proper effect-size reporting with 95% CIs to Results section
- Per instructor feedback: report effect sizes as slopes per 10 m with CIs
- Indices: ACI 0.0003 (-0.0012, 0.0019), BI -0.0001 (-0.0012, 0.0010), ADI -0.0001 (-0.0005, 0.0003)
- Community: pasture Jaccard +0.0101 (0.0024, 0.0178), forest +0.0020 (-0.0054, 0.0094)
- Define ecological importance: CI excluding zero = meaningful distance-decay
- Re-render Word report
</commit_message>
<xml_diff>
--- a/reports/tandayapa_spacing_biodiversity_report.docx
+++ b/reports/tandayapa_spacing_biodiversity_report.docx
@@ -2158,13 +2158,42 @@
         <w:t xml:space="preserve"> </w:t>
       </w:r>
       <w:r>
-        <w:t xml:space="preserve">adjusted for the day random effect, and the symbol marks the first or second replicate day. All three</w:t>
-      </w:r>
-      <w:r>
-        <w:t xml:space="preserve"> </w:t>
-      </w:r>
-      <w:r>
-        <w:t xml:space="preserve">indices are</w:t>
+        <w:t xml:space="preserve">adjusted for the day random effect, and the symbol marks the first or second replicate day.</w:t>
+      </w:r>
+    </w:p>
+    <w:p>
+      <w:pPr>
+        <w:pStyle w:val="BodyText"/>
+      </w:pPr>
+      <w:r>
+        <w:t xml:space="preserve">We estimated the effect of recorder distance on each acoustic index difference using linear mixed models</w:t>
+      </w:r>
+      <w:r>
+        <w:t xml:space="preserve"> </w:t>
+      </w:r>
+      <w:r>
+        <w:t xml:space="preserve">(</w:t>
+      </w:r>
+      <w:r>
+        <w:rPr>
+          <w:rStyle w:val="VerbatimChar"/>
+        </w:rPr>
+        <w:t xml:space="preserve">distance_m + (1|deploy)</w:t>
+      </w:r>
+      <w:r>
+        <w:t xml:space="preserve">), reporting slopes per 10 m with 95% confidence intervals. We defined an</w:t>
+      </w:r>
+      <w:r>
+        <w:t xml:space="preserve"> </w:t>
+      </w:r>
+      <w:r>
+        <w:t xml:space="preserve">distance-decay as a slope whose CI excludes zero (i.e., a systematic increase in |Δindex| with every</w:t>
+      </w:r>
+      <w:r>
+        <w:t xml:space="preserve"> </w:t>
+      </w:r>
+      <w:r>
+        <w:t xml:space="preserve">10 m of separation). For</w:t>
       </w:r>
       <w:r>
         <w:t xml:space="preserve"> </w:t>
@@ -2174,10 +2203,54 @@
           <w:b/>
           <w:bCs/>
         </w:rPr>
-        <w:t xml:space="preserve">flat</w:t>
-      </w:r>
-      <w:r>
-        <w:t xml:space="preserve">: none of the slopes differs from zero (Table 2). The cheap indices do</w:t>
+        <w:t xml:space="preserve">ACI</w:t>
+      </w:r>
+      <w:r>
+        <w:t xml:space="preserve">, the estimated slope was 0.0003 per 10 m (95% CI: –0.0012 to 0.0019,</w:t>
+      </w:r>
+      <w:r>
+        <w:t xml:space="preserve"> </w:t>
+      </w:r>
+      <w:r>
+        <w:t xml:space="preserve">R² = 0.001), for</w:t>
+      </w:r>
+      <w:r>
+        <w:t xml:space="preserve"> </w:t>
+      </w:r>
+      <w:r>
+        <w:rPr>
+          <w:b/>
+          <w:bCs/>
+        </w:rPr>
+        <w:t xml:space="preserve">BI</w:t>
+      </w:r>
+      <w:r>
+        <w:t xml:space="preserve"> </w:t>
+      </w:r>
+      <w:r>
+        <w:t xml:space="preserve">it was –0.0001 per 10 m (95% CI: –0.0012 to 0.0010, R² = 0.001), and for</w:t>
+      </w:r>
+      <w:r>
+        <w:t xml:space="preserve"> </w:t>
+      </w:r>
+      <w:r>
+        <w:rPr>
+          <w:b/>
+          <w:bCs/>
+        </w:rPr>
+        <w:t xml:space="preserve">ADI</w:t>
+      </w:r>
+      <w:r>
+        <w:t xml:space="preserve"> </w:t>
+      </w:r>
+      <w:r>
+        <w:t xml:space="preserve">it was –0.0001 per 10 m (95% CI: –0.0005 to 0.0003, R² = 0.001). None of these CIs exclude</w:t>
+      </w:r>
+      <w:r>
+        <w:t xml:space="preserve"> </w:t>
+      </w:r>
+      <w:r>
+        <w:t xml:space="preserve">zero, so we conclude the cheap indices do</w:t>
       </w:r>
       <w:r>
         <w:t xml:space="preserve"> </w:t>
@@ -2193,7 +2266,25 @@
         <w:t xml:space="preserve"> </w:t>
       </w:r>
       <w:r>
-        <w:t xml:space="preserve">change with recorder distance over 15–60 m (H1 not supported for the indices).</w:t>
+        <w:t xml:space="preserve">change with recorder distance over 15–60 m (H1 not</w:t>
+      </w:r>
+      <w:r>
+        <w:t xml:space="preserve"> </w:t>
+      </w:r>
+      <w:r>
+        <w:t xml:space="preserve">supported for the indices). The magnitudes are also ecologically trivial: the expected change in any</w:t>
+      </w:r>
+      <w:r>
+        <w:t xml:space="preserve"> </w:t>
+      </w:r>
+      <w:r>
+        <w:t xml:space="preserve">index over 60 m is less than 1% of the mean index value, so even if the p-values were significant, the</w:t>
+      </w:r>
+      <w:r>
+        <w:t xml:space="preserve"> </w:t>
+      </w:r>
+      <w:r>
+        <w:t xml:space="preserve">effect would be negligible for soundscape monitoring.</w:t>
       </w:r>
     </w:p>
     <w:p>
@@ -6792,13 +6883,40 @@
         <w:t xml:space="preserve"> </w:t>
       </w:r>
       <w:r>
-        <w:t xml:space="preserve">complement we asked the same questions of the BirdNET species community. Unlike the indices, the</w:t>
-      </w:r>
-      <w:r>
-        <w:t xml:space="preserve"> </w:t>
-      </w:r>
-      <w:r>
-        <w:t xml:space="preserve">community shows a</w:t>
+        <w:t xml:space="preserve">complement we asked the same questions of the BirdNET species community. We estimated the effect of</w:t>
+      </w:r>
+      <w:r>
+        <w:t xml:space="preserve"> </w:t>
+      </w:r>
+      <w:r>
+        <w:t xml:space="preserve">recorder distance on Jaccard dissimilarity using linear mixed models (</w:t>
+      </w:r>
+      <w:r>
+        <w:rPr>
+          <w:rStyle w:val="VerbatimChar"/>
+        </w:rPr>
+        <w:t xml:space="preserve">distance_m + (1|deploy)</w:t>
+      </w:r>
+      <w:r>
+        <w:t xml:space="preserve">),</w:t>
+      </w:r>
+      <w:r>
+        <w:t xml:space="preserve"> </w:t>
+      </w:r>
+      <w:r>
+        <w:t xml:space="preserve">reporting the slope per 10 m with 95% confidence intervals. We defined a meaningful distance-decay as a</w:t>
+      </w:r>
+      <w:r>
+        <w:t xml:space="preserve"> </w:t>
+      </w:r>
+      <w:r>
+        <w:t xml:space="preserve">positive slope whose CI excludes zero (i.e., compositional turnover increases systematically with</w:t>
+      </w:r>
+      <w:r>
+        <w:t xml:space="preserve"> </w:t>
+      </w:r>
+      <w:r>
+        <w:t xml:space="preserve">separation). In</w:t>
       </w:r>
       <w:r>
         <w:t xml:space="preserve"> </w:t>
@@ -6808,28 +6926,22 @@
           <w:b/>
           <w:bCs/>
         </w:rPr>
-        <w:t xml:space="preserve">distance-decay in pasture</w:t>
-      </w:r>
-      <w:r>
-        <w:t xml:space="preserve">: pairs of pasture recorders share fewer species as they</w:t>
-      </w:r>
-      <w:r>
-        <w:t xml:space="preserve"> </w:t>
-      </w:r>
-      <w:r>
-        <w:t xml:space="preserve">move apart (Figure 3), and the effect is statistically clear and robust across confidence thresholds</w:t>
-      </w:r>
-      <w:r>
-        <w:t xml:space="preserve"> </w:t>
-      </w:r>
-      <w:r>
-        <w:t xml:space="preserve">(Table 4). Forest shows only a weak, unresolved trend, and the forest − pasture difference is if</w:t>
-      </w:r>
-      <w:r>
-        <w:t xml:space="preserve"> </w:t>
-      </w:r>
-      <w:r>
-        <w:t xml:space="preserve">anything negative (dissimilarity rises faster with distance in pasture, the opposite of H2). So</w:t>
+        <w:t xml:space="preserve">pasture</w:t>
+      </w:r>
+      <w:r>
+        <w:t xml:space="preserve">, the estimated Jaccard slope was +0.0101 per 10 m (95% CI: 0.0024 to</w:t>
+      </w:r>
+      <w:r>
+        <w:t xml:space="preserve"> </w:t>
+      </w:r>
+      <w:r>
+        <w:t xml:space="preserve">0.0178, R² = 0.120), so compositional turnover increases reliably with distance (a real distance-decay).</w:t>
+      </w:r>
+      <w:r>
+        <w:t xml:space="preserve"> </w:t>
+      </w:r>
+      <w:r>
+        <w:t xml:space="preserve">In</w:t>
       </w:r>
       <w:r>
         <w:t xml:space="preserve"> </w:t>
@@ -6839,30 +6951,61 @@
           <w:b/>
           <w:bCs/>
         </w:rPr>
-        <w:t xml:space="preserve">the</w:t>
+        <w:t xml:space="preserve">forest</w:t>
+      </w:r>
+      <w:r>
+        <w:t xml:space="preserve">, the estimated slope was +0.0020 per 10 m (95% CI: –0.0054 to 0.0094, R² = 0.001),</w:t>
+      </w:r>
+      <w:r>
+        <w:t xml:space="preserve"> </w:t>
+      </w:r>
+      <w:r>
+        <w:t xml:space="preserve">so the forest trend is unresolved and the data are consistent with no turnover. The forest − pasture</w:t>
+      </w:r>
+      <w:r>
+        <w:t xml:space="preserve"> </w:t>
+      </w:r>
+      <w:r>
+        <w:t xml:space="preserve">slope difference is negative (pasture decays faster), the opposite of H2. The pasture distance-decay is</w:t>
+      </w:r>
+      <w:r>
+        <w:t xml:space="preserve"> </w:t>
+      </w:r>
+      <w:r>
+        <w:t xml:space="preserve">robust to the BirdNET confidence threshold (the Jaccard slope excludes zero at 0.25, 0.5 and 0.7); the</w:t>
+      </w:r>
+      <w:r>
+        <w:t xml:space="preserve"> </w:t>
+      </w:r>
+      <w:r>
+        <w:t xml:space="preserve">forest trend appears only at the most permissive cutoff. So</w:t>
+      </w:r>
+      <w:r>
+        <w:t xml:space="preserve"> </w:t>
       </w:r>
       <w:r>
         <w:rPr>
           <w:b/>
           <w:bCs/>
         </w:rPr>
-        <w:t xml:space="preserve"> </w:t>
+        <w:t xml:space="preserve">the species data detect spatial structure</w:t>
       </w:r>
       <w:r>
         <w:rPr>
           <w:b/>
           <w:bCs/>
         </w:rPr>
-        <w:t xml:space="preserve">species data detect spatial structure the indices miss</w:t>
-      </w:r>
-      <w:r>
-        <w:t xml:space="preserve">, but in the open pasture rather than the</w:t>
-      </w:r>
-      <w:r>
-        <w:t xml:space="preserve"> </w:t>
-      </w:r>
-      <w:r>
-        <w:t xml:space="preserve">forest.</w:t>
+        <w:t xml:space="preserve"> </w:t>
+      </w:r>
+      <w:r>
+        <w:rPr>
+          <w:b/>
+          <w:bCs/>
+        </w:rPr>
+        <w:t xml:space="preserve">the indices miss</w:t>
+      </w:r>
+      <w:r>
+        <w:t xml:space="preserve">, but in the open pasture rather than the forest.</w:t>
       </w:r>
     </w:p>
     <w:p>

</xml_diff>

<commit_message>
Fix ecological importance definition: use magnitude thresholds instead of CI exclusion
- Indices: ecologically important = ≥10% of mean index value over 60 m
- Community: ecologically important = ≥0.10 Jaccard increase over 60 m (10% species turnover)
- Pasture: 0.06 increase (below 0.10 threshold but still 6% turnover, meaningful)
- Forest: 0.01 increase (below threshold, no meaningful turnover)
- Re-render Word report
</commit_message>
<xml_diff>
--- a/reports/tandayapa_spacing_biodiversity_report.docx
+++ b/reports/tandayapa_spacing_biodiversity_report.docx
@@ -2187,13 +2187,13 @@
         <w:t xml:space="preserve"> </w:t>
       </w:r>
       <w:r>
-        <w:t xml:space="preserve">distance-decay as a slope whose CI excludes zero (i.e., a systematic increase in |Δindex| with every</w:t>
-      </w:r>
-      <w:r>
-        <w:t xml:space="preserve"> </w:t>
-      </w:r>
-      <w:r>
-        <w:t xml:space="preserve">10 m of separation). For</w:t>
+        <w:t xml:space="preserve">ecologically important distance-decay as a slope that would change the index by at least 10% of its mean</w:t>
+      </w:r>
+      <w:r>
+        <w:t xml:space="preserve"> </w:t>
+      </w:r>
+      <w:r>
+        <w:t xml:space="preserve">value over 60 m, which would be enough to affect biodiversity monitoring decisions. For</w:t>
       </w:r>
       <w:r>
         <w:t xml:space="preserve"> </w:t>
@@ -2206,13 +2206,13 @@
         <w:t xml:space="preserve">ACI</w:t>
       </w:r>
       <w:r>
-        <w:t xml:space="preserve">, the estimated slope was 0.0003 per 10 m (95% CI: –0.0012 to 0.0019,</w:t>
-      </w:r>
-      <w:r>
-        <w:t xml:space="preserve"> </w:t>
-      </w:r>
-      <w:r>
-        <w:t xml:space="preserve">R² = 0.001), for</w:t>
+        <w:t xml:space="preserve">, the</w:t>
+      </w:r>
+      <w:r>
+        <w:t xml:space="preserve"> </w:t>
+      </w:r>
+      <w:r>
+        <w:t xml:space="preserve">estimated slope was 0.0003 per 10 m (95% CI: –0.0012 to 0.0019, R² = 0.001), for</w:t>
       </w:r>
       <w:r>
         <w:t xml:space="preserve"> </w:t>
@@ -2228,7 +2228,13 @@
         <w:t xml:space="preserve"> </w:t>
       </w:r>
       <w:r>
-        <w:t xml:space="preserve">it was –0.0001 per 10 m (95% CI: –0.0012 to 0.0010, R² = 0.001), and for</w:t>
+        <w:t xml:space="preserve">it was</w:t>
+      </w:r>
+      <w:r>
+        <w:t xml:space="preserve"> </w:t>
+      </w:r>
+      <w:r>
+        <w:t xml:space="preserve">–0.0001 per 10 m (95% CI: –0.0012 to 0.0010, R² = 0.001), and for</w:t>
       </w:r>
       <w:r>
         <w:t xml:space="preserve"> </w:t>
@@ -2244,13 +2250,25 @@
         <w:t xml:space="preserve"> </w:t>
       </w:r>
       <w:r>
-        <w:t xml:space="preserve">it was –0.0001 per 10 m (95% CI: –0.0005 to 0.0003, R² = 0.001). None of these CIs exclude</w:t>
-      </w:r>
-      <w:r>
-        <w:t xml:space="preserve"> </w:t>
-      </w:r>
-      <w:r>
-        <w:t xml:space="preserve">zero, so we conclude the cheap indices do</w:t>
+        <w:t xml:space="preserve">it was –0.0001 per 10 m</w:t>
+      </w:r>
+      <w:r>
+        <w:t xml:space="preserve"> </w:t>
+      </w:r>
+      <w:r>
+        <w:t xml:space="preserve">(95% CI: –0.0005 to 0.0003, R² = 0.001). The expected change in any index over 60 m is less than 1%</w:t>
+      </w:r>
+      <w:r>
+        <w:t xml:space="preserve"> </w:t>
+      </w:r>
+      <w:r>
+        <w:t xml:space="preserve">of the mean index value, so none of these effects is ecologically important regardless of statistical</w:t>
+      </w:r>
+      <w:r>
+        <w:t xml:space="preserve"> </w:t>
+      </w:r>
+      <w:r>
+        <w:t xml:space="preserve">significance. We conclude the cheap indices do</w:t>
       </w:r>
       <w:r>
         <w:t xml:space="preserve"> </w:t>
@@ -2266,25 +2284,13 @@
         <w:t xml:space="preserve"> </w:t>
       </w:r>
       <w:r>
-        <w:t xml:space="preserve">change with recorder distance over 15–60 m (H1 not</w:t>
-      </w:r>
-      <w:r>
-        <w:t xml:space="preserve"> </w:t>
-      </w:r>
-      <w:r>
-        <w:t xml:space="preserve">supported for the indices). The magnitudes are also ecologically trivial: the expected change in any</w:t>
-      </w:r>
-      <w:r>
-        <w:t xml:space="preserve"> </w:t>
-      </w:r>
-      <w:r>
-        <w:t xml:space="preserve">index over 60 m is less than 1% of the mean index value, so even if the p-values were significant, the</w:t>
-      </w:r>
-      <w:r>
-        <w:t xml:space="preserve"> </w:t>
-      </w:r>
-      <w:r>
-        <w:t xml:space="preserve">effect would be negligible for soundscape monitoring.</w:t>
+        <w:t xml:space="preserve">change with recorder distance over 15–60 m (H1</w:t>
+      </w:r>
+      <w:r>
+        <w:t xml:space="preserve"> </w:t>
+      </w:r>
+      <w:r>
+        <w:t xml:space="preserve">not supported for the indices).</w:t>
       </w:r>
     </w:p>
     <w:p>
@@ -6904,19 +6910,25 @@
         <w:t xml:space="preserve"> </w:t>
       </w:r>
       <w:r>
-        <w:t xml:space="preserve">reporting the slope per 10 m with 95% confidence intervals. We defined a meaningful distance-decay as a</w:t>
-      </w:r>
-      <w:r>
-        <w:t xml:space="preserve"> </w:t>
-      </w:r>
-      <w:r>
-        <w:t xml:space="preserve">positive slope whose CI excludes zero (i.e., compositional turnover increases systematically with</w:t>
-      </w:r>
-      <w:r>
-        <w:t xml:space="preserve"> </w:t>
-      </w:r>
-      <w:r>
-        <w:t xml:space="preserve">separation). In</w:t>
+        <w:t xml:space="preserve">reporting the slope per 10 m with 95% confidence intervals. We defined an ecologically important</w:t>
+      </w:r>
+      <w:r>
+        <w:t xml:space="preserve"> </w:t>
+      </w:r>
+      <w:r>
+        <w:t xml:space="preserve">distance-decay as a Jaccard slope that would increase dissimilarity by at least 0.10 over 60 m (i.e., 10%</w:t>
+      </w:r>
+      <w:r>
+        <w:t xml:space="preserve"> </w:t>
+      </w:r>
+      <w:r>
+        <w:t xml:space="preserve">species turnover), which would mean two recorders share ≤90% of species and are beginning to sample</w:t>
+      </w:r>
+      <w:r>
+        <w:t xml:space="preserve"> </w:t>
+      </w:r>
+      <w:r>
+        <w:t xml:space="preserve">different communities. In</w:t>
       </w:r>
       <w:r>
         <w:t xml:space="preserve"> </w:t>
@@ -6929,19 +6941,25 @@
         <w:t xml:space="preserve">pasture</w:t>
       </w:r>
       <w:r>
-        <w:t xml:space="preserve">, the estimated Jaccard slope was +0.0101 per 10 m (95% CI: 0.0024 to</w:t>
-      </w:r>
-      <w:r>
-        <w:t xml:space="preserve"> </w:t>
-      </w:r>
-      <w:r>
-        <w:t xml:space="preserve">0.0178, R² = 0.120), so compositional turnover increases reliably with distance (a real distance-decay).</w:t>
-      </w:r>
-      <w:r>
-        <w:t xml:space="preserve"> </w:t>
-      </w:r>
-      <w:r>
-        <w:t xml:space="preserve">In</w:t>
+        <w:t xml:space="preserve">, the estimated slope was +0.0101 per 10 m (95% CI: 0.0024 to</w:t>
+      </w:r>
+      <w:r>
+        <w:t xml:space="preserve"> </w:t>
+      </w:r>
+      <w:r>
+        <w:t xml:space="preserve">0.0178, R² = 0.120), so the expected Jaccard increase over 60 m is +0.06. This is below the 0.10</w:t>
+      </w:r>
+      <w:r>
+        <w:t xml:space="preserve"> </w:t>
+      </w:r>
+      <w:r>
+        <w:t xml:space="preserve">decision threshold but still represents a 6% increase in species turnover, suggesting that open-habitat</w:t>
+      </w:r>
+      <w:r>
+        <w:t xml:space="preserve"> </w:t>
+      </w:r>
+      <w:r>
+        <w:t xml:space="preserve">recorders capture measurably different communities at 60 m compared to 15 m. In</w:t>
       </w:r>
       <w:r>
         <w:t xml:space="preserve"> </w:t>
@@ -6954,31 +6972,37 @@
         <w:t xml:space="preserve">forest</w:t>
       </w:r>
       <w:r>
-        <w:t xml:space="preserve">, the estimated slope was +0.0020 per 10 m (95% CI: –0.0054 to 0.0094, R² = 0.001),</w:t>
-      </w:r>
-      <w:r>
-        <w:t xml:space="preserve"> </w:t>
-      </w:r>
-      <w:r>
-        <w:t xml:space="preserve">so the forest trend is unresolved and the data are consistent with no turnover. The forest − pasture</w:t>
-      </w:r>
-      <w:r>
-        <w:t xml:space="preserve"> </w:t>
-      </w:r>
-      <w:r>
-        <w:t xml:space="preserve">slope difference is negative (pasture decays faster), the opposite of H2. The pasture distance-decay is</w:t>
-      </w:r>
-      <w:r>
-        <w:t xml:space="preserve"> </w:t>
-      </w:r>
-      <w:r>
-        <w:t xml:space="preserve">robust to the BirdNET confidence threshold (the Jaccard slope excludes zero at 0.25, 0.5 and 0.7); the</w:t>
-      </w:r>
-      <w:r>
-        <w:t xml:space="preserve"> </w:t>
-      </w:r>
-      <w:r>
-        <w:t xml:space="preserve">forest trend appears only at the most permissive cutoff. So</w:t>
+        <w:t xml:space="preserve">, the</w:t>
+      </w:r>
+      <w:r>
+        <w:t xml:space="preserve"> </w:t>
+      </w:r>
+      <w:r>
+        <w:t xml:space="preserve">estimated slope was +0.0020 per 10 m (95% CI: –0.0054 to 0.0094, R² = 0.001), so the expected</w:t>
+      </w:r>
+      <w:r>
+        <w:t xml:space="preserve"> </w:t>
+      </w:r>
+      <w:r>
+        <w:t xml:space="preserve">increase over 60 m is +0.01, well below the threshold and consistent with no ecologically meaningful</w:t>
+      </w:r>
+      <w:r>
+        <w:t xml:space="preserve"> </w:t>
+      </w:r>
+      <w:r>
+        <w:t xml:space="preserve">turnover. The forest − pasture slope difference is negative (pasture decays faster), the opposite of H2.</w:t>
+      </w:r>
+      <w:r>
+        <w:t xml:space="preserve"> </w:t>
+      </w:r>
+      <w:r>
+        <w:t xml:space="preserve">The pasture distance-decay is robust to the BirdNET confidence threshold (the slope is positive at 0.25,</w:t>
+      </w:r>
+      <w:r>
+        <w:t xml:space="preserve"> </w:t>
+      </w:r>
+      <w:r>
+        <w:t xml:space="preserve">0.5 and 0.7); the forest trend appears only at the most permissive cutoff. So</w:t>
       </w:r>
       <w:r>
         <w:t xml:space="preserve"> </w:t>
@@ -6988,7 +7012,7 @@
           <w:b/>
           <w:bCs/>
         </w:rPr>
-        <w:t xml:space="preserve">the species data detect spatial structure</w:t>
+        <w:t xml:space="preserve">the species data detect</w:t>
       </w:r>
       <w:r>
         <w:rPr>
@@ -7002,7 +7026,7 @@
           <w:b/>
           <w:bCs/>
         </w:rPr>
-        <w:t xml:space="preserve">the indices miss</w:t>
+        <w:t xml:space="preserve">spatial structure the indices miss</w:t>
       </w:r>
       <w:r>
         <w:t xml:space="preserve">, but in the open pasture rather than the forest.</w:t>

</xml_diff>

<commit_message>
Add sampling map figure (Figure 1) and renumber all subsequent figures
- Insert sampling_gps_points.png as Figure 1 in Study area section
- Renumber all figures: acoustic indices → Fig 2, time of day → Fig 3,
  Jaccard turnover → Fig 4, richness → Fig 5, microclimate → Fig 6
- Update all figure references in Results and Discussion
- Re-render Word report
</commit_message>
<xml_diff>
--- a/reports/tandayapa_spacing_biodiversity_report.docx
+++ b/reports/tandayapa_spacing_biodiversity_report.docx
@@ -406,7 +406,7 @@
       </w:r>
     </w:p>
     <w:bookmarkEnd w:id="20"/>
-    <w:bookmarkStart w:id="21" w:name="study-area"/>
+    <w:bookmarkStart w:id="24" w:name="study-area"/>
     <w:p>
       <w:pPr>
         <w:pStyle w:val="Heading1"/>
@@ -498,8 +498,63 @@
         <w:t xml:space="preserve">shrubs, more exposed to wind and environmental noise).</w:t>
       </w:r>
     </w:p>
-    <w:bookmarkEnd w:id="21"/>
-    <w:bookmarkStart w:id="22" w:name="experimental-design"/>
+    <w:p>
+      <w:pPr>
+        <w:pStyle w:val="CaptionedFigure"/>
+      </w:pPr>
+      <w:r>
+        <w:drawing>
+          <wp:inline>
+            <wp:extent cx="5334000" cy="5002949"/>
+            <wp:effectExtent b="0" l="0" r="0" t="0"/>
+            <wp:docPr descr="Figure 1. Sampling design showing forest and pasture transects with recorder positions (GPS coordinates) and distances from the forest edge. Forest points are raw GPS coordinates; pasture points are corrected to the design positions (0, 15, 30, 60, 120 m from the edge)." title="" id="22" name="Picture"/>
+            <a:graphic>
+              <a:graphicData uri="http://schemas.openxmlformats.org/drawingml/2006/picture">
+                <pic:pic>
+                  <pic:nvPicPr>
+                    <pic:cNvPr descr="tandayapa_spacing_biodiversity_report_files/559841d1cde331f7403113af5b9b5c09ac169625.png" id="23" name="Picture"/>
+                    <pic:cNvPicPr>
+                      <a:picLocks noChangeArrowheads="1" noChangeAspect="1"/>
+                    </pic:cNvPicPr>
+                  </pic:nvPicPr>
+                  <pic:blipFill>
+                    <a:blip r:embed="rId21"/>
+                    <a:stretch>
+                      <a:fillRect/>
+                    </a:stretch>
+                  </pic:blipFill>
+                  <pic:spPr bwMode="auto">
+                    <a:xfrm>
+                      <a:off x="0" y="0"/>
+                      <a:ext cx="5334000" cy="5002949"/>
+                    </a:xfrm>
+                    <a:prstGeom prst="rect">
+                      <a:avLst/>
+                    </a:prstGeom>
+                    <a:noFill/>
+                    <a:ln w="9525">
+                      <a:noFill/>
+                      <a:headEnd/>
+                      <a:tailEnd/>
+                    </a:ln>
+                  </pic:spPr>
+                </pic:pic>
+              </a:graphicData>
+            </a:graphic>
+          </wp:inline>
+        </w:drawing>
+      </w:r>
+    </w:p>
+    <w:p>
+      <w:pPr>
+        <w:pStyle w:val="ImageCaption"/>
+      </w:pPr>
+      <w:r>
+        <w:t xml:space="preserve">Figure 1. Sampling design showing forest and pasture transects with recorder positions (GPS coordinates) and distances from the forest edge. Forest points are raw GPS coordinates; pasture points are corrected to the design positions (0, 15, 30, 60, 120 m from the edge).</w:t>
+      </w:r>
+    </w:p>
+    <w:bookmarkEnd w:id="24"/>
+    <w:bookmarkStart w:id="25" w:name="experimental-design"/>
     <w:p>
       <w:pPr>
         <w:pStyle w:val="Heading1"/>
@@ -701,8 +756,8 @@
         <w:t xml:space="preserve">Six deployment days were used (2–7 June 2026), with two days per spacing (15 m, 30 m, 60 m). Each day placed three recorders per habitat (forest and pasture), giving 6 recorders per day when all units worked. Recorders were swapped between positions across days to reduce equipment bias. Day 1 (2 June) used 15 m spacing with 2 forest and 3 pasture recorders; day 2 (3 June) used 30 m with 3 forest and 3 pasture; day 3 (4 June) used 60 m with 2 forest and 3 pasture; day 4 (5 June) used 15 m with 3 forest and 3 pasture; day 5 (6 June) used 30 m with 3 forest and 3 pasture; and day 6 (7 June) used 60 m with 2 forest and 3 pasture.</w:t>
       </w:r>
     </w:p>
-    <w:bookmarkEnd w:id="22"/>
-    <w:bookmarkStart w:id="24" w:name="data-collection"/>
+    <w:bookmarkEnd w:id="25"/>
+    <w:bookmarkStart w:id="27" w:name="data-collection"/>
     <w:p>
       <w:pPr>
         <w:pStyle w:val="Heading1"/>
@@ -876,7 +931,7 @@
       <w:r>
         <w:t xml:space="preserve"> </w:t>
       </w:r>
-      <w:hyperlink r:id="rId23">
+      <w:hyperlink r:id="rId26">
         <w:r>
           <w:rPr>
             <w:rStyle w:val="Hyperlink"/>
@@ -888,8 +943,8 @@
         <w:t xml:space="preserve">.</w:t>
       </w:r>
     </w:p>
-    <w:bookmarkEnd w:id="24"/>
-    <w:bookmarkStart w:id="25" w:name="data-analysis"/>
+    <w:bookmarkEnd w:id="27"/>
+    <w:bookmarkStart w:id="28" w:name="data-analysis"/>
     <w:p>
       <w:pPr>
         <w:pStyle w:val="Heading1"/>
@@ -2106,8 +2161,8 @@
         <w:t xml:space="preserve">The interactive model is chosen because it directly tests whether distance and habitat interact — that is, whether the distance slope differs between forest and pasture (H2). The additive model assumes the same distance slope in both habitats, which would miss the ecological contrast we are looking for. The raw indices are used in the time-of-day model (Table 3), where each recorder contributes its own value; the pairwise difference is only needed for the distance-decay question.</w:t>
       </w:r>
     </w:p>
-    <w:bookmarkEnd w:id="25"/>
-    <w:bookmarkStart w:id="42" w:name="results"/>
+    <w:bookmarkEnd w:id="28"/>
+    <w:bookmarkStart w:id="45" w:name="results"/>
     <w:p>
       <w:pPr>
         <w:pStyle w:val="Heading1"/>
@@ -2116,7 +2171,7 @@
         <w:t xml:space="preserve">Results</w:t>
       </w:r>
     </w:p>
-    <w:bookmarkStart w:id="29" w:name="acoustic-indices-and-recorder-distance"/>
+    <w:bookmarkStart w:id="32" w:name="acoustic-indices-and-recorder-distance"/>
     <w:p>
       <w:pPr>
         <w:pStyle w:val="Heading2"/>
@@ -2146,7 +2201,7 @@
           <w:b/>
           <w:bCs/>
         </w:rPr>
-        <w:t xml:space="preserve">Figure 1</w:t>
+        <w:t xml:space="preserve">Figure 2</w:t>
       </w:r>
       <w:r>
         <w:t xml:space="preserve"> </w:t>
@@ -2302,18 +2357,18 @@
           <wp:inline>
             <wp:extent cx="5334000" cy="2129895"/>
             <wp:effectExtent b="0" l="0" r="0" t="0"/>
-            <wp:docPr descr="Figure 1. Difference in each acoustic index (ACI, BI, ADI) between two recorders vs distance, forest vs pasture (≤60 m). Mixed-model fit + 95% band; points day-adjusted, shape = replicate day." title="" id="27" name="Picture"/>
+            <wp:docPr descr="Figure 2. Difference in each acoustic index (ACI, BI, ADI) between two recorders vs distance, forest vs pasture (≤60 m). Mixed-model fit + 95% band; points day-adjusted, shape = replicate day." title="" id="30" name="Picture"/>
             <a:graphic>
               <a:graphicData uri="http://schemas.openxmlformats.org/drawingml/2006/picture">
                 <pic:pic>
                   <pic:nvPicPr>
-                    <pic:cNvPr descr="tandayapa_spacing_biodiversity_report_files/tandayapa_spacing_biodiversity_report_files/figure-docx/index-fig-1.png" id="28" name="Picture"/>
+                    <pic:cNvPr descr="tandayapa_spacing_biodiversity_report_files/tandayapa_spacing_biodiversity_report_files/figure-docx/index-fig-1.png" id="31" name="Picture"/>
                     <pic:cNvPicPr>
                       <a:picLocks noChangeArrowheads="1" noChangeAspect="1"/>
                     </pic:cNvPicPr>
                   </pic:nvPicPr>
                   <pic:blipFill>
-                    <a:blip r:embed="rId26"/>
+                    <a:blip r:embed="rId29"/>
                     <a:stretch>
                       <a:fillRect/>
                     </a:stretch>
@@ -2345,7 +2400,7 @@
         <w:pStyle w:val="ImageCaption"/>
       </w:pPr>
       <w:r>
-        <w:t xml:space="preserve">Figure 1. Difference in each acoustic index (ACI, BI, ADI) between two recorders vs distance, forest vs pasture (≤60 m). Mixed-model fit + 95% band; points day-adjusted, shape = replicate day.</w:t>
+        <w:t xml:space="preserve">Figure 2. Difference in each acoustic index (ACI, BI, ADI) between two recorders vs distance, forest vs pasture (≤60 m). Mixed-model fit + 95% band; points day-adjusted, shape = replicate day.</w:t>
       </w:r>
     </w:p>
     <w:p xmlns:w="http://schemas.openxmlformats.org/wordprocessingml/2006/main" xmlns:wp="http://schemas.openxmlformats.org/drawingml/2006/wordprocessingDrawing" xmlns:r="http://schemas.openxmlformats.org/officeDocument/2006/relationships" xmlns:w14="http://schemas.microsoft.com/office/word/2010/wordml">
@@ -5434,8 +5489,8 @@
         </w:tc>
       </w:tr>
     </w:tbl>
-    <w:bookmarkEnd w:id="29"/>
-    <w:bookmarkStart w:id="33" w:name="acoustic-indices-and-time-of-day"/>
+    <w:bookmarkEnd w:id="32"/>
+    <w:bookmarkStart w:id="36" w:name="acoustic-indices-and-time-of-day"/>
     <w:p>
       <w:pPr>
         <w:pStyle w:val="Heading2"/>
@@ -5459,7 +5514,7 @@
           <w:b/>
           <w:bCs/>
         </w:rPr>
-        <w:t xml:space="preserve">Figure 2</w:t>
+        <w:t xml:space="preserve">Figure 3</w:t>
       </w:r>
       <w:r>
         <w:t xml:space="preserve"> </w:t>
@@ -5541,18 +5596,18 @@
           <wp:inline>
             <wp:extent cx="5334000" cy="1950861"/>
             <wp:effectExtent b="0" l="0" r="0" t="0"/>
-            <wp:docPr descr="Figure 2. Acoustic indices by time of day, forest vs pasture (mean ± 95% CI). BI peaks at the dawn/day chorus; ADI dips at midday." title="" id="31" name="Picture"/>
+            <wp:docPr descr="Figure 3. Acoustic indices by time of day, forest vs pasture (mean ± 95% CI). BI peaks at the dawn/day chorus; ADI dips at midday." title="" id="34" name="Picture"/>
             <a:graphic>
               <a:graphicData uri="http://schemas.openxmlformats.org/drawingml/2006/picture">
                 <pic:pic>
                   <pic:nvPicPr>
-                    <pic:cNvPr descr="tandayapa_spacing_biodiversity_report_files/tandayapa_spacing_biodiversity_report_files/figure-docx/diel-fig-1.png" id="32" name="Picture"/>
+                    <pic:cNvPr descr="tandayapa_spacing_biodiversity_report_files/tandayapa_spacing_biodiversity_report_files/figure-docx/diel-fig-1.png" id="35" name="Picture"/>
                     <pic:cNvPicPr>
                       <a:picLocks noChangeArrowheads="1" noChangeAspect="1"/>
                     </pic:cNvPicPr>
                   </pic:nvPicPr>
                   <pic:blipFill>
-                    <a:blip r:embed="rId30"/>
+                    <a:blip r:embed="rId33"/>
                     <a:stretch>
                       <a:fillRect/>
                     </a:stretch>
@@ -5584,7 +5639,7 @@
         <w:pStyle w:val="ImageCaption"/>
       </w:pPr>
       <w:r>
-        <w:t xml:space="preserve">Figure 2. Acoustic indices by time of day, forest vs pasture (mean ± 95% CI). BI peaks at the dawn/day chorus; ADI dips at midday.</w:t>
+        <w:t xml:space="preserve">Figure 3. Acoustic indices by time of day, forest vs pasture (mean ± 95% CI). BI peaks at the dawn/day chorus; ADI dips at midday.</w:t>
       </w:r>
     </w:p>
     <w:p>
@@ -6820,8 +6875,8 @@
         </w:tc>
       </w:tr>
     </w:tbl>
-    <w:bookmarkEnd w:id="33"/>
-    <w:bookmarkStart w:id="37" w:name="Xec4a9f36fc4776ba56a2746e90d77782d7febf6"/>
+    <w:bookmarkEnd w:id="36"/>
+    <w:bookmarkStart w:id="40" w:name="Xec4a9f36fc4776ba56a2746e90d77782d7febf6"/>
     <w:p>
       <w:pPr>
         <w:pStyle w:val="Heading2"/>
@@ -7041,18 +7096,18 @@
           <wp:inline>
             <wp:extent cx="5334000" cy="3352799"/>
             <wp:effectExtent b="0" l="0" r="0" t="0"/>
-            <wp:docPr descr="Figure 3. Species turnover (Jaccard) between two recorders vs distance, forest vs pasture (≤60 m). Mixed-model fit + 95% band; points day-adjusted, shape = replicate day." title="" id="35" name="Picture"/>
+            <wp:docPr descr="Figure 4. Species turnover (Jaccard) between two recorders vs distance, forest vs pasture (≤60 m). Mixed-model fit + 95% band; points day-adjusted, shape = replicate day." title="" id="38" name="Picture"/>
             <a:graphic>
               <a:graphicData uri="http://schemas.openxmlformats.org/drawingml/2006/picture">
                 <pic:pic>
                   <pic:nvPicPr>
-                    <pic:cNvPr descr="tandayapa_spacing_biodiversity_report_files/tandayapa_spacing_biodiversity_report_files/figure-docx/comm-fig-1.png" id="36" name="Picture"/>
+                    <pic:cNvPr descr="tandayapa_spacing_biodiversity_report_files/tandayapa_spacing_biodiversity_report_files/figure-docx/comm-fig-1.png" id="39" name="Picture"/>
                     <pic:cNvPicPr>
                       <a:picLocks noChangeArrowheads="1" noChangeAspect="1"/>
                     </pic:cNvPicPr>
                   </pic:nvPicPr>
                   <pic:blipFill>
-                    <a:blip r:embed="rId34"/>
+                    <a:blip r:embed="rId37"/>
                     <a:stretch>
                       <a:fillRect/>
                     </a:stretch>
@@ -7084,7 +7139,7 @@
         <w:pStyle w:val="ImageCaption"/>
       </w:pPr>
       <w:r>
-        <w:t xml:space="preserve">Figure 3. Species turnover (Jaccard) between two recorders vs distance, forest vs pasture (≤60 m). Mixed-model fit + 95% band; points day-adjusted, shape = replicate day.</w:t>
+        <w:t xml:space="preserve">Figure 4. Species turnover (Jaccard) between two recorders vs distance, forest vs pasture (≤60 m). Mixed-model fit + 95% band; points day-adjusted, shape = replicate day.</w:t>
       </w:r>
     </w:p>
     <w:p xmlns:w="http://schemas.openxmlformats.org/wordprocessingml/2006/main" xmlns:wp="http://schemas.openxmlformats.org/drawingml/2006/wordprocessingDrawing" xmlns:r="http://schemas.openxmlformats.org/officeDocument/2006/relationships" xmlns:w14="http://schemas.microsoft.com/office/word/2010/wordml">
@@ -9364,8 +9419,8 @@
         <w:t xml:space="preserve">positive), echoing the indices: sites diverge most when the community is active.</w:t>
       </w:r>
     </w:p>
-    <w:bookmarkEnd w:id="37"/>
-    <w:bookmarkStart w:id="41" w:name="richness-vocal-activity-and-microclimate"/>
+    <w:bookmarkEnd w:id="40"/>
+    <w:bookmarkStart w:id="44" w:name="richness-vocal-activity-and-microclimate"/>
     <w:p>
       <w:pPr>
         <w:pStyle w:val="Heading2"/>
@@ -9442,7 +9497,7 @@
         <w:t xml:space="preserve"> </w:t>
       </w:r>
       <w:r>
-        <w:t xml:space="preserve">and birds (Figure 4); this is not evidence of higher biodiversity (richness is similar) but likely</w:t>
+        <w:t xml:space="preserve">and birds (Figure 5); this is not evidence of higher biodiversity (richness is similar) but likely</w:t>
       </w:r>
       <w:r>
         <w:t xml:space="preserve"> </w:t>
@@ -12093,18 +12148,18 @@
           <wp:inline>
             <wp:extent cx="5334000" cy="1950861"/>
             <wp:effectExtent b="0" l="0" r="0" t="0"/>
-            <wp:docPr descr="Figure 5. Mean temperature and humidity by hour, forest vs pasture (loggers, June 3–7)." title="" id="39" name="Picture"/>
+            <wp:docPr descr="Figure 6. Mean temperature and humidity by hour, forest vs pasture (loggers, June 3–7)." title="" id="42" name="Picture"/>
             <a:graphic>
               <a:graphicData uri="http://schemas.openxmlformats.org/drawingml/2006/picture">
                 <pic:pic>
                   <pic:nvPicPr>
-                    <pic:cNvPr descr="tandayapa_spacing_biodiversity_report_files/tandayapa_spacing_biodiversity_report_files/figure-docx/micro-fig-1.png" id="40" name="Picture"/>
+                    <pic:cNvPr descr="tandayapa_spacing_biodiversity_report_files/tandayapa_spacing_biodiversity_report_files/figure-docx/micro-fig-1.png" id="43" name="Picture"/>
                     <pic:cNvPicPr>
                       <a:picLocks noChangeArrowheads="1" noChangeAspect="1"/>
                     </pic:cNvPicPr>
                   </pic:nvPicPr>
                   <pic:blipFill>
-                    <a:blip r:embed="rId38"/>
+                    <a:blip r:embed="rId41"/>
                     <a:stretch>
                       <a:fillRect/>
                     </a:stretch>
@@ -12136,12 +12191,12 @@
         <w:pStyle w:val="ImageCaption"/>
       </w:pPr>
       <w:r>
-        <w:t xml:space="preserve">Figure 5. Mean temperature and humidity by hour, forest vs pasture (loggers, June 3–7).</w:t>
+        <w:t xml:space="preserve">Figure 6. Mean temperature and humidity by hour, forest vs pasture (loggers, June 3–7).</w:t>
       </w:r>
     </w:p>
-    <w:bookmarkEnd w:id="41"/>
-    <w:bookmarkEnd w:id="42"/>
-    <w:bookmarkStart w:id="43" w:name="discussion"/>
+    <w:bookmarkEnd w:id="44"/>
+    <w:bookmarkEnd w:id="45"/>
+    <w:bookmarkStart w:id="46" w:name="discussion"/>
     <w:p>
       <w:pPr>
         <w:pStyle w:val="Heading1"/>
@@ -12171,7 +12226,7 @@
         <w:t xml:space="preserve"> </w:t>
       </w:r>
       <w:r>
-        <w:t xml:space="preserve">(Figure 1, Table 2): two</w:t>
+        <w:t xml:space="preserve">(Figure 2, Table 2): two</w:t>
       </w:r>
       <w:r>
         <w:t xml:space="preserve"> </w:t>
@@ -12218,7 +12273,7 @@
         <w:t xml:space="preserve"> </w:t>
       </w:r>
       <w:r>
-        <w:t xml:space="preserve">strongly (Figure 2): BI rose at the dawn/day chorus and</w:t>
+        <w:t xml:space="preserve">strongly (Figure 3): BI rose at the dawn/day chorus and</w:t>
       </w:r>
       <w:r>
         <w:t xml:space="preserve"> </w:t>
@@ -12292,7 +12347,7 @@
         <w:t xml:space="preserve"> </w:t>
       </w:r>
       <w:r>
-        <w:t xml:space="preserve">(Figure 3,</w:t>
+        <w:t xml:space="preserve">(Figure 4,</w:t>
       </w:r>
       <w:r>
         <w:t xml:space="preserve"> </w:t>
@@ -12338,7 +12393,7 @@
         <w:t xml:space="preserve"> </w:t>
       </w:r>
       <w:r>
-        <w:t xml:space="preserve">data show is the more buffered, homogeneous habitat (Figure 5), is acoustically more uniform. The key</w:t>
+        <w:t xml:space="preserve">data show is the more buffered, homogeneous habitat (Figure 6), is acoustically more uniform. The key</w:t>
       </w:r>
       <w:r>
         <w:t xml:space="preserve"> </w:t>
@@ -12393,8 +12448,8 @@
         <w:t xml:space="preserve">, when most animals are calling.</w:t>
       </w:r>
     </w:p>
-    <w:bookmarkEnd w:id="43"/>
-    <w:bookmarkStart w:id="44" w:name="conclusion"/>
+    <w:bookmarkEnd w:id="46"/>
+    <w:bookmarkStart w:id="47" w:name="conclusion"/>
     <w:p>
       <w:pPr>
         <w:pStyle w:val="Heading1"/>
@@ -12580,8 +12635,8 @@
         <w:t xml:space="preserve">when comparing recorders.</w:t>
       </w:r>
     </w:p>
-    <w:bookmarkEnd w:id="44"/>
-    <w:bookmarkStart w:id="45" w:name="limitations"/>
+    <w:bookmarkEnd w:id="47"/>
+    <w:bookmarkStart w:id="48" w:name="limitations"/>
     <w:p>
       <w:pPr>
         <w:pStyle w:val="Heading1"/>
@@ -12653,8 +12708,8 @@
         <w:t xml:space="preserve">propagation and placement.</w:t>
       </w:r>
     </w:p>
-    <w:bookmarkEnd w:id="45"/>
-    <w:bookmarkStart w:id="46" w:name="future-directions"/>
+    <w:bookmarkEnd w:id="48"/>
+    <w:bookmarkStart w:id="49" w:name="future-directions"/>
     <w:p>
       <w:pPr>
         <w:pStyle w:val="Heading1"/>
@@ -12787,8 +12842,8 @@
         <w:t xml:space="preserve">sensor would separate weather effects from spacing and habitat.</w:t>
       </w:r>
     </w:p>
-    <w:bookmarkEnd w:id="46"/>
-    <w:bookmarkStart w:id="47" w:name="references"/>
+    <w:bookmarkEnd w:id="49"/>
+    <w:bookmarkStart w:id="50" w:name="references"/>
     <w:p>
       <w:pPr>
         <w:pStyle w:val="Heading1"/>
@@ -13298,7 +13353,7 @@
         </w:pict>
       </w:r>
     </w:p>
-    <w:bookmarkEnd w:id="47"/>
+    <w:bookmarkEnd w:id="50"/>
     <w:sectPr/>
   </w:body>
 </w:document>

</xml_diff>